<commit_message>
save runs - colondb
</commit_message>
<xml_diff>
--- a/paper/Paper.docx
+++ b/paper/Paper.docx
@@ -379,304 +379,392 @@
         <w:t>Colonoscopy</w:t>
       </w:r>
     </w:p>
+    <w:p>
+      <w:r>
+        <w:fldChar w:fldCharType="begin"/>
+      </w:r>
+      <w:r>
+        <w:instrText xml:space="preserve"> ADDIN ZOTERO_ITEM CSL_CITATION {"citationID":"LywWOdf8","properties":{"formattedCitation":"[1]","plainCitation":"[1]","noteIndex":0},"citationItems":[{"id":2053,"uris":["http://zotero.org/users/8619560/items/WCNNB9V3"],"itemData":{"id":2053,"type":"article-journal","abstract":"Background and Aim Application of artificial intelligence in medicine is now attracting substantial attention. In the field of gastrointestinal endoscopy, computer-aided diagnosis (CAD) for colonoscopy is the most investigated area, although it is still in the preclinical phase. Because colonoscopy is carried out by humans, it is inherently an imperfect procedure. CAD assistance is expected to improve its quality regarding automated polyp detection and characterization (i.e. predicting the polyp's pathology). It could help prevent endoscopists from missing polyps as well as provide a precise optical diagnosis for those detected. Ultimately, these functions that CAD provides could produce a higher adenoma detection rate and reduce the cost of polypectomy for hyperplastic polyps. Methods and Results Currently, research on automated polyp detection has been limited to experimental assessments using an algorithm based on ex vivo videos or static images. Performance for clinical use was reported to have &gt;90% sensitivity with acceptable specificity. In contrast, research on automated polyp characterization seems to surpass that for polyp detection. Prospective studies of in vivo use of artificial intelligence technologies have been reported by several groups, some of which showed a &gt;90% negative predictive value for differentiating diminutive (≤5 mm) rectosigmoid adenomas, which exceeded the threshold for optical biopsy. Conclusion We introduce the potential of using CAD for colonoscopy and describe the most recent conditions for regulatory approval for artificial intelligence-assisted medical devices.","container-title":"Digestive Endoscopy","DOI":"10.1111/den.13340","ISSN":"1443-1661","issue":"4","language":"en","note":"_eprint: https://onlinelibrary.wiley.com/doi/pdf/10.1111/den.13340","page":"363-371","source":"Wiley Online Library","title":"Artificial intelligence and colonoscopy: Current status and future perspectives","title-short":"Artificial intelligence and colonoscopy","volume":"31","author":[{"family":"Kudo","given":"Shin-ei"},{"family":"Mori","given":"Yuichi"},{"family":"Misawa","given":"Masashi"},{"family":"Takeda","given":"Kenichi"},{"family":"Kudo","given":"Toyoki"},{"family":"Itoh","given":"Hayato"},{"family":"Oda","given":"Masahiro"},{"family":"Mori","given":"Kensaku"}],"issued":{"date-parts":[["2019"]]}}}],"schema":"https://github.com/citation-style-language/schema/raw/master/csl-citation.json"} </w:instrText>
+      </w:r>
+      <w:r>
+        <w:fldChar w:fldCharType="separate"/>
+      </w:r>
+      <w:r>
+        <w:t>[1]</w:t>
+      </w:r>
+      <w:r>
+        <w:fldChar w:fldCharType="end"/>
+      </w:r>
+      <w:r>
+        <w:t xml:space="preserve"> </w:t>
+      </w:r>
+      <w:r>
+        <w:t>Application of artificial intelligence in medicine is now attracting substantial attention. In the field of gastrointestinal endoscopy, computer-aided diagnosis (CAD) for colonoscopy is the most investigated area, although it is still in the preclinical phase.</w:t>
+      </w:r>
+    </w:p>
+    <w:p>
+      <w:r>
+        <w:t>Colorectal cancer (CRC) is a major cause of cancer-related death in both eastern and western countries. </w:t>
+      </w:r>
+    </w:p>
+    <w:p>
+      <w:r>
+        <w:t>Poorly conducted colonoscopy could impair CRC prevention. It has been established that the adenoma detection rate during colonoscopy is inversely associated with the incidence of post-colonoscopy CRC and with CRC-related mortality. Therefore, standardizing the quality of colonoscopy by reducing the number of missed adenomas/polyps is a desirable goal.</w:t>
+      </w:r>
+    </w:p>
+    <w:p>
+      <w:r>
+        <w:t>The other concern regarding the quality of the colonoscopy is the accuracy of the optical diagnosis of recognized colorectal polyps. </w:t>
+      </w:r>
+    </w:p>
+    <w:p>
+      <w:pPr>
+        <w:rPr>
+          <w:lang w:bidi="en-US"/>
+        </w:rPr>
+      </w:pPr>
+      <w:r>
+        <w:rPr>
+          <w:lang w:bidi="en-US"/>
+        </w:rPr>
+        <w:fldChar w:fldCharType="begin"/>
+      </w:r>
+      <w:r>
+        <w:rPr>
+          <w:lang w:bidi="en-US"/>
+        </w:rPr>
+        <w:instrText xml:space="preserve"> ADDIN ZOTERO_ITEM CSL_CITATION {"citationID":"agp6chdn9h","properties":{"formattedCitation":"[2]","plainCitation":"[2]","noteIndex":0},"citationItems":[{"id":2076,"uris":["http://zotero.org/users/8619560/items/GBLG9PJ2"],"itemData":{"id":2076,"type":"article-journal","abstract":"Gastrointestinal tract disorders, including colorectal cancer (CRC), impose a significant health burden in Europe, with rising incidence rates among both young and elderly populations. Timely detection and removal of polyps, the precursors to CRC, are vital for prevention. Conventional colonoscopy, though effective, is prone to human errors. To address this, we propose an artificial intelligence-based polyp detection system using the YOLO-V8 network. We constructed a diverse dataset from multiple publicly available sources and conducted extensive evaluations. YOLO-V8 m demonstrated impressive performance, achieving 95.6% precision, 91.7% recall, and 92.4% F1-score. It outperformed other state-of-the-art models in terms of mean average precision. YOLO-V8 s offered a balance between accuracy and computational efficiency. Our research provides valuable insights into enhancing polyp detection and contributes to the advancement of computer-aided diagnosis for colorectal cancer.","container-title":"Signal, Image and Video Processing","DOI":"10.1007/s11760-023-02835-1","ISSN":"1863-1711","issue":"3","journalAbbreviation":"SIViP","language":"en","page":"2047-2058","source":"Springer Link","title":"Colorectal polyp detection in colonoscopy images using YOLO-V8 network","volume":"18","author":[{"family":"Lalinia","given":"Mehrshad"},{"family":"Sahafi","given":"Ali"}],"issued":{"date-parts":[["2024",4,1]]}}}],"schema":"https://github.com/citation-style-language/schema/raw/master/csl-citation.json"} </w:instrText>
+      </w:r>
+      <w:r>
+        <w:rPr>
+          <w:lang w:bidi="en-US"/>
+        </w:rPr>
+        <w:fldChar w:fldCharType="separate"/>
+      </w:r>
+      <w:r>
+        <w:t>[2]</w:t>
+      </w:r>
+      <w:r>
+        <w:rPr>
+          <w:lang w:bidi="en-US"/>
+        </w:rPr>
+        <w:fldChar w:fldCharType="end"/>
+      </w:r>
+      <w:r>
+        <w:rPr>
+          <w:lang w:bidi="en-US"/>
+        </w:rPr>
+        <w:t xml:space="preserve"> </w:t>
+      </w:r>
+      <w:r>
+        <w:rPr>
+          <w:lang w:bidi="en-US"/>
+        </w:rPr>
+        <w:t>Currently, artificial intelligence polyp detection technology is in its early stages of development.</w:t>
+      </w:r>
+      <w:r>
+        <w:rPr>
+          <w:lang w:bidi="en-US"/>
+        </w:rPr>
+        <w:t xml:space="preserve"> </w:t>
+      </w:r>
+      <w:r>
+        <w:rPr>
+          <w:lang w:bidi="en-US"/>
+        </w:rPr>
+        <w:t>When compared to traditional statistics or expert systems, deep learning methods typically exhibit notable enhancements in performance and detection accuracy for most image target detection tasks</w:t>
+      </w:r>
+    </w:p>
     <w:p/>
     <w:p>
       <w:r>
+        <w:t>Gastrointestinal (GI) tract disorders are responsible for around 1 million deaths per year across Europe; and are associated with substantial morbidity and healthcare costs</w:t>
+      </w:r>
+      <w:r>
+        <w:t xml:space="preserve"> </w:t>
+      </w:r>
+      <w:r>
         <w:fldChar w:fldCharType="begin"/>
       </w:r>
       <w:r>
-        <w:instrText xml:space="preserve"> ADDIN ZOTERO_ITEM CSL_CITATION {"citationID":"LywWOdf8","properties":{"formattedCitation":"[1]","plainCitation":"[1]","noteIndex":0},"citationItems":[{"id":2053,"uris":["http://zotero.org/users/8619560/items/WCNNB9V3"],"itemData":{"id":2053,"type":"article-journal","abstract":"Background and Aim Application of artificial intelligence in medicine is now attracting substantial attention. In the field of gastrointestinal endoscopy, computer-aided diagnosis (CAD) for colonoscopy is the most investigated area, although it is still in the preclinical phase. Because colonoscopy is carried out by humans, it is inherently an imperfect procedure. CAD assistance is expected to improve its quality regarding automated polyp detection and characterization (i.e. predicting the polyp's pathology). It could help prevent endoscopists from missing polyps as well as provide a precise optical diagnosis for those detected. Ultimately, these functions that CAD provides could produce a higher adenoma detection rate and reduce the cost of polypectomy for hyperplastic polyps. Methods and Results Currently, research on automated polyp detection has been limited to experimental assessments using an algorithm based on ex vivo videos or static images. Performance for clinical use was reported to have &gt;90% sensitivity with acceptable specificity. In contrast, research on automated polyp characterization seems to surpass that for polyp detection. Prospective studies of in vivo use of artificial intelligence technologies have been reported by several groups, some of which showed a &gt;90% negative predictive value for differentiating diminutive (≤5 mm) rectosigmoid adenomas, which exceeded the threshold for optical biopsy. Conclusion We introduce the potential of using CAD for colonoscopy and describe the most recent conditions for regulatory approval for artificial intelligence-assisted medical devices.","container-title":"Digestive Endoscopy","DOI":"10.1111/den.13340","ISSN":"1443-1661","issue":"4","language":"en","note":"_eprint: https://onlinelibrary.wiley.com/doi/pdf/10.1111/den.13340","page":"363-371","source":"Wiley Online Library","title":"Artificial intelligence and colonoscopy: Current status and future perspectives","title-short":"Artificial intelligence and colonoscopy","volume":"31","author":[{"family":"Kudo","given":"Shin-ei"},{"family":"Mori","given":"Yuichi"},{"family":"Misawa","given":"Masashi"},{"family":"Takeda","given":"Kenichi"},{"family":"Kudo","given":"Toyoki"},{"family":"Itoh","given":"Hayato"},{"family":"Oda","given":"Masahiro"},{"family":"Mori","given":"Kensaku"}],"issued":{"date-parts":[["2019"]]}}}],"schema":"https://github.com/citation-style-language/schema/raw/master/csl-citation.json"} </w:instrText>
+        <w:instrText xml:space="preserve"> ADDIN ZOTERO_ITEM CSL_CITATION {"citationID":"aerpdi3mae","properties":{"formattedCitation":"[3]","plainCitation":"[3]","noteIndex":0},"citationItems":[{"id":2043,"uris":["http://zotero.org/users/8619560/items/6XXH2SLZ"],"itemData":{"id":2043,"type":"article-journal","abstract":"Gastrointestinal (GI) tract diseases are responsible for substantial morbidity and mortality worldwide, including colorectal cancer, which has shown a rising incidence among adults younger than 50. Although this could be alleviated by regular screening, only a small percentage of those at risk are screened comprehensively, due to shortcomings in accuracy and patient acceptance. To address these challenges, we designed an artificial intelligence (AI)-empowered wireless video endoscopic capsule that surpasses the performance of the existing solutions by featuring, among others: (1) real-time image processing using onboard deep neural networks (DNN), (2) enhanced visualization of the mucous layer by deploying both white-light and narrow-band imaging, (3) on-the-go task modification and DNN update using over-the-air-programming and (4) bi-directional communication with patient’s personal electronic devices to report important findings. We tested our solution in an in vivo setting, by administrating our endoscopic capsule to a pig under general anesthesia. All novel features, successfully implemented on a single platform, were validated. Our study lays the groundwork for clinically implementing a new generation of endoscopic capsules, which will significantly improve early diagnosis of upper and lower GI tract diseases.","container-title":"Scientific Reports","DOI":"10.1038/s41598-022-17502-7","ISSN":"2045-2322","issue":"1","journalAbbreviation":"Sci Rep","language":"en","license":"2022 The Author(s)","note":"publisher: Nature Publishing Group","page":"13723","source":"www.nature.com","title":"Edge artificial intelligence wireless video capsule endoscopy","volume":"12","author":[{"family":"Sahafi","given":"A."},{"family":"Wang","given":"Y."},{"family":"Rasmussen","given":"C. L. M."},{"family":"Bollen","given":"P."},{"family":"Baatrup","given":"G."},{"family":"Blanes-Vidal","given":"V."},{"family":"Herp","given":"J."},{"family":"Nadimi","given":"E. S."}],"issued":{"date-parts":[["2022",8,12]]}}}],"schema":"https://github.com/citation-style-language/schema/raw/master/csl-citation.json"} </w:instrText>
       </w:r>
       <w:r>
         <w:fldChar w:fldCharType="separate"/>
       </w:r>
       <w:r>
-        <w:t>[1]</w:t>
+        <w:t>[3]</w:t>
       </w:r>
       <w:r>
         <w:fldChar w:fldCharType="end"/>
       </w:r>
       <w:r>
+        <w:fldChar w:fldCharType="begin"/>
+      </w:r>
+      <w:r>
+        <w:instrText xml:space="preserve"> ADDIN ZOTERO_ITEM CSL_CITATION {"citationID":"aq55pip8qo","properties":{"formattedCitation":"[4]","plainCitation":"[4]","noteIndex":0},"citationItems":[{"id":2078,"uris":["http://zotero.org/users/8619560/items/GU5EF2UI"],"itemData":{"id":2078,"type":"article-journal","abstract":"Nowadays, the number of cases in which malignant colorectal polyps are removed is increasing due to colorectal cancer screening programmes. Cancerous polyps are classified into non-invasive high grade neoplasia (NHGN), when the cancer has not reached the muscularis mucosa, and malignant polyps, classed as T1, when they have invaded the submucosa. NHGN is considered cured with polypectomy, while the prognosis for malignant polyps depends on various morphological and histological factors. The prognostic factors include, sessile or pedunculated morphology of the polyp, whether partial or en bloc resection is carried out, the degree of differentiation of the carcinoma, vascular or lymphatic involvement, and whether the polypectomy resection margin is tumor free. A malignant polyp at T1 is considered cured with polypectomy if it is a pedunculated polyp (Ip of the Paris classification), it has been completely resected, it is not poorly differentiated, the resection edge is not affected by the tumor and there is no vascular or lymphatic involvement. The sessile malignant polyp (Is of the Paris classification) at T1 is considered not cured with polypectomy. Only in some cases (e.g. older people with high surgical risk) local excision (polypectomy or endoscopic submucosal dissection or conventional endoscopic mucosal resection) is considered the definitive treatment.","container-title":"World Journal of Gastroenterology","DOI":"10.3748/wjg.v16.i25.3103","ISSN":"2219-2840","issue":"25","journalAbbreviation":"World J Gastroenterol","language":"eng","note":"PMID: 20593495\nPMCID: PMC2896747","page":"3103-3111","source":"PubMed","title":"Malignant colorectal polyps","volume":"16","author":[{"family":"Bujanda","given":"Luis"},{"family":"Cosme","given":"Angel"},{"family":"Gil","given":"Ines"},{"family":"Arenas-Mirave","given":"Juan I."}],"issued":{"date-parts":[["2010",7,7]]}}}],"schema":"https://github.com/citation-style-language/schema/raw/master/csl-citation.json"} </w:instrText>
+      </w:r>
+      <w:r>
+        <w:fldChar w:fldCharType="separate"/>
+      </w:r>
+      <w:r>
+        <w:t>[4]</w:t>
+      </w:r>
+      <w:r>
+        <w:fldChar w:fldCharType="end"/>
+      </w:r>
+      <w:r>
+        <w:t xml:space="preserve">. </w:t>
+      </w:r>
+    </w:p>
+    <w:p>
+      <w:r>
+        <w:t>The incidence and prevalence of many GI tract disorders are highest amongst the young and specially, the elderly, and as the world population ages, the disease burden will inevitably increase</w:t>
+      </w:r>
+      <w:r>
         <w:t xml:space="preserve"> </w:t>
       </w:r>
       <w:r>
-        <w:t>Application of artificial intelligence in medicine is now attracting substantial attention. In the field of gastrointestinal endoscopy, computer-aided diagnosis (CAD) for colonoscopy is the most investigated area, although it is still in the preclinical phase.</w:t>
-      </w:r>
-    </w:p>
-    <w:p>
-      <w:r>
-        <w:t>Colorectal cancer (CRC) is a major cause of cancer-related death in both eastern and western countries. </w:t>
-      </w:r>
-    </w:p>
-    <w:p>
-      <w:r>
-        <w:t>Poorly conducted colonoscopy could impair CRC prevention. It has been established that the adenoma detection rate during colonoscopy is inversely associated with the incidence of post-colonoscopy CRC and with CRC-related mortality. Therefore, standardizing the quality of colonoscopy by reducing the number of missed adenomas/polyps is a desirable goal.</w:t>
-      </w:r>
-    </w:p>
-    <w:p>
-      <w:r>
-        <w:t>The other concern regarding the quality of the colonoscopy is the accuracy of the optical diagnosis of recognized colorectal polyps. </w:t>
-      </w:r>
-    </w:p>
-    <w:p>
-      <w:pPr>
-        <w:rPr>
-          <w:lang w:bidi="en-US"/>
-        </w:rPr>
-      </w:pPr>
-      <w:r>
-        <w:rPr>
-          <w:lang w:bidi="en-US"/>
-        </w:rPr>
         <w:fldChar w:fldCharType="begin"/>
       </w:r>
       <w:r>
-        <w:rPr>
-          <w:lang w:bidi="en-US"/>
-        </w:rPr>
-        <w:instrText xml:space="preserve"> ADDIN ZOTERO_ITEM CSL_CITATION {"citationID":"agp6chdn9h","properties":{"formattedCitation":"[2]","plainCitation":"[2]","noteIndex":0},"citationItems":[{"id":2076,"uris":["http://zotero.org/users/8619560/items/GBLG9PJ2"],"itemData":{"id":2076,"type":"article-journal","abstract":"Gastrointestinal tract disorders, including colorectal cancer (CRC), impose a significant health burden in Europe, with rising incidence rates among both young and elderly populations. Timely detection and removal of polyps, the precursors to CRC, are vital for prevention. Conventional colonoscopy, though effective, is prone to human errors. To address this, we propose an artificial intelligence-based polyp detection system using the YOLO-V8 network. We constructed a diverse dataset from multiple publicly available sources and conducted extensive evaluations. YOLO-V8 m demonstrated impressive performance, achieving 95.6% precision, 91.7% recall, and 92.4% F1-score. It outperformed other state-of-the-art models in terms of mean average precision. YOLO-V8 s offered a balance between accuracy and computational efficiency. Our research provides valuable insights into enhancing polyp detection and contributes to the advancement of computer-aided diagnosis for colorectal cancer.","container-title":"Signal, Image and Video Processing","DOI":"10.1007/s11760-023-02835-1","ISSN":"1863-1711","issue":"3","journalAbbreviation":"SIViP","language":"en","page":"2047-2058","source":"Springer Link","title":"Colorectal polyp detection in colonoscopy images using YOLO-V8 network","volume":"18","author":[{"family":"Lalinia","given":"Mehrshad"},{"family":"Sahafi","given":"Ali"}],"issued":{"date-parts":[["2024",4,1]]}}}],"schema":"https://github.com/citation-style-language/schema/raw/master/csl-citation.json"} </w:instrText>
-      </w:r>
-      <w:r>
-        <w:rPr>
-          <w:lang w:bidi="en-US"/>
-        </w:rPr>
+        <w:instrText xml:space="preserve"> ADDIN ZOTERO_ITEM CSL_CITATION {"citationID":"aerpdi3mae","properties":{"formattedCitation":"[3]","plainCitation":"[3]","noteIndex":0},"citationItems":[{"id":2043,"uris":["http://zotero.org/users/8619560/items/6XXH2SLZ"],"itemData":{"id":2043,"type":"article-journal","abstract":"Gastrointestinal (GI) tract diseases are responsible for substantial morbidity and mortality worldwide, including colorectal cancer, which has shown a rising incidence among adults younger than 50. Although this could be alleviated by regular screening, only a small percentage of those at risk are screened comprehensively, due to shortcomings in accuracy and patient acceptance. To address these challenges, we designed an artificial intelligence (AI)-empowered wireless video endoscopic capsule that surpasses the performance of the existing solutions by featuring, among others: (1) real-time image processing using onboard deep neural networks (DNN), (2) enhanced visualization of the mucous layer by deploying both white-light and narrow-band imaging, (3) on-the-go task modification and DNN update using over-the-air-programming and (4) bi-directional communication with patient’s personal electronic devices to report important findings. We tested our solution in an in vivo setting, by administrating our endoscopic capsule to a pig under general anesthesia. All novel features, successfully implemented on a single platform, were validated. Our study lays the groundwork for clinically implementing a new generation of endoscopic capsules, which will significantly improve early diagnosis of upper and lower GI tract diseases.","container-title":"Scientific Reports","DOI":"10.1038/s41598-022-17502-7","ISSN":"2045-2322","issue":"1","journalAbbreviation":"Sci Rep","language":"en","license":"2022 The Author(s)","note":"publisher: Nature Publishing Group","page":"13723","source":"www.nature.com","title":"Edge artificial intelligence wireless video capsule endoscopy","volume":"12","author":[{"family":"Sahafi","given":"A."},{"family":"Wang","given":"Y."},{"family":"Rasmussen","given":"C. L. M."},{"family":"Bollen","given":"P."},{"family":"Baatrup","given":"G."},{"family":"Blanes-Vidal","given":"V."},{"family":"Herp","given":"J."},{"family":"Nadimi","given":"E. S."}],"issued":{"date-parts":[["2022",8,12]]}}}],"schema":"https://github.com/citation-style-language/schema/raw/master/csl-citation.json"} </w:instrText>
+      </w:r>
+      <w:r>
         <w:fldChar w:fldCharType="separate"/>
       </w:r>
       <w:r>
-        <w:t>[2]</w:t>
-      </w:r>
-      <w:r>
-        <w:rPr>
-          <w:lang w:bidi="en-US"/>
-        </w:rPr>
+        <w:t>[3]</w:t>
+      </w:r>
+      <w:r>
         <w:fldChar w:fldCharType="end"/>
       </w:r>
       <w:r>
-        <w:rPr>
-          <w:lang w:bidi="en-US"/>
-        </w:rPr>
+        <w:fldChar w:fldCharType="begin"/>
+      </w:r>
+      <w:r>
+        <w:instrText xml:space="preserve"> ADDIN ZOTERO_ITEM CSL_CITATION {"citationID":"aq55pip8qo","properties":{"formattedCitation":"[4]","plainCitation":"[4]","noteIndex":0},"citationItems":[{"id":2078,"uris":["http://zotero.org/users/8619560/items/GU5EF2UI"],"itemData":{"id":2078,"type":"article-journal","abstract":"Nowadays, the number of cases in which malignant colorectal polyps are removed is increasing due to colorectal cancer screening programmes. Cancerous polyps are classified into non-invasive high grade neoplasia (NHGN), when the cancer has not reached the muscularis mucosa, and malignant polyps, classed as T1, when they have invaded the submucosa. NHGN is considered cured with polypectomy, while the prognosis for malignant polyps depends on various morphological and histological factors. The prognostic factors include, sessile or pedunculated morphology of the polyp, whether partial or en bloc resection is carried out, the degree of differentiation of the carcinoma, vascular or lymphatic involvement, and whether the polypectomy resection margin is tumor free. A malignant polyp at T1 is considered cured with polypectomy if it is a pedunculated polyp (Ip of the Paris classification), it has been completely resected, it is not poorly differentiated, the resection edge is not affected by the tumor and there is no vascular or lymphatic involvement. The sessile malignant polyp (Is of the Paris classification) at T1 is considered not cured with polypectomy. Only in some cases (e.g. older people with high surgical risk) local excision (polypectomy or endoscopic submucosal dissection or conventional endoscopic mucosal resection) is considered the definitive treatment.","container-title":"World Journal of Gastroenterology","DOI":"10.3748/wjg.v16.i25.3103","ISSN":"2219-2840","issue":"25","journalAbbreviation":"World J Gastroenterol","language":"eng","note":"PMID: 20593495\nPMCID: PMC2896747","page":"3103-3111","source":"PubMed","title":"Malignant colorectal polyps","volume":"16","author":[{"family":"Bujanda","given":"Luis"},{"family":"Cosme","given":"Angel"},{"family":"Gil","given":"Ines"},{"family":"Arenas-Mirave","given":"Juan I."}],"issued":{"date-parts":[["2010",7,7]]}}}],"schema":"https://github.com/citation-style-language/schema/raw/master/csl-citation.json"} </w:instrText>
+      </w:r>
+      <w:r>
+        <w:fldChar w:fldCharType="separate"/>
+      </w:r>
+      <w:r>
+        <w:t>[4]</w:t>
+      </w:r>
+      <w:r>
+        <w:fldChar w:fldCharType="end"/>
+      </w:r>
+      <w:r>
+        <w:t>.</w:t>
+      </w:r>
+    </w:p>
+    <w:p>
+      <w:r>
+        <w:t>Colorectal cancer (CRC) is the most common GI cancer in Europe, with a risk of CRC diagnosis in a lifetime of 1 in 20. The incidence in Europe is expected to increase from 3.6 million cases in 2015 to 4.3 million cases in 2035, due to increased life expectancy and adoption of western diet and lifestyle. Although the prognosis for early CRC diagnosis and 5-year survival can reach 70%, it stays extremely poor for late cases, being as low as 10%</w:t>
+      </w:r>
+      <w:r>
         <w:t xml:space="preserve"> </w:t>
       </w:r>
       <w:r>
-        <w:rPr>
-          <w:lang w:bidi="en-US"/>
-        </w:rPr>
-        <w:t>Currently, artificial intelligence polyp detection technology is in its early stages of development.</w:t>
-      </w:r>
-      <w:r>
-        <w:rPr>
-          <w:lang w:bidi="en-US"/>
-        </w:rPr>
+        <w:fldChar w:fldCharType="begin"/>
+      </w:r>
+      <w:r>
+        <w:instrText xml:space="preserve"> ADDIN ZOTERO_ITEM CSL_CITATION {"citationID":"oRUVHTve","properties":{"formattedCitation":"[3]","plainCitation":"[3]","noteIndex":0},"citationItems":[{"id":2043,"uris":["http://zotero.org/users/8619560/items/6XXH2SLZ"],"itemData":{"id":2043,"type":"article-journal","abstract":"Gastrointestinal (GI) tract diseases are responsible for substantial morbidity and mortality worldwide, including colorectal cancer, which has shown a rising incidence among adults younger than 50. Although this could be alleviated by regular screening, only a small percentage of those at risk are screened comprehensively, due to shortcomings in accuracy and patient acceptance. To address these challenges, we designed an artificial intelligence (AI)-empowered wireless video endoscopic capsule that surpasses the performance of the existing solutions by featuring, among others: (1) real-time image processing using onboard deep neural networks (DNN), (2) enhanced visualization of the mucous layer by deploying both white-light and narrow-band imaging, (3) on-the-go task modification and DNN update using over-the-air-programming and (4) bi-directional communication with patient’s personal electronic devices to report important findings. We tested our solution in an in vivo setting, by administrating our endoscopic capsule to a pig under general anesthesia. All novel features, successfully implemented on a single platform, were validated. Our study lays the groundwork for clinically implementing a new generation of endoscopic capsules, which will significantly improve early diagnosis of upper and lower GI tract diseases.","container-title":"Scientific Reports","DOI":"10.1038/s41598-022-17502-7","ISSN":"2045-2322","issue":"1","journalAbbreviation":"Sci Rep","language":"en","license":"2022 The Author(s)","note":"publisher: Nature Publishing Group","page":"13723","source":"www.nature.com","title":"Edge artificial intelligence wireless video capsule endoscopy","volume":"12","author":[{"family":"Sahafi","given":"A."},{"family":"Wang","given":"Y."},{"family":"Rasmussen","given":"C. L. M."},{"family":"Bollen","given":"P."},{"family":"Baatrup","given":"G."},{"family":"Blanes-Vidal","given":"V."},{"family":"Herp","given":"J."},{"family":"Nadimi","given":"E. S."}],"issued":{"date-parts":[["2022",8,12]]}}}],"schema":"https://github.com/citation-style-language/schema/raw/master/csl-citation.json"} </w:instrText>
+      </w:r>
+      <w:r>
+        <w:fldChar w:fldCharType="separate"/>
+      </w:r>
+      <w:r>
+        <w:t>[3]</w:t>
+      </w:r>
+      <w:r>
+        <w:fldChar w:fldCharType="end"/>
+      </w:r>
+      <w:r>
+        <w:fldChar w:fldCharType="begin"/>
+      </w:r>
+      <w:r>
+        <w:instrText xml:space="preserve"> ADDIN ZOTERO_ITEM CSL_CITATION {"citationID":"afUbnCts","properties":{"formattedCitation":"[4]","plainCitation":"[4]","noteIndex":0},"citationItems":[{"id":2078,"uris":["http://zotero.org/users/8619560/items/GU5EF2UI"],"itemData":{"id":2078,"type":"article-journal","abstract":"Nowadays, the number of cases in which malignant colorectal polyps are removed is increasing due to colorectal cancer screening programmes. Cancerous polyps are classified into non-invasive high grade neoplasia (NHGN), when the cancer has not reached the muscularis mucosa, and malignant polyps, classed as T1, when they have invaded the submucosa. NHGN is considered cured with polypectomy, while the prognosis for malignant polyps depends on various morphological and histological factors. The prognostic factors include, sessile or pedunculated morphology of the polyp, whether partial or en bloc resection is carried out, the degree of differentiation of the carcinoma, vascular or lymphatic involvement, and whether the polypectomy resection margin is tumor free. A malignant polyp at T1 is considered cured with polypectomy if it is a pedunculated polyp (Ip of the Paris classification), it has been completely resected, it is not poorly differentiated, the resection edge is not affected by the tumor and there is no vascular or lymphatic involvement. The sessile malignant polyp (Is of the Paris classification) at T1 is considered not cured with polypectomy. Only in some cases (e.g. older people with high surgical risk) local excision (polypectomy or endoscopic submucosal dissection or conventional endoscopic mucosal resection) is considered the definitive treatment.","container-title":"World Journal of Gastroenterology","DOI":"10.3748/wjg.v16.i25.3103","ISSN":"2219-2840","issue":"25","journalAbbreviation":"World J Gastroenterol","language":"eng","note":"PMID: 20593495\nPMCID: PMC2896747","page":"3103-3111","source":"PubMed","title":"Malignant colorectal polyps","volume":"16","author":[{"family":"Bujanda","given":"Luis"},{"family":"Cosme","given":"Angel"},{"family":"Gil","given":"Ines"},{"family":"Arenas-Mirave","given":"Juan I."}],"issued":{"date-parts":[["2010",7,7]]}}}],"schema":"https://github.com/citation-style-language/schema/raw/master/csl-citation.json"} </w:instrText>
+      </w:r>
+      <w:r>
+        <w:fldChar w:fldCharType="separate"/>
+      </w:r>
+      <w:r>
+        <w:t>[4]</w:t>
+      </w:r>
+      <w:r>
+        <w:fldChar w:fldCharType="end"/>
+      </w:r>
+      <w:r>
+        <w:t>.</w:t>
+      </w:r>
+    </w:p>
+    <w:p/>
+    <w:p>
+      <w:r>
+        <w:t>Colorectal cancer (CRC) is the second most common cause of cancer death in the United States</w:t>
+      </w:r>
+      <w:r>
         <w:t xml:space="preserve"> </w:t>
       </w:r>
       <w:r>
-        <w:rPr>
-          <w:lang w:bidi="en-US"/>
-        </w:rPr>
-        <w:t>When compared to traditional statistics or expert systems, deep learning methods typically exhibit notable enhancements in performance and detection accuracy for most image target detection tasks</w:t>
-      </w:r>
-    </w:p>
-    <w:p/>
-    <w:p>
-      <w:r>
-        <w:t>Gastrointestinal (GI) tract disorders are responsible for around 1 million deaths per year across Europe; and are associated with substantial morbidity and healthcare costs. The incidence and prevalence of many GI tract disorders are highest amongst the young and specially, the elderly, and as the world population ages, the disease burden will inevitably increase</w:t>
-      </w:r>
-      <w:r>
         <w:fldChar w:fldCharType="begin"/>
       </w:r>
       <w:r>
-        <w:instrText xml:space="preserve"> ADDIN ZOTERO_ITEM CSL_CITATION {"citationID":"aerpdi3mae","properties":{"formattedCitation":"[3]","plainCitation":"[3]","noteIndex":0},"citationItems":[{"id":2043,"uris":["http://zotero.org/users/8619560/items/6XXH2SLZ"],"itemData":{"id":2043,"type":"article-journal","abstract":"Gastrointestinal (GI) tract diseases are responsible for substantial morbidity and mortality worldwide, including colorectal cancer, which has shown a rising incidence among adults younger than 50. Although this could be alleviated by regular screening, only a small percentage of those at risk are screened comprehensively, due to shortcomings in accuracy and patient acceptance. To address these challenges, we designed an artificial intelligence (AI)-empowered wireless video endoscopic capsule that surpasses the performance of the existing solutions by featuring, among others: (1) real-time image processing using onboard deep neural networks (DNN), (2) enhanced visualization of the mucous layer by deploying both white-light and narrow-band imaging, (3) on-the-go task modification and DNN update using over-the-air-programming and (4) bi-directional communication with patient’s personal electronic devices to report important findings. We tested our solution in an in vivo setting, by administrating our endoscopic capsule to a pig under general anesthesia. All novel features, successfully implemented on a single platform, were validated. Our study lays the groundwork for clinically implementing a new generation of endoscopic capsules, which will significantly improve early diagnosis of upper and lower GI tract diseases.","container-title":"Scientific Reports","DOI":"10.1038/s41598-022-17502-7","ISSN":"2045-2322","issue":"1","journalAbbreviation":"Sci Rep","language":"en","license":"2022 The Author(s)","note":"publisher: Nature Publishing Group","page":"13723","source":"www.nature.com","title":"Edge artificial intelligence wireless video capsule endoscopy","volume":"12","author":[{"family":"Sahafi","given":"A."},{"family":"Wang","given":"Y."},{"family":"Rasmussen","given":"C. L. M."},{"family":"Bollen","given":"P."},{"family":"Baatrup","given":"G."},{"family":"Blanes-Vidal","given":"V."},{"family":"Herp","given":"J."},{"family":"Nadimi","given":"E. S."}],"issued":{"date-parts":[["2022",8,12]]}}}],"schema":"https://github.com/citation-style-language/schema/raw/master/csl-citation.json"} </w:instrText>
+        <w:instrText xml:space="preserve"> ADDIN ZOTERO_ITEM CSL_CITATION {"citationID":"AgecEW24","properties":{"formattedCitation":"[5]","plainCitation":"[5]","noteIndex":0},"citationItems":[{"id":2041,"uris":["http://zotero.org/users/8619560/items/3PB6Y59E"],"itemData":{"id":2041,"type":"article-journal","abstract":"Gastrointestinal tract disorders, including colorectal cancer (CRC), impose a significant health burden in Europe, with rising incidence rates among both young and elderly populations. Timely detection and removal of polyps, the precursors to CRC, are vital for prevention. Conventional colonoscopy, though effective, is prone to human errors. To address this, we propose an artificial intelligence-based polyp detection system using the YOLO-V8 network. We constructed a diverse dataset from multiple publicly available sources and conducted extensive evaluations. YOLO-V8 m demonstrated impressive performance, achieving 95.6% precision, 91.7% recall, and 92.4% F1-score. It outperformed other state-of-the-art models in terms of mean average precision. YOLO-V8 s offered a balance between accuracy and computational efficiency. Our research provides valuable insights into enhancing polyp detection and contributes to the advancement of computer-aided diagnosis for colorectal cancer.","container-title":"Signal, Image and Video Processing","DOI":"10.1007/s11760-023-02835-1","ISSN":"1863-1711","issue":"3","journalAbbreviation":"SIViP","language":"en","page":"2047-2058","source":"Springer Link","title":"Colorectal polyp detection in colonoscopy images using YOLO-V8 network","volume":"18","author":[{"family":"Lalinia","given":"Mehrshad"},{"family":"Sahafi","given":"Ali"}],"issued":{"date-parts":[["2024",4,1]]}}}],"schema":"https://github.com/citation-style-language/schema/raw/master/csl-citation.json"} </w:instrText>
       </w:r>
       <w:r>
         <w:fldChar w:fldCharType="separate"/>
       </w:r>
       <w:r>
-        <w:t>[3]</w:t>
+        <w:t>[5]</w:t>
       </w:r>
       <w:r>
         <w:fldChar w:fldCharType="end"/>
       </w:r>
       <w:r>
+        <w:fldChar w:fldCharType="begin"/>
+      </w:r>
+      <w:r>
+        <w:instrText xml:space="preserve"> ADDIN ZOTERO_ITEM CSL_CITATION {"citationID":"prsoqIjy","properties":{"formattedCitation":"[7]","plainCitation":"[7]","noteIndex":0},"citationItems":[{"id":2047,"uris":["http://zotero.org/users/8619560/items/TZK2TW5R"],"itemData":{"id":2047,"type":"article-journal","abstract":"Colorectal cancer (CRC) is the second most common cause of cancer death in the United States. Every 3 years, the American Cancer Society provides an update of CRC occurrence based on incidence data (available through 2016) from population-based cancer registries and mortality data (through 2017) from the National Center for Health Statistics. In 2020, approximately 147,950 individuals will be diagnosed with CRC and 53,200 will die from the disease, including 17,930 cases and 3,640 deaths in individuals aged younger than 50 years. The incidence rate during 2012 through 2016 ranged from 30 (per 100,000 persons) in Asian/Pacific Islanders to 45.7 in blacks and 89 in Alaska Natives. Rapid declines in incidence among screening-aged individuals during the 2000s continued during 2011 through 2016 in those aged 65 years and older (by 3.3% annually) but reversed in those aged 50 to 64 years, among whom rates increased by 1% annually. Among individuals aged younger than 50 years, the incidence rate increased by approximately 2% annually for tumors in the proximal and distal colon, as well as the rectum, driven by trends in non-Hispanic whites. CRC death rates during 2008 through 2017 declined by 3% annually in individuals aged 65 years and older and by 0.6% annually in individuals aged 50 to 64 years while increasing by 1.3% annually in those aged younger than 50 years. Mortality declines among individuals aged 50 years and older were steepest among blacks, who also had the only decreasing trend among those aged younger than 50 years, and excluded American Indians/Alaska Natives, among whom rates remained stable. Progress against CRC can be accelerated by increasing access to guideline-recommended screening and high-quality treatment, particularly among Alaska Natives, and elucidating causes for rising incidence in young and middle-aged adults.","container-title":"CA: a cancer journal for clinicians","DOI":"10.3322/caac.21601","ISSN":"1542-4863","issue":"3","journalAbbreviation":"CA Cancer J Clin","language":"eng","note":"PMID: 32133645","page":"145-164","source":"PubMed","title":"Colorectal cancer statistics, 2020","volume":"70","author":[{"family":"Siegel","given":"Rebecca L."},{"family":"Miller","given":"Kimberly D."},{"family":"Goding Sauer","given":"Ann"},{"family":"Fedewa","given":"Stacey A."},{"family":"Butterly","given":"Lynn F."},{"family":"Anderson","given":"Joseph C."},{"family":"Cercek","given":"Andrea"},{"family":"Smith","given":"Robert A."},{"family":"Jemal","given":"Ahmedin"}],"issued":{"date-parts":[["2020",5]]}}}],"schema":"https://github.com/citation-style-language/schema/raw/master/csl-citation.json"} </w:instrText>
+      </w:r>
+      <w:r>
+        <w:fldChar w:fldCharType="separate"/>
+      </w:r>
+      <w:r>
+        <w:t>[7]</w:t>
+      </w:r>
+      <w:r>
+        <w:fldChar w:fldCharType="end"/>
+      </w:r>
+      <w:r>
+        <w:t>. Every 3 years, the American Cancer Society provides an update of CRC occurrence based on incidence data (available through 2016) from population-based cancer registries and mortality data (through 2017) from the National Center for Health Statistics</w:t>
+      </w:r>
+      <w:r>
         <w:t xml:space="preserve"> </w:t>
       </w:r>
       <w:r>
         <w:fldChar w:fldCharType="begin"/>
       </w:r>
       <w:r>
-        <w:instrText xml:space="preserve"> ADDIN ZOTERO_ITEM CSL_CITATION {"citationID":"aq55pip8qo","properties":{"formattedCitation":"[4]","plainCitation":"[4]","noteIndex":0},"citationItems":[{"id":2078,"uris":["http://zotero.org/users/8619560/items/GU5EF2UI"],"itemData":{"id":2078,"type":"article-journal","abstract":"Nowadays, the number of cases in which malignant colorectal polyps are removed is increasing due to colorectal cancer screening programmes. Cancerous polyps are classified into non-invasive high grade neoplasia (NHGN), when the cancer has not reached the muscularis mucosa, and malignant polyps, classed as T1, when they have invaded the submucosa. NHGN is considered cured with polypectomy, while the prognosis for malignant polyps depends on various morphological and histological factors. The prognostic factors include, sessile or pedunculated morphology of the polyp, whether partial or en bloc resection is carried out, the degree of differentiation of the carcinoma, vascular or lymphatic involvement, and whether the polypectomy resection margin is tumor free. A malignant polyp at T1 is considered cured with polypectomy if it is a pedunculated polyp (Ip of the Paris classification), it has been completely resected, it is not poorly differentiated, the resection edge is not affected by the tumor and there is no vascular or lymphatic involvement. The sessile malignant polyp (Is of the Paris classification) at T1 is considered not cured with polypectomy. Only in some cases (e.g. older people with high surgical risk) local excision (polypectomy or endoscopic submucosal dissection or conventional endoscopic mucosal resection) is considered the definitive treatment.","container-title":"World Journal of Gastroenterology","DOI":"10.3748/wjg.v16.i25.3103","ISSN":"2219-2840","issue":"25","journalAbbreviation":"World J Gastroenterol","language":"eng","note":"PMID: 20593495\nPMCID: PMC2896747","page":"3103-3111","source":"PubMed","title":"Malignant colorectal polyps","volume":"16","author":[{"family":"Bujanda","given":"Luis"},{"family":"Cosme","given":"Angel"},{"family":"Gil","given":"Ines"},{"family":"Arenas-Mirave","given":"Juan I."}],"issued":{"date-parts":[["2010",7,7]]}}}],"schema":"https://github.com/citation-style-language/schema/raw/master/csl-citation.json"} </w:instrText>
+        <w:instrText xml:space="preserve"> ADDIN ZOTERO_ITEM CSL_CITATION {"citationID":"prsoqIjy","properties":{"formattedCitation":"[7]","plainCitation":"[7]","noteIndex":0},"citationItems":[{"id":2047,"uris":["http://zotero.org/users/8619560/items/TZK2TW5R"],"itemData":{"id":2047,"type":"article-journal","abstract":"Colorectal cancer (CRC) is the second most common cause of cancer death in the United States. Every 3 years, the American Cancer Society provides an update of CRC occurrence based on incidence data (available through 2016) from population-based cancer registries and mortality data (through 2017) from the National Center for Health Statistics. In 2020, approximately 147,950 individuals will be diagnosed with CRC and 53,200 will die from the disease, including 17,930 cases and 3,640 deaths in individuals aged younger than 50 years. The incidence rate during 2012 through 2016 ranged from 30 (per 100,000 persons) in Asian/Pacific Islanders to 45.7 in blacks and 89 in Alaska Natives. Rapid declines in incidence among screening-aged individuals during the 2000s continued during 2011 through 2016 in those aged 65 years and older (by 3.3% annually) but reversed in those aged 50 to 64 years, among whom rates increased by 1% annually. Among individuals aged younger than 50 years, the incidence rate increased by approximately 2% annually for tumors in the proximal and distal colon, as well as the rectum, driven by trends in non-Hispanic whites. CRC death rates during 2008 through 2017 declined by 3% annually in individuals aged 65 years and older and by 0.6% annually in individuals aged 50 to 64 years while increasing by 1.3% annually in those aged younger than 50 years. Mortality declines among individuals aged 50 years and older were steepest among blacks, who also had the only decreasing trend among those aged younger than 50 years, and excluded American Indians/Alaska Natives, among whom rates remained stable. Progress against CRC can be accelerated by increasing access to guideline-recommended screening and high-quality treatment, particularly among Alaska Natives, and elucidating causes for rising incidence in young and middle-aged adults.","container-title":"CA: a cancer journal for clinicians","DOI":"10.3322/caac.21601","ISSN":"1542-4863","issue":"3","journalAbbreviation":"CA Cancer J Clin","language":"eng","note":"PMID: 32133645","page":"145-164","source":"PubMed","title":"Colorectal cancer statistics, 2020","volume":"70","author":[{"family":"Siegel","given":"Rebecca L."},{"family":"Miller","given":"Kimberly D."},{"family":"Goding Sauer","given":"Ann"},{"family":"Fedewa","given":"Stacey A."},{"family":"Butterly","given":"Lynn F."},{"family":"Anderson","given":"Joseph C."},{"family":"Cercek","given":"Andrea"},{"family":"Smith","given":"Robert A."},{"family":"Jemal","given":"Ahmedin"}],"issued":{"date-parts":[["2020",5]]}}}],"schema":"https://github.com/citation-style-language/schema/raw/master/csl-citation.json"} </w:instrText>
       </w:r>
       <w:r>
         <w:fldChar w:fldCharType="separate"/>
       </w:r>
       <w:r>
-        <w:t>[4]</w:t>
+        <w:t>[7]</w:t>
       </w:r>
       <w:r>
         <w:fldChar w:fldCharType="end"/>
       </w:r>
       <w:r>
-        <w:t>.</w:t>
-      </w:r>
-    </w:p>
-    <w:p>
-      <w:r>
-        <w:t>Colorectal cancer (CRC) is the most common GI cancer in Europe, with a risk of CRC diagnosis in a lifetime of 1 in 20. The incidence in Europe is expected to increase from 3.6 million cases in 2015 to 4.3 million cases in 2035, due to increased life expectancy and adoption of western diet and lifestyle. Although the prognosis for early CRC diagnosis and 5-year survival can reach 70%, it stays extremely poor for late cases, being as low as 10%</w:t>
+        <w:t>. </w:t>
+      </w:r>
+    </w:p>
+    <w:p>
+      <w:r>
+        <w:t>Gastrointestinal tract disorders, including colorectal cancer (CRC), impose a significant health burden in Europe, with rising incidence rates among both young and elderly populations</w:t>
+      </w:r>
+      <w:r>
+        <w:t xml:space="preserve"> </w:t>
       </w:r>
       <w:r>
         <w:fldChar w:fldCharType="begin"/>
       </w:r>
       <w:r>
-        <w:instrText xml:space="preserve"> ADDIN ZOTERO_ITEM CSL_CITATION {"citationID":"oRUVHTve","properties":{"formattedCitation":"[3]","plainCitation":"[3]","noteIndex":0},"citationItems":[{"id":2043,"uris":["http://zotero.org/users/8619560/items/6XXH2SLZ"],"itemData":{"id":2043,"type":"article-journal","abstract":"Gastrointestinal (GI) tract diseases are responsible for substantial morbidity and mortality worldwide, including colorectal cancer, which has shown a rising incidence among adults younger than 50. Although this could be alleviated by regular screening, only a small percentage of those at risk are screened comprehensively, due to shortcomings in accuracy and patient acceptance. To address these challenges, we designed an artificial intelligence (AI)-empowered wireless video endoscopic capsule that surpasses the performance of the existing solutions by featuring, among others: (1) real-time image processing using onboard deep neural networks (DNN), (2) enhanced visualization of the mucous layer by deploying both white-light and narrow-band imaging, (3) on-the-go task modification and DNN update using over-the-air-programming and (4) bi-directional communication with patient’s personal electronic devices to report important findings. We tested our solution in an in vivo setting, by administrating our endoscopic capsule to a pig under general anesthesia. All novel features, successfully implemented on a single platform, were validated. Our study lays the groundwork for clinically implementing a new generation of endoscopic capsules, which will significantly improve early diagnosis of upper and lower GI tract diseases.","container-title":"Scientific Reports","DOI":"10.1038/s41598-022-17502-7","ISSN":"2045-2322","issue":"1","journalAbbreviation":"Sci Rep","language":"en","license":"2022 The Author(s)","note":"publisher: Nature Publishing Group","page":"13723","source":"www.nature.com","title":"Edge artificial intelligence wireless video capsule endoscopy","volume":"12","author":[{"family":"Sahafi","given":"A."},{"family":"Wang","given":"Y."},{"family":"Rasmussen","given":"C. L. M."},{"family":"Bollen","given":"P."},{"family":"Baatrup","given":"G."},{"family":"Blanes-Vidal","given":"V."},{"family":"Herp","given":"J."},{"family":"Nadimi","given":"E. S."}],"issued":{"date-parts":[["2022",8,12]]}}}],"schema":"https://github.com/citation-style-language/schema/raw/master/csl-citation.json"} </w:instrText>
+        <w:instrText xml:space="preserve"> ADDIN ZOTERO_ITEM CSL_CITATION {"citationID":"AgecEW24","properties":{"formattedCitation":"[5]","plainCitation":"[5]","noteIndex":0},"citationItems":[{"id":2041,"uris":["http://zotero.org/users/8619560/items/3PB6Y59E"],"itemData":{"id":2041,"type":"article-journal","abstract":"Gastrointestinal tract disorders, including colorectal cancer (CRC), impose a significant health burden in Europe, with rising incidence rates among both young and elderly populations. Timely detection and removal of polyps, the precursors to CRC, are vital for prevention. Conventional colonoscopy, though effective, is prone to human errors. To address this, we propose an artificial intelligence-based polyp detection system using the YOLO-V8 network. We constructed a diverse dataset from multiple publicly available sources and conducted extensive evaluations. YOLO-V8 m demonstrated impressive performance, achieving 95.6% precision, 91.7% recall, and 92.4% F1-score. It outperformed other state-of-the-art models in terms of mean average precision. YOLO-V8 s offered a balance between accuracy and computational efficiency. Our research provides valuable insights into enhancing polyp detection and contributes to the advancement of computer-aided diagnosis for colorectal cancer.","container-title":"Signal, Image and Video Processing","DOI":"10.1007/s11760-023-02835-1","ISSN":"1863-1711","issue":"3","journalAbbreviation":"SIViP","language":"en","page":"2047-2058","source":"Springer Link","title":"Colorectal polyp detection in colonoscopy images using YOLO-V8 network","volume":"18","author":[{"family":"Lalinia","given":"Mehrshad"},{"family":"Sahafi","given":"Ali"}],"issued":{"date-parts":[["2024",4,1]]}}}],"schema":"https://github.com/citation-style-language/schema/raw/master/csl-citation.json"} </w:instrText>
       </w:r>
       <w:r>
         <w:fldChar w:fldCharType="separate"/>
       </w:r>
       <w:r>
-        <w:t>[3]</w:t>
+        <w:t>[5]</w:t>
       </w:r>
       <w:r>
         <w:fldChar w:fldCharType="end"/>
       </w:r>
       <w:r>
+        <w:t xml:space="preserve">. </w:t>
+      </w:r>
+      <w:r>
+        <w:lastRenderedPageBreak/>
+        <w:t>Timely detection and removal of polyps, the precursors to CRC, are vital for prevention. Conventional colonoscopy, though effective, is prone to human errors.</w:t>
+      </w:r>
+    </w:p>
+    <w:p>
+      <w:r>
+        <w:t xml:space="preserve">Gastrointestinal (GI) tract disorders pose a significant public health concern in Europe, leading to approximately 1 million deaths annually. These disorders not only result in substantial </w:t>
+      </w:r>
+      <w:proofErr w:type="gramStart"/>
+      <w:r>
+        <w:t>mortality, but</w:t>
+      </w:r>
+      <w:proofErr w:type="gramEnd"/>
+      <w:r>
+        <w:t xml:space="preserve"> also impose a considerable burden of illness and healthcare expenses. It is noteworthy that the incidence and prevalence of many GI tract disorders are most prevalent among both the young and, particularly, the elderly population. Given the global aging trend, the burden of these diseases is expected to rise steadily in the future</w:t>
+      </w:r>
+      <w:r>
         <w:t xml:space="preserve"> </w:t>
       </w:r>
       <w:r>
         <w:fldChar w:fldCharType="begin"/>
       </w:r>
       <w:r>
-        <w:instrText xml:space="preserve"> ADDIN ZOTERO_ITEM CSL_CITATION {"citationID":"afUbnCts","properties":{"formattedCitation":"[4]","plainCitation":"[4]","noteIndex":0},"citationItems":[{"id":2078,"uris":["http://zotero.org/users/8619560/items/GU5EF2UI"],"itemData":{"id":2078,"type":"article-journal","abstract":"Nowadays, the number of cases in which malignant colorectal polyps are removed is increasing due to colorectal cancer screening programmes. Cancerous polyps are classified into non-invasive high grade neoplasia (NHGN), when the cancer has not reached the muscularis mucosa, and malignant polyps, classed as T1, when they have invaded the submucosa. NHGN is considered cured with polypectomy, while the prognosis for malignant polyps depends on various morphological and histological factors. The prognostic factors include, sessile or pedunculated morphology of the polyp, whether partial or en bloc resection is carried out, the degree of differentiation of the carcinoma, vascular or lymphatic involvement, and whether the polypectomy resection margin is tumor free. A malignant polyp at T1 is considered cured with polypectomy if it is a pedunculated polyp (Ip of the Paris classification), it has been completely resected, it is not poorly differentiated, the resection edge is not affected by the tumor and there is no vascular or lymphatic involvement. The sessile malignant polyp (Is of the Paris classification) at T1 is considered not cured with polypectomy. Only in some cases (e.g. older people with high surgical risk) local excision (polypectomy or endoscopic submucosal dissection or conventional endoscopic mucosal resection) is considered the definitive treatment.","container-title":"World Journal of Gastroenterology","DOI":"10.3748/wjg.v16.i25.3103","ISSN":"2219-2840","issue":"25","journalAbbreviation":"World J Gastroenterol","language":"eng","note":"PMID: 20593495\nPMCID: PMC2896747","page":"3103-3111","source":"PubMed","title":"Malignant colorectal polyps","volume":"16","author":[{"family":"Bujanda","given":"Luis"},{"family":"Cosme","given":"Angel"},{"family":"Gil","given":"Ines"},{"family":"Arenas-Mirave","given":"Juan I."}],"issued":{"date-parts":[["2010",7,7]]}}}],"schema":"https://github.com/citation-style-language/schema/raw/master/csl-citation.json"} </w:instrText>
+        <w:instrText xml:space="preserve"> ADDIN ZOTERO_ITEM CSL_CITATION {"citationID":"WoxawhSf","properties":{"formattedCitation":"[3], [5]","plainCitation":"[3], [5]","noteIndex":0},"citationItems":[{"id":2041,"uris":["http://zotero.org/users/8619560/items/3PB6Y59E"],"itemData":{"id":2041,"type":"article-journal","abstract":"Gastrointestinal tract disorders, including colorectal cancer (CRC), impose a significant health burden in Europe, with rising incidence rates among both young and elderly populations. Timely detection and removal of polyps, the precursors to CRC, are vital for prevention. Conventional colonoscopy, though effective, is prone to human errors. To address this, we propose an artificial intelligence-based polyp detection system using the YOLO-V8 network. We constructed a diverse dataset from multiple publicly available sources and conducted extensive evaluations. YOLO-V8 m demonstrated impressive performance, achieving 95.6% precision, 91.7% recall, and 92.4% F1-score. It outperformed other state-of-the-art models in terms of mean average precision. YOLO-V8 s offered a balance between accuracy and computational efficiency. Our research provides valuable insights into enhancing polyp detection and contributes to the advancement of computer-aided diagnosis for colorectal cancer.","container-title":"Signal, Image and Video Processing","DOI":"10.1007/s11760-023-02835-1","ISSN":"1863-1711","issue":"3","journalAbbreviation":"SIViP","language":"en","page":"2047-2058","source":"Springer Link","title":"Colorectal polyp detection in colonoscopy images using YOLO-V8 network","volume":"18","author":[{"family":"Lalinia","given":"Mehrshad"},{"family":"Sahafi","given":"Ali"}],"issued":{"date-parts":[["2024",4,1]]}}},{"id":2043,"uris":["http://zotero.org/users/8619560/items/6XXH2SLZ"],"itemData":{"id":2043,"type":"article-journal","abstract":"Gastrointestinal (GI) tract diseases are responsible for substantial morbidity and mortality worldwide, including colorectal cancer, which has shown a rising incidence among adults younger than 50. Although this could be alleviated by regular screening, only a small percentage of those at risk are screened comprehensively, due to shortcomings in accuracy and patient acceptance. To address these challenges, we designed an artificial intelligence (AI)-empowered wireless video endoscopic capsule that surpasses the performance of the existing solutions by featuring, among others: (1) real-time image processing using onboard deep neural networks (DNN), (2) enhanced visualization of the mucous layer by deploying both white-light and narrow-band imaging, (3) on-the-go task modification and DNN update using over-the-air-programming and (4) bi-directional communication with patient’s personal electronic devices to report important findings. We tested our solution in an in vivo setting, by administrating our endoscopic capsule to a pig under general anesthesia. All novel features, successfully implemented on a single platform, were validated. Our study lays the groundwork for clinically implementing a new generation of endoscopic capsules, which will significantly improve early diagnosis of upper and lower GI tract diseases.","container-title":"Scientific Reports","DOI":"10.1038/s41598-022-17502-7","ISSN":"2045-2322","issue":"1","journalAbbreviation":"Sci Rep","language":"en","license":"2022 The Author(s)","note":"publisher: Nature Publishing Group","page":"13723","source":"www.nature.com","title":"Edge artificial intelligence wireless video capsule endoscopy","volume":"12","author":[{"family":"Sahafi","given":"A."},{"family":"Wang","given":"Y."},{"family":"Rasmussen","given":"C. L. M."},{"family":"Bollen","given":"P."},{"family":"Baatrup","given":"G."},{"family":"Blanes-Vidal","given":"V."},{"family":"Herp","given":"J."},{"family":"Nadimi","given":"E. S."}],"issued":{"date-parts":[["2022",8,12]]}}}],"schema":"https://github.com/citation-style-language/schema/raw/master/csl-citation.json"} </w:instrText>
       </w:r>
       <w:r>
         <w:fldChar w:fldCharType="separate"/>
       </w:r>
       <w:r>
-        <w:t>[4]</w:t>
+        <w:t>[3], [5]</w:t>
       </w:r>
       <w:r>
         <w:fldChar w:fldCharType="end"/>
       </w:r>
-      <w:r>
-        <w:t>.</w:t>
-      </w:r>
-    </w:p>
-    <w:p/>
-    <w:p>
+    </w:p>
+    <w:p>
+      <w:r>
+        <w:t>Colorectal cancer (CRC) is a type of cancer affecting the large intestine and is among the most serious and prevalent forms of cancer. The 5-year survival rates are influenced by various factors and can vary significantly depending on the cancer stage and its location in either the colon or rectum. On average, 5-year survival rates for CRC are estimated to range from 48.6 to 59.4%</w:t>
+      </w:r>
+      <w:r>
+        <w:t xml:space="preserve"> </w:t>
+      </w:r>
       <w:r>
         <w:fldChar w:fldCharType="begin"/>
       </w:r>
       <w:r>
-        <w:instrText xml:space="preserve"> ADDIN ZOTERO_ITEM CSL_CITATION {"citationID":"AgecEW24","properties":{"formattedCitation":"[5]","plainCitation":"[5]","noteIndex":0},"citationItems":[{"id":2041,"uris":["http://zotero.org/users/8619560/items/3PB6Y59E"],"itemData":{"id":2041,"type":"article-journal","abstract":"Gastrointestinal tract disorders, including colorectal cancer (CRC), impose a significant health burden in Europe, with rising incidence rates among both young and elderly populations. Timely detection and removal of polyps, the precursors to CRC, are vital for prevention. Conventional colonoscopy, though effective, is prone to human errors. To address this, we propose an artificial intelligence-based polyp detection system using the YOLO-V8 network. We constructed a diverse dataset from multiple publicly available sources and conducted extensive evaluations. YOLO-V8 m demonstrated impressive performance, achieving 95.6% precision, 91.7% recall, and 92.4% F1-score. It outperformed other state-of-the-art models in terms of mean average precision. YOLO-V8 s offered a balance between accuracy and computational efficiency. Our research provides valuable insights into enhancing polyp detection and contributes to the advancement of computer-aided diagnosis for colorectal cancer.","container-title":"Signal, Image and Video Processing","DOI":"10.1007/s11760-023-02835-1","ISSN":"1863-1711","issue":"3","journalAbbreviation":"SIViP","language":"en","page":"2047-2058","source":"Springer Link","title":"Colorectal polyp detection in colonoscopy images using YOLO-V8 network","volume":"18","author":[{"family":"Lalinia","given":"Mehrshad"},{"family":"Sahafi","given":"Ali"}],"issued":{"date-parts":[["2024",4,1]]}}}],"schema":"https://github.com/citation-style-language/schema/raw/master/csl-citation.json"} </w:instrText>
+        <w:instrText xml:space="preserve"> ADDIN ZOTERO_ITEM CSL_CITATION {"citationID":"XLtAztvN","properties":{"formattedCitation":"[6]","plainCitation":"[6]","noteIndex":0},"citationItems":[{"id":2045,"uris":["http://zotero.org/users/8619560/items/WWPMAG9W"],"itemData":{"id":2045,"type":"article-journal","abstract":"Detection of colorectal polyps through colonoscopy is an essential practice in prevention of colorectal cancers. However, the method itself is labor intensive and is subject to human error. With the advent of deep learning-based methodologies, and specifically convolutional neural networks, an opportunity to improve upon the prognosis of potential patients suffering with colorectal cancer has appeared with automated detection and segmentation of polyps. Polyp segmentation is subject to a number of problems such as model overfitting and generalization, poor definition of boundary pixels, as well as the model’s ability to capture the practical range in textures, sizes, and colors. In an effort to address these challenges, we propose a dual encoder–decoder solution named Polyp Segmentation Network (PSNet). Both the dual encoder and decoder were developed by the comprehensive combination of a variety of deep learning modules, including the PS encoder, transformer encoder, PS decoder, enhanced dilated transformer decoder, partial decoder, and merge module. PSNet outperforms state-of-the-art results through an extensive comparative study against 5 existing polyp datasets with respect to both mDice and mIoU at 0.863 and 0.797, respectively. With our new modified polyp dataset we obtain an mDice and mIoU of 0.941 and 0.897 respectively.","container-title":"Scientific Reports","DOI":"10.1038/s41598-023-28530-2","ISSN":"2045-2322","issue":"1","journalAbbreviation":"Sci Rep","language":"en","license":"2023 The Author(s)","note":"publisher: Nature Publishing Group","page":"1183","source":"www.nature.com","title":"Dual encoder–decoder-based deep polyp segmentation network for colonoscopy images","volume":"13","author":[{"family":"Lewis","given":"John"},{"family":"Cha","given":"Young-Jin"},{"family":"Kim","given":"Jongho"}],"issued":{"date-parts":[["2023",1,21]]}}}],"schema":"https://github.com/citation-style-language/schema/raw/master/csl-citation.json"} </w:instrText>
       </w:r>
       <w:r>
         <w:fldChar w:fldCharType="separate"/>
       </w:r>
       <w:r>
-        <w:t>[5]</w:t>
+        <w:t>[6]</w:t>
       </w:r>
       <w:r>
         <w:fldChar w:fldCharType="end"/>
       </w:r>
-    </w:p>
-    <w:p>
-      <w:r>
-        <w:t>Gastrointestinal tract disorders, including colorectal cancer (CRC), impose a significant health burden in Europe, with rising incidence rates among both young and elderly populations. Timely detection and removal of polyps, the precursors to CRC, are vital for prevention. Conventional colonoscopy, though effective, is prone to human errors.</w:t>
-      </w:r>
-    </w:p>
-    <w:p>
-      <w:r>
-        <w:lastRenderedPageBreak/>
-        <w:t xml:space="preserve">Gastrointestinal (GI) tract disorders pose a significant public health concern in Europe, leading to approximately 1 million deaths annually. These disorders not only result in substantial </w:t>
-      </w:r>
-      <w:proofErr w:type="gramStart"/>
-      <w:r>
-        <w:t>mortality, but</w:t>
-      </w:r>
-      <w:proofErr w:type="gramEnd"/>
-      <w:r>
-        <w:t xml:space="preserve"> also impose a considerable burden of illness and healthcare expenses. It is noteworthy that the incidence and prevalence of many GI tract disorders are most prevalent among both the young and, particularly, the elderly population. Given the global aging trend, the burden of these diseases is expected to rise steadily in the future</w:t>
-      </w:r>
-      <w:r>
-        <w:t xml:space="preserve"> </w:t>
+      <w:r>
+        <w:t xml:space="preserve">. Statistics project that by the year 2020, nearly 150,000 individuals will have been diagnosed with CRC, and more than 50,000 will succumb to the disease </w:t>
       </w:r>
       <w:r>
         <w:fldChar w:fldCharType="begin"/>
       </w:r>
       <w:r>
-        <w:instrText xml:space="preserve"> ADDIN ZOTERO_ITEM CSL_CITATION {"citationID":"WoxawhSf","properties":{"formattedCitation":"[3], [5]","plainCitation":"[3], [5]","noteIndex":0},"citationItems":[{"id":2041,"uris":["http://zotero.org/users/8619560/items/3PB6Y59E"],"itemData":{"id":2041,"type":"article-journal","abstract":"Gastrointestinal tract disorders, including colorectal cancer (CRC), impose a significant health burden in Europe, with rising incidence rates among both young and elderly populations. Timely detection and removal of polyps, the precursors to CRC, are vital for prevention. Conventional colonoscopy, though effective, is prone to human errors. To address this, we propose an artificial intelligence-based polyp detection system using the YOLO-V8 network. We constructed a diverse dataset from multiple publicly available sources and conducted extensive evaluations. YOLO-V8 m demonstrated impressive performance, achieving 95.6% precision, 91.7% recall, and 92.4% F1-score. It outperformed other state-of-the-art models in terms of mean average precision. YOLO-V8 s offered a balance between accuracy and computational efficiency. Our research provides valuable insights into enhancing polyp detection and contributes to the advancement of computer-aided diagnosis for colorectal cancer.","container-title":"Signal, Image and Video Processing","DOI":"10.1007/s11760-023-02835-1","ISSN":"1863-1711","issue":"3","journalAbbreviation":"SIViP","language":"en","page":"2047-2058","source":"Springer Link","title":"Colorectal polyp detection in colonoscopy images using YOLO-V8 network","volume":"18","author":[{"family":"Lalinia","given":"Mehrshad"},{"family":"Sahafi","given":"Ali"}],"issued":{"date-parts":[["2024",4,1]]}}},{"id":2043,"uris":["http://zotero.org/users/8619560/items/6XXH2SLZ"],"itemData":{"id":2043,"type":"article-journal","abstract":"Gastrointestinal (GI) tract diseases are responsible for substantial morbidity and mortality worldwide, including colorectal cancer, which has shown a rising incidence among adults younger than 50. Although this could be alleviated by regular screening, only a small percentage of those at risk are screened comprehensively, due to shortcomings in accuracy and patient acceptance. To address these challenges, we designed an artificial intelligence (AI)-empowered wireless video endoscopic capsule that surpasses the performance of the existing solutions by featuring, among others: (1) real-time image processing using onboard deep neural networks (DNN), (2) enhanced visualization of the mucous layer by deploying both white-light and narrow-band imaging, (3) on-the-go task modification and DNN update using over-the-air-programming and (4) bi-directional communication with patient’s personal electronic devices to report important findings. We tested our solution in an in vivo setting, by administrating our endoscopic capsule to a pig under general anesthesia. All novel features, successfully implemented on a single platform, were validated. Our study lays the groundwork for clinically implementing a new generation of endoscopic capsules, which will significantly improve early diagnosis of upper and lower GI tract diseases.","container-title":"Scientific Reports","DOI":"10.1038/s41598-022-17502-7","ISSN":"2045-2322","issue":"1","journalAbbreviation":"Sci Rep","language":"en","license":"2022 The Author(s)","note":"publisher: Nature Publishing Group","page":"13723","source":"www.nature.com","title":"Edge artificial intelligence wireless video capsule endoscopy","volume":"12","author":[{"family":"Sahafi","given":"A."},{"family":"Wang","given":"Y."},{"family":"Rasmussen","given":"C. L. M."},{"family":"Bollen","given":"P."},{"family":"Baatrup","given":"G."},{"family":"Blanes-Vidal","given":"V."},{"family":"Herp","given":"J."},{"family":"Nadimi","given":"E. S."}],"issued":{"date-parts":[["2022",8,12]]}}}],"schema":"https://github.com/citation-style-language/schema/raw/master/csl-citation.json"} </w:instrText>
+        <w:instrText xml:space="preserve"> ADDIN ZOTERO_ITEM CSL_CITATION {"citationID":"GMlfW48B","properties":{"formattedCitation":"[7]","plainCitation":"[7]","noteIndex":0},"citationItems":[{"id":2047,"uris":["http://zotero.org/users/8619560/items/TZK2TW5R"],"itemData":{"id":2047,"type":"article-journal","abstract":"Colorectal cancer (CRC) is the second most common cause of cancer death in the United States. Every 3 years, the American Cancer Society provides an update of CRC occurrence based on incidence data (available through 2016) from population-based cancer registries and mortality data (through 2017) from the National Center for Health Statistics. In 2020, approximately 147,950 individuals will be diagnosed with CRC and 53,200 will die from the disease, including 17,930 cases and 3,640 deaths in individuals aged younger than 50 years. The incidence rate during 2012 through 2016 ranged from 30 (per 100,000 persons) in Asian/Pacific Islanders to 45.7 in blacks and 89 in Alaska Natives. Rapid declines in incidence among screening-aged individuals during the 2000s continued during 2011 through 2016 in those aged 65 years and older (by 3.3% annually) but reversed in those aged 50 to 64 years, among whom rates increased by 1% annually. Among individuals aged younger than 50 years, the incidence rate increased by approximately 2% annually for tumors in the proximal and distal colon, as well as the rectum, driven by trends in non-Hispanic whites. CRC death rates during 2008 through 2017 declined by 3% annually in individuals aged 65 years and older and by 0.6% annually in individuals aged 50 to 64 years while increasing by 1.3% annually in those aged younger than 50 years. Mortality declines among individuals aged 50 years and older were steepest among blacks, who also had the only decreasing trend among those aged younger than 50 years, and excluded American Indians/Alaska Natives, among whom rates remained stable. Progress against CRC can be accelerated by increasing access to guideline-recommended screening and high-quality treatment, particularly among Alaska Natives, and elucidating causes for rising incidence in young and middle-aged adults.","container-title":"CA: a cancer journal for clinicians","DOI":"10.3322/caac.21601","ISSN":"1542-4863","issue":"3","journalAbbreviation":"CA Cancer J Clin","language":"eng","note":"PMID: 32133645","page":"145-164","source":"PubMed","title":"Colorectal cancer statistics, 2020","volume":"70","author":[{"family":"Siegel","given":"Rebecca L."},{"family":"Miller","given":"Kimberly D."},{"family":"Goding Sauer","given":"Ann"},{"family":"Fedewa","given":"Stacey A."},{"family":"Butterly","given":"Lynn F."},{"family":"Anderson","given":"Joseph C."},{"family":"Cercek","given":"Andrea"},{"family":"Smith","given":"Robert A."},{"family":"Jemal","given":"Ahmedin"}],"issued":{"date-parts":[["2020",5]]}}}],"schema":"https://github.com/citation-style-language/schema/raw/master/csl-citation.json"} </w:instrText>
       </w:r>
       <w:r>
         <w:fldChar w:fldCharType="separate"/>
       </w:r>
       <w:r>
-        <w:t>[3], [5]</w:t>
+        <w:t>[7]</w:t>
       </w:r>
       <w:r>
         <w:fldChar w:fldCharType="end"/>
       </w:r>
-    </w:p>
-    <w:p>
-      <w:r>
-        <w:t>Colorectal cancer (CRC) is a type of cancer affecting the large intestine and is among the most serious and prevalent forms of cancer. The 5-year survival rates are influenced by various factors and can vary significantly depending on the cancer stage and its location in either the colon or rectum. On average, 5-year survival rates for CRC are estimated to range from 48.6 to 59.4%</w:t>
-      </w:r>
-      <w:r>
-        <w:t xml:space="preserve"> </w:t>
-      </w:r>
-      <w:r>
-        <w:fldChar w:fldCharType="begin"/>
-      </w:r>
-      <w:r>
-        <w:instrText xml:space="preserve"> ADDIN ZOTERO_ITEM CSL_CITATION {"citationID":"XLtAztvN","properties":{"formattedCitation":"[6]","plainCitation":"[6]","noteIndex":0},"citationItems":[{"id":2045,"uris":["http://zotero.org/users/8619560/items/WWPMAG9W"],"itemData":{"id":2045,"type":"article-journal","abstract":"Detection of colorectal polyps through colonoscopy is an essential practice in prevention of colorectal cancers. However, the method itself is labor intensive and is subject to human error. With the advent of deep learning-based methodologies, and specifically convolutional neural networks, an opportunity to improve upon the prognosis of potential patients suffering with colorectal cancer has appeared with automated detection and segmentation of polyps. Polyp segmentation is subject to a number of problems such as model overfitting and generalization, poor definition of boundary pixels, as well as the model’s ability to capture the practical range in textures, sizes, and colors. In an effort to address these challenges, we propose a dual encoder–decoder solution named Polyp Segmentation Network (PSNet). Both the dual encoder and decoder were developed by the comprehensive combination of a variety of deep learning modules, including the PS encoder, transformer encoder, PS decoder, enhanced dilated transformer decoder, partial decoder, and merge module. PSNet outperforms state-of-the-art results through an extensive comparative study against 5 existing polyp datasets with respect to both mDice and mIoU at 0.863 and 0.797, respectively. With our new modified polyp dataset we obtain an mDice and mIoU of 0.941 and 0.897 respectively.","container-title":"Scientific Reports","DOI":"10.1038/s41598-023-28530-2","ISSN":"2045-2322","issue":"1","journalAbbreviation":"Sci Rep","language":"en","license":"2023 The Author(s)","note":"publisher: Nature Publishing Group","page":"1183","source":"www.nature.com","title":"Dual encoder–decoder-based deep polyp segmentation network for colonoscopy images","volume":"13","author":[{"family":"Lewis","given":"John"},{"family":"Cha","given":"Young-Jin"},{"family":"Kim","given":"Jongho"}],"issued":{"date-parts":[["2023",1,21]]}}}],"schema":"https://github.com/citation-style-language/schema/raw/master/csl-citation.json"} </w:instrText>
-      </w:r>
-      <w:r>
-        <w:fldChar w:fldCharType="separate"/>
-      </w:r>
-      <w:r>
-        <w:t>[6]</w:t>
-      </w:r>
-      <w:r>
-        <w:fldChar w:fldCharType="end"/>
-      </w:r>
-      <w:r>
-        <w:t xml:space="preserve">. Statistics project that by the year 2020, nearly 150,000 individuals will have been diagnosed with CRC, and more than 50,000 will succumb to the disease </w:t>
-      </w:r>
-      <w:r>
-        <w:fldChar w:fldCharType="begin"/>
-      </w:r>
-      <w:r>
-        <w:instrText xml:space="preserve"> ADDIN ZOTERO_ITEM CSL_CITATION {"citationID":"GMlfW48B","properties":{"formattedCitation":"[7]","plainCitation":"[7]","noteIndex":0},"citationItems":[{"id":2047,"uris":["http://zotero.org/users/8619560/items/TZK2TW5R"],"itemData":{"id":2047,"type":"article-journal","abstract":"Colorectal cancer (CRC) is the second most common cause of cancer death in the United States. Every 3 years, the American Cancer Society provides an update of CRC occurrence based on incidence data (available through 2016) from population-based cancer registries and mortality data (through 2017) from the National Center for Health Statistics. In 2020, approximately 147,950 individuals will be diagnosed with CRC and 53,200 will die from the disease, including 17,930 cases and 3,640 deaths in individuals aged younger than 50 years. The incidence rate during 2012 through 2016 ranged from 30 (per 100,000 persons) in Asian/Pacific Islanders to 45.7 in blacks and 89 in Alaska Natives. Rapid declines in incidence among screening-aged individuals during the 2000s continued during 2011 through 2016 in those aged 65 years and older (by 3.3% annually) but reversed in those aged 50 to 64 years, among whom rates increased by 1% annually. Among individuals aged younger than 50 years, the incidence rate increased by approximately 2% annually for tumors in the proximal and distal colon, as well as the rectum, driven by trends in non-Hispanic whites. CRC death rates during 2008 through 2017 declined by 3% annually in individuals aged 65 years and older and by 0.6% annually in individuals aged 50 to 64 years while increasing by 1.3% annually in those aged younger than 50 years. Mortality declines among individuals aged 50 years and older were steepest among blacks, who also had the only decreasing trend among those aged younger than 50 years, and excluded American Indians/Alaska Natives, among whom rates remained stable. Progress against CRC can be accelerated by increasing access to guideline-recommended screening and high-quality treatment, particularly among Alaska Natives, and elucidating causes for rising incidence in young and middle-aged adults.","container-title":"CA: a cancer journal for clinicians","DOI":"10.3322/caac.21601","ISSN":"1542-4863","issue":"3","journalAbbreviation":"CA Cancer J Clin","language":"eng","note":"PMID: 32133645","page":"145-164","source":"PubMed","title":"Colorectal cancer statistics, 2020","volume":"70","author":[{"family":"Siegel","given":"Rebecca L."},{"family":"Miller","given":"Kimberly D."},{"family":"Goding Sauer","given":"Ann"},{"family":"Fedewa","given":"Stacey A."},{"family":"Butterly","given":"Lynn F."},{"family":"Anderson","given":"Joseph C."},{"family":"Cercek","given":"Andrea"},{"family":"Smith","given":"Robert A."},{"family":"Jemal","given":"Ahmedin"}],"issued":{"date-parts":[["2020",5]]}}}],"schema":"https://github.com/citation-style-language/schema/raw/master/csl-citation.json"} </w:instrText>
-      </w:r>
-      <w:r>
-        <w:fldChar w:fldCharType="separate"/>
-      </w:r>
-      <w:r>
-        <w:t>[7]</w:t>
-      </w:r>
-      <w:r>
-        <w:fldChar w:fldCharType="end"/>
-      </w:r>
-      <w:r>
-        <w:t>. Colorectal cancer (CRC) is the second most common cause of cancer death in the United States. Every 3 years, the American Cancer Society provides an update of CRC occurrence based on incidence data (available through 2016) from population-based cancer registries and mortality data (through 2017) from the National Center for Health Statistics</w:t>
-      </w:r>
-      <w:r>
-        <w:t xml:space="preserve"> </w:t>
-      </w:r>
-      <w:r>
-        <w:fldChar w:fldCharType="begin"/>
-      </w:r>
-      <w:r>
-        <w:instrText xml:space="preserve"> ADDIN ZOTERO_ITEM CSL_CITATION {"citationID":"prsoqIjy","properties":{"formattedCitation":"[7]","plainCitation":"[7]","noteIndex":0},"citationItems":[{"id":2047,"uris":["http://zotero.org/users/8619560/items/TZK2TW5R"],"itemData":{"id":2047,"type":"article-journal","abstract":"Colorectal cancer (CRC) is the second most common cause of cancer death in the United States. Every 3 years, the American Cancer Society provides an update of CRC occurrence based on incidence data (available through 2016) from population-based cancer registries and mortality data (through 2017) from the National Center for Health Statistics. In 2020, approximately 147,950 individuals will be diagnosed with CRC and 53,200 will die from the disease, including 17,930 cases and 3,640 deaths in individuals aged younger than 50 years. The incidence rate during 2012 through 2016 ranged from 30 (per 100,000 persons) in Asian/Pacific Islanders to 45.7 in blacks and 89 in Alaska Natives. Rapid declines in incidence among screening-aged individuals during the 2000s continued during 2011 through 2016 in those aged 65 years and older (by 3.3% annually) but reversed in those aged 50 to 64 years, among whom rates increased by 1% annually. Among individuals aged younger than 50 years, the incidence rate increased by approximately 2% annually for tumors in the proximal and distal colon, as well as the rectum, driven by trends in non-Hispanic whites. CRC death rates during 2008 through 2017 declined by 3% annually in individuals aged 65 years and older and by 0.6% annually in individuals aged 50 to 64 years while increasing by 1.3% annually in those aged younger than 50 years. Mortality declines among individuals aged 50 years and older were steepest among blacks, who also had the only decreasing trend among those aged younger than 50 years, and excluded American Indians/Alaska Natives, among whom rates remained stable. Progress against CRC can be accelerated by increasing access to guideline-recommended screening and high-quality treatment, particularly among Alaska Natives, and elucidating causes for rising incidence in young and middle-aged adults.","container-title":"CA: a cancer journal for clinicians","DOI":"10.3322/caac.21601","ISSN":"1542-4863","issue":"3","journalAbbreviation":"CA Cancer J Clin","language":"eng","note":"PMID: 32133645","page":"145-164","source":"PubMed","title":"Colorectal cancer statistics, 2020","volume":"70","author":[{"family":"Siegel","given":"Rebecca L."},{"family":"Miller","given":"Kimberly D."},{"family":"Goding Sauer","given":"Ann"},{"family":"Fedewa","given":"Stacey A."},{"family":"Butterly","given":"Lynn F."},{"family":"Anderson","given":"Joseph C."},{"family":"Cercek","given":"Andrea"},{"family":"Smith","given":"Robert A."},{"family":"Jemal","given":"Ahmedin"}],"issued":{"date-parts":[["2020",5]]}}}],"schema":"https://github.com/citation-style-language/schema/raw/master/csl-citation.json"} </w:instrText>
-      </w:r>
-      <w:r>
-        <w:fldChar w:fldCharType="separate"/>
-      </w:r>
-      <w:r>
-        <w:t>[7]</w:t>
-      </w:r>
-      <w:r>
-        <w:fldChar w:fldCharType="end"/>
-      </w:r>
-      <w:r>
-        <w:t>. </w:t>
+      <w:r>
+        <w:t xml:space="preserve">. </w:t>
       </w:r>
     </w:p>
     <w:p/>
@@ -792,222 +880,212 @@
       </w:r>
       <w:proofErr w:type="gramEnd"/>
       <w:r>
-        <w:t xml:space="preserve"> a trend that consists of developing intelligent systems for medical applications. Intelligent systems are currently being used to assist in other medical interventions. For instance, there are systems that can interpret medical data automatically, such as KARDIO, which was developed to interpret electrocardiograms. It is possible to find many examples of intelligent </w:t>
-      </w:r>
+        <w:t xml:space="preserve"> a trend that consists of developing intelligent systems for medical applications. Intelligent systems are currently being used to assist in other medical interventions. For instance, there are systems that can interpret medical data automatically, such as KARDIO, which was developed to interpret electrocardiograms. It is possible to find many examples of intelligent systems built to assist in cancer detection. The interested reader can consult some works in the field of breast cancer detection </w:t>
+      </w:r>
+      <w:r>
+        <w:fldChar w:fldCharType="begin"/>
+      </w:r>
+      <w:r>
+        <w:instrText xml:space="preserve"> ADDIN ZOTERO_ITEM CSL_CITATION {"citationID":"sZ7Rd2HX","properties":{"formattedCitation":"[12]","plainCitation":"[12]","noteIndex":0},"citationItems":[{"id":2037,"uris":["http://zotero.org/users/8619560/items/T8KMX5BD"],"itemData":{"id":2037,"type":"article-journal","abstract":"Purpose: To improve the performance of a computer-aided detection (CAD) system for mass detection by using four-view information in screening mammography., Methods: The authors developed a four-view CAD system that emulates radiologists’ reading by using the craniocaudal and mediolateral oblique views of the ipsilateral breast to reduce false positives (FPs) and the corresponding views of the contralateral breast to detect asymmetry. The CAD system consists of four major components: (1) Initial detection of breast masses on individual views, (2) information fusion of the ipsilateral views of the breast (referred to as two-view analysis), (3) information fusion of the corresponding views of the contralateral breast (referred to as bilateral analysis), and (4) fusion of the four-view information with a decision tree. The authors collected two data sets for training and testing of the CAD system: A mass set containing 389 patients with 389 biopsy-proven masses and a normal set containing 200 normal subjects. All cases had four-view mammograms. The true locations of the masses on the mammograms were identified by an experienced MQSA radiologist. The authors randomly divided the mass set into two independent sets for cross validation training and testing. The overall test performance was assessed by averaging the free response receiver operating characteristic (FROC) curves of the two test subsets. The FP rates during the FROC analysis were estimated by using the normal set only. The jackknife free-response ROC (JAFROC) method was used to estimate the statistical significance of the difference between the test FROC curves obtained with the single-view and the four-view CAD systems., Results: Using the single-view CAD system, the breast-based test sensitivities were 58% and 77% at the FP rates of 0.5 and 1.0 per image, respectively. With the four-view CAD system, the breast-based test sensitivities were improved to 76% and 87% at the corresponding FP rates, respectively. The improvement was found to be statistically significant (p&lt;0.0001) by JAFROC analysis., Conclusions: The four-view information fusion approach that emulates radiologists’ reading strategy significantly improves the performance of breast mass detection of the CAD system in comparison with the single-view approach.","container-title":"Medical Physics","DOI":"10.1118/1.3560462","ISSN":"0094-2405","issue":"4","journalAbbreviation":"Med Phys","note":"PMID: 21626920\nPMCID: PMC3069993","page":"1867-1876","source":"PubMed Central","title":"Computer-aided detection of breast masses: Four-view strategy for screening mammography","title-short":"Computer-aided detection of breast masses","volume":"38","author":[{"family":"Wei","given":"Jun"},{"family":"Chan","given":"Heang-Ping"},{"family":"Zhou","given":"Chuan"},{"family":"Wu","given":"Yi-Ta"},{"family":"Sahiner","given":"Berkman"},{"family":"Hadjiiski","given":"Lubomir M."},{"family":"Roubidoux","given":"Marilyn A."},{"family":"Helvie","given":"Mark A."}],"issued":{"date-parts":[["2011",4]]}}}],"schema":"https://github.com/citation-style-language/schema/raw/master/csl-citation.json"} </w:instrText>
+      </w:r>
+      <w:r>
+        <w:fldChar w:fldCharType="separate"/>
+      </w:r>
+      <w:r>
+        <w:t>[12]</w:t>
+      </w:r>
+      <w:r>
+        <w:fldChar w:fldCharType="end"/>
+      </w:r>
+      <w:r>
+        <w:t xml:space="preserve"> or prostate cancer detection </w:t>
+      </w:r>
+      <w:r>
+        <w:fldChar w:fldCharType="begin"/>
+      </w:r>
+      <w:r>
+        <w:instrText xml:space="preserve"> ADDIN ZOTERO_ITEM CSL_CITATION {"citationID":"GMrRSKgp","properties":{"formattedCitation":"[13]","plainCitation":"[13]","noteIndex":0},"citationItems":[{"id":2040,"uris":["http://zotero.org/users/8619560/items/65U4CBS6"],"itemData":{"id":2040,"type":"paper-conference","abstract":"In magnetic resonance imaging (MRI), intensity inhomogeneity refers to an acquisition artifact which introduces a non-linear variation in the signal intensities within the image. Intensity inhomogeneity is known to significantly affect computerized analysis of MRI data (such as automated segmentation or classification procedures), hence requiring the application of bias field correction (BFC) algorithms to account for this artifact. Quantitative evaluation of BFC schemes is typically performed using generalized intensity-based measures (percent coefficient of variation, %CV ) or information-theoretic measures (entropy). While some investigators have previously empirically compared BFC schemes in the context of different domains (using changes in %CV and entropy to quantify improvements), no consensus has emerged as to the best BFC scheme for any given application. The motivation for this work is that the choice of a BFC scheme for a given application should be dictated by application-specific measures rather than ad hoc measures such as entropy and %CV. In this paper, we have attempted to address the problem of determining an optimal BFC algorithm in the context of a computer-aided diagnosis (CAD) scheme for prostate cancer (CaP) detection from T2-weighted (T2w) MRI. One goal of this work is to identify a BFC algorithm that will maximize the CaP classification accuracy (measured in terms of the area under the ROC curve or AUC). A secondary aim of our work is to determine whether measures such as %CV and entropy are correlated with a classifier-based objective measure (AUC). Determining the presence or absence of these correlations is important to understand whether domain independent BFC performance measures such as %CV , entropy should be used to identify the optimal BFC scheme for any given application. In order to answer these questions, we quantitatively compared 3 different popular BFC algorithms on a cohort of 10 clinical 3 Tesla prostate T2w MRI datasets (comprising 39 2D MRI slices): N3 , PABIC, and the method of Cohen et al. Results of BFC via each of the algorithms was evaluated in terms of %CV , entropy, as well as classifier AUC for CaP detection from T2w MRI. The CaP classifier was trained and evaluated on a per-pixel basis using annotations of CaP obtained via registration of T2w MRI and ex vivo whole-mount histology sections. Our results revealed that different BFC schemes resulted in a maximization of different performance measures, that is, the BFC scheme identified by minimization of %CV and entropy was not the one that maximized AUC as well. Moreover, existing BFC evaluation measures (%CV , entropy) did not correlate with AUC (application-based evaluation), but did correlate with each other, suggesting that domain-specific performance measures should be considered in making a decision regarding choice of appropriate BFC scheme. Our results also revealed that N3 provided the best correction of bias field artifacts in prostate MRI data, when the goal was to identify prostate cancer.","container-title":"Medical Imaging 2011: Computer-Aided Diagnosis","DOI":"10.1117/12.878813","event-title":"Medical Imaging 2011: Computer-Aided Diagnosis","page":"254-265","publisher":"SPIE","source":"www.spiedigitallibrary.org","title":"Empirical evaluation of bias field correction algorithms for computer-aided detection of prostate cancer on T2w MRI","URL":"https://www.spiedigitallibrary.org/conference-proceedings-of-spie/7963/79630V/Empirical-evaluation-of-bias-field-correction-algorithms-for-computer-aided/10.1117/12.878813.full","volume":"7963","author":[{"family":"Viswanath","given":"Satish"},{"family":"Palumbo","given":"Daniel"},{"family":"Chappelow","given":"Jonathan"},{"family":"Patel","given":"Pratik"},{"family":"Bloch","given":"B. Nicholas"},{"family":"Rofsky","given":"Neil"},{"family":"Lenkinski","given":"Robert"},{"family":"Genega","given":"Elizabeth"},{"family":"Madabhushi","given":"Anant"}],"accessed":{"date-parts":[["2026",3,3]]},"issued":{"date-parts":[["2011",3,15]]}}}],"schema":"https://github.com/citation-style-language/schema/raw/master/csl-citation.json"} </w:instrText>
+      </w:r>
+      <w:r>
+        <w:fldChar w:fldCharType="separate"/>
+      </w:r>
+      <w:r>
+        <w:t>[13]</w:t>
+      </w:r>
+      <w:r>
+        <w:fldChar w:fldCharType="end"/>
+      </w:r>
+      <w:r>
+        <w:t>.</w:t>
+      </w:r>
+    </w:p>
+    <w:p>
       <w:r>
         <w:lastRenderedPageBreak/>
-        <w:t xml:space="preserve">systems built to assist in cancer detection. The interested reader can consult some works in the field of breast cancer detection </w:t>
-      </w:r>
-      <w:r>
         <w:fldChar w:fldCharType="begin"/>
       </w:r>
       <w:r>
-        <w:instrText xml:space="preserve"> ADDIN ZOTERO_ITEM CSL_CITATION {"citationID":"sZ7Rd2HX","properties":{"formattedCitation":"[12]","plainCitation":"[12]","noteIndex":0},"citationItems":[{"id":2037,"uris":["http://zotero.org/users/8619560/items/T8KMX5BD"],"itemData":{"id":2037,"type":"article-journal","abstract":"Purpose: To improve the performance of a computer-aided detection (CAD) system for mass detection by using four-view information in screening mammography., Methods: The authors developed a four-view CAD system that emulates radiologists’ reading by using the craniocaudal and mediolateral oblique views of the ipsilateral breast to reduce false positives (FPs) and the corresponding views of the contralateral breast to detect asymmetry. The CAD system consists of four major components: (1) Initial detection of breast masses on individual views, (2) information fusion of the ipsilateral views of the breast (referred to as two-view analysis), (3) information fusion of the corresponding views of the contralateral breast (referred to as bilateral analysis), and (4) fusion of the four-view information with a decision tree. The authors collected two data sets for training and testing of the CAD system: A mass set containing 389 patients with 389 biopsy-proven masses and a normal set containing 200 normal subjects. All cases had four-view mammograms. The true locations of the masses on the mammograms were identified by an experienced MQSA radiologist. The authors randomly divided the mass set into two independent sets for cross validation training and testing. The overall test performance was assessed by averaging the free response receiver operating characteristic (FROC) curves of the two test subsets. The FP rates during the FROC analysis were estimated by using the normal set only. The jackknife free-response ROC (JAFROC) method was used to estimate the statistical significance of the difference between the test FROC curves obtained with the single-view and the four-view CAD systems., Results: Using the single-view CAD system, the breast-based test sensitivities were 58% and 77% at the FP rates of 0.5 and 1.0 per image, respectively. With the four-view CAD system, the breast-based test sensitivities were improved to 76% and 87% at the corresponding FP rates, respectively. The improvement was found to be statistically significant (p&lt;0.0001) by JAFROC analysis., Conclusions: The four-view information fusion approach that emulates radiologists’ reading strategy significantly improves the performance of breast mass detection of the CAD system in comparison with the single-view approach.","container-title":"Medical Physics","DOI":"10.1118/1.3560462","ISSN":"0094-2405","issue":"4","journalAbbreviation":"Med Phys","note":"PMID: 21626920\nPMCID: PMC3069993","page":"1867-1876","source":"PubMed Central","title":"Computer-aided detection of breast masses: Four-view strategy for screening mammography","title-short":"Computer-aided detection of breast masses","volume":"38","author":[{"family":"Wei","given":"Jun"},{"family":"Chan","given":"Heang-Ping"},{"family":"Zhou","given":"Chuan"},{"family":"Wu","given":"Yi-Ta"},{"family":"Sahiner","given":"Berkman"},{"family":"Hadjiiski","given":"Lubomir M."},{"family":"Roubidoux","given":"Marilyn A."},{"family":"Helvie","given":"Mark A."}],"issued":{"date-parts":[["2011",4]]}}}],"schema":"https://github.com/citation-style-language/schema/raw/master/csl-citation.json"} </w:instrText>
+        <w:instrText xml:space="preserve"> ADDIN ZOTERO_ITEM CSL_CITATION {"citationID":"q2SnCyAx","properties":{"formattedCitation":"[14]","plainCitation":"[14]","noteIndex":0},"citationItems":[{"id":2028,"uris":["http://zotero.org/users/8619560/items/XYDTN3F5"],"itemData":{"id":2028,"type":"article-journal","abstract":"Colonoscopy is the gold standard for colon cancer screening though some polyps are still missed, thus preventing early disease detection and treatment. Several computational systems have been proposed to assist polyp detection during colonoscopy but so far without consistent evaluation. The lack of publicly available annotated databases has made it difficult to compare methods and to assess if they achieve performance levels acceptable for clinical use. The Automatic Polyp Detection sub-challenge, conducted as part of the Endoscopic Vision Challenge (http://endovis.grand-challenge.org) at the international conference on Medical Image Computing and Computer Assisted Intervention (MICCAI) in 2015, was an effort to address this need. In this paper, we report the results of this comparative evaluation of polyp detection methods, as well as describe additional experiments to further explore differences between methods. We define performance metrics and provide evaluation databases that allow comparison of multiple methodologies. Results show that convolutional neural networks are the state of the art. Nevertheless, it is also demonstrated that combining different methodologies can lead to an improved overall performance.","container-title":"IEEE Transactions on Medical Imaging","DOI":"10.1109/TMI.2017.2664042","ISSN":"1558-254X","issue":"6","page":"1231-1249","source":"IEEE Xplore","title":"Comparative Validation of Polyp Detection Methods in Video Colonoscopy: Results From the MICCAI 2015 Endoscopic Vision Challenge","title-short":"Comparative Validation of Polyp Detection Methods in Video Colonoscopy","volume":"36","author":[{"family":"Bernal","given":"Jorge"},{"family":"Tajkbaksh","given":"Nima"},{"family":"Sánchez","given":"Francisco Javier"},{"family":"Matuszewski","given":"Bogdan J."},{"family":"Chen","given":"Hao"},{"family":"Yu","given":"Lequan"},{"family":"Angermann","given":"Quentin"},{"family":"Romain","given":"Olivier"},{"family":"Rustad","given":"Bjørn"},{"family":"Balasingham","given":"Ilangko"},{"family":"Pogorelov","given":"Konstantin"},{"family":"Choi","given":"Sungbin"},{"family":"Debard","given":"Quentin"},{"family":"Maier-Hein","given":"Lena"},{"family":"Speidel","given":"Stefanie"},{"family":"Stoyanov","given":"Danail"},{"family":"Brandao","given":"Patrick"},{"family":"Córdova","given":"Henry"},{"family":"Sánchez-Montes","given":"Cristina"},{"family":"Gurudu","given":"Suryakanth R."},{"family":"Fernández-Esparrach","given":"Gloria"},{"family":"Dray","given":"Xavier"},{"family":"Liang","given":"Jianming"},{"family":"Histace","given":"Aymeric"}],"issued":{"date-parts":[["2017",6]]}}}],"schema":"https://github.com/citation-style-language/schema/raw/master/csl-citation.json"} </w:instrText>
       </w:r>
       <w:r>
         <w:fldChar w:fldCharType="separate"/>
       </w:r>
       <w:r>
-        <w:t>[12]</w:t>
+        <w:t>[14]</w:t>
       </w:r>
       <w:r>
         <w:fldChar w:fldCharType="end"/>
       </w:r>
-      <w:r>
-        <w:t xml:space="preserve"> or prostate cancer detection </w:t>
-      </w:r>
-      <w:r>
+    </w:p>
+    <w:p>
+      <w:r>
+        <w:t xml:space="preserve">Colonoscopy is the gold standard for colon cancer screening though some polyps are still </w:t>
+      </w:r>
+      <w:proofErr w:type="gramStart"/>
+      <w:r>
+        <w:t>missed</w:t>
+      </w:r>
+      <w:proofErr w:type="gramEnd"/>
+      <w:r>
+        <w:t>, thus preventing early disease detection and treatment. Several computational systems have been proposed to assist polyp detection during colonoscopy but so far without consistent evaluation. The lack of publicly available annotated databases has made it difficult to compare methods and to assess if they achieve performance levels acceptable for clinical use. The Automatic Polyp Detection sub-challenge, conducted as part of the Endoscopic Vision Challenge (http://endovis.grand-challenge.org) at the international conference on Medical Image Computing and Computer Assisted Intervention (MICCAI) in 2015, was an effort to address this need. In this paper, we report the results of this comparative evaluation of polyp detection methods, as well as describe additional experiments to further explore differences between methods. We define performance metrics and provide evaluation databases that allow comparison of multiple methodologies. Results show that convolutional neural networks are the state of the art. Nevertheless, it is also demonstrated that combining different methodologies can lead to an improved overall performance.</w:t>
+      </w:r>
+    </w:p>
+    <w:p>
+      <w:pPr>
+        <w:pStyle w:val="Heading2"/>
+      </w:pPr>
+      <w:r>
+        <w:t>Neural networks in medical applications</w:t>
+      </w:r>
+    </w:p>
+    <w:p>
+      <w:pPr>
+        <w:rPr>
+          <w:lang w:bidi="en-US"/>
+        </w:rPr>
+      </w:pPr>
+      <w:r>
+        <w:rPr>
+          <w:lang w:bidi="en-US"/>
+        </w:rPr>
         <w:fldChar w:fldCharType="begin"/>
       </w:r>
       <w:r>
-        <w:instrText xml:space="preserve"> ADDIN ZOTERO_ITEM CSL_CITATION {"citationID":"GMrRSKgp","properties":{"formattedCitation":"[13]","plainCitation":"[13]","noteIndex":0},"citationItems":[{"id":2040,"uris":["http://zotero.org/users/8619560/items/65U4CBS6"],"itemData":{"id":2040,"type":"paper-conference","abstract":"In magnetic resonance imaging (MRI), intensity inhomogeneity refers to an acquisition artifact which introduces a non-linear variation in the signal intensities within the image. Intensity inhomogeneity is known to significantly affect computerized analysis of MRI data (such as automated segmentation or classification procedures), hence requiring the application of bias field correction (BFC) algorithms to account for this artifact. Quantitative evaluation of BFC schemes is typically performed using generalized intensity-based measures (percent coefficient of variation, %CV ) or information-theoretic measures (entropy). While some investigators have previously empirically compared BFC schemes in the context of different domains (using changes in %CV and entropy to quantify improvements), no consensus has emerged as to the best BFC scheme for any given application. The motivation for this work is that the choice of a BFC scheme for a given application should be dictated by application-specific measures rather than ad hoc measures such as entropy and %CV. In this paper, we have attempted to address the problem of determining an optimal BFC algorithm in the context of a computer-aided diagnosis (CAD) scheme for prostate cancer (CaP) detection from T2-weighted (T2w) MRI. One goal of this work is to identify a BFC algorithm that will maximize the CaP classification accuracy (measured in terms of the area under the ROC curve or AUC). A secondary aim of our work is to determine whether measures such as %CV and entropy are correlated with a classifier-based objective measure (AUC). Determining the presence or absence of these correlations is important to understand whether domain independent BFC performance measures such as %CV , entropy should be used to identify the optimal BFC scheme for any given application. In order to answer these questions, we quantitatively compared 3 different popular BFC algorithms on a cohort of 10 clinical 3 Tesla prostate T2w MRI datasets (comprising 39 2D MRI slices): N3 , PABIC, and the method of Cohen et al. Results of BFC via each of the algorithms was evaluated in terms of %CV , entropy, as well as classifier AUC for CaP detection from T2w MRI. The CaP classifier was trained and evaluated on a per-pixel basis using annotations of CaP obtained via registration of T2w MRI and ex vivo whole-mount histology sections. Our results revealed that different BFC schemes resulted in a maximization of different performance measures, that is, the BFC scheme identified by minimization of %CV and entropy was not the one that maximized AUC as well. Moreover, existing BFC evaluation measures (%CV , entropy) did not correlate with AUC (application-based evaluation), but did correlate with each other, suggesting that domain-specific performance measures should be considered in making a decision regarding choice of appropriate BFC scheme. Our results also revealed that N3 provided the best correction of bias field artifacts in prostate MRI data, when the goal was to identify prostate cancer.","container-title":"Medical Imaging 2011: Computer-Aided Diagnosis","DOI":"10.1117/12.878813","event-title":"Medical Imaging 2011: Computer-Aided Diagnosis","page":"254-265","publisher":"SPIE","source":"www.spiedigitallibrary.org","title":"Empirical evaluation of bias field correction algorithms for computer-aided detection of prostate cancer on T2w MRI","URL":"https://www.spiedigitallibrary.org/conference-proceedings-of-spie/7963/79630V/Empirical-evaluation-of-bias-field-correction-algorithms-for-computer-aided/10.1117/12.878813.full","volume":"7963","author":[{"family":"Viswanath","given":"Satish"},{"family":"Palumbo","given":"Daniel"},{"family":"Chappelow","given":"Jonathan"},{"family":"Patel","given":"Pratik"},{"family":"Bloch","given":"B. Nicholas"},{"family":"Rofsky","given":"Neil"},{"family":"Lenkinski","given":"Robert"},{"family":"Genega","given":"Elizabeth"},{"family":"Madabhushi","given":"Anant"}],"accessed":{"date-parts":[["2026",3,3]]},"issued":{"date-parts":[["2011",3,15]]}}}],"schema":"https://github.com/citation-style-language/schema/raw/master/csl-citation.json"} </w:instrText>
-      </w:r>
-      <w:r>
+        <w:rPr>
+          <w:lang w:bidi="en-US"/>
+        </w:rPr>
+        <w:instrText xml:space="preserve"> ADDIN ZOTERO_ITEM CSL_CITATION {"citationID":"HgOfTpXe","properties":{"formattedCitation":"[14]","plainCitation":"[14]","noteIndex":0},"citationItems":[{"id":2028,"uris":["http://zotero.org/users/8619560/items/XYDTN3F5"],"itemData":{"id":2028,"type":"article-journal","abstract":"Colonoscopy is the gold standard for colon cancer screening though some polyps are still missed, thus preventing early disease detection and treatment. Several computational systems have been proposed to assist polyp detection during colonoscopy but so far without consistent evaluation. The lack of publicly available annotated databases has made it difficult to compare methods and to assess if they achieve performance levels acceptable for clinical use. The Automatic Polyp Detection sub-challenge, conducted as part of the Endoscopic Vision Challenge (http://endovis.grand-challenge.org) at the international conference on Medical Image Computing and Computer Assisted Intervention (MICCAI) in 2015, was an effort to address this need. In this paper, we report the results of this comparative evaluation of polyp detection methods, as well as describe additional experiments to further explore differences between methods. We define performance metrics and provide evaluation databases that allow comparison of multiple methodologies. Results show that convolutional neural networks are the state of the art. Nevertheless, it is also demonstrated that combining different methodologies can lead to an improved overall performance.","container-title":"IEEE Transactions on Medical Imaging","DOI":"10.1109/TMI.2017.2664042","ISSN":"1558-254X","issue":"6","page":"1231-1249","source":"IEEE Xplore","title":"Comparative Validation of Polyp Detection Methods in Video Colonoscopy: Results From the MICCAI 2015 Endoscopic Vision Challenge","title-short":"Comparative Validation of Polyp Detection Methods in Video Colonoscopy","volume":"36","author":[{"family":"Bernal","given":"Jorge"},{"family":"Tajkbaksh","given":"Nima"},{"family":"Sánchez","given":"Francisco Javier"},{"family":"Matuszewski","given":"Bogdan J."},{"family":"Chen","given":"Hao"},{"family":"Yu","given":"Lequan"},{"family":"Angermann","given":"Quentin"},{"family":"Romain","given":"Olivier"},{"family":"Rustad","given":"Bjørn"},{"family":"Balasingham","given":"Ilangko"},{"family":"Pogorelov","given":"Konstantin"},{"family":"Choi","given":"Sungbin"},{"family":"Debard","given":"Quentin"},{"family":"Maier-Hein","given":"Lena"},{"family":"Speidel","given":"Stefanie"},{"family":"Stoyanov","given":"Danail"},{"family":"Brandao","given":"Patrick"},{"family":"Córdova","given":"Henry"},{"family":"Sánchez-Montes","given":"Cristina"},{"family":"Gurudu","given":"Suryakanth R."},{"family":"Fernández-Esparrach","given":"Gloria"},{"family":"Dray","given":"Xavier"},{"family":"Liang","given":"Jianming"},{"family":"Histace","given":"Aymeric"}],"issued":{"date-parts":[["2017",6]]}}}],"schema":"https://github.com/citation-style-language/schema/raw/master/csl-citation.json"} </w:instrText>
+      </w:r>
+      <w:r>
+        <w:rPr>
+          <w:lang w:bidi="en-US"/>
+        </w:rPr>
         <w:fldChar w:fldCharType="separate"/>
       </w:r>
       <w:r>
-        <w:t>[13]</w:t>
-      </w:r>
-      <w:r>
+        <w:t>[14]</w:t>
+      </w:r>
+      <w:r>
+        <w:rPr>
+          <w:lang w:bidi="en-US"/>
+        </w:rPr>
         <w:fldChar w:fldCharType="end"/>
       </w:r>
-      <w:r>
-        <w:t>.</w:t>
-      </w:r>
-    </w:p>
-    <w:p>
-      <w:r>
-        <w:fldChar w:fldCharType="begin"/>
-      </w:r>
-      <w:r>
-        <w:instrText xml:space="preserve"> ADDIN ZOTERO_ITEM CSL_CITATION {"citationID":"q2SnCyAx","properties":{"formattedCitation":"[14]","plainCitation":"[14]","noteIndex":0},"citationItems":[{"id":2028,"uris":["http://zotero.org/users/8619560/items/XYDTN3F5"],"itemData":{"id":2028,"type":"article-journal","abstract":"Colonoscopy is the gold standard for colon cancer screening though some polyps are still missed, thus preventing early disease detection and treatment. Several computational systems have been proposed to assist polyp detection during colonoscopy but so far without consistent evaluation. The lack of publicly available annotated databases has made it difficult to compare methods and to assess if they achieve performance levels acceptable for clinical use. The Automatic Polyp Detection sub-challenge, conducted as part of the Endoscopic Vision Challenge (http://endovis.grand-challenge.org) at the international conference on Medical Image Computing and Computer Assisted Intervention (MICCAI) in 2015, was an effort to address this need. In this paper, we report the results of this comparative evaluation of polyp detection methods, as well as describe additional experiments to further explore differences between methods. We define performance metrics and provide evaluation databases that allow comparison of multiple methodologies. Results show that convolutional neural networks are the state of the art. Nevertheless, it is also demonstrated that combining different methodologies can lead to an improved overall performance.","container-title":"IEEE Transactions on Medical Imaging","DOI":"10.1109/TMI.2017.2664042","ISSN":"1558-254X","issue":"6","page":"1231-1249","source":"IEEE Xplore","title":"Comparative Validation of Polyp Detection Methods in Video Colonoscopy: Results From the MICCAI 2015 Endoscopic Vision Challenge","title-short":"Comparative Validation of Polyp Detection Methods in Video Colonoscopy","volume":"36","author":[{"family":"Bernal","given":"Jorge"},{"family":"Tajkbaksh","given":"Nima"},{"family":"Sánchez","given":"Francisco Javier"},{"family":"Matuszewski","given":"Bogdan J."},{"family":"Chen","given":"Hao"},{"family":"Yu","given":"Lequan"},{"family":"Angermann","given":"Quentin"},{"family":"Romain","given":"Olivier"},{"family":"Rustad","given":"Bjørn"},{"family":"Balasingham","given":"Ilangko"},{"family":"Pogorelov","given":"Konstantin"},{"family":"Choi","given":"Sungbin"},{"family":"Debard","given":"Quentin"},{"family":"Maier-Hein","given":"Lena"},{"family":"Speidel","given":"Stefanie"},{"family":"Stoyanov","given":"Danail"},{"family":"Brandao","given":"Patrick"},{"family":"Córdova","given":"Henry"},{"family":"Sánchez-Montes","given":"Cristina"},{"family":"Gurudu","given":"Suryakanth R."},{"family":"Fernández-Esparrach","given":"Gloria"},{"family":"Dray","given":"Xavier"},{"family":"Liang","given":"Jianming"},{"family":"Histace","given":"Aymeric"}],"issued":{"date-parts":[["2017",6]]}}}],"schema":"https://github.com/citation-style-language/schema/raw/master/csl-citation.json"} </w:instrText>
-      </w:r>
-      <w:r>
-        <w:fldChar w:fldCharType="separate"/>
-      </w:r>
-      <w:r>
-        <w:t>[14]</w:t>
-      </w:r>
-      <w:r>
-        <w:fldChar w:fldCharType="end"/>
-      </w:r>
-    </w:p>
-    <w:p>
-      <w:r>
-        <w:t xml:space="preserve">Colonoscopy is the gold standard for colon cancer screening though some polyps are still </w:t>
+    </w:p>
+    <w:p>
+      <w:pPr>
+        <w:rPr>
+          <w:lang w:bidi="en-US"/>
+        </w:rPr>
+      </w:pPr>
+      <w:r>
+        <w:rPr>
+          <w:lang w:bidi="en-US"/>
+        </w:rPr>
+        <w:t>This paper introduces the results and main conclusions of the MICCAI 2015 Sub-Challenge on Automatic Polyp Detection in Colonoscopy, conducted as part of the Endoscopic Vision Challenge (http://endovis.grand-challenge.org). More precisely, we present a validation study comparing the performance of different polyp detection methods covering different methodologies proposed by participating teams, providing an insight analysis of their detection yield.</w:t>
+      </w:r>
+    </w:p>
+    <w:p>
+      <w:pPr>
+        <w:rPr>
+          <w:lang w:bidi="en-US"/>
+        </w:rPr>
+      </w:pPr>
+      <w:r>
+        <w:rPr>
+          <w:lang w:bidi="en-US"/>
+        </w:rPr>
+        <w:t xml:space="preserve">We present in this paper a complete validation study comparing the performance of different polyp detection methods. Eight different teams took part in this challenge, ranging from methodologies based on hand-crafted methods to trending techniques such as CNNs. We propose the use of uniform performance metrics and common, publicly available, fully annotated databases to objectively assess their performance. The analysis of the results obtained by each method shows a superior performance by methods using machine learning as part of their methodologies, obtaining promising performance in both still frames and full-sequence sets. The global analysis of methods’ performance shows that some of them are close to </w:t>
       </w:r>
       <w:proofErr w:type="gramStart"/>
       <w:r>
-        <w:t>missed</w:t>
+        <w:rPr>
+          <w:lang w:bidi="en-US"/>
+        </w:rPr>
+        <w:t>be</w:t>
       </w:r>
       <w:proofErr w:type="gramEnd"/>
       <w:r>
-        <w:t>, thus preventing early disease detection and treatment. Several computational systems have been proposed to assist polyp detection during colonoscopy but so far without consistent evaluation. The lack of publicly available annotated databases has made it difficult to compare methods and to assess if they achieve performance levels acceptable for clinical use. The Automatic Polyp Detection sub-challenge, conducted as part of the Endoscopic Vision Challenge (http://endovis.grand-challenge.org) at the international conference on Medical Image Computing and Computer Assisted Intervention (MICCAI) in 2015, was an effort to address this need. In this paper, we report the results of this comparative evaluation of polyp detection methods, as well as describe additional experiments to further explore differences between methods. We define performance metrics and provide evaluation databases that allow comparison of multiple methodologies. Results show that convolutional neural networks are the state of the art. Nevertheless, it is also demonstrated that combining different methodologies can lead to an improved overall performance.</w:t>
-      </w:r>
-    </w:p>
-    <w:p>
-      <w:pPr>
-        <w:pStyle w:val="Heading2"/>
-      </w:pPr>
-      <w:r>
-        <w:t>Neural networks in medical applications</w:t>
-      </w:r>
-    </w:p>
-    <w:p>
-      <w:pPr>
-        <w:rPr>
-          <w:lang w:bidi="en-US"/>
-        </w:rPr>
-      </w:pPr>
-      <w:r>
-        <w:rPr>
-          <w:lang w:bidi="en-US"/>
-        </w:rPr>
-        <w:fldChar w:fldCharType="begin"/>
-      </w:r>
-      <w:r>
-        <w:rPr>
-          <w:lang w:bidi="en-US"/>
-        </w:rPr>
-        <w:instrText xml:space="preserve"> ADDIN ZOTERO_ITEM CSL_CITATION {"citationID":"HgOfTpXe","properties":{"formattedCitation":"[14]","plainCitation":"[14]","noteIndex":0},"citationItems":[{"id":2028,"uris":["http://zotero.org/users/8619560/items/XYDTN3F5"],"itemData":{"id":2028,"type":"article-journal","abstract":"Colonoscopy is the gold standard for colon cancer screening though some polyps are still missed, thus preventing early disease detection and treatment. Several computational systems have been proposed to assist polyp detection during colonoscopy but so far without consistent evaluation. The lack of publicly available annotated databases has made it difficult to compare methods and to assess if they achieve performance levels acceptable for clinical use. The Automatic Polyp Detection sub-challenge, conducted as part of the Endoscopic Vision Challenge (http://endovis.grand-challenge.org) at the international conference on Medical Image Computing and Computer Assisted Intervention (MICCAI) in 2015, was an effort to address this need. In this paper, we report the results of this comparative evaluation of polyp detection methods, as well as describe additional experiments to further explore differences between methods. We define performance metrics and provide evaluation databases that allow comparison of multiple methodologies. Results show that convolutional neural networks are the state of the art. Nevertheless, it is also demonstrated that combining different methodologies can lead to an improved overall performance.","container-title":"IEEE Transactions on Medical Imaging","DOI":"10.1109/TMI.2017.2664042","ISSN":"1558-254X","issue":"6","page":"1231-1249","source":"IEEE Xplore","title":"Comparative Validation of Polyp Detection Methods in Video Colonoscopy: Results From the MICCAI 2015 Endoscopic Vision Challenge","title-short":"Comparative Validation of Polyp Detection Methods in Video Colonoscopy","volume":"36","author":[{"family":"Bernal","given":"Jorge"},{"family":"Tajkbaksh","given":"Nima"},{"family":"Sánchez","given":"Francisco Javier"},{"family":"Matuszewski","given":"Bogdan J."},{"family":"Chen","given":"Hao"},{"family":"Yu","given":"Lequan"},{"family":"Angermann","given":"Quentin"},{"family":"Romain","given":"Olivier"},{"family":"Rustad","given":"Bjørn"},{"family":"Balasingham","given":"Ilangko"},{"family":"Pogorelov","given":"Konstantin"},{"family":"Choi","given":"Sungbin"},{"family":"Debard","given":"Quentin"},{"family":"Maier-Hein","given":"Lena"},{"family":"Speidel","given":"Stefanie"},{"family":"Stoyanov","given":"Danail"},{"family":"Brandao","given":"Patrick"},{"family":"Córdova","given":"Henry"},{"family":"Sánchez-Montes","given":"Cristina"},{"family":"Gurudu","given":"Suryakanth R."},{"family":"Fernández-Esparrach","given":"Gloria"},{"family":"Dray","given":"Xavier"},{"family":"Liang","given":"Jianming"},{"family":"Histace","given":"Aymeric"}],"issued":{"date-parts":[["2017",6]]}}}],"schema":"https://github.com/citation-style-language/schema/raw/master/csl-citation.json"} </w:instrText>
-      </w:r>
-      <w:r>
-        <w:rPr>
-          <w:lang w:bidi="en-US"/>
-        </w:rPr>
-        <w:fldChar w:fldCharType="separate"/>
-      </w:r>
-      <w:r>
-        <w:t>[14]</w:t>
-      </w:r>
-      <w:r>
-        <w:rPr>
-          <w:lang w:bidi="en-US"/>
-        </w:rPr>
-        <w:fldChar w:fldCharType="end"/>
-      </w:r>
-    </w:p>
-    <w:p>
-      <w:pPr>
-        <w:rPr>
-          <w:lang w:bidi="en-US"/>
-        </w:rPr>
-      </w:pPr>
-      <w:r>
-        <w:rPr>
-          <w:lang w:bidi="en-US"/>
-        </w:rPr>
-        <w:t>This paper introduces the results and main conclusions of the MICCAI 2015 Sub-Challenge on Automatic Polyp Detection in Colonoscopy, conducted as part of the Endoscopic Vision Challenge (http://endovis.grand-challenge.org). More precisely, we present a validation study comparing the performance of different polyp detection methods covering different methodologies proposed by participating teams, providing an insight analysis of their detection yield.</w:t>
-      </w:r>
-    </w:p>
-    <w:p>
-      <w:pPr>
-        <w:rPr>
-          <w:lang w:bidi="en-US"/>
-        </w:rPr>
-      </w:pPr>
-      <w:r>
-        <w:rPr>
-          <w:lang w:bidi="en-US"/>
-        </w:rPr>
-        <w:t xml:space="preserve">We present in this paper a complete validation study comparing the performance of different polyp detection methods. Eight different teams took part in this challenge, ranging from methodologies based on hand-crafted methods to trending techniques such as CNNs. We propose the use of uniform performance metrics and common, publicly available, fully annotated databases to objectively assess their performance. The analysis of the results obtained by each method shows a superior performance by methods using machine learning as part of their methodologies, obtaining promising performance in both still frames and full-sequence sets. The global analysis of methods’ performance shows that some of them are close to </w:t>
+        <w:rPr>
+          <w:lang w:bidi="en-US"/>
+        </w:rPr>
+        <w:t xml:space="preserve"> clinically applicable as they </w:t>
       </w:r>
       <w:proofErr w:type="gramStart"/>
       <w:r>
         <w:rPr>
           <w:lang w:bidi="en-US"/>
         </w:rPr>
-        <w:t>be</w:t>
+        <w:t>are able to</w:t>
       </w:r>
       <w:proofErr w:type="gramEnd"/>
       <w:r>
         <w:rPr>
           <w:lang w:bidi="en-US"/>
         </w:rPr>
-        <w:t xml:space="preserve"> clinically applicable as they </w:t>
+        <w:t xml:space="preserve"> detect polyps in all sequences with a small reaction time. We have also shown how there is a clear link between clinical and technical challenges and that mitigating them is key to </w:t>
       </w:r>
       <w:proofErr w:type="gramStart"/>
       <w:r>
         <w:rPr>
           <w:lang w:bidi="en-US"/>
         </w:rPr>
-        <w:t>are able to</w:t>
+        <w:t>improve</w:t>
       </w:r>
       <w:proofErr w:type="gramEnd"/>
       <w:r>
         <w:rPr>
           <w:lang w:bidi="en-US"/>
         </w:rPr>
-        <w:t xml:space="preserve"> detect polyps in all sequences with a small reaction time. We have also shown how there is a clear link between clinical and technical challenges and that mitigating them is key to </w:t>
+        <w:t xml:space="preserve"> methods’ performance. </w:t>
       </w:r>
       <w:proofErr w:type="gramStart"/>
       <w:r>
         <w:rPr>
           <w:lang w:bidi="en-US"/>
         </w:rPr>
-        <w:t>improve</w:t>
+        <w:t>As it</w:t>
       </w:r>
       <w:proofErr w:type="gramEnd"/>
       <w:r>
         <w:rPr>
           <w:lang w:bidi="en-US"/>
         </w:rPr>
-        <w:t xml:space="preserve"> methods’ performance. </w:t>
+        <w:t xml:space="preserve"> was expected, our preliminary study proves that image quality and careful mucosa inspection do have a positive impact in methods’ performance. A deep analysis of the results shows that, as different methods detect different polyps, there is room for improvement by combining some of the methods into a new solution. Going along this line, we have performed a first study on how to combine some of the methods </w:t>
       </w:r>
       <w:proofErr w:type="gramStart"/>
       <w:r>
         <w:rPr>
           <w:lang w:bidi="en-US"/>
         </w:rPr>
-        <w:t>As it</w:t>
+        <w:t>in order to</w:t>
       </w:r>
       <w:proofErr w:type="gramEnd"/>
       <w:r>
         <w:rPr>
           <w:lang w:bidi="en-US"/>
         </w:rPr>
-        <w:t xml:space="preserve"> was expected, our preliminary study proves that image quality and careful mucosa inspection do have a positive impact in methods’ performance. A deep analysis of the results shows that, as different methods detect different polyps, there is room for improvement by combining some of the methods into a new solution. Going along this line, we have performed a first study on how to combine some of the methods </w:t>
-      </w:r>
-      <w:proofErr w:type="gramStart"/>
-      <w:r>
-        <w:rPr>
-          <w:lang w:bidi="en-US"/>
-        </w:rPr>
-        <w:t>in order to</w:t>
-      </w:r>
-      <w:proofErr w:type="gramEnd"/>
-      <w:r>
-        <w:rPr>
-          <w:lang w:bidi="en-US"/>
-        </w:rPr>
-        <w:t xml:space="preserve"> improve detection performance. </w:t>
-      </w:r>
-      <w:r>
-        <w:rPr>
-          <w:lang w:bidi="en-US"/>
-        </w:rPr>
-        <w:lastRenderedPageBreak/>
-        <w:t>Preliminary results show how the combination of the best methods can be used to exceed best individual scores, indicating the potential of creating clinically useful systems integrating capabilities from several individual methods.</w:t>
+        <w:t xml:space="preserve"> improve detection performance. Preliminary results show how the combination of the best methods can be used to exceed best individual scores, indicating the potential of creating clinically useful systems integrating capabilities from several individual methods.</w:t>
       </w:r>
     </w:p>
     <w:p>
@@ -1580,143 +1658,149 @@
         <w:rPr>
           <w:lang w:bidi="en-US"/>
         </w:rPr>
+        <w:t xml:space="preserve">Several literature reviews </w:t>
+      </w:r>
+      <w:r>
+        <w:rPr>
+          <w:color w:val="FF0000"/>
+        </w:rPr>
+        <w:fldChar w:fldCharType="begin"/>
+      </w:r>
+      <w:r>
+        <w:rPr>
+          <w:color w:val="FF0000"/>
+        </w:rPr>
+        <w:instrText xml:space="preserve"> ADDIN ZOTERO_ITEM CSL_CITATION {"citationID":"LrFYZ0E7","properties":{"formattedCitation":"[20], [35], [36], [37]","plainCitation":"[20], [35], [36], [37]","noteIndex":0},"citationItems":[{"id":1578,"uris":["http://zotero.org/users/8619560/items/RP6Q4YCX"],"itemData":{"id":1578,"type":"article-journal","abstract":"Deep learning algorithms, in particular convolutional networks, have rapidly become a methodology of choice for analyzing medical images. This paper reviews the major deep learning concepts pertinent to medical image analysis and summarizes over 300 contributions to the field, most of which appeared in the last year. We survey the use of deep learning for image classification, object detection, segmentation, registration, and other tasks. Concise overviews are provided of studies per application area: neuro, retinal, pulmonary, digital pathology, breast, cardiac, abdominal, musculoskeletal. We end with a summary of the current state-of-the-art, a critical discussion of open challenges and directions for future research.","container-title":"Medical Image Analysis","DOI":"10.1016/j.media.2017.07.005","ISSN":"1361-8415","journalAbbreviation":"Medical Image Analysis","page":"60-88","source":"ScienceDirect","title":"A survey on deep learning in medical image analysis","volume":"42","author":[{"family":"Litjens","given":"Geert"},{"family":"Kooi","given":"Thijs"},{"family":"Bejnordi","given":"Babak Ehteshami"},{"family":"Setio","given":"Arnaud Arindra Adiyoso"},{"family":"Ciompi","given":"Francesco"},{"family":"Ghafoorian","given":"Mohsen"},{"family":"Laak","given":"Jeroen A. W. M.","non-dropping-particle":"van der"},{"family":"Ginneken","given":"Bram","non-dropping-particle":"van"},{"family":"Sánchez","given":"Clara I."}],"issued":{"date-parts":[["2017",12,1]]}}},{"id":1589,"uris":["http://zotero.org/users/8619560/items/BD8AFJNR"],"itemData":{"id":1589,"type":"article-journal","abstract":"Over the past decade, dramatic increases in computational power and improvement in image analysis algorithms have allowed the development of powerful computer-assisted analytical approaches to radiological data. With the recent advent of whole slide digital scanners, tissue histopathology slides can now be digitized and stored in digital image form. Consequently, digitized tissue histopathology has now become amenable to the application of computerized image analysis and machine learning techniques. Analogous to the role of computer-assisted diagnosis (CAD) algorithms in medical imaging to complement the opinion of a radiologist, CAD algorithms have begun to be developed for disease detection, diagnosis, and prognosis prediction to complement the opinion of the pathologist. In this paper, we review the recent state of the art CAD technology for digitized histopathology. This paper also briefly describes the development and application of novel image analysis technology for a few specific histopathology related problems being pursued in the United States and Europe.","container-title":"IEEE Reviews in Biomedical Engineering","DOI":"10.1109/RBME.2009.2034865","ISSN":"1941-1189","page":"147-171","source":"IEEE Xplore","title":"Histopathological Image Analysis: A Review","title-short":"Histopathological Image Analysis","volume":"2","author":[{"family":"Gurcan","given":"Metin N."},{"family":"Boucheron","given":"Laura E."},{"family":"Can","given":"Ali"},{"family":"Madabhushi","given":"Anant"},{"family":"Rajpoot","given":"Nasir M."},{"family":"Yener","given":"Bulent"}],"issued":{"date-parts":[["2009"]]}}},{"id":1591,"uris":["http://zotero.org/users/8619560/items/H8GAK338"],"itemData":{"id":1591,"type":"article-journal","abstract":"This review covers computer-assisted analysis of images in the field of medical imaging. Recent advances in machine learning, especially with regard to deep learning, are helping to identify, classify, and quantify patterns in medical images. At the core of these advances is the ability to exploit hierarchical feature representations learned solely from data, instead of features designed by hand according to domain-specific knowledge. Deep learning is rapidly becoming the state of the art, leading to enhanced performance in various medical applications. We introduce the fundamentals of deep learning methods and review their successes in image registration, detection of anatomical and cellular structures, tissue segmentation, computer-aided disease diagnosis and prognosis, and so on. We conclude by discussing research issues and suggesting future directions for further improvement.","container-title":"Annual Review of Biomedical Engineering","DOI":"10.1146/annurev-bioeng-071516-044442","ISSN":"1523-9829, 1545-4274","issue":"Volume 19, 2017","language":"en","note":"publisher: Annual Reviews","page":"221-248","source":"www.annualreviews.org","title":"Deep Learning in Medical Image Analysis","volume":"19","author":[{"family":"Shen","given":"Dinggang"},{"family":"Wu","given":"Guorong"},{"family":"Suk","given":"Heung-Il"}],"issued":{"date-parts":[["2017",6,21]]}}},{"id":1594,"uris":["http://zotero.org/users/8619560/items/G9XMQ5UL"],"itemData":{"id":1594,"type":"article-journal","abstract":"Digital pathology and microscopy image analysis is widely used for comprehensive studies of cell morphology or tissue structure. Manual assessment is labor intensive and prone to interobserver variations. Computer-aided methods, which can significantly improve the objectivity and reproducibility, have attracted a great deal of interest in recent literature. Among the pipeline of building a computer-aided diagnosis system, nucleus or cell detection and segmentation play a very important role to describe the molecular morphological information. In the past few decades, many efforts have been devoted to automated nucleus/cell detection and segmentation. In this review, we provide a comprehensive summary of the recent state-of-the-art nucleus/cell segmentation approaches on different types of microscopy images including bright-field, phase-contrast, differential interference contrast, fluorescence, and electron microscopies. In addition, we discuss the challenges for the current methods and the potential future work of nucleus/cell detection and segmentation.","container-title":"IEEE Reviews in Biomedical Engineering","DOI":"10.1109/RBME.2016.2515127","ISSN":"1941-1189","page":"234-263","source":"IEEE Xplore","title":"Robust Nucleus/Cell Detection and Segmentation in Digital Pathology and Microscopy Images: A Comprehensive Review","title-short":"Robust Nucleus/Cell Detection and Segmentation in Digital Pathology and Microscopy Images","volume":"9","author":[{"family":"Xing","given":"Fuyong"},{"family":"Yang","given":"Lin"}],"issued":{"date-parts":[["2016"]]}}}],"schema":"https://github.com/citation-style-language/schema/raw/master/csl-citation.json"} </w:instrText>
+      </w:r>
+      <w:r>
+        <w:rPr>
+          <w:color w:val="FF0000"/>
+        </w:rPr>
+        <w:fldChar w:fldCharType="separate"/>
+      </w:r>
+      <w:r>
+        <w:t>[20], [35], [36], [37]</w:t>
+      </w:r>
+      <w:r>
+        <w:rPr>
+          <w:color w:val="FF0000"/>
+        </w:rPr>
+        <w:fldChar w:fldCharType="end"/>
+      </w:r>
+      <w:r>
+        <w:rPr>
+          <w:color w:val="FF0000"/>
+        </w:rPr>
+        <w:t xml:space="preserve"> </w:t>
+      </w:r>
+      <w:r>
+        <w:rPr>
+          <w:lang w:bidi="en-US"/>
+        </w:rPr>
+        <w:t xml:space="preserve">have discussed the analysis of histopathological images including the use of machine learning algorithms. Machine learning has been identified as a promising avenue of research in histopathology due to its ability to uncover subtle patterns invisible to the human eye </w:t>
+      </w:r>
+      <w:r>
+        <w:fldChar w:fldCharType="begin"/>
+      </w:r>
+      <w:r>
+        <w:instrText xml:space="preserve"> ADDIN ZOTERO_ITEM CSL_CITATION {"citationID":"Wl92rIce","properties":{"formattedCitation":"[38], [39]","plainCitation":"[38], [39]","noteIndex":0},"citationItems":[{"id":1576,"uris":["http://zotero.org/users/8619560/items/47T72EAS"],"itemData":{"id":1576,"type":"article-journal","abstract":"Prostate cancer (PCa) is a heterogeneous disease that is manifested in a diverse range of histologic patterns and its grading is therefore associated with an inter-observer variability among pathologists, which may lead to an under- or over-treatment of patients. In this work, we develop a computer aided diagnosis system for automatic grading of PCa in digitized histopathology images using supervised learning methods. Our pipeline comprises extraction of multi-scale features that include glandular, cellular, and image-based features. A number of novel features are proposed based on intra- and inter-nuclei properties; these features are shown to be among the most important ones for classification. We train our classifiers on 333 tissue microarray (TMA) cores that were sampled from 231 radical prostatectomy patients and annotated in detail by six pathologists for different Gleason grades. We also demonstrate the TMA-trained classifier’s performance on additional 230 whole-mount slides of 56 patients, independent of the training dataset, by examining the automatic grading on manually marked lesions and randomly sampled 10% of the benign tissue. For the first time, we incorporate a probabilistic approach for supervised learning by multiple experts to account for the inter-observer grading variability. Through cross-validation experiments, the overall grading agreement of the classifier with the pathologists was found to be an unweighted kappa of 0.51, while the overall agreements between each pathologist and the others ranged from 0.45 to 0.62. These results suggest that our classifier’s performance is within the inter-observer grading variability levels across the pathologists in our study, which are also consistent with those reported in the literature.","container-title":"Medical Image Analysis","DOI":"10.1016/j.media.2018.09.005","ISSN":"1361-8415","journalAbbreviation":"Medical Image Analysis","page":"167-180","source":"ScienceDirect","title":"Automatic grading of prostate cancer in digitized histopathology images: Learning from multiple experts","title-short":"Automatic grading of prostate cancer in digitized histopathology images","volume":"50","author":[{"family":"Nir","given":"Guy"},{"family":"Hor","given":"Soheil"},{"family":"Karimi","given":"Davood"},{"family":"Fazli","given":"Ladan"},{"family":"Skinnider","given":"Brian F."},{"family":"Tavassoli","given":"Peyman"},{"family":"Turbin","given":"Dmitry"},{"family":"Villamil","given":"Carlos F."},{"family":"Wang","given":"Gang"},{"family":"Wilson","given":"R. Storey"},{"family":"Iczkowski","given":"Kenneth A."},{"family":"Lucia","given":"M. Scott"},{"family":"Black","given":"Peter C."},{"family":"Abolmaesumi","given":"Purang"},{"family":"Goldenberg","given":"S. Larry"},{"family":"Salcudean","given":"Septimiu E."}],"issued":{"date-parts":[["2018",12,1]]}}},{"id":1581,"uris":["http://zotero.org/users/8619560/items/PWWNR4L2"],"itemData":{"id":1581,"type":"article-journal","abstract":"Abundant accumulation of digital histopathological images has led to the increased demand for their analysis, such as computer-aided diagnosis using machine learning techniques. However, digital pathological images and related tasks have some issues to be considered. In this mini-review, we introduce the application of digital pathological image analysis using machine learning algorithms, address some problems specific to such analysis, and propose possible solutions.","container-title":"Computational and Structural Biotechnology Journal","DOI":"10.1016/j.csbj.2018.01.001","ISSN":"2001-0370","journalAbbreviation":"Computational and Structural Biotechnology Journal","page":"34-42","source":"ScienceDirect","title":"Machine Learning Methods for Histopathological Image Analysis","volume":"16","author":[{"family":"Komura","given":"Daisuke"},{"family":"Ishikawa","given":"Shumpei"}],"issued":{"date-parts":[["2018",1,1]]}}}],"schema":"https://github.com/citation-style-language/schema/raw/master/csl-citation.json"} </w:instrText>
+      </w:r>
+      <w:r>
+        <w:fldChar w:fldCharType="separate"/>
+      </w:r>
+      <w:r>
+        <w:t>[38], [39]</w:t>
+      </w:r>
+      <w:r>
+        <w:fldChar w:fldCharType="end"/>
+      </w:r>
+      <w:r>
+        <w:t xml:space="preserve"> </w:t>
+      </w:r>
+      <w:r>
+        <w:t xml:space="preserve">with the potential to trace cancer origins in </w:t>
+      </w:r>
+      <w:r>
+        <w:t>histo</w:t>
+      </w:r>
+      <w:r>
+        <w:t>patholog</w:t>
+      </w:r>
+      <w:r>
+        <w:t>ical</w:t>
+      </w:r>
+      <w:r>
+        <w:t xml:space="preserve"> images </w:t>
+      </w:r>
+      <w:r>
+        <w:fldChar w:fldCharType="begin"/>
+      </w:r>
+      <w:r>
+        <w:instrText xml:space="preserve"> ADDIN ZOTERO_ITEM CSL_CITATION {"citationID":"OABg0Yaq","properties":{"formattedCitation":"[38], [40]","plainCitation":"[38], [40]","noteIndex":0},"citationItems":[{"id":1576,"uris":["http://zotero.org/users/8619560/items/47T72EAS"],"itemData":{"id":1576,"type":"article-journal","abstract":"Prostate cancer (PCa) is a heterogeneous disease that is manifested in a diverse range of histologic patterns and its grading is therefore associated with an inter-observer variability among pathologists, which may lead to an under- or over-treatment of patients. In this work, we develop a computer aided diagnosis system for automatic grading of PCa in digitized histopathology images using supervised learning methods. Our pipeline comprises extraction of multi-scale features that include glandular, cellular, and image-based features. A number of novel features are proposed based on intra- and inter-nuclei properties; these features are shown to be among the most important ones for classification. We train our classifiers on 333 tissue microarray (TMA) cores that were sampled from 231 radical prostatectomy patients and annotated in detail by six pathologists for different Gleason grades. We also demonstrate the TMA-trained classifier’s performance on additional 230 whole-mount slides of 56 patients, independent of the training dataset, by examining the automatic grading on manually marked lesions and randomly sampled 10% of the benign tissue. For the first time, we incorporate a probabilistic approach for supervised learning by multiple experts to account for the inter-observer grading variability. Through cross-validation experiments, the overall grading agreement of the classifier with the pathologists was found to be an unweighted kappa of 0.51, while the overall agreements between each pathologist and the others ranged from 0.45 to 0.62. These results suggest that our classifier’s performance is within the inter-observer grading variability levels across the pathologists in our study, which are also consistent with those reported in the literature.","container-title":"Medical Image Analysis","DOI":"10.1016/j.media.2018.09.005","ISSN":"1361-8415","journalAbbreviation":"Medical Image Analysis","page":"167-180","source":"ScienceDirect","title":"Automatic grading of prostate cancer in digitized histopathology images: Learning from multiple experts","title-short":"Automatic grading of prostate cancer in digitized histopathology images","volume":"50","author":[{"family":"Nir","given":"Guy"},{"family":"Hor","given":"Soheil"},{"family":"Karimi","given":"Davood"},{"family":"Fazli","given":"Ladan"},{"family":"Skinnider","given":"Brian F."},{"family":"Tavassoli","given":"Peyman"},{"family":"Turbin","given":"Dmitry"},{"family":"Villamil","given":"Carlos F."},{"family":"Wang","given":"Gang"},{"family":"Wilson","given":"R. Storey"},{"family":"Iczkowski","given":"Kenneth A."},{"family":"Lucia","given":"M. Scott"},{"family":"Black","given":"Peter C."},{"family":"Abolmaesumi","given":"Purang"},{"family":"Goldenberg","given":"S. Larry"},{"family":"Salcudean","given":"Septimiu E."}],"issued":{"date-parts":[["2018",12,1]]}}},{"id":1584,"uris":["http://zotero.org/users/8619560/items/9CGXUYRX"],"itemData":{"id":1584,"type":"article-journal","abstract":"Cancer of unknown primary (CUP) origin is an enigmatic group of diagnoses in which the primary anatomical site of tumour origin cannot be determined1,2. This poses a considerable challenge, as modern therapeutics are predominantly specific to the primary tumour3. Recent research has focused on using genomics and transcriptomics to identify the origin of a tumour4–9. However, genomic testing is not always performed and lacks clinical penetration in low-resource settings. Here, to overcome these challenges, we present a deep-learning-based algorithm—Tumour Origin Assessment via Deep Learning (TOAD)—that can provide a differential diagnosis for the origin of the primary tumour using routinely acquired histology slides. We used whole-slide images of tumours with known primary origins to train a model that simultaneously identifies the tumour as primary or metastatic and predicts its site of origin. On our held-out test set of tumours with known primary origins, the model achieved a top-1 accuracy of 0.83 and a top-3 accuracy of 0.96, whereas on our external test set it achieved top-1 and top-3 accuracies of 0.80 and 0.93, respectively. We further curated a dataset of 317 cases of CUP for which a differential diagnosis was assigned. Our model predictions resulted in concordance for 61% of cases and a top-3 agreement of 82%. TOAD can be used as an assistive tool to assign a differential diagnosis to complicated cases of metastatic tumours and CUPs and could be used in conjunction with or in lieu of ancillary tests and extensive diagnostic work-ups to reduce the occurrence of CUP.","container-title":"Nature","DOI":"10.1038/s41586-021-03512-4","ISSN":"1476-4687","issue":"7861","language":"en","license":"2021 The Author(s), under exclusive licence to Springer Nature Limited","note":"publisher: Nature Publishing Group","page":"106-110","source":"www.nature.com","title":"AI-based pathology predicts origins for cancers of unknown primary","volume":"594","author":[{"family":"Lu","given":"Ming Y."},{"family":"Chen","given":"Tiffany Y."},{"family":"Williamson","given":"Drew F. K."},{"family":"Zhao","given":"Melissa"},{"family":"Shady","given":"Maha"},{"family":"Lipkova","given":"Jana"},{"family":"Mahmood","given":"Faisal"}],"issued":{"date-parts":[["2021",6]]}}}],"schema":"https://github.com/citation-style-language/schema/raw/master/csl-citation.json"} </w:instrText>
+      </w:r>
+      <w:r>
+        <w:fldChar w:fldCharType="separate"/>
+      </w:r>
+      <w:r>
+        <w:t>[38], [40]</w:t>
+      </w:r>
+      <w:r>
+        <w:fldChar w:fldCharType="end"/>
+      </w:r>
+      <w:r>
+        <w:rPr>
+          <w:lang w:bidi="en-US"/>
+        </w:rPr>
+        <w:t xml:space="preserve">. </w:t>
+      </w:r>
+      <w:r>
+        <w:rPr>
+          <w:lang w:bidi="en-US"/>
+        </w:rPr>
+        <w:t xml:space="preserve">Other studies </w:t>
+      </w:r>
+      <w:r>
+        <w:rPr>
+          <w:color w:val="FF0000"/>
+          <w:lang w:bidi="en-US"/>
+        </w:rPr>
+        <w:fldChar w:fldCharType="begin"/>
+      </w:r>
+      <w:r>
+        <w:rPr>
+          <w:color w:val="FF0000"/>
+          <w:lang w:bidi="en-US"/>
+        </w:rPr>
+        <w:instrText xml:space="preserve"> ADDIN ZOTERO_ITEM CSL_CITATION {"citationID":"0JjoMiqG","properties":{"formattedCitation":"[15]","plainCitation":"[15]","noteIndex":0},"citationItems":[{"id":"GuItfQo8/xyD9IiAT","uris":["http://zotero.org/users/8619560/items/EEYNX9AD"],"itemData":{"id":1371,"type":"webpage","abstract":"Biomedical image segmentation plays a vital role in diagnosis of diseases across various organs. Deep learning-based object detection methods are commonly used for such segmentation. There exists an extensive research in this topic. However, there is no standard review on this topic. Existing surveys often lack a standardized approach or focus on broader segmentation techniques. In this paper, we conducted a systematic literature review (SLR), collected and analysed 148 articles that explore deep learning object detection methods for biomedical image segmentation. We critically analyzed these methods, identified the key challenges, and discussed the future directions. From the selected articles we extracted the results including the deep learning models, targeted imaging modalities, targeted diseases, and the metrics for the analysis of the methods. The results have been presented in tabular and/or charted forms. The results are presented in three major categories including two stage detection models, one stage detection models and point-based detection models. Each article is individually analyzed along with its pros and cons. Finally, we discuss open challenges, potential benefits, and future research directions. This SLR aims to provide the research community with a quick yet deeper understanding of these segmentation models, ultimately facilitating the development of more powerful solutions for biomedical image analysis.","container-title":"arXiv.org","language":"en","title":"Biomedical Image Segmentation: A Systematic Literature Review of Deep Learning Based Object Detection Methods","title-short":"Biomedical Image Segmentation","URL":"https://arxiv.org/abs/2408.03393v2","author":[{"family":"Wahid","given":"Fazli"},{"family":"Ma","given":"Yingliang"},{"family":"Khan","given":"Dawar"},{"family":"Aamir","given":"Muhammad"},{"family":"Bukhari","given":"Syed U. K."}],"accessed":{"date-parts":[["2025",6,3]]},"issued":{"date-parts":[["2024",8,6]]}}}],"schema":"https://github.com/citation-style-language/schema/raw/master/csl-citation.json"} </w:instrText>
+      </w:r>
+      <w:r>
+        <w:rPr>
+          <w:color w:val="FF0000"/>
+          <w:lang w:bidi="en-US"/>
+        </w:rPr>
+        <w:fldChar w:fldCharType="separate"/>
+      </w:r>
+      <w:r>
+        <w:t>[15]</w:t>
+      </w:r>
+      <w:r>
+        <w:rPr>
+          <w:color w:val="FF0000"/>
+        </w:rPr>
+        <w:fldChar w:fldCharType="end"/>
+      </w:r>
+      <w:r>
+        <w:rPr>
+          <w:lang w:bidi="en-US"/>
+        </w:rPr>
+        <w:t xml:space="preserve"> have identified the YOLO family of models as the most </w:t>
+      </w:r>
+      <w:r>
+        <w:rPr>
+          <w:lang w:bidi="en-US"/>
+        </w:rPr>
         <w:lastRenderedPageBreak/>
-        <w:t xml:space="preserve">Several literature reviews </w:t>
-      </w:r>
-      <w:r>
-        <w:rPr>
-          <w:color w:val="FF0000"/>
-        </w:rPr>
-        <w:fldChar w:fldCharType="begin"/>
-      </w:r>
-      <w:r>
-        <w:rPr>
-          <w:color w:val="FF0000"/>
-        </w:rPr>
-        <w:instrText xml:space="preserve"> ADDIN ZOTERO_ITEM CSL_CITATION {"citationID":"LrFYZ0E7","properties":{"formattedCitation":"[20], [35], [36], [37]","plainCitation":"[20], [35], [36], [37]","noteIndex":0},"citationItems":[{"id":1578,"uris":["http://zotero.org/users/8619560/items/RP6Q4YCX"],"itemData":{"id":1578,"type":"article-journal","abstract":"Deep learning algorithms, in particular convolutional networks, have rapidly become a methodology of choice for analyzing medical images. This paper reviews the major deep learning concepts pertinent to medical image analysis and summarizes over 300 contributions to the field, most of which appeared in the last year. We survey the use of deep learning for image classification, object detection, segmentation, registration, and other tasks. Concise overviews are provided of studies per application area: neuro, retinal, pulmonary, digital pathology, breast, cardiac, abdominal, musculoskeletal. We end with a summary of the current state-of-the-art, a critical discussion of open challenges and directions for future research.","container-title":"Medical Image Analysis","DOI":"10.1016/j.media.2017.07.005","ISSN":"1361-8415","journalAbbreviation":"Medical Image Analysis","page":"60-88","source":"ScienceDirect","title":"A survey on deep learning in medical image analysis","volume":"42","author":[{"family":"Litjens","given":"Geert"},{"family":"Kooi","given":"Thijs"},{"family":"Bejnordi","given":"Babak Ehteshami"},{"family":"Setio","given":"Arnaud Arindra Adiyoso"},{"family":"Ciompi","given":"Francesco"},{"family":"Ghafoorian","given":"Mohsen"},{"family":"Laak","given":"Jeroen A. W. M.","non-dropping-particle":"van der"},{"family":"Ginneken","given":"Bram","non-dropping-particle":"van"},{"family":"Sánchez","given":"Clara I."}],"issued":{"date-parts":[["2017",12,1]]}}},{"id":1589,"uris":["http://zotero.org/users/8619560/items/BD8AFJNR"],"itemData":{"id":1589,"type":"article-journal","abstract":"Over the past decade, dramatic increases in computational power and improvement in image analysis algorithms have allowed the development of powerful computer-assisted analytical approaches to radiological data. With the recent advent of whole slide digital scanners, tissue histopathology slides can now be digitized and stored in digital image form. Consequently, digitized tissue histopathology has now become amenable to the application of computerized image analysis and machine learning techniques. Analogous to the role of computer-assisted diagnosis (CAD) algorithms in medical imaging to complement the opinion of a radiologist, CAD algorithms have begun to be developed for disease detection, diagnosis, and prognosis prediction to complement the opinion of the pathologist. In this paper, we review the recent state of the art CAD technology for digitized histopathology. This paper also briefly describes the development and application of novel image analysis technology for a few specific histopathology related problems being pursued in the United States and Europe.","container-title":"IEEE Reviews in Biomedical Engineering","DOI":"10.1109/RBME.2009.2034865","ISSN":"1941-1189","page":"147-171","source":"IEEE Xplore","title":"Histopathological Image Analysis: A Review","title-short":"Histopathological Image Analysis","volume":"2","author":[{"family":"Gurcan","given":"Metin N."},{"family":"Boucheron","given":"Laura E."},{"family":"Can","given":"Ali"},{"family":"Madabhushi","given":"Anant"},{"family":"Rajpoot","given":"Nasir M."},{"family":"Yener","given":"Bulent"}],"issued":{"date-parts":[["2009"]]}}},{"id":1591,"uris":["http://zotero.org/users/8619560/items/H8GAK338"],"itemData":{"id":1591,"type":"article-journal","abstract":"This review covers computer-assisted analysis of images in the field of medical imaging. Recent advances in machine learning, especially with regard to deep learning, are helping to identify, classify, and quantify patterns in medical images. At the core of these advances is the ability to exploit hierarchical feature representations learned solely from data, instead of features designed by hand according to domain-specific knowledge. Deep learning is rapidly becoming the state of the art, leading to enhanced performance in various medical applications. We introduce the fundamentals of deep learning methods and review their successes in image registration, detection of anatomical and cellular structures, tissue segmentation, computer-aided disease diagnosis and prognosis, and so on. We conclude by discussing research issues and suggesting future directions for further improvement.","container-title":"Annual Review of Biomedical Engineering","DOI":"10.1146/annurev-bioeng-071516-044442","ISSN":"1523-9829, 1545-4274","issue":"Volume 19, 2017","language":"en","note":"publisher: Annual Reviews","page":"221-248","source":"www.annualreviews.org","title":"Deep Learning in Medical Image Analysis","volume":"19","author":[{"family":"Shen","given":"Dinggang"},{"family":"Wu","given":"Guorong"},{"family":"Suk","given":"Heung-Il"}],"issued":{"date-parts":[["2017",6,21]]}}},{"id":1594,"uris":["http://zotero.org/users/8619560/items/G9XMQ5UL"],"itemData":{"id":1594,"type":"article-journal","abstract":"Digital pathology and microscopy image analysis is widely used for comprehensive studies of cell morphology or tissue structure. Manual assessment is labor intensive and prone to interobserver variations. Computer-aided methods, which can significantly improve the objectivity and reproducibility, have attracted a great deal of interest in recent literature. Among the pipeline of building a computer-aided diagnosis system, nucleus or cell detection and segmentation play a very important role to describe the molecular morphological information. In the past few decades, many efforts have been devoted to automated nucleus/cell detection and segmentation. In this review, we provide a comprehensive summary of the recent state-of-the-art nucleus/cell segmentation approaches on different types of microscopy images including bright-field, phase-contrast, differential interference contrast, fluorescence, and electron microscopies. In addition, we discuss the challenges for the current methods and the potential future work of nucleus/cell detection and segmentation.","container-title":"IEEE Reviews in Biomedical Engineering","DOI":"10.1109/RBME.2016.2515127","ISSN":"1941-1189","page":"234-263","source":"IEEE Xplore","title":"Robust Nucleus/Cell Detection and Segmentation in Digital Pathology and Microscopy Images: A Comprehensive Review","title-short":"Robust Nucleus/Cell Detection and Segmentation in Digital Pathology and Microscopy Images","volume":"9","author":[{"family":"Xing","given":"Fuyong"},{"family":"Yang","given":"Lin"}],"issued":{"date-parts":[["2016"]]}}}],"schema":"https://github.com/citation-style-language/schema/raw/master/csl-citation.json"} </w:instrText>
-      </w:r>
-      <w:r>
-        <w:rPr>
-          <w:color w:val="FF0000"/>
-        </w:rPr>
-        <w:fldChar w:fldCharType="separate"/>
-      </w:r>
-      <w:r>
-        <w:t>[20], [35], [36], [37]</w:t>
-      </w:r>
-      <w:r>
-        <w:rPr>
-          <w:color w:val="FF0000"/>
-        </w:rPr>
-        <w:fldChar w:fldCharType="end"/>
-      </w:r>
-      <w:r>
-        <w:rPr>
-          <w:color w:val="FF0000"/>
-        </w:rPr>
-        <w:t xml:space="preserve"> </w:t>
-      </w:r>
-      <w:r>
-        <w:rPr>
-          <w:lang w:bidi="en-US"/>
-        </w:rPr>
-        <w:t xml:space="preserve">have discussed the analysis of histopathological images including the use of machine learning algorithms. Machine learning has been identified as a promising avenue of research in histopathology due to its ability to uncover subtle patterns invisible to the human eye </w:t>
-      </w:r>
-      <w:r>
-        <w:fldChar w:fldCharType="begin"/>
-      </w:r>
-      <w:r>
-        <w:instrText xml:space="preserve"> ADDIN ZOTERO_ITEM CSL_CITATION {"citationID":"Wl92rIce","properties":{"formattedCitation":"[38], [39]","plainCitation":"[38], [39]","noteIndex":0},"citationItems":[{"id":1576,"uris":["http://zotero.org/users/8619560/items/47T72EAS"],"itemData":{"id":1576,"type":"article-journal","abstract":"Prostate cancer (PCa) is a heterogeneous disease that is manifested in a diverse range of histologic patterns and its grading is therefore associated with an inter-observer variability among pathologists, which may lead to an under- or over-treatment of patients. In this work, we develop a computer aided diagnosis system for automatic grading of PCa in digitized histopathology images using supervised learning methods. Our pipeline comprises extraction of multi-scale features that include glandular, cellular, and image-based features. A number of novel features are proposed based on intra- and inter-nuclei properties; these features are shown to be among the most important ones for classification. We train our classifiers on 333 tissue microarray (TMA) cores that were sampled from 231 radical prostatectomy patients and annotated in detail by six pathologists for different Gleason grades. We also demonstrate the TMA-trained classifier’s performance on additional 230 whole-mount slides of 56 patients, independent of the training dataset, by examining the automatic grading on manually marked lesions and randomly sampled 10% of the benign tissue. For the first time, we incorporate a probabilistic approach for supervised learning by multiple experts to account for the inter-observer grading variability. Through cross-validation experiments, the overall grading agreement of the classifier with the pathologists was found to be an unweighted kappa of 0.51, while the overall agreements between each pathologist and the others ranged from 0.45 to 0.62. These results suggest that our classifier’s performance is within the inter-observer grading variability levels across the pathologists in our study, which are also consistent with those reported in the literature.","container-title":"Medical Image Analysis","DOI":"10.1016/j.media.2018.09.005","ISSN":"1361-8415","journalAbbreviation":"Medical Image Analysis","page":"167-180","source":"ScienceDirect","title":"Automatic grading of prostate cancer in digitized histopathology images: Learning from multiple experts","title-short":"Automatic grading of prostate cancer in digitized histopathology images","volume":"50","author":[{"family":"Nir","given":"Guy"},{"family":"Hor","given":"Soheil"},{"family":"Karimi","given":"Davood"},{"family":"Fazli","given":"Ladan"},{"family":"Skinnider","given":"Brian F."},{"family":"Tavassoli","given":"Peyman"},{"family":"Turbin","given":"Dmitry"},{"family":"Villamil","given":"Carlos F."},{"family":"Wang","given":"Gang"},{"family":"Wilson","given":"R. Storey"},{"family":"Iczkowski","given":"Kenneth A."},{"family":"Lucia","given":"M. Scott"},{"family":"Black","given":"Peter C."},{"family":"Abolmaesumi","given":"Purang"},{"family":"Goldenberg","given":"S. Larry"},{"family":"Salcudean","given":"Septimiu E."}],"issued":{"date-parts":[["2018",12,1]]}}},{"id":1581,"uris":["http://zotero.org/users/8619560/items/PWWNR4L2"],"itemData":{"id":1581,"type":"article-journal","abstract":"Abundant accumulation of digital histopathological images has led to the increased demand for their analysis, such as computer-aided diagnosis using machine learning techniques. However, digital pathological images and related tasks have some issues to be considered. In this mini-review, we introduce the application of digital pathological image analysis using machine learning algorithms, address some problems specific to such analysis, and propose possible solutions.","container-title":"Computational and Structural Biotechnology Journal","DOI":"10.1016/j.csbj.2018.01.001","ISSN":"2001-0370","journalAbbreviation":"Computational and Structural Biotechnology Journal","page":"34-42","source":"ScienceDirect","title":"Machine Learning Methods for Histopathological Image Analysis","volume":"16","author":[{"family":"Komura","given":"Daisuke"},{"family":"Ishikawa","given":"Shumpei"}],"issued":{"date-parts":[["2018",1,1]]}}}],"schema":"https://github.com/citation-style-language/schema/raw/master/csl-citation.json"} </w:instrText>
-      </w:r>
-      <w:r>
-        <w:fldChar w:fldCharType="separate"/>
-      </w:r>
-      <w:r>
-        <w:t>[38], [39]</w:t>
-      </w:r>
-      <w:r>
-        <w:fldChar w:fldCharType="end"/>
-      </w:r>
-      <w:r>
-        <w:t xml:space="preserve"> </w:t>
-      </w:r>
-      <w:r>
-        <w:t xml:space="preserve">with the potential to trace cancer origins in </w:t>
-      </w:r>
-      <w:r>
-        <w:t>histo</w:t>
-      </w:r>
-      <w:r>
-        <w:t>patholog</w:t>
-      </w:r>
-      <w:r>
-        <w:t>ical</w:t>
-      </w:r>
-      <w:r>
-        <w:t xml:space="preserve"> images </w:t>
-      </w:r>
-      <w:r>
-        <w:fldChar w:fldCharType="begin"/>
-      </w:r>
-      <w:r>
-        <w:instrText xml:space="preserve"> ADDIN ZOTERO_ITEM CSL_CITATION {"citationID":"OABg0Yaq","properties":{"formattedCitation":"[38], [40]","plainCitation":"[38], [40]","noteIndex":0},"citationItems":[{"id":1576,"uris":["http://zotero.org/users/8619560/items/47T72EAS"],"itemData":{"id":1576,"type":"article-journal","abstract":"Prostate cancer (PCa) is a heterogeneous disease that is manifested in a diverse range of histologic patterns and its grading is therefore associated with an inter-observer variability among pathologists, which may lead to an under- or over-treatment of patients. In this work, we develop a computer aided diagnosis system for automatic grading of PCa in digitized histopathology images using supervised learning methods. Our pipeline comprises extraction of multi-scale features that include glandular, cellular, and image-based features. A number of novel features are proposed based on intra- and inter-nuclei properties; these features are shown to be among the most important ones for classification. We train our classifiers on 333 tissue microarray (TMA) cores that were sampled from 231 radical prostatectomy patients and annotated in detail by six pathologists for different Gleason grades. We also demonstrate the TMA-trained classifier’s performance on additional 230 whole-mount slides of 56 patients, independent of the training dataset, by examining the automatic grading on manually marked lesions and randomly sampled 10% of the benign tissue. For the first time, we incorporate a probabilistic approach for supervised learning by multiple experts to account for the inter-observer grading variability. Through cross-validation experiments, the overall grading agreement of the classifier with the pathologists was found to be an unweighted kappa of 0.51, while the overall agreements between each pathologist and the others ranged from 0.45 to 0.62. These results suggest that our classifier’s performance is within the inter-observer grading variability levels across the pathologists in our study, which are also consistent with those reported in the literature.","container-title":"Medical Image Analysis","DOI":"10.1016/j.media.2018.09.005","ISSN":"1361-8415","journalAbbreviation":"Medical Image Analysis","page":"167-180","source":"ScienceDirect","title":"Automatic grading of prostate cancer in digitized histopathology images: Learning from multiple experts","title-short":"Automatic grading of prostate cancer in digitized histopathology images","volume":"50","author":[{"family":"Nir","given":"Guy"},{"family":"Hor","given":"Soheil"},{"family":"Karimi","given":"Davood"},{"family":"Fazli","given":"Ladan"},{"family":"Skinnider","given":"Brian F."},{"family":"Tavassoli","given":"Peyman"},{"family":"Turbin","given":"Dmitry"},{"family":"Villamil","given":"Carlos F."},{"family":"Wang","given":"Gang"},{"family":"Wilson","given":"R. Storey"},{"family":"Iczkowski","given":"Kenneth A."},{"family":"Lucia","given":"M. Scott"},{"family":"Black","given":"Peter C."},{"family":"Abolmaesumi","given":"Purang"},{"family":"Goldenberg","given":"S. Larry"},{"family":"Salcudean","given":"Septimiu E."}],"issued":{"date-parts":[["2018",12,1]]}}},{"id":1584,"uris":["http://zotero.org/users/8619560/items/9CGXUYRX"],"itemData":{"id":1584,"type":"article-journal","abstract":"Cancer of unknown primary (CUP) origin is an enigmatic group of diagnoses in which the primary anatomical site of tumour origin cannot be determined1,2. This poses a considerable challenge, as modern therapeutics are predominantly specific to the primary tumour3. Recent research has focused on using genomics and transcriptomics to identify the origin of a tumour4–9. However, genomic testing is not always performed and lacks clinical penetration in low-resource settings. Here, to overcome these challenges, we present a deep-learning-based algorithm—Tumour Origin Assessment via Deep Learning (TOAD)—that can provide a differential diagnosis for the origin of the primary tumour using routinely acquired histology slides. We used whole-slide images of tumours with known primary origins to train a model that simultaneously identifies the tumour as primary or metastatic and predicts its site of origin. On our held-out test set of tumours with known primary origins, the model achieved a top-1 accuracy of 0.83 and a top-3 accuracy of 0.96, whereas on our external test set it achieved top-1 and top-3 accuracies of 0.80 and 0.93, respectively. We further curated a dataset of 317 cases of CUP for which a differential diagnosis was assigned. Our model predictions resulted in concordance for 61% of cases and a top-3 agreement of 82%. TOAD can be used as an assistive tool to assign a differential diagnosis to complicated cases of metastatic tumours and CUPs and could be used in conjunction with or in lieu of ancillary tests and extensive diagnostic work-ups to reduce the occurrence of CUP.","container-title":"Nature","DOI":"10.1038/s41586-021-03512-4","ISSN":"1476-4687","issue":"7861","language":"en","license":"2021 The Author(s), under exclusive licence to Springer Nature Limited","note":"publisher: Nature Publishing Group","page":"106-110","source":"www.nature.com","title":"AI-based pathology predicts origins for cancers of unknown primary","volume":"594","author":[{"family":"Lu","given":"Ming Y."},{"family":"Chen","given":"Tiffany Y."},{"family":"Williamson","given":"Drew F. K."},{"family":"Zhao","given":"Melissa"},{"family":"Shady","given":"Maha"},{"family":"Lipkova","given":"Jana"},{"family":"Mahmood","given":"Faisal"}],"issued":{"date-parts":[["2021",6]]}}}],"schema":"https://github.com/citation-style-language/schema/raw/master/csl-citation.json"} </w:instrText>
-      </w:r>
-      <w:r>
-        <w:fldChar w:fldCharType="separate"/>
-      </w:r>
-      <w:r>
-        <w:t>[38], [40]</w:t>
-      </w:r>
-      <w:r>
-        <w:fldChar w:fldCharType="end"/>
-      </w:r>
-      <w:r>
-        <w:rPr>
-          <w:lang w:bidi="en-US"/>
-        </w:rPr>
-        <w:t xml:space="preserve">. </w:t>
-      </w:r>
-      <w:r>
-        <w:rPr>
-          <w:lang w:bidi="en-US"/>
-        </w:rPr>
-        <w:t xml:space="preserve">Other studies </w:t>
-      </w:r>
-      <w:r>
-        <w:rPr>
-          <w:color w:val="FF0000"/>
-          <w:lang w:bidi="en-US"/>
-        </w:rPr>
-        <w:fldChar w:fldCharType="begin"/>
-      </w:r>
-      <w:r>
-        <w:rPr>
-          <w:color w:val="FF0000"/>
-          <w:lang w:bidi="en-US"/>
-        </w:rPr>
-        <w:instrText xml:space="preserve"> ADDIN ZOTERO_ITEM CSL_CITATION {"citationID":"0JjoMiqG","properties":{"formattedCitation":"[15]","plainCitation":"[15]","noteIndex":0},"citationItems":[{"id":"GuItfQo8/xyD9IiAT","uris":["http://zotero.org/users/8619560/items/EEYNX9AD"],"itemData":{"id":1371,"type":"webpage","abstract":"Biomedical image segmentation plays a vital role in diagnosis of diseases across various organs. Deep learning-based object detection methods are commonly used for such segmentation. There exists an extensive research in this topic. However, there is no standard review on this topic. Existing surveys often lack a standardized approach or focus on broader segmentation techniques. In this paper, we conducted a systematic literature review (SLR), collected and analysed 148 articles that explore deep learning object detection methods for biomedical image segmentation. We critically analyzed these methods, identified the key challenges, and discussed the future directions. From the selected articles we extracted the results including the deep learning models, targeted imaging modalities, targeted diseases, and the metrics for the analysis of the methods. The results have been presented in tabular and/or charted forms. The results are presented in three major categories including two stage detection models, one stage detection models and point-based detection models. Each article is individually analyzed along with its pros and cons. Finally, we discuss open challenges, potential benefits, and future research directions. This SLR aims to provide the research community with a quick yet deeper understanding of these segmentation models, ultimately facilitating the development of more powerful solutions for biomedical image analysis.","container-title":"arXiv.org","language":"en","title":"Biomedical Image Segmentation: A Systematic Literature Review of Deep Learning Based Object Detection Methods","title-short":"Biomedical Image Segmentation","URL":"https://arxiv.org/abs/2408.03393v2","author":[{"family":"Wahid","given":"Fazli"},{"family":"Ma","given":"Yingliang"},{"family":"Khan","given":"Dawar"},{"family":"Aamir","given":"Muhammad"},{"family":"Bukhari","given":"Syed U. K."}],"accessed":{"date-parts":[["2025",6,3]]},"issued":{"date-parts":[["2024",8,6]]}}}],"schema":"https://github.com/citation-style-language/schema/raw/master/csl-citation.json"} </w:instrText>
-      </w:r>
-      <w:r>
-        <w:rPr>
-          <w:color w:val="FF0000"/>
-          <w:lang w:bidi="en-US"/>
-        </w:rPr>
-        <w:fldChar w:fldCharType="separate"/>
-      </w:r>
-      <w:r>
-        <w:t>[15]</w:t>
-      </w:r>
-      <w:r>
-        <w:rPr>
-          <w:color w:val="FF0000"/>
-        </w:rPr>
-        <w:fldChar w:fldCharType="end"/>
-      </w:r>
-      <w:r>
-        <w:rPr>
-          <w:lang w:bidi="en-US"/>
-        </w:rPr>
-        <w:t xml:space="preserve"> have identified the YOLO family of models as the most frequently used ranging across a wide variety of medical applications such as brain tumor detection, glaucoma detection, pulmonary embolism detection, skin lesion detection, kidney disease localization and many others </w:t>
+        <w:t xml:space="preserve">frequently used ranging across a wide variety of medical applications such as brain tumor detection, glaucoma detection, pulmonary embolism detection, skin lesion detection, kidney disease localization and many others </w:t>
       </w:r>
       <w:r>
         <w:rPr>
@@ -2362,8 +2446,59 @@
         <w:rPr>
           <w:lang w:bidi="en-US"/>
         </w:rPr>
+        <w:t xml:space="preserve">In a comprehensive experimental study, Pacal et al. </w:t>
+      </w:r>
+      <w:r>
+        <w:rPr>
+          <w:lang w:bidi="en-US"/>
+        </w:rPr>
+        <w:fldChar w:fldCharType="begin"/>
+      </w:r>
+      <w:r>
+        <w:rPr>
+          <w:lang w:bidi="en-US"/>
+        </w:rPr>
+        <w:instrText xml:space="preserve"> ADDIN ZOTERO_ITEM CSL_CITATION {"citationID":"nf6dv0If","properties":{"formattedCitation":"[49]","plainCitation":"[49]","noteIndex":0},"citationItems":[{"id":2065,"uris":["http://zotero.org/users/8619560/items/4C8T5APA"],"itemData":{"id":2065,"type":"article-journal","abstract":"Colorectal cancer (CRC) is one of the common types of cancer with a high mortality rate. Colonoscopy is the gold standard for CRC screening and significantly reduces CRC mortality. However, due to many factors, the rate of missed polyps, which are the precursors of colorectal cancer, is high in practice. Therefore, many artificial intelligence-based computer-aided diagnostic systems have been presented to increase the detection rate of missed polyps. In this article, we present deep learning-based methods for reliable computer-assisted polyp detection. The proposed methods differ from state-of-the-art methods as follows. First, we improved the performances of YOLOv3 and YOLOv4 object detection algorithms by integrating Cross Stage Partial Network (CSPNet) for real-time and high-performance automatic polyp detection. Then, we utilized advanced data augmentation techniques and transfer learning to improve the performance of polyp detection. Next, for further improving the performance of polyp detection using negative samples, we substituted the Sigmoid-weighted Linear Unit (SiLU) activation functions instead of the Leaky ReLU and Mish activation functions, and Complete Intersection over Union (CIoU) as the loss function. In addition, we present a comparative analysis of these activation functions for polyp detection. We applied the proposed methods on the recently published novel datasets, which are the SUN polyp database and the PICCOLO database. Additionally, we investigated the proposed models for MICCAI Sub-Challenge on Automatic Polyp Detection in Colonoscopy dataset. The proposed methods outperformed the other studies in both real-time performance and polyp detection accuracy.","container-title":"Computers in Biology and Medicine","DOI":"10.1016/j.compbiomed.2021.105031","ISSN":"0010-4825","journalAbbreviation":"Computers in Biology and Medicine","page":"105031","source":"ScienceDirect","title":"An efficient real-time colonic polyp detection with YOLO algorithms trained by using negative samples and large datasets","volume":"141","author":[{"family":"Pacal","given":"Ishak"},{"family":"Karaman","given":"Ahmet"},{"family":"Karaboga","given":"Dervis"},{"family":"Akay","given":"Bahriye"},{"family":"Basturk","given":"Alper"},{"family":"Nalbantoglu","given":"Ufuk"},{"family":"Coskun","given":"Seymanur"}],"issued":{"date-parts":[["2022",2,1]]}}}],"schema":"https://github.com/citation-style-language/schema/raw/master/csl-citation.json"} </w:instrText>
+      </w:r>
+      <w:r>
+        <w:rPr>
+          <w:lang w:bidi="en-US"/>
+        </w:rPr>
+        <w:fldChar w:fldCharType="separate"/>
+      </w:r>
+      <w:r>
+        <w:t>[49]</w:t>
+      </w:r>
+      <w:r>
+        <w:rPr>
+          <w:lang w:bidi="en-US"/>
+        </w:rPr>
+        <w:fldChar w:fldCharType="end"/>
+      </w:r>
+      <w:r>
+        <w:rPr>
+          <w:lang w:bidi="en-US"/>
+        </w:rPr>
+        <w:t xml:space="preserve"> </w:t>
+      </w:r>
+      <w:r>
+        <w:rPr>
+          <w:lang w:bidi="en-US"/>
+        </w:rPr>
+        <w:t xml:space="preserve">assessed novel datasets, SUN and PICCOLO, using the Scaled YOLO-V4 algorithm. The results of the experimental studies indicate that the SUN and PICCOLO datasets demonstrate exceptional success in polyp detection, with the Scaled YOLO-V4 algorithm standing out as one of the most suitable object detection algorithms </w:t>
+      </w:r>
+      <w:r>
+        <w:rPr>
+          <w:lang w:bidi="en-US"/>
+        </w:rPr>
         <w:lastRenderedPageBreak/>
-        <w:t xml:space="preserve">In a comprehensive experimental study, Pacal et al. </w:t>
+        <w:t>for large-scale datasets. Durak and colleagues</w:t>
+      </w:r>
+      <w:r>
+        <w:rPr>
+          <w:lang w:bidi="en-US"/>
+        </w:rPr>
+        <w:t xml:space="preserve"> </w:t>
       </w:r>
       <w:r>
         <w:rPr>
@@ -2375,7 +2510,7 @@
         <w:rPr>
           <w:lang w:bidi="en-US"/>
         </w:rPr>
-        <w:instrText xml:space="preserve"> ADDIN ZOTERO_ITEM CSL_CITATION {"citationID":"nf6dv0If","properties":{"formattedCitation":"[49]","plainCitation":"[49]","noteIndex":0},"citationItems":[{"id":2065,"uris":["http://zotero.org/users/8619560/items/4C8T5APA"],"itemData":{"id":2065,"type":"article-journal","abstract":"Colorectal cancer (CRC) is one of the common types of cancer with a high mortality rate. Colonoscopy is the gold standard for CRC screening and significantly reduces CRC mortality. However, due to many factors, the rate of missed polyps, which are the precursors of colorectal cancer, is high in practice. Therefore, many artificial intelligence-based computer-aided diagnostic systems have been presented to increase the detection rate of missed polyps. In this article, we present deep learning-based methods for reliable computer-assisted polyp detection. The proposed methods differ from state-of-the-art methods as follows. First, we improved the performances of YOLOv3 and YOLOv4 object detection algorithms by integrating Cross Stage Partial Network (CSPNet) for real-time and high-performance automatic polyp detection. Then, we utilized advanced data augmentation techniques and transfer learning to improve the performance of polyp detection. Next, for further improving the performance of polyp detection using negative samples, we substituted the Sigmoid-weighted Linear Unit (SiLU) activation functions instead of the Leaky ReLU and Mish activation functions, and Complete Intersection over Union (CIoU) as the loss function. In addition, we present a comparative analysis of these activation functions for polyp detection. We applied the proposed methods on the recently published novel datasets, which are the SUN polyp database and the PICCOLO database. Additionally, we investigated the proposed models for MICCAI Sub-Challenge on Automatic Polyp Detection in Colonoscopy dataset. The proposed methods outperformed the other studies in both real-time performance and polyp detection accuracy.","container-title":"Computers in Biology and Medicine","DOI":"10.1016/j.compbiomed.2021.105031","ISSN":"0010-4825","journalAbbreviation":"Computers in Biology and Medicine","page":"105031","source":"ScienceDirect","title":"An efficient real-time colonic polyp detection with YOLO algorithms trained by using negative samples and large datasets","volume":"141","author":[{"family":"Pacal","given":"Ishak"},{"family":"Karaman","given":"Ahmet"},{"family":"Karaboga","given":"Dervis"},{"family":"Akay","given":"Bahriye"},{"family":"Basturk","given":"Alper"},{"family":"Nalbantoglu","given":"Ufuk"},{"family":"Coskun","given":"Seymanur"}],"issued":{"date-parts":[["2022",2,1]]}}}],"schema":"https://github.com/citation-style-language/schema/raw/master/csl-citation.json"} </w:instrText>
+        <w:instrText xml:space="preserve"> ADDIN ZOTERO_ITEM CSL_CITATION {"citationID":"bDrThQSH","properties":{"formattedCitation":"[50]","plainCitation":"[50]","noteIndex":0},"citationItems":[{"id":2067,"uris":["http://zotero.org/users/8619560/items/6NIF36Z3"],"itemData":{"id":2067,"type":"article-journal","abstract":"Gastrointestinal endoscopy is the primary method used for the diagnosis and treatment of gastric polyps. The early detection and removal of polyps is vitally important in preventing cancer development. Many studies indicate that a high workload can contribute to misdiagnosing gastric polyps, even for experienced physicians. In this study, we aimed to establish a deep learning-based computer-aided diagnosis system for automatic gastric polyp detection. A private gastric polyp dataset was generated for this purpose consisting of 2195 endoscopic images and 3031 polyp labels. Retrospective gastrointestinal endoscopy data from the Karadeniz Technical University, Farabi Hospital, were used in the study. YOLOv4, CenterNet, EfficientNet, Cross Stage ResNext50-SPP, YOLOv3, YOLOv3-SPP, Single Shot Detection, and Faster Regional CNN deep learning models were implemented and assessed to determine the most efficient model for precancerous gastric polyp detection. The dataset was split 70% and 30% for training and testing all the implemented models. YOLOv4 was determined to be the most accurate model, with an 87.95% mean average precision. We also evaluated all the deep learning models using a public gastric polyp dataset as the test data. The results show that YOLOv4 has significant potential applicability in detecting gastric polyps and can be used effectively in gastrointestinal CAD systems. Gastric Polyp Detection Process using Deep Learning with Private Dataset.","container-title":"Medical &amp; Biological Engineering &amp; Computing","DOI":"10.1007/s11517-021-02398-8","ISSN":"1741-0444","issue":"7-8","journalAbbreviation":"Med Biol Eng Comput","language":"eng","note":"PMID: 34259974","page":"1563-1574","source":"PubMed","title":"Deep neural network approaches for detecting gastric polyps in endoscopic images","volume":"59","author":[{"family":"Durak","given":"Serdar"},{"family":"Bayram","given":"Bülent"},{"family":"Bakırman","given":"Tolga"},{"family":"Erkut","given":"Murat"},{"family":"Doğan","given":"Metehan"},{"family":"Gürtürk","given":"Mert"},{"family":"Akpınar","given":"Burak"}],"issued":{"date-parts":[["2021",8]]}}}],"schema":"https://github.com/citation-style-language/schema/raw/master/csl-citation.json"} </w:instrText>
       </w:r>
       <w:r>
         <w:rPr>
@@ -2384,7 +2519,7 @@
         <w:fldChar w:fldCharType="separate"/>
       </w:r>
       <w:r>
-        <w:t>[49]</w:t>
+        <w:t>[50]</w:t>
       </w:r>
       <w:r>
         <w:rPr>
@@ -2402,7 +2537,62 @@
         <w:rPr>
           <w:lang w:bidi="en-US"/>
         </w:rPr>
-        <w:t>assessed novel datasets, SUN and PICCOLO, using the Scaled YOLO-V4 algorithm. The results of the experimental studies indicate that the SUN and PICCOLO datasets demonstrate exceptional success in polyp detection, with the Scaled YOLO-V4 algorithm standing out as one of the most suitable object detection algorithms for large-scale datasets. Durak and colleagues</w:t>
+        <w:t xml:space="preserve">conducted training on state-of-the-art object detection algorithms, including YOLO-V4, </w:t>
+      </w:r>
+      <w:proofErr w:type="spellStart"/>
+      <w:r>
+        <w:rPr>
+          <w:lang w:bidi="en-US"/>
+        </w:rPr>
+        <w:t>CenterNet</w:t>
+      </w:r>
+      <w:proofErr w:type="spellEnd"/>
+      <w:r>
+        <w:rPr>
+          <w:lang w:bidi="en-US"/>
+        </w:rPr>
+        <w:t xml:space="preserve">, </w:t>
+      </w:r>
+      <w:proofErr w:type="spellStart"/>
+      <w:r>
+        <w:rPr>
+          <w:lang w:bidi="en-US"/>
+        </w:rPr>
+        <w:t>EfficientDet</w:t>
+      </w:r>
+      <w:proofErr w:type="spellEnd"/>
+      <w:r>
+        <w:rPr>
+          <w:lang w:bidi="en-US"/>
+        </w:rPr>
+        <w:t xml:space="preserve">, and YOLO-V3, for automatic gastric polyp detection. In the experimental results, the YOLO-V4 algorithm demonstrated the highest performance compared to other methods, showcasing its effectiveness for deployment in CAD systems for automatic polyp detection. Qian et al. </w:t>
+      </w:r>
+      <w:r>
+        <w:rPr>
+          <w:lang w:bidi="en-US"/>
+        </w:rPr>
+        <w:fldChar w:fldCharType="begin"/>
+      </w:r>
+      <w:r>
+        <w:rPr>
+          <w:lang w:bidi="en-US"/>
+        </w:rPr>
+        <w:instrText xml:space="preserve"> ADDIN ZOTERO_ITEM CSL_CITATION {"citationID":"N8nKlP4B","properties":{"formattedCitation":"[51]","plainCitation":"[51]","noteIndex":0},"citationItems":[{"id":2069,"uris":["http://zotero.org/users/8619560/items/FRMMLCUM"],"itemData":{"id":2069,"type":"article-journal","abstract":"Recent years have seen deep learning algorithms such as Convolutional Neural Networks (CNNs) and their variants achieving competitive performance in the application of medical image processing. Yet their shortcomings are: (i) the need of a large collection of annotated data, and (ii) the involvement of careful design of CNN layers. In this paper, we presented a novel polyp detection architecture based on two ideas: (i) to use Conditional Generative Adversarial Network (CGAN) to expand the training datasets, specifically the Generator takes advantage of the Efficient Spatial Pyramid (ESP) and the Discriminator is based on the PatchGAN; (ii) to modify the architecture of YOLOv4 using dilated convolution and skip connections. Experiments were performed using three publicly available datasets, i.e., CVC-ClinicDB, CVC-ColonDB, and ETIS-Larib Polyp DB. Experimental results showed that our generative network outperformed U-Net and can synthesize more realistic polyp images. The modified YOLOv4 significantly improved the performance of polyp detection using the expanded dataset, with an accuracy of 92.37% and a detection rate of 17.2 frames per second.","container-title":"IEEE Sensors Journal","DOI":"10.1109/JSEN.2022.3170034","ISSN":"1558-1748","issue":"11","page":"10841-10849","source":"IEEE Xplore","title":"Automatic Polyp Detection by Combining Conditional Generative Adversarial Network and Modified You-Only-Look-Once","volume":"22","author":[{"family":"Qian","given":"Zhiqin"},{"family":"Jing","given":"Weiji"},{"family":"Lv","given":"Yi"},{"family":"Zhang","given":"Wenjun"}],"issued":{"date-parts":[["2022",6]]}}}],"schema":"https://github.com/citation-style-language/schema/raw/master/csl-citation.json"} </w:instrText>
+      </w:r>
+      <w:r>
+        <w:rPr>
+          <w:lang w:bidi="en-US"/>
+        </w:rPr>
+        <w:fldChar w:fldCharType="separate"/>
+      </w:r>
+      <w:r>
+        <w:t>[51]</w:t>
+      </w:r>
+      <w:r>
+        <w:rPr>
+          <w:lang w:bidi="en-US"/>
+        </w:rPr>
+        <w:fldChar w:fldCharType="end"/>
       </w:r>
       <w:r>
         <w:rPr>
@@ -2414,13 +2604,103 @@
         <w:rPr>
           <w:lang w:bidi="en-US"/>
         </w:rPr>
+        <w:t xml:space="preserve">proposed a method that combines GAN architectures with the YOLO-V4 object detection algorithm for robust polyp detection. Experimental evaluations were carried out on three publicly available datasets. The results indicated that the proposed method outperforms U-Net, synthesizes more realistic polyp images and significantly improves polyp detection performance. Gabriel provides a comprehensive implementation of YOLO-V4 at various precision levels (FP32, FP16, and INT8) for polyp detection. Notably, the study explores the previously untested INT8 quantization level. The research employs Darknet for YOLO-V4 training, integrates </w:t>
+      </w:r>
+      <w:proofErr w:type="spellStart"/>
+      <w:r>
+        <w:rPr>
+          <w:lang w:bidi="en-US"/>
+        </w:rPr>
+        <w:t>TensorRT</w:t>
+      </w:r>
+      <w:proofErr w:type="spellEnd"/>
+      <w:r>
+        <w:rPr>
+          <w:lang w:bidi="en-US"/>
+        </w:rPr>
+        <w:t xml:space="preserve"> for quantization and optimization (FP16 and INT8), and evaluates different data augmentation and regularization techniques on benchmark datasets of </w:t>
+      </w:r>
+      <w:proofErr w:type="spellStart"/>
+      <w:r>
+        <w:rPr>
+          <w:lang w:bidi="en-US"/>
+        </w:rPr>
+        <w:t>Etis-Larib</w:t>
+      </w:r>
+      <w:proofErr w:type="spellEnd"/>
+      <w:r>
+        <w:rPr>
+          <w:lang w:bidi="en-US"/>
+        </w:rPr>
+        <w:t xml:space="preserve"> and CVC-</w:t>
+      </w:r>
+      <w:proofErr w:type="spellStart"/>
+      <w:r>
+        <w:rPr>
+          <w:lang w:bidi="en-US"/>
+        </w:rPr>
+        <w:t>ClinicDB</w:t>
+      </w:r>
+      <w:proofErr w:type="spellEnd"/>
+      <w:r>
+        <w:rPr>
+          <w:lang w:bidi="en-US"/>
+        </w:rPr>
+        <w:t>. The study achieves commendable performance metrics, including a median average precision (</w:t>
+      </w:r>
+      <w:proofErr w:type="spellStart"/>
+      <w:r>
+        <w:rPr>
+          <w:lang w:bidi="en-US"/>
+        </w:rPr>
+        <w:t>mAP</w:t>
+      </w:r>
+      <w:proofErr w:type="spellEnd"/>
+      <w:r>
+        <w:rPr>
+          <w:lang w:bidi="en-US"/>
+        </w:rPr>
+        <w:t xml:space="preserve">) of 82.93% for </w:t>
+      </w:r>
+      <w:proofErr w:type="spellStart"/>
+      <w:r>
+        <w:rPr>
+          <w:lang w:bidi="en-US"/>
+        </w:rPr>
+        <w:t>Etis-Larib</w:t>
+      </w:r>
+      <w:proofErr w:type="spellEnd"/>
+      <w:r>
+        <w:rPr>
+          <w:lang w:bidi="en-US"/>
+        </w:rPr>
+        <w:t xml:space="preserve"> and 90.96% for CVC-</w:t>
+      </w:r>
+      <w:proofErr w:type="spellStart"/>
+      <w:r>
+        <w:rPr>
+          <w:lang w:bidi="en-US"/>
+        </w:rPr>
+        <w:t>ClinicDB</w:t>
+      </w:r>
+      <w:proofErr w:type="spellEnd"/>
+      <w:r>
+        <w:rPr>
+          <w:lang w:bidi="en-US"/>
+        </w:rPr>
+        <w:t xml:space="preserve">. The analysis encompasses GPU specifications, inference speeds, and accuracy metrics for each precision level, revealing potential regularization effects with quantization. The findings contribute valuable insights to the application of quantization, particularly in the context of larger and more complex models like YOLO-V4, strengthening the argument for its role in network regularization </w:t>
+      </w:r>
+      <w:r>
+        <w:rPr>
+          <w:lang w:bidi="en-US"/>
+        </w:rPr>
         <w:fldChar w:fldCharType="begin"/>
       </w:r>
       <w:r>
         <w:rPr>
           <w:lang w:bidi="en-US"/>
         </w:rPr>
-        <w:instrText xml:space="preserve"> ADDIN ZOTERO_ITEM CSL_CITATION {"citationID":"bDrThQSH","properties":{"formattedCitation":"[50]","plainCitation":"[50]","noteIndex":0},"citationItems":[{"id":2067,"uris":["http://zotero.org/users/8619560/items/6NIF36Z3"],"itemData":{"id":2067,"type":"article-journal","abstract":"Gastrointestinal endoscopy is the primary method used for the diagnosis and treatment of gastric polyps. The early detection and removal of polyps is vitally important in preventing cancer development. Many studies indicate that a high workload can contribute to misdiagnosing gastric polyps, even for experienced physicians. In this study, we aimed to establish a deep learning-based computer-aided diagnosis system for automatic gastric polyp detection. A private gastric polyp dataset was generated for this purpose consisting of 2195 endoscopic images and 3031 polyp labels. Retrospective gastrointestinal endoscopy data from the Karadeniz Technical University, Farabi Hospital, were used in the study. YOLOv4, CenterNet, EfficientNet, Cross Stage ResNext50-SPP, YOLOv3, YOLOv3-SPP, Single Shot Detection, and Faster Regional CNN deep learning models were implemented and assessed to determine the most efficient model for precancerous gastric polyp detection. The dataset was split 70% and 30% for training and testing all the implemented models. YOLOv4 was determined to be the most accurate model, with an 87.95% mean average precision. We also evaluated all the deep learning models using a public gastric polyp dataset as the test data. The results show that YOLOv4 has significant potential applicability in detecting gastric polyps and can be used effectively in gastrointestinal CAD systems. Gastric Polyp Detection Process using Deep Learning with Private Dataset.","container-title":"Medical &amp; Biological Engineering &amp; Computing","DOI":"10.1007/s11517-021-02398-8","ISSN":"1741-0444","issue":"7-8","journalAbbreviation":"Med Biol Eng Comput","language":"eng","note":"PMID: 34259974","page":"1563-1574","source":"PubMed","title":"Deep neural network approaches for detecting gastric polyps in endoscopic images","volume":"59","author":[{"family":"Durak","given":"Serdar"},{"family":"Bayram","given":"Bülent"},{"family":"Bakırman","given":"Tolga"},{"family":"Erkut","given":"Murat"},{"family":"Doğan","given":"Metehan"},{"family":"Gürtürk","given":"Mert"},{"family":"Akpınar","given":"Burak"}],"issued":{"date-parts":[["2021",8]]}}}],"schema":"https://github.com/citation-style-language/schema/raw/master/csl-citation.json"} </w:instrText>
+        <w:instrText xml:space="preserve"> ADDIN ZOTERO_ITEM CSL_CITATION {"citationID":"a1cm8ags419","properties":{"formattedCitation":"[52]","plainCitation":"[52]","noteIndex":0},"citationItems":[{"id":2071,"uris":["http://zotero.org/users/8619560/items/HJJWVIZW"],"itemData":{"id":2071,"type":"article-journal","abstract":"More than 900000 deaths were caused by Colorectal Cancer (CRC) in 2020. Colonoscopy is the gold standard for colorectal cancer screening, with studies concluding that colonoscopies significantly reduce mortality from CRC. It has been shown in the literature that computer-aided detection (CAD) systems can improve adenoma detection. In particular, deep learning models have shown promising results in helping physicians reduce the number of missed lesions during real-time colonoscopies. To keep up with the increase in resolution of the colonoscopies and to perform inference in real-time in smaller medical devices, faster models (i.e., models that can process images at high frame rates) are required. In this work, we use YOLOv4 to detect polyps, which are known to be CRC precursors. To further increase the inference speed of the model, achieve real-time performance, and make the model smaller, we deployed it on NVIDIA TensorRT, which optimizes and quantizes the model using different floating-point and integer representation levels down to 8-bit. Different methods of regularization, data pre-processing, and data augmentation were tested. An analysis of various data augmentation methods was conducted, where we individually tested these techniques by stacking them on top of previously used ones and assessed the improvements. The effects of transfer learning, using custom anchor boxes, the usage of different optimizers, Cross-Iteration Batch Normalization (CBN), and Distance-Intersection Over Union Non-Maximum Suppression (DIOU-NMS) were equally analyzed. We used publicly available datasets to train, test, and validate our model to facilitate comparison to other studies. To evaluate the inference speed, a publicly available video dataset was used. We achieved 82.93% for mAP, 81.44% for precision, 75.96% for recall in the Etis-Larib dataset, and 90.96% for mAP, 88.65% for precision, 87.62% for recall, 88.23% for F1, and 87.86% for F2 using the CVC-ClinicDB dataset. Using an NVIDIA RTX 2080TI graphics processing unit (GPU), a speed of approximately 98 frames per second (FPS) was obtained on three videos from the Colonoscopic video dataset. For the FP16 version of the implementation, the inference speed increased to 163 FPS. For the INT8 version of the model, the inference speed was further increased to approximately 172 FPS. An important conclusion was that for FP16 and INT8 levels of quantization, the accuracy metrics for the model did not suffer much degradation and, in some cases, even increased performance, thus suggesting that a regularization effect can occur when using quantization. This implies that the network may become smaller, faster, and more precise (which could prove to be essential for resource-constrained devices) and that quantization might also be used as a regularization technique. Also, data augmentation techniques proved crucial to overcoming the lack of labeled data, which often happens in the medical field due to privacy reasons.","container-title":"Expert Systems with Applications","DOI":"10.1016/j.eswa.2023.120834","ISSN":"0957-4174","journalAbbreviation":"Expert Systems with Applications","page":"120834","source":"ScienceDirect","title":"Highly accurate and fast YOLOv4-based polyp detection","volume":"232","author":[{"family":"Carrinho","given":"Pedro"},{"family":"Falcao","given":"Gabriel"}],"issued":{"date-parts":[["2023",12,1]]}}}],"schema":"https://github.com/citation-style-language/schema/raw/master/csl-citation.json"} </w:instrText>
       </w:r>
       <w:r>
         <w:rPr>
@@ -2429,7 +2709,7 @@
         <w:fldChar w:fldCharType="separate"/>
       </w:r>
       <w:r>
-        <w:t>[50]</w:t>
+        <w:t>[52]</w:t>
       </w:r>
       <w:r>
         <w:rPr>
@@ -2441,41 +2721,46 @@
         <w:rPr>
           <w:lang w:bidi="en-US"/>
         </w:rPr>
+        <w:t xml:space="preserve">. In </w:t>
+      </w:r>
+      <w:r>
+        <w:rPr>
+          <w:lang w:bidi="en-US"/>
+        </w:rPr>
+        <w:fldChar w:fldCharType="begin"/>
+      </w:r>
+      <w:r>
+        <w:rPr>
+          <w:lang w:bidi="en-US"/>
+        </w:rPr>
+        <w:instrText xml:space="preserve"> ADDIN ZOTERO_ITEM CSL_CITATION {"citationID":"a1r4kn4ngmu","properties":{"formattedCitation":"[53]","plainCitation":"[53]","noteIndex":0},"citationItems":[{"id":2073,"uris":["http://zotero.org/users/8619560/items/AEUXIDSS"],"itemData":{"id":2073,"type":"article-journal","abstract":"Colorectal cancer (CRC) is one of the most common and malignant types of cancer worldwide. Colonoscopy, considered the gold standard for CRC screening, allows immediate removal of polyps, which are precursors to CRC. Many computer-aided diagnosis systems (CADs) have been proposed for automatic polyp detection. Most of these systems are based on traditional machine learning algorithms and their generalization ability, sensitivity and specificity are limited. On the other hand, with the widespread use of deep learning algorithms in medical image analysis and the successful results in the analysis of colonoscopy images, especially in the early and accurate detection of polyps, these problems are eliminated in recent years. In short, deep learning algorithms and applications have gained a critical role in CAD systems for real-time autonomous polyp detection. Here, we make significant improvements to object detection algorithms to improve the performance of CAD-based real-time polyp detection systems. We integrate the artificial bee colony algorithm (ABC) into the YOLO algorithm to optimize the hyper-parameters of YOLO-based algorithms. The proposed method can be easily integrated into all YOLO algorithms such as YOLOv3, YOLOv4, Scaled-YOLOv4, YOLOv5, YOLOR and YOLOv7. The proposed method improves the performance of the Scaled-YOLOv4 algorithm with an average of more than 3% increase in mAP and a more than 2% improvement in F1 value. In addition, the most comprehensive study is conducted by evaluating the performance of all existing models in the Scaled-YOLOv4 algorithm (YOLOv4s, YOLOv4m, YOLOV4-CSP, YOLOv4-P5, YOLOV4-P6 and YOLOv4-P7) on the novel SUN and PICCOLO polyp datasets. The proposed method is the first study for the optimization of YOLO-based algorithms in the literature and makes a significant contribution to the detection accuracy.","container-title":"Applied Intelligence","DOI":"10.1007/s10489-022-04299-1","ISSN":"0924-669X","issue":"12","page":"15603–15620","source":"ACM Digital Library","title":"Hyper-parameter optimization of deep learning architectures using artificial bee colony (ABC) algorithm for high performance real-time automatic colorectal cancer (CRC) polyp detection","volume":"53","author":[{"family":"Karaman","given":"Ahmet"},{"family":"Karaboga","given":"Dervis"},{"family":"Pacal","given":"Ishak"},{"family":"Akay","given":"Bahriye"},{"family":"Basturk","given":"Alper"},{"family":"Nalbantoglu","given":"Ufuk"},{"family":"Coskun","given":"Seymanur"},{"family":"Sahin","given":"Omur"}],"issued":{"date-parts":[["2022",11,23]]}}}],"schema":"https://github.com/citation-style-language/schema/raw/master/csl-citation.json"} </w:instrText>
+      </w:r>
+      <w:r>
+        <w:rPr>
+          <w:lang w:bidi="en-US"/>
+        </w:rPr>
+        <w:fldChar w:fldCharType="separate"/>
+      </w:r>
+      <w:r>
+        <w:t>[53]</w:t>
+      </w:r>
+      <w:r>
+        <w:rPr>
+          <w:lang w:bidi="en-US"/>
+        </w:rPr>
+        <w:fldChar w:fldCharType="end"/>
+      </w:r>
+      <w:r>
+        <w:rPr>
+          <w:lang w:bidi="en-US"/>
+        </w:rPr>
         <w:t xml:space="preserve"> </w:t>
       </w:r>
       <w:r>
         <w:rPr>
           <w:lang w:bidi="en-US"/>
         </w:rPr>
-        <w:t xml:space="preserve">conducted training on state-of-the-art object detection algorithms, including YOLO-V4, </w:t>
-      </w:r>
-      <w:proofErr w:type="spellStart"/>
-      <w:r>
-        <w:rPr>
-          <w:lang w:bidi="en-US"/>
-        </w:rPr>
-        <w:t>CenterNet</w:t>
-      </w:r>
-      <w:proofErr w:type="spellEnd"/>
-      <w:r>
-        <w:rPr>
-          <w:lang w:bidi="en-US"/>
-        </w:rPr>
-        <w:t xml:space="preserve">, </w:t>
-      </w:r>
-      <w:proofErr w:type="spellStart"/>
-      <w:r>
-        <w:rPr>
-          <w:lang w:bidi="en-US"/>
-        </w:rPr>
-        <w:t>EfficientDet</w:t>
-      </w:r>
-      <w:proofErr w:type="spellEnd"/>
-      <w:r>
-        <w:rPr>
-          <w:lang w:bidi="en-US"/>
-        </w:rPr>
-        <w:t xml:space="preserve">, and YOLO-V3, for automatic gastric polyp detection. In the experimental results, the YOLO-V4 algorithm demonstrated the highest performance compared to other methods, showcasing its effectiveness for deployment in CAD systems for automatic polyp detection. Qian et al. </w:t>
+        <w:t xml:space="preserve">by Ahmet Karaman and Ishak Pacal, the study introduces a groundbreaking integration of the ABC algorithm with YOLO-based object detection algorithms, focusing on optimizing activation functions and hyperparameters—an unprecedented exploration in the literature. This integration achieves more efficient optimization in a single operation, saving time and hardware costs. Key contributions include a 3% improvement in real-time polyp detection performance with the YOLO-V5 algorithm, marking the first demonstration of real-time capabilities on SUN and PICCOLO datasets. The study thoroughly examines the influence of activation functions and hyperparameters on real-time polyp detection accuracy. The proposed method is versatile, easily applicable to any dataset and YOLO-based algorithm, tailoring parameters to optimize performance </w:t>
       </w:r>
       <w:r>
         <w:rPr>
@@ -2487,7 +2772,7 @@
         <w:rPr>
           <w:lang w:bidi="en-US"/>
         </w:rPr>
-        <w:instrText xml:space="preserve"> ADDIN ZOTERO_ITEM CSL_CITATION {"citationID":"N8nKlP4B","properties":{"formattedCitation":"[51]","plainCitation":"[51]","noteIndex":0},"citationItems":[{"id":2069,"uris":["http://zotero.org/users/8619560/items/FRMMLCUM"],"itemData":{"id":2069,"type":"article-journal","abstract":"Recent years have seen deep learning algorithms such as Convolutional Neural Networks (CNNs) and their variants achieving competitive performance in the application of medical image processing. Yet their shortcomings are: (i) the need of a large collection of annotated data, and (ii) the involvement of careful design of CNN layers. In this paper, we presented a novel polyp detection architecture based on two ideas: (i) to use Conditional Generative Adversarial Network (CGAN) to expand the training datasets, specifically the Generator takes advantage of the Efficient Spatial Pyramid (ESP) and the Discriminator is based on the PatchGAN; (ii) to modify the architecture of YOLOv4 using dilated convolution and skip connections. Experiments were performed using three publicly available datasets, i.e., CVC-ClinicDB, CVC-ColonDB, and ETIS-Larib Polyp DB. Experimental results showed that our generative network outperformed U-Net and can synthesize more realistic polyp images. The modified YOLOv4 significantly improved the performance of polyp detection using the expanded dataset, with an accuracy of 92.37% and a detection rate of 17.2 frames per second.","container-title":"IEEE Sensors Journal","DOI":"10.1109/JSEN.2022.3170034","ISSN":"1558-1748","issue":"11","page":"10841-10849","source":"IEEE Xplore","title":"Automatic Polyp Detection by Combining Conditional Generative Adversarial Network and Modified You-Only-Look-Once","volume":"22","author":[{"family":"Qian","given":"Zhiqin"},{"family":"Jing","given":"Weiji"},{"family":"Lv","given":"Yi"},{"family":"Zhang","given":"Wenjun"}],"issued":{"date-parts":[["2022",6]]}}}],"schema":"https://github.com/citation-style-language/schema/raw/master/csl-citation.json"} </w:instrText>
+        <w:instrText xml:space="preserve"> ADDIN ZOTERO_ITEM CSL_CITATION {"citationID":"a1dvnmqgpa0","properties":{"formattedCitation":"[54]","plainCitation":"[54]","noteIndex":0},"citationItems":[{"id":2074,"uris":["http://zotero.org/users/8619560/items/G5W2VDSD"],"itemData":{"id":2074,"type":"article-journal","abstract":"Colorectal cancer (CRC) is one of the most common cancer types with a high mortality rate. Colonoscopy is considered the gold standard in CRC screening, it also provides immediate removal of polyps, which are the precursors of CRC, significantly reducing CRC mortality. Polyps can be overlooked due to many factors and can progress to a fatal stage. Increasing the detection rate of missed polyps can be a turning point for CRC. Therefore, many traditional computer-aided detection (CAD) systems have been proposed, but the desired efficiency could not be obtained due to real-time detection or the limited sensitivity and specificity of the systems. In this article, we present a deep learning-based approach unlike traditional systems. This approach is basically based on 5th version of you only look once (YOLOv5) object detection algorithm and artificial bee colony (ABC) optimization algorithm. While models belonging to the YOLOv5 algorithm are used for polyp detection, the ABC algorithm is used to improve the performance of the models. The ABC algorithm is positioned to find the optimal activation functions and hyper-parameters for the YOLOv5 algorithm. The proposed method was performed on the novel Showa University and Nagoya University polyp database (SUN) dataset and PICCOLO white-light and narrow-band imaging colonoscopic dataset (PICCOLO). Experimental studies showed that the ABC algorithm successfully optimizes the YOLOv5 algorithm and offers much higher accuracy than the original YOLOv5 algorithm. The proposed method is far ahead of the existing methods in the literature in terms of speed and accuracy, with high performance in real-time polyp detection. This study is the first proposed method for optimization of activation functions and hyper-parameters for object detection algorithms.","container-title":"Expert Systems with Applications","DOI":"10.1016/j.eswa.2023.119741","ISSN":"0957-4174","journalAbbreviation":"Expert Systems with Applications","page":"119741","source":"ScienceDirect","title":"Robust real-time polyp detection system design based on YOLO algorithms by optimizing activation functions and hyper-parameters with artificial bee colony (ABC)","volume":"221","author":[{"family":"Karaman","given":"Ahmet"},{"family":"Pacal","given":"Ishak"},{"family":"Basturk","given":"Alper"},{"family":"Akay","given":"Bahriye"},{"family":"Nalbantoglu","given":"Ufuk"},{"family":"Coskun","given":"Seymanur"},{"family":"Sahin","given":"Omur"},{"family":"Karaboga","given":"Dervis"}],"issued":{"date-parts":[["2023",7,1]]}}}],"schema":"https://github.com/citation-style-language/schema/raw/master/csl-citation.json"} </w:instrText>
       </w:r>
       <w:r>
         <w:rPr>
@@ -2496,7 +2781,7 @@
         <w:fldChar w:fldCharType="separate"/>
       </w:r>
       <w:r>
-        <w:t>[51]</w:t>
+        <w:t>[54]</w:t>
       </w:r>
       <w:r>
         <w:rPr>
@@ -2508,109 +2793,106 @@
         <w:rPr>
           <w:lang w:bidi="en-US"/>
         </w:rPr>
+        <w:t>.</w:t>
+      </w:r>
+    </w:p>
+    <w:p>
+      <w:pPr>
+        <w:rPr>
+          <w:lang w:bidi="en-US"/>
+        </w:rPr>
+      </w:pPr>
+      <w:r>
+        <w:rPr>
+          <w:lang w:bidi="en-US"/>
+        </w:rPr>
+        <w:fldChar w:fldCharType="begin"/>
+      </w:r>
+      <w:r>
+        <w:rPr>
+          <w:lang w:bidi="en-US"/>
+        </w:rPr>
+        <w:instrText xml:space="preserve"> ADDIN ZOTERO_ITEM CSL_CITATION {"citationID":"kHA6v2Fg","properties":{"formattedCitation":"[2]","plainCitation":"[2]","noteIndex":0},"citationItems":[{"id":2076,"uris":["http://zotero.org/users/8619560/items/GBLG9PJ2"],"itemData":{"id":2076,"type":"article-journal","abstract":"Gastrointestinal tract disorders, including colorectal cancer (CRC), impose a significant health burden in Europe, with rising incidence rates among both young and elderly populations. Timely detection and removal of polyps, the precursors to CRC, are vital for prevention. Conventional colonoscopy, though effective, is prone to human errors. To address this, we propose an artificial intelligence-based polyp detection system using the YOLO-V8 network. We constructed a diverse dataset from multiple publicly available sources and conducted extensive evaluations. YOLO-V8 m demonstrated impressive performance, achieving 95.6% precision, 91.7% recall, and 92.4% F1-score. It outperformed other state-of-the-art models in terms of mean average precision. YOLO-V8 s offered a balance between accuracy and computational efficiency. Our research provides valuable insights into enhancing polyp detection and contributes to the advancement of computer-aided diagnosis for colorectal cancer.","container-title":"Signal, Image and Video Processing","DOI":"10.1007/s11760-023-02835-1","ISSN":"1863-1711","issue":"3","journalAbbreviation":"SIViP","language":"en","page":"2047-2058","source":"Springer Link","title":"Colorectal polyp detection in colonoscopy images using YOLO-V8 network","volume":"18","author":[{"family":"Lalinia","given":"Mehrshad"},{"family":"Sahafi","given":"Ali"}],"issued":{"date-parts":[["2024",4,1]]}}}],"schema":"https://github.com/citation-style-language/schema/raw/master/csl-citation.json"} </w:instrText>
+      </w:r>
+      <w:r>
+        <w:rPr>
+          <w:lang w:bidi="en-US"/>
+        </w:rPr>
+        <w:fldChar w:fldCharType="separate"/>
+      </w:r>
+      <w:r>
+        <w:t>[2]</w:t>
+      </w:r>
+      <w:r>
+        <w:rPr>
+          <w:lang w:bidi="en-US"/>
+        </w:rPr>
+        <w:fldChar w:fldCharType="end"/>
+      </w:r>
+      <w:r>
+        <w:rPr>
+          <w:lang w:bidi="en-US"/>
+        </w:rPr>
+        <w:t>We constructed a diverse dataset from multiple publicly available sources and conducted extensive evaluations. YOLO-V8 m demonstrated impressive performance, achieving 95.6% precision, 91.7% recall, and 92.4% F1-score. It outperformed other state-of-the-art models in terms of mean average precision. YOLO-</w:t>
+      </w:r>
+      <w:proofErr w:type="gramStart"/>
+      <w:r>
+        <w:rPr>
+          <w:lang w:bidi="en-US"/>
+        </w:rPr>
+        <w:t>V8 s</w:t>
+      </w:r>
+      <w:proofErr w:type="gramEnd"/>
+      <w:r>
+        <w:rPr>
+          <w:lang w:bidi="en-US"/>
+        </w:rPr>
+        <w:t xml:space="preserve"> offered a balance between accuracy and computational efficiency. Our research provides valuable insights into enhancing polyp detection and contributes to the advancement of computer-aided diagnosis for colorectal cancer.</w:t>
+      </w:r>
+    </w:p>
+    <w:p>
+      <w:pPr>
+        <w:rPr>
+          <w:lang w:bidi="en-US"/>
+        </w:rPr>
+      </w:pPr>
+    </w:p>
+    <w:p>
+      <w:pPr>
+        <w:rPr>
+          <w:lang w:bidi="en-US"/>
+        </w:rPr>
+      </w:pPr>
+    </w:p>
+    <w:p>
+      <w:pPr>
+        <w:rPr>
+          <w:lang w:bidi="en-US"/>
+        </w:rPr>
+      </w:pPr>
+      <w:r>
+        <w:rPr>
+          <w:lang w:bidi="en-US"/>
+        </w:rPr>
+        <w:t>PD-YOLO</w:t>
+      </w:r>
+      <w:r>
+        <w:rPr>
+          <w:lang w:bidi="en-US"/>
+        </w:rPr>
         <w:t xml:space="preserve"> </w:t>
       </w:r>
       <w:r>
         <w:rPr>
           <w:lang w:bidi="en-US"/>
         </w:rPr>
-        <w:t xml:space="preserve">proposed a method that combines GAN architectures with the YOLO-V4 object detection algorithm for robust polyp detection. Experimental evaluations were carried out on three publicly available datasets. The results indicated that the proposed method outperforms U-Net, synthesizes more realistic polyp images and significantly improves polyp detection performance. Gabriel provides a comprehensive implementation of YOLO-V4 at various precision levels (FP32, FP16, and INT8) for polyp detection. Notably, the study explores the previously untested INT8 quantization level. The research employs Darknet for YOLO-V4 training, integrates </w:t>
-      </w:r>
-      <w:proofErr w:type="spellStart"/>
-      <w:r>
-        <w:rPr>
-          <w:lang w:bidi="en-US"/>
-        </w:rPr>
-        <w:t>TensorRT</w:t>
-      </w:r>
-      <w:proofErr w:type="spellEnd"/>
-      <w:r>
-        <w:rPr>
-          <w:lang w:bidi="en-US"/>
-        </w:rPr>
-        <w:t xml:space="preserve"> for quantization and optimization (FP16 and INT8), and evaluates different data augmentation and regularization techniques on benchmark datasets of </w:t>
-      </w:r>
-      <w:proofErr w:type="spellStart"/>
-      <w:r>
-        <w:rPr>
-          <w:lang w:bidi="en-US"/>
-        </w:rPr>
-        <w:t>Etis-Larib</w:t>
-      </w:r>
-      <w:proofErr w:type="spellEnd"/>
-      <w:r>
-        <w:rPr>
-          <w:lang w:bidi="en-US"/>
-        </w:rPr>
-        <w:t xml:space="preserve"> and CVC-</w:t>
-      </w:r>
-      <w:proofErr w:type="spellStart"/>
-      <w:r>
-        <w:rPr>
-          <w:lang w:bidi="en-US"/>
-        </w:rPr>
-        <w:t>ClinicDB</w:t>
-      </w:r>
-      <w:proofErr w:type="spellEnd"/>
-      <w:r>
-        <w:rPr>
-          <w:lang w:bidi="en-US"/>
-        </w:rPr>
-        <w:t>. The study achieves commendable performance metrics, including a median average precision (</w:t>
-      </w:r>
-      <w:proofErr w:type="spellStart"/>
-      <w:r>
-        <w:rPr>
-          <w:lang w:bidi="en-US"/>
-        </w:rPr>
-        <w:t>mAP</w:t>
-      </w:r>
-      <w:proofErr w:type="spellEnd"/>
-      <w:r>
-        <w:rPr>
-          <w:lang w:bidi="en-US"/>
-        </w:rPr>
-        <w:t xml:space="preserve">) of 82.93% for </w:t>
-      </w:r>
-      <w:proofErr w:type="spellStart"/>
-      <w:r>
-        <w:rPr>
-          <w:lang w:bidi="en-US"/>
-        </w:rPr>
-        <w:t>Etis-Larib</w:t>
-      </w:r>
-      <w:proofErr w:type="spellEnd"/>
-      <w:r>
-        <w:rPr>
-          <w:lang w:bidi="en-US"/>
-        </w:rPr>
-        <w:t xml:space="preserve"> and 90.96% for CVC-</w:t>
-      </w:r>
-      <w:proofErr w:type="spellStart"/>
-      <w:r>
-        <w:rPr>
-          <w:lang w:bidi="en-US"/>
-        </w:rPr>
-        <w:t>ClinicDB</w:t>
-      </w:r>
-      <w:proofErr w:type="spellEnd"/>
-      <w:r>
-        <w:rPr>
-          <w:lang w:bidi="en-US"/>
-        </w:rPr>
-        <w:t xml:space="preserve">. The analysis encompasses GPU specifications, inference speeds, and accuracy metrics for each precision level, revealing potential regularization effects with quantization. The findings contribute valuable insights to the application of quantization, particularly in the context of larger and more complex models like YOLO-V4, strengthening the argument for its role in network regularization </w:t>
-      </w:r>
-      <w:r>
-        <w:rPr>
-          <w:lang w:bidi="en-US"/>
-        </w:rPr>
         <w:fldChar w:fldCharType="begin"/>
       </w:r>
       <w:r>
         <w:rPr>
           <w:lang w:bidi="en-US"/>
         </w:rPr>
-        <w:instrText xml:space="preserve"> ADDIN ZOTERO_ITEM CSL_CITATION {"citationID":"a1cm8ags419","properties":{"formattedCitation":"[52]","plainCitation":"[52]","noteIndex":0},"citationItems":[{"id":2071,"uris":["http://zotero.org/users/8619560/items/HJJWVIZW"],"itemData":{"id":2071,"type":"article-journal","abstract":"More than 900000 deaths were caused by Colorectal Cancer (CRC) in 2020. Colonoscopy is the gold standard for colorectal cancer screening, with studies concluding that colonoscopies significantly reduce mortality from CRC. It has been shown in the literature that computer-aided detection (CAD) systems can improve adenoma detection. In particular, deep learning models have shown promising results in helping physicians reduce the number of missed lesions during real-time colonoscopies. To keep up with the increase in resolution of the colonoscopies and to perform inference in real-time in smaller medical devices, faster models (i.e., models that can process images at high frame rates) are required. In this work, we use YOLOv4 to detect polyps, which are known to be CRC precursors. To further increase the inference speed of the model, achieve real-time performance, and make the model smaller, we deployed it on NVIDIA TensorRT, which optimizes and quantizes the model using different floating-point and integer representation levels down to 8-bit. Different methods of regularization, data pre-processing, and data augmentation were tested. An analysis of various data augmentation methods was conducted, where we individually tested these techniques by stacking them on top of previously used ones and assessed the improvements. The effects of transfer learning, using custom anchor boxes, the usage of different optimizers, Cross-Iteration Batch Normalization (CBN), and Distance-Intersection Over Union Non-Maximum Suppression (DIOU-NMS) were equally analyzed. We used publicly available datasets to train, test, and validate our model to facilitate comparison to other studies. To evaluate the inference speed, a publicly available video dataset was used. We achieved 82.93% for mAP, 81.44% for precision, 75.96% for recall in the Etis-Larib dataset, and 90.96% for mAP, 88.65% for precision, 87.62% for recall, 88.23% for F1, and 87.86% for F2 using the CVC-ClinicDB dataset. Using an NVIDIA RTX 2080TI graphics processing unit (GPU), a speed of approximately 98 frames per second (FPS) was obtained on three videos from the Colonoscopic video dataset. For the FP16 version of the implementation, the inference speed increased to 163 FPS. For the INT8 version of the model, the inference speed was further increased to approximately 172 FPS. An important conclusion was that for FP16 and INT8 levels of quantization, the accuracy metrics for the model did not suffer much degradation and, in some cases, even increased performance, thus suggesting that a regularization effect can occur when using quantization. This implies that the network may become smaller, faster, and more precise (which could prove to be essential for resource-constrained devices) and that quantization might also be used as a regularization technique. Also, data augmentation techniques proved crucial to overcoming the lack of labeled data, which often happens in the medical field due to privacy reasons.","container-title":"Expert Systems with Applications","DOI":"10.1016/j.eswa.2023.120834","ISSN":"0957-4174","journalAbbreviation":"Expert Systems with Applications","page":"120834","source":"ScienceDirect","title":"Highly accurate and fast YOLOv4-based polyp detection","volume":"232","author":[{"family":"Carrinho","given":"Pedro"},{"family":"Falcao","given":"Gabriel"}],"issued":{"date-parts":[["2023",12,1]]}}}],"schema":"https://github.com/citation-style-language/schema/raw/master/csl-citation.json"} </w:instrText>
+        <w:instrText xml:space="preserve"> ADDIN ZOTERO_ITEM CSL_CITATION {"citationID":"avv6uuqh1v","properties":{"formattedCitation":"[55]","plainCitation":"[55]","noteIndex":0},"citationItems":[{"id":2081,"uris":["http://zotero.org/users/8619560/items/UJ3JW55N"],"itemData":{"id":2081,"type":"article-journal","abstract":"In recent years, the number of patients with colon disease has increased significantly. Colon polyps are the precursor lesions of colon cancer. If not diagnosed in time, they can easily develop into colon cancer, posing a ser... | Find, read and cite all the research you need on Tech Science Press","container-title":"Computers, Materials &amp; Continua","DOI":"10.32604/cmc.2024.058467","ISSN":"1546-2218, 1546-2226","issue":"1","journalAbbreviation":"CMC","language":"en","note":"publisher: Tech Science Press","page":"913-928","source":"www.techscience.com","title":"PD-YOLO: Colon Polyp Detection Model Based on Enhanced Small-Target Feature Extraction","title-short":"PD-YOLO","volume":"82","author":[{"family":"Yu","given":"Yicong"},{"family":"Lin","given":"Kaixin"},{"family":"Hong","given":"Jiajun"},{"family":"Tsai","given":"Rong-Guei"},{"family":"Huang","given":"Yuanzhi"}],"issued":{"date-parts":[["2025"]]}}}],"schema":"https://github.com/citation-style-language/schema/raw/master/csl-citation.json"} </w:instrText>
       </w:r>
       <w:r>
         <w:rPr>
@@ -2619,7 +2901,7 @@
         <w:fldChar w:fldCharType="separate"/>
       </w:r>
       <w:r>
-        <w:t>[52]</w:t>
+        <w:t>[55]</w:t>
       </w:r>
       <w:r>
         <w:rPr>
@@ -2631,214 +2913,28 @@
         <w:rPr>
           <w:lang w:bidi="en-US"/>
         </w:rPr>
-        <w:t xml:space="preserve">. In </w:t>
-      </w:r>
-      <w:r>
-        <w:rPr>
-          <w:lang w:bidi="en-US"/>
-        </w:rPr>
-        <w:fldChar w:fldCharType="begin"/>
-      </w:r>
-      <w:r>
-        <w:rPr>
-          <w:lang w:bidi="en-US"/>
-        </w:rPr>
-        <w:instrText xml:space="preserve"> ADDIN ZOTERO_ITEM CSL_CITATION {"citationID":"a1r4kn4ngmu","properties":{"formattedCitation":"[53]","plainCitation":"[53]","noteIndex":0},"citationItems":[{"id":2073,"uris":["http://zotero.org/users/8619560/items/AEUXIDSS"],"itemData":{"id":2073,"type":"article-journal","abstract":"Colorectal cancer (CRC) is one of the most common and malignant types of cancer worldwide. Colonoscopy, considered the gold standard for CRC screening, allows immediate removal of polyps, which are precursors to CRC. Many computer-aided diagnosis systems (CADs) have been proposed for automatic polyp detection. Most of these systems are based on traditional machine learning algorithms and their generalization ability, sensitivity and specificity are limited. On the other hand, with the widespread use of deep learning algorithms in medical image analysis and the successful results in the analysis of colonoscopy images, especially in the early and accurate detection of polyps, these problems are eliminated in recent years. In short, deep learning algorithms and applications have gained a critical role in CAD systems for real-time autonomous polyp detection. Here, we make significant improvements to object detection algorithms to improve the performance of CAD-based real-time polyp detection systems. We integrate the artificial bee colony algorithm (ABC) into the YOLO algorithm to optimize the hyper-parameters of YOLO-based algorithms. The proposed method can be easily integrated into all YOLO algorithms such as YOLOv3, YOLOv4, Scaled-YOLOv4, YOLOv5, YOLOR and YOLOv7. The proposed method improves the performance of the Scaled-YOLOv4 algorithm with an average of more than 3% increase in mAP and a more than 2% improvement in F1 value. In addition, the most comprehensive study is conducted by evaluating the performance of all existing models in the Scaled-YOLOv4 algorithm (YOLOv4s, YOLOv4m, YOLOV4-CSP, YOLOv4-P5, YOLOV4-P6 and YOLOv4-P7) on the novel SUN and PICCOLO polyp datasets. The proposed method is the first study for the optimization of YOLO-based algorithms in the literature and makes a significant contribution to the detection accuracy.","container-title":"Applied Intelligence","DOI":"10.1007/s10489-022-04299-1","ISSN":"0924-669X","issue":"12","page":"15603–15620","source":"ACM Digital Library","title":"Hyper-parameter optimization of deep learning architectures using artificial bee colony (ABC) algorithm for high performance real-time automatic colorectal cancer (CRC) polyp detection","volume":"53","author":[{"family":"Karaman","given":"Ahmet"},{"family":"Karaboga","given":"Dervis"},{"family":"Pacal","given":"Ishak"},{"family":"Akay","given":"Bahriye"},{"family":"Basturk","given":"Alper"},{"family":"Nalbantoglu","given":"Ufuk"},{"family":"Coskun","given":"Seymanur"},{"family":"Sahin","given":"Omur"}],"issued":{"date-parts":[["2022",11,23]]}}}],"schema":"https://github.com/citation-style-language/schema/raw/master/csl-citation.json"} </w:instrText>
-      </w:r>
-      <w:r>
-        <w:rPr>
-          <w:lang w:bidi="en-US"/>
-        </w:rPr>
-        <w:fldChar w:fldCharType="separate"/>
-      </w:r>
-      <w:r>
-        <w:t>[53]</w:t>
-      </w:r>
-      <w:r>
-        <w:rPr>
-          <w:lang w:bidi="en-US"/>
-        </w:rPr>
-        <w:fldChar w:fldCharType="end"/>
-      </w:r>
-      <w:r>
-        <w:rPr>
-          <w:lang w:bidi="en-US"/>
-        </w:rPr>
-        <w:t xml:space="preserve"> </w:t>
-      </w:r>
-      <w:r>
-        <w:rPr>
-          <w:lang w:bidi="en-US"/>
-        </w:rPr>
-        <w:t xml:space="preserve">by Ahmet Karaman and Ishak Pacal, the study introduces a groundbreaking integration of the ABC algorithm with YOLO-based object detection algorithms, focusing on optimizing activation functions and hyperparameters—an unprecedented exploration in the literature. This integration achieves more efficient optimization in a single operation, saving time and hardware costs. Key contributions include a 3% improvement in real-time polyp detection performance with the YOLO-V5 algorithm, marking the first demonstration of real-time capabilities on SUN and PICCOLO datasets. The study thoroughly examines the influence of activation functions and hyperparameters on real-time polyp detection accuracy. The proposed method is versatile, easily applicable to any dataset and YOLO-based algorithm, tailoring parameters to optimize performance </w:t>
-      </w:r>
-      <w:r>
-        <w:rPr>
-          <w:lang w:bidi="en-US"/>
-        </w:rPr>
-        <w:fldChar w:fldCharType="begin"/>
-      </w:r>
-      <w:r>
-        <w:rPr>
-          <w:lang w:bidi="en-US"/>
-        </w:rPr>
-        <w:instrText xml:space="preserve"> ADDIN ZOTERO_ITEM CSL_CITATION {"citationID":"a1dvnmqgpa0","properties":{"formattedCitation":"[54]","plainCitation":"[54]","noteIndex":0},"citationItems":[{"id":2074,"uris":["http://zotero.org/users/8619560/items/G5W2VDSD"],"itemData":{"id":2074,"type":"article-journal","abstract":"Colorectal cancer (CRC) is one of the most common cancer types with a high mortality rate. Colonoscopy is considered the gold standard in CRC screening, it also provides immediate removal of polyps, which are the precursors of CRC, significantly reducing CRC mortality. Polyps can be overlooked due to many factors and can progress to a fatal stage. Increasing the detection rate of missed polyps can be a turning point for CRC. Therefore, many traditional computer-aided detection (CAD) systems have been proposed, but the desired efficiency could not be obtained due to real-time detection or the limited sensitivity and specificity of the systems. In this article, we present a deep learning-based approach unlike traditional systems. This approach is basically based on 5th version of you only look once (YOLOv5) object detection algorithm and artificial bee colony (ABC) optimization algorithm. While models belonging to the YOLOv5 algorithm are used for polyp detection, the ABC algorithm is used to improve the performance of the models. The ABC algorithm is positioned to find the optimal activation functions and hyper-parameters for the YOLOv5 algorithm. The proposed method was performed on the novel Showa University and Nagoya University polyp database (SUN) dataset and PICCOLO white-light and narrow-band imaging colonoscopic dataset (PICCOLO). Experimental studies showed that the ABC algorithm successfully optimizes the YOLOv5 algorithm and offers much higher accuracy than the original YOLOv5 algorithm. The proposed method is far ahead of the existing methods in the literature in terms of speed and accuracy, with high performance in real-time polyp detection. This study is the first proposed method for optimization of activation functions and hyper-parameters for object detection algorithms.","container-title":"Expert Systems with Applications","DOI":"10.1016/j.eswa.2023.119741","ISSN":"0957-4174","journalAbbreviation":"Expert Systems with Applications","page":"119741","source":"ScienceDirect","title":"Robust real-time polyp detection system design based on YOLO algorithms by optimizing activation functions and hyper-parameters with artificial bee colony (ABC)","volume":"221","author":[{"family":"Karaman","given":"Ahmet"},{"family":"Pacal","given":"Ishak"},{"family":"Basturk","given":"Alper"},{"family":"Akay","given":"Bahriye"},{"family":"Nalbantoglu","given":"Ufuk"},{"family":"Coskun","given":"Seymanur"},{"family":"Sahin","given":"Omur"},{"family":"Karaboga","given":"Dervis"}],"issued":{"date-parts":[["2023",7,1]]}}}],"schema":"https://github.com/citation-style-language/schema/raw/master/csl-citation.json"} </w:instrText>
-      </w:r>
-      <w:r>
-        <w:rPr>
-          <w:lang w:bidi="en-US"/>
-        </w:rPr>
-        <w:fldChar w:fldCharType="separate"/>
-      </w:r>
-      <w:r>
-        <w:t>[54]</w:t>
-      </w:r>
-      <w:r>
-        <w:rPr>
-          <w:lang w:bidi="en-US"/>
-        </w:rPr>
-        <w:fldChar w:fldCharType="end"/>
-      </w:r>
-      <w:r>
-        <w:rPr>
-          <w:lang w:bidi="en-US"/>
-        </w:rPr>
-        <w:t>.</w:t>
-      </w:r>
-    </w:p>
-    <w:p>
-      <w:pPr>
-        <w:rPr>
-          <w:lang w:bidi="en-US"/>
-        </w:rPr>
-      </w:pPr>
-      <w:r>
-        <w:rPr>
-          <w:lang w:bidi="en-US"/>
-        </w:rPr>
-        <w:fldChar w:fldCharType="begin"/>
-      </w:r>
-      <w:r>
-        <w:rPr>
-          <w:lang w:bidi="en-US"/>
-        </w:rPr>
-        <w:instrText xml:space="preserve"> ADDIN ZOTERO_ITEM CSL_CITATION {"citationID":"kHA6v2Fg","properties":{"formattedCitation":"[2]","plainCitation":"[2]","noteIndex":0},"citationItems":[{"id":2076,"uris":["http://zotero.org/users/8619560/items/GBLG9PJ2"],"itemData":{"id":2076,"type":"article-journal","abstract":"Gastrointestinal tract disorders, including colorectal cancer (CRC), impose a significant health burden in Europe, with rising incidence rates among both young and elderly populations. Timely detection and removal of polyps, the precursors to CRC, are vital for prevention. Conventional colonoscopy, though effective, is prone to human errors. To address this, we propose an artificial intelligence-based polyp detection system using the YOLO-V8 network. We constructed a diverse dataset from multiple publicly available sources and conducted extensive evaluations. YOLO-V8 m demonstrated impressive performance, achieving 95.6% precision, 91.7% recall, and 92.4% F1-score. It outperformed other state-of-the-art models in terms of mean average precision. YOLO-V8 s offered a balance between accuracy and computational efficiency. Our research provides valuable insights into enhancing polyp detection and contributes to the advancement of computer-aided diagnosis for colorectal cancer.","container-title":"Signal, Image and Video Processing","DOI":"10.1007/s11760-023-02835-1","ISSN":"1863-1711","issue":"3","journalAbbreviation":"SIViP","language":"en","page":"2047-2058","source":"Springer Link","title":"Colorectal polyp detection in colonoscopy images using YOLO-V8 network","volume":"18","author":[{"family":"Lalinia","given":"Mehrshad"},{"family":"Sahafi","given":"Ali"}],"issued":{"date-parts":[["2024",4,1]]}}}],"schema":"https://github.com/citation-style-language/schema/raw/master/csl-citation.json"} </w:instrText>
-      </w:r>
-      <w:r>
-        <w:rPr>
-          <w:lang w:bidi="en-US"/>
-        </w:rPr>
-        <w:fldChar w:fldCharType="separate"/>
-      </w:r>
-      <w:r>
-        <w:t>[2]</w:t>
-      </w:r>
-      <w:r>
-        <w:rPr>
-          <w:lang w:bidi="en-US"/>
-        </w:rPr>
-        <w:fldChar w:fldCharType="end"/>
-      </w:r>
-      <w:r>
-        <w:rPr>
-          <w:lang w:bidi="en-US"/>
-        </w:rPr>
-        <w:t>We constructed a diverse dataset from multiple publicly available sources and conducted extensive evaluations. YOLO-V8 m demonstrated impressive performance, achieving 95.6% precision, 91.7% recall, and 92.4% F1-score. It outperformed other state-of-the-art models in terms of mean average precision. YOLO-</w:t>
+        <w:t xml:space="preserve"> A colonoscopy is an important means of detecting colon polyps. However, in polyp imaging, due to the large differences and diverse types of polyps in size, shape, color, etc., traditional detection methods face the problem of high false positive rates, which creates problems for doctors during the diagnosis process. </w:t>
       </w:r>
       <w:proofErr w:type="gramStart"/>
       <w:r>
         <w:rPr>
           <w:lang w:bidi="en-US"/>
         </w:rPr>
-        <w:t>V8 s</w:t>
+        <w:t>In order to</w:t>
       </w:r>
       <w:proofErr w:type="gramEnd"/>
       <w:r>
         <w:rPr>
           <w:lang w:bidi="en-US"/>
         </w:rPr>
-        <w:t xml:space="preserve"> offered a balance between accuracy and computational efficiency. Our research provides valuable insights into enhancing polyp detection and contributes to the advancement of computer-aided diagnosis for colorectal cancer.</w:t>
-      </w:r>
-    </w:p>
-    <w:p>
-      <w:pPr>
-        <w:rPr>
-          <w:lang w:bidi="en-US"/>
-        </w:rPr>
-      </w:pPr>
-    </w:p>
-    <w:p>
-      <w:pPr>
-        <w:rPr>
-          <w:lang w:bidi="en-US"/>
-        </w:rPr>
-      </w:pPr>
-    </w:p>
-    <w:p>
-      <w:pPr>
-        <w:rPr>
-          <w:lang w:bidi="en-US"/>
-        </w:rPr>
-      </w:pPr>
+        <w:t xml:space="preserve"> improve the accuracy and efficiency of colon </w:t>
+      </w:r>
       <w:r>
         <w:rPr>
           <w:lang w:bidi="en-US"/>
         </w:rPr>
         <w:lastRenderedPageBreak/>
-        <w:t>PD-YOLO</w:t>
-      </w:r>
-      <w:r>
-        <w:rPr>
-          <w:lang w:bidi="en-US"/>
-        </w:rPr>
-        <w:t xml:space="preserve"> </w:t>
-      </w:r>
-      <w:r>
-        <w:rPr>
-          <w:lang w:bidi="en-US"/>
-        </w:rPr>
-        <w:fldChar w:fldCharType="begin"/>
-      </w:r>
-      <w:r>
-        <w:rPr>
-          <w:lang w:bidi="en-US"/>
-        </w:rPr>
-        <w:instrText xml:space="preserve"> ADDIN ZOTERO_ITEM CSL_CITATION {"citationID":"avv6uuqh1v","properties":{"formattedCitation":"[55]","plainCitation":"[55]","noteIndex":0},"citationItems":[{"id":2081,"uris":["http://zotero.org/users/8619560/items/UJ3JW55N"],"itemData":{"id":2081,"type":"article-journal","abstract":"In recent years, the number of patients with colon disease has increased significantly. Colon polyps are the precursor lesions of colon cancer. If not diagnosed in time, they can easily develop into colon cancer, posing a ser... | Find, read and cite all the research you need on Tech Science Press","container-title":"Computers, Materials &amp; Continua","DOI":"10.32604/cmc.2024.058467","ISSN":"1546-2218, 1546-2226","issue":"1","journalAbbreviation":"CMC","language":"en","note":"publisher: Tech Science Press","page":"913-928","source":"www.techscience.com","title":"PD-YOLO: Colon Polyp Detection Model Based on Enhanced Small-Target Feature Extraction","title-short":"PD-YOLO","volume":"82","author":[{"family":"Yu","given":"Yicong"},{"family":"Lin","given":"Kaixin"},{"family":"Hong","given":"Jiajun"},{"family":"Tsai","given":"Rong-Guei"},{"family":"Huang","given":"Yuanzhi"}],"issued":{"date-parts":[["2025"]]}}}],"schema":"https://github.com/citation-style-language/schema/raw/master/csl-citation.json"} </w:instrText>
-      </w:r>
-      <w:r>
-        <w:rPr>
-          <w:lang w:bidi="en-US"/>
-        </w:rPr>
-        <w:fldChar w:fldCharType="separate"/>
-      </w:r>
-      <w:r>
-        <w:t>[55]</w:t>
-      </w:r>
-      <w:r>
-        <w:rPr>
-          <w:lang w:bidi="en-US"/>
-        </w:rPr>
-        <w:fldChar w:fldCharType="end"/>
-      </w:r>
-      <w:r>
-        <w:rPr>
-          <w:lang w:bidi="en-US"/>
-        </w:rPr>
-        <w:t xml:space="preserve"> A colonoscopy is an important means of detecting colon polyps. However, in polyp imaging, due to the large differences and diverse types of polyps in size, shape, color, etc., traditional detection methods face the problem of high false positive rates, which creates problems for doctors during the diagnosis process. </w:t>
-      </w:r>
-      <w:proofErr w:type="gramStart"/>
-      <w:r>
-        <w:rPr>
-          <w:lang w:bidi="en-US"/>
-        </w:rPr>
-        <w:t>In order to</w:t>
-      </w:r>
-      <w:proofErr w:type="gramEnd"/>
-      <w:r>
-        <w:rPr>
-          <w:lang w:bidi="en-US"/>
-        </w:rPr>
-        <w:t xml:space="preserve"> improve the accuracy and efficiency of colon polyp detection, this question proposes a network model suitable for colon polyp detection (PD-YOLO). This method introduces the self-attention mechanism CBAM (Convolutional Block Attention Module) in the backbone layer based on YOLOv7, allowing the model to adaptively focus on key information and ignore the unimportant parts. To help the model do a better job of polyp localization and bounding box regression, add the SPD-Conv (Symmetric Positive Definite Convolution) module to the neck layer and use deconvolution instead of upsampling. The experimental results indicate that the PD-YOLO algorithm demonstrates strong robustness in colon polyp detection. Compared to the original YOLOv7, on the Kvasir-SEG dataset, PD-YOLO has shown an increase of 5.44 percentage points in AP@0.5, showcasing significant advantages over other mainstream methods.</w:t>
+        <w:t>polyp detection, this question proposes a network model suitable for colon polyp detection (PD-YOLO). This method introduces the self-attention mechanism CBAM (Convolutional Block Attention Module) in the backbone layer based on YOLOv7, allowing the model to adaptively focus on key information and ignore the unimportant parts. To help the model do a better job of polyp localization and bounding box regression, add the SPD-Conv (Symmetric Positive Definite Convolution) module to the neck layer and use deconvolution instead of upsampling. The experimental results indicate that the PD-YOLO algorithm demonstrates strong robustness in colon polyp detection. Compared to the original YOLOv7, on the Kvasir-SEG dataset, PD-YOLO has shown an increase of 5.44 percentage points in AP@0.5, showcasing significant advantages over other mainstream methods.</w:t>
       </w:r>
     </w:p>
     <w:p>
@@ -2989,14 +3085,109 @@
         <w:rPr>
           <w:lang w:bidi="en-US"/>
         </w:rPr>
+        <w:fldChar w:fldCharType="begin"/>
+      </w:r>
+      <w:r>
+        <w:rPr>
+          <w:lang w:bidi="en-US"/>
+        </w:rPr>
+        <w:instrText xml:space="preserve"> ADDIN ZOTERO_ITEM CSL_CITATION {"citationID":"a159m7a1v6e","properties":{"formattedCitation":"[57]","plainCitation":"[57]","noteIndex":0},"citationItems":[{"id":2086,"uris":["http://zotero.org/users/8619560/items/HRRG3QKA"],"itemData":{"id":2086,"type":"article-journal","abstract":"Colorectal cancer is a major public health challenge making it a priority to detect it at the earliest stage possible. Initially, traditional object detection networks like Single Stage Detection and Faster Recurrent Convolutional Neural Networks were used in medical imaging however, their high computational overhead decreased their feasibility for real-time applications. Currently one stage models are prevalent due to their increased speed and compact nature and building on this the proposed model uses You Look Only Once (YOLO) for polyp detection. The novel module Wavelet-Enhanced Reverse Attention (WERA) along with a custom neck YOLO architecture makes it channel-efficient utilizing both the frequency and spatial domain coupled with feature fusion. The anchor-free head with mixed precision strategy results in a lightweight model. The model was tested on three datasets to test its reliability and performance in diverse environments. It was further tested on a combined dataset to test the generalisation capabilities. The proposed model achieves an increase of 1.98% to recall metrics and increase of 1.9% to the F2 score in the Polypgen dataset when compared with YOLO11 while still maintaining the precision. The model achieves polyp detection at 100 FPS on a RTX3060 GPU with an average latency of 10.11 ms.","container-title":"Biomedical Signal Processing and Control","DOI":"10.1016/j.bspc.2026.109909","ISSN":"1746-8094","journalAbbreviation":"Biomedical Signal Processing and Control","page":"109909","source":"ScienceDirect","title":"A channel-efficient colorectal polyp detection using wavelet-enhanced reverse attention and custom neck YOLO architecture","volume":"119","author":[{"family":"Sureban","given":"Nakshatra Basavaraj"},{"family":"Ajish","given":"Adithyan Chilangaliyath"},{"family":"Abhinav","given":"Y."},{"family":"Prusty","given":"Manas Ranjan"},{"family":"Patra","given":"Subhra Rani"}],"issued":{"date-parts":[["2026",6,15]]}}}],"schema":"https://github.com/citation-style-language/schema/raw/master/csl-citation.json"} </w:instrText>
+      </w:r>
+      <w:r>
+        <w:rPr>
+          <w:lang w:bidi="en-US"/>
+        </w:rPr>
+        <w:fldChar w:fldCharType="separate"/>
+      </w:r>
+      <w:r>
+        <w:t>[57]</w:t>
+      </w:r>
+      <w:r>
+        <w:rPr>
+          <w:lang w:bidi="en-US"/>
+        </w:rPr>
+        <w:fldChar w:fldCharType="end"/>
+      </w:r>
+    </w:p>
+    <w:p>
+      <w:pPr>
+        <w:rPr>
+          <w:lang w:bidi="en-US"/>
+        </w:rPr>
+      </w:pPr>
+      <w:r>
+        <w:rPr>
+          <w:lang w:bidi="en-US"/>
+        </w:rPr>
+        <w:t xml:space="preserve">Currently one stage models are prevalent due to their increased speed and compact nature and building on this the proposed model uses You Look Only Once (YOLO) for polyp detection. The </w:t>
+      </w:r>
+      <w:r>
+        <w:rPr>
+          <w:lang w:bidi="en-US"/>
+        </w:rPr>
         <w:lastRenderedPageBreak/>
+        <w:t xml:space="preserve">novel module Wavelet-Enhanced Reverse Attention (WERA) along with a custom neck YOLO architecture makes it channel-efficient utilizing both the frequency and spatial domain coupled with feature fusion. The anchor-free head with mixed precision strategy results in a lightweight model. The model was tested on three datasets to test its reliability and performance in diverse environments. It was further tested on a combined dataset to test the </w:t>
+      </w:r>
+      <w:proofErr w:type="spellStart"/>
+      <w:r>
+        <w:rPr>
+          <w:lang w:bidi="en-US"/>
+        </w:rPr>
+        <w:t>generalisation</w:t>
+      </w:r>
+      <w:proofErr w:type="spellEnd"/>
+      <w:r>
+        <w:rPr>
+          <w:lang w:bidi="en-US"/>
+        </w:rPr>
+        <w:t xml:space="preserve"> capabilities. The proposed model achieves an increase of 1.98% to recall metrics and increase of 1.9% to the F2 score in the </w:t>
+      </w:r>
+      <w:proofErr w:type="spellStart"/>
+      <w:r>
+        <w:rPr>
+          <w:lang w:bidi="en-US"/>
+        </w:rPr>
+        <w:t>Polypgen</w:t>
+      </w:r>
+      <w:proofErr w:type="spellEnd"/>
+      <w:r>
+        <w:rPr>
+          <w:lang w:bidi="en-US"/>
+        </w:rPr>
+        <w:t xml:space="preserve"> dataset when compared with YOLO11 while still maintaining </w:t>
+      </w:r>
+      <w:proofErr w:type="gramStart"/>
+      <w:r>
+        <w:rPr>
+          <w:lang w:bidi="en-US"/>
+        </w:rPr>
+        <w:t>the precision</w:t>
+      </w:r>
+      <w:proofErr w:type="gramEnd"/>
+      <w:r>
+        <w:rPr>
+          <w:lang w:bidi="en-US"/>
+        </w:rPr>
+        <w:t>. </w:t>
+      </w:r>
+    </w:p>
+    <w:p>
+      <w:pPr>
+        <w:rPr>
+          <w:lang w:bidi="en-US"/>
+        </w:rPr>
+      </w:pPr>
+      <w:r>
+        <w:rPr>
+          <w:lang w:bidi="en-US"/>
+        </w:rPr>
         <w:fldChar w:fldCharType="begin"/>
       </w:r>
       <w:r>
         <w:rPr>
           <w:lang w:bidi="en-US"/>
         </w:rPr>
-        <w:instrText xml:space="preserve"> ADDIN ZOTERO_ITEM CSL_CITATION {"citationID":"a159m7a1v6e","properties":{"formattedCitation":"[57]","plainCitation":"[57]","noteIndex":0},"citationItems":[{"id":2086,"uris":["http://zotero.org/users/8619560/items/HRRG3QKA"],"itemData":{"id":2086,"type":"article-journal","abstract":"Colorectal cancer is a major public health challenge making it a priority to detect it at the earliest stage possible. Initially, traditional object detection networks like Single Stage Detection and Faster Recurrent Convolutional Neural Networks were used in medical imaging however, their high computational overhead decreased their feasibility for real-time applications. Currently one stage models are prevalent due to their increased speed and compact nature and building on this the proposed model uses You Look Only Once (YOLO) for polyp detection. The novel module Wavelet-Enhanced Reverse Attention (WERA) along with a custom neck YOLO architecture makes it channel-efficient utilizing both the frequency and spatial domain coupled with feature fusion. The anchor-free head with mixed precision strategy results in a lightweight model. The model was tested on three datasets to test its reliability and performance in diverse environments. It was further tested on a combined dataset to test the generalisation capabilities. The proposed model achieves an increase of 1.98% to recall metrics and increase of 1.9% to the F2 score in the Polypgen dataset when compared with YOLO11 while still maintaining the precision. The model achieves polyp detection at 100 FPS on a RTX3060 GPU with an average latency of 10.11 ms.","container-title":"Biomedical Signal Processing and Control","DOI":"10.1016/j.bspc.2026.109909","ISSN":"1746-8094","journalAbbreviation":"Biomedical Signal Processing and Control","page":"109909","source":"ScienceDirect","title":"A channel-efficient colorectal polyp detection using wavelet-enhanced reverse attention and custom neck YOLO architecture","volume":"119","author":[{"family":"Sureban","given":"Nakshatra Basavaraj"},{"family":"Ajish","given":"Adithyan Chilangaliyath"},{"family":"Abhinav","given":"Y."},{"family":"Prusty","given":"Manas Ranjan"},{"family":"Patra","given":"Subhra Rani"}],"issued":{"date-parts":[["2026",6,15]]}}}],"schema":"https://github.com/citation-style-language/schema/raw/master/csl-citation.json"} </w:instrText>
+        <w:instrText xml:space="preserve"> ADDIN ZOTERO_ITEM CSL_CITATION {"citationID":"ab7d75f4r5","properties":{"formattedCitation":"[58]","plainCitation":"[58]","noteIndex":0},"citationItems":[{"id":2088,"uris":["http://zotero.org/users/8619560/items/7SEX2U2K"],"itemData":{"id":2088,"type":"article-journal","abstract":"Colorectal cancer (CRC) is the second leading cause of cancer-related deaths worldwide. Colonoscopy is the primary method to prevent CRC. However, tra...","container-title":"Electronics","DOI":"10.3390/electronics13122298","ISSN":"2079-9292","issue":"12","language":"en","license":"http://creativecommons.org/licenses/by/3.0/","note":"Company: Multidisciplinary Digital Publishing Institute\nDistributor: Multidisciplinary Digital Publishing Institute\nInstitution: Multidisciplinary Digital Publishing Institute\nLabel: Multidisciplinary Digital Publishing Institute\npublisher: publisher","source":"www.mdpi.com","title":"Colorectal Polyp Detection Model by Using Super-Resolution Reconstruction and YOLO","URL":"https://www.mdpi.com/2079-9292/13/12/2298","volume":"13","author":[{"family":"Wang","given":"Shaofang"},{"family":"Xie","given":"Jun"},{"family":"Cui","given":"Yanrong"},{"family":"Chen","given":"Zhongju"}],"accessed":{"date-parts":[["2026",3,3]]},"issued":{"date-parts":[["2024",6,12]]}}}],"schema":"https://github.com/citation-style-language/schema/raw/master/csl-citation.json"} </w:instrText>
       </w:r>
       <w:r>
         <w:rPr>
@@ -3005,7 +3196,7 @@
         <w:fldChar w:fldCharType="separate"/>
       </w:r>
       <w:r>
-        <w:t>[57]</w:t>
+        <w:t>[58]</w:t>
       </w:r>
       <w:r>
         <w:rPr>
@@ -3024,50 +3215,174 @@
         <w:rPr>
           <w:lang w:bidi="en-US"/>
         </w:rPr>
-        <w:t xml:space="preserve">Currently one stage models are prevalent due to their increased speed and compact nature and building on this the proposed model uses You Look Only Once (YOLO) for polyp detection. The novel module Wavelet-Enhanced Reverse Attention (WERA) along with a custom neck YOLO architecture makes it channel-efficient utilizing both the frequency and spatial domain coupled with feature fusion. The anchor-free head with mixed precision strategy results in a lightweight model. The model was tested on three datasets to test its reliability and performance in diverse environments. It was further tested on a combined dataset to test the </w:t>
+        <w:t xml:space="preserve">Colorectal cancer (CRC) is the second leading cause of cancer-related deaths worldwide. Colonoscopy is the primary method to prevent CRC. However, traditional polyp detection methods face problems such as low image resolution and the possibility of missing polyps. In recent years, deep learning techniques have been extensively employed in the detection of colorectal polyps. However, these algorithms have not yet addressed the issue of detection in low-resolution images. In this study, we propose a novel YOLO-SRPD model by integrating SRGAN and YOLO to address the issue of low-resolution colonoscopy images. Firstly, the SRGAN with integrated </w:t>
       </w:r>
       <w:proofErr w:type="spellStart"/>
       <w:r>
         <w:rPr>
           <w:lang w:bidi="en-US"/>
         </w:rPr>
-        <w:t>generalisation</w:t>
+        <w:t>ACmix</w:t>
       </w:r>
       <w:proofErr w:type="spellEnd"/>
       <w:r>
         <w:rPr>
           <w:lang w:bidi="en-US"/>
         </w:rPr>
-        <w:t xml:space="preserve"> capabilities. The proposed model achieves an increase of 1.98% to recall metrics and increase of 1.9% to the F2 score in the </w:t>
+        <w:t xml:space="preserve"> is used to convert low-resolution images to high-resolution images. The generated high-resolution images are then used as </w:t>
+      </w:r>
+      <w:proofErr w:type="gramStart"/>
+      <w:r>
+        <w:rPr>
+          <w:lang w:bidi="en-US"/>
+        </w:rPr>
+        <w:t>the training set</w:t>
+      </w:r>
+      <w:proofErr w:type="gramEnd"/>
+      <w:r>
+        <w:rPr>
+          <w:lang w:bidi="en-US"/>
+        </w:rPr>
+        <w:t xml:space="preserve"> for polyp detection. Then, the C3_Res2Net is integrated into the YOLOv5 backbone to enhance multiscale feature extraction. Finally, CBAM modules are added before the prediction head to enhance attention to polyp information. The experimental results indicate that YOLO-SRPD achieves a mean average precision (</w:t>
       </w:r>
       <w:proofErr w:type="spellStart"/>
       <w:r>
         <w:rPr>
           <w:lang w:bidi="en-US"/>
         </w:rPr>
-        <w:t>Polypgen</w:t>
+        <w:t>mAP</w:t>
       </w:r>
       <w:proofErr w:type="spellEnd"/>
       <w:r>
         <w:rPr>
           <w:lang w:bidi="en-US"/>
         </w:rPr>
-        <w:t xml:space="preserve"> dataset when compared with YOLO11 while still maintaining </w:t>
+        <w:t>) of 94.2% and a precision of 95.2%. Compared to the original model (YOLOv5), the average accuracy increased by 1.8% and the recall rate increased by 5.6%. These experimental results confirm that YOLO-SRPD can address the low-resolution problem during colorectal polyp detection and exhibit exceptional robustness.</w:t>
+      </w:r>
+    </w:p>
+    <w:p>
+      <w:pPr>
+        <w:rPr>
+          <w:lang w:bidi="en-US"/>
+        </w:rPr>
+      </w:pPr>
+      <w:r>
+        <w:rPr>
+          <w:lang w:bidi="en-US"/>
+        </w:rPr>
+        <w:fldChar w:fldCharType="begin"/>
+      </w:r>
+      <w:r>
+        <w:rPr>
+          <w:lang w:bidi="en-US"/>
+        </w:rPr>
+        <w:instrText xml:space="preserve"> ADDIN ZOTERO_ITEM CSL_CITATION {"citationID":"a3l2oe07gc","properties":{"formattedCitation":"[59]","plainCitation":"[59]","noteIndex":0},"citationItems":[{"id":2090,"uris":["http://zotero.org/users/8619560/items/DFDYH32I"],"itemData":{"id":2090,"type":"article-journal","abstract":"Colorectal (CRC) represents one of the leading global causes of cancer-related deaths since polyps function as original precursors to cancer development. The identification of colorectal polyps at an early stage directly contributes to lowering CRC incidence while giving patients improved survival outcomes. The proposed research utilizes YOLOv8m through YOLOv11m state-of-the-art YOLO architectures as an advanced framework to enhance real-time detection and classification of polyps. The research used four different colorectal database sets including Kvasir-SEG and CVC-300, CVC-ClinicDB, CVC-ColonDB for training and validating the models across a wide spectrum of polyp image variations. Following 300 training epochs YOLOv8m achieved the best performance with precision at 92.4% and recall at 85.4% while reaching an F1-Score of 88.7% and mAP@0.5 at 91.1%. The testing of YOLOv8m’s generalization skills included an external validation on ETIS-LaribPolypDB where it demonstrated reliable detection performance and high accuracy levels. YOLOv8m demonstrates a strong capability for real-time polyp detection in endoscopic examinations through these performance results which showcase its potential to enhance diagnostic support.","container-title":"IEEE Access","DOI":"10.1109/ACCESS.2025.3608668","ISSN":"2169-3536","page":"162000-162008","source":"IEEE Xplore","title":"Multi-Dataset Training Strategy for Robust Polyp Detection With Clinical Validation Insights","volume":"13","author":[{"family":"Mert","given":"Alben"},{"family":"Hakan Büyüklü","given":"Ali"},{"family":"Bayram","given":"Bülent"},{"family":"Erpolat Taşabat","given":"Semra"}],"issued":{"date-parts":[["2025"]]}}}],"schema":"https://github.com/citation-style-language/schema/raw/master/csl-citation.json"} </w:instrText>
+      </w:r>
+      <w:r>
+        <w:rPr>
+          <w:lang w:bidi="en-US"/>
+        </w:rPr>
+        <w:fldChar w:fldCharType="separate"/>
+      </w:r>
+      <w:r>
+        <w:t>[59]</w:t>
+      </w:r>
+      <w:r>
+        <w:rPr>
+          <w:lang w:bidi="en-US"/>
+        </w:rPr>
+        <w:fldChar w:fldCharType="end"/>
+      </w:r>
+    </w:p>
+    <w:p>
+      <w:pPr>
+        <w:rPr>
+          <w:lang w:bidi="en-US"/>
+        </w:rPr>
+      </w:pPr>
+      <w:r>
+        <w:rPr>
+          <w:lang w:bidi="en-US"/>
+        </w:rPr>
+        <w:t xml:space="preserve">Colorectal (CRC) represents one of the leading global causes of cancer-related deaths since </w:t>
       </w:r>
       <w:proofErr w:type="gramStart"/>
       <w:r>
         <w:rPr>
           <w:lang w:bidi="en-US"/>
         </w:rPr>
-        <w:t>the precision</w:t>
+        <w:t>polyps</w:t>
       </w:r>
       <w:proofErr w:type="gramEnd"/>
       <w:r>
         <w:rPr>
           <w:lang w:bidi="en-US"/>
         </w:rPr>
-        <w:t>. </w:t>
-      </w:r>
+        <w:t xml:space="preserve"> function as original precursors to cancer development. The identification of colorectal polyps at an early stage directly contributes to lowering CRC incidence while giving patients improved survival outcomes. The proposed research utilizes YOLOv8m through YOLOv11m state-of-the-art YOLO </w:t>
+      </w:r>
+      <w:proofErr w:type="gramStart"/>
+      <w:r>
+        <w:rPr>
+          <w:lang w:bidi="en-US"/>
+        </w:rPr>
+        <w:t>architectures</w:t>
+      </w:r>
+      <w:proofErr w:type="gramEnd"/>
+      <w:r>
+        <w:rPr>
+          <w:lang w:bidi="en-US"/>
+        </w:rPr>
+        <w:t xml:space="preserve"> as an advanced framework to enhance real-time detection and classification of polyps. The research used four different colorectal database sets including Kvasir-SEG and CVC-300, CVC-</w:t>
+      </w:r>
+      <w:proofErr w:type="spellStart"/>
+      <w:r>
+        <w:rPr>
+          <w:lang w:bidi="en-US"/>
+        </w:rPr>
+        <w:t>ClinicDB</w:t>
+      </w:r>
+      <w:proofErr w:type="spellEnd"/>
+      <w:r>
+        <w:rPr>
+          <w:lang w:bidi="en-US"/>
+        </w:rPr>
+        <w:t>, CVC-</w:t>
+      </w:r>
+      <w:proofErr w:type="spellStart"/>
+      <w:r>
+        <w:rPr>
+          <w:lang w:bidi="en-US"/>
+        </w:rPr>
+        <w:t>ColonDB</w:t>
+      </w:r>
+      <w:proofErr w:type="spellEnd"/>
+      <w:r>
+        <w:rPr>
+          <w:lang w:bidi="en-US"/>
+        </w:rPr>
+        <w:t xml:space="preserve"> for training and validating the models across a wide spectrum of polyp image variations. Following 300 training epochs YOLOv8m achieved the best performance with precision at 92.4% and recall at 85.4% while reaching an F1-Score of 88.7% and mAP@0.5 at 91.1%. The testing of YOLOv8m’s generalization skills included an external validation on ETIS-</w:t>
+      </w:r>
+      <w:proofErr w:type="spellStart"/>
+      <w:r>
+        <w:rPr>
+          <w:lang w:bidi="en-US"/>
+        </w:rPr>
+        <w:t>LaribPolypDB</w:t>
+      </w:r>
+      <w:proofErr w:type="spellEnd"/>
+      <w:r>
+        <w:rPr>
+          <w:lang w:bidi="en-US"/>
+        </w:rPr>
+        <w:t xml:space="preserve"> where it demonstrated reliable detection performance and high accuracy levels. YOLOv8m demonstrates a strong capability for real-time polyp detection in endoscopic examinations through these performance results which showcase its potential to enhance diagnostic support.</w:t>
+      </w:r>
+    </w:p>
+    <w:p>
+      <w:pPr>
+        <w:rPr>
+          <w:lang w:bidi="en-US"/>
+        </w:rPr>
+      </w:pPr>
     </w:p>
     <w:p>
       <w:pPr>
@@ -3085,7 +3400,7 @@
         <w:rPr>
           <w:lang w:bidi="en-US"/>
         </w:rPr>
-        <w:instrText xml:space="preserve"> ADDIN ZOTERO_ITEM CSL_CITATION {"citationID":"ab7d75f4r5","properties":{"formattedCitation":"[58]","plainCitation":"[58]","noteIndex":0},"citationItems":[{"id":2088,"uris":["http://zotero.org/users/8619560/items/7SEX2U2K"],"itemData":{"id":2088,"type":"article-journal","abstract":"Colorectal cancer (CRC) is the second leading cause of cancer-related deaths worldwide. Colonoscopy is the primary method to prevent CRC. However, tra...","container-title":"Electronics","DOI":"10.3390/electronics13122298","ISSN":"2079-9292","issue":"12","language":"en","license":"http://creativecommons.org/licenses/by/3.0/","note":"Company: Multidisciplinary Digital Publishing Institute\nDistributor: Multidisciplinary Digital Publishing Institute\nInstitution: Multidisciplinary Digital Publishing Institute\nLabel: Multidisciplinary Digital Publishing Institute\npublisher: publisher","source":"www.mdpi.com","title":"Colorectal Polyp Detection Model by Using Super-Resolution Reconstruction and YOLO","URL":"https://www.mdpi.com/2079-9292/13/12/2298","volume":"13","author":[{"family":"Wang","given":"Shaofang"},{"family":"Xie","given":"Jun"},{"family":"Cui","given":"Yanrong"},{"family":"Chen","given":"Zhongju"}],"accessed":{"date-parts":[["2026",3,3]]},"issued":{"date-parts":[["2024",6,12]]}}}],"schema":"https://github.com/citation-style-language/schema/raw/master/csl-citation.json"} </w:instrText>
+        <w:instrText xml:space="preserve"> ADDIN ZOTERO_ITEM CSL_CITATION {"citationID":"a22g1r1n3da","properties":{"formattedCitation":"[60]","plainCitation":"[60]","noteIndex":0},"citationItems":[{"id":2092,"uris":["http://zotero.org/users/8619560/items/NDWRB8F9"],"itemData":{"id":2092,"type":"article-journal","abstract":"Colon cancer is a prevalent malignancy, substantially it prevented most effectively from killing patients through early endoscopic detection. With the rapid development of artificial intelligence technology, the early diagnosis rate of colonic polyps achieves greater clinical efficacy for colon cancer by applying target detection algorithms to colonoscopy images. This paper presents two outcomes achieved through the application of the improved YOLOv5s algorithm with annotated microscopy images of clinical cases and publicly available polyp image data: (1) enhancement of the C3(Cross Stage Partial Networks) module with multiple layers to C3SE(Cross Stage Partial Networks with Squeeze-and-Excitation) via the attention mechanism SE (squeeze-and-excitation) and (2) fusion of higher-level features utilizing BiFPN (the weighted bi-directional feature pyramid network). Experimental comparisons are performed based on a new image dataset of colonic polyps among more than 6 target detection algorithms to validate the better detection capability. The tests indicate that the YOLOv5s + BiFPN and YOLOv5s-1st-2nd-C3SE models exhibit enhancements of detection capability compared to the YOLOv5 algorithm according to the main indicators of the mAP, accuracy, and recall. The YOLOv5s + SEBiFPN model demonstrate a substantial improvement over the YOLOv5s algorithm, and establishing a benchmark technology for advancing computer-assisted diagnostic systems is feasible.","container-title":"Scientific Reports","DOI":"10.1038/s41598-025-91467-1","ISSN":"2045-2322","issue":"1","journalAbbreviation":"Sci Rep","language":"en","license":"2025 The Author(s)","note":"publisher: Nature Publishing Group","page":"6852","source":"www.nature.com","title":"A colonic polyps detection algorithm based on an improved YOLOv5s","volume":"15","author":[{"family":"Li","given":"Jianjun"},{"family":"Zhao","given":"Jinhui"},{"family":"Wang","given":"Yifan"},{"family":"Zhu","given":"Jinhui"},{"family":"Wei","given":"Yanhong"},{"family":"Zhu","given":"Junjiang"},{"family":"Li","given":"Xiaolu"},{"family":"Yan","given":"Shubin"},{"family":"Zhang","given":"Qichun"}],"issued":{"date-parts":[["2025",2,26]]}}}],"schema":"https://github.com/citation-style-language/schema/raw/master/csl-citation.json"} </w:instrText>
       </w:r>
       <w:r>
         <w:rPr>
@@ -3094,7 +3409,7 @@
         <w:fldChar w:fldCharType="separate"/>
       </w:r>
       <w:r>
-        <w:t>[58]</w:t>
+        <w:t>[60]</w:t>
       </w:r>
       <w:r>
         <w:rPr>
@@ -3113,296 +3428,76 @@
         <w:rPr>
           <w:lang w:bidi="en-US"/>
         </w:rPr>
-        <w:t xml:space="preserve">Colorectal cancer (CRC) is the second leading cause of cancer-related deaths worldwide. Colonoscopy is the primary method to prevent CRC. However, traditional polyp detection methods face problems such as low image resolution and the possibility of missing polyps. In recent years, deep learning techniques have been extensively employed in the detection of colorectal polyps. However, these algorithms have not yet addressed the issue of detection in low-resolution images. In this study, we propose a novel YOLO-SRPD model by integrating SRGAN and YOLO to address the issue of low-resolution colonoscopy images. Firstly, the SRGAN with integrated </w:t>
+        <w:t xml:space="preserve">Colon cancer is a prevalent malignancy, substantially it prevented most effectively from killing patients through early endoscopic detection. With the rapid development of artificial intelligence technology, the early diagnosis rate of colonic polyps achieves greater clinical efficacy for colon cancer by applying target detection algorithms to colonoscopy images. This paper presents two outcomes achieved through the application of the improved YOLOv5s algorithm with annotated microscopy images of clinical cases and publicly available polyp image data: (1) enhancement of the C3(Cross Stage Partial Networks) module with multiple layers to C3SE(Cross Stage Partial Networks with Squeeze-and-Excitation) via the attention mechanism SE (squeeze-and-excitation) and (2) fusion of higher-level features utilizing </w:t>
       </w:r>
       <w:proofErr w:type="spellStart"/>
       <w:r>
         <w:rPr>
           <w:lang w:bidi="en-US"/>
         </w:rPr>
-        <w:t>ACmix</w:t>
+        <w:t>BiFPN</w:t>
       </w:r>
       <w:proofErr w:type="spellEnd"/>
       <w:r>
         <w:rPr>
           <w:lang w:bidi="en-US"/>
         </w:rPr>
-        <w:t xml:space="preserve"> is used to convert low-resolution images to high-resolution images. The generated high-resolution images are then used as </w:t>
+        <w:t xml:space="preserve"> (the weighted bi-directional feature pyramid network). Experimental comparisons are performed based on a new image dataset of colonic polyps among more than 6 target detection algorithms to validate the better detection capability. The tests indicate that the YOLOv5s + </w:t>
+      </w:r>
+      <w:proofErr w:type="spellStart"/>
+      <w:r>
+        <w:rPr>
+          <w:lang w:bidi="en-US"/>
+        </w:rPr>
+        <w:t>BiFPN</w:t>
+      </w:r>
+      <w:proofErr w:type="spellEnd"/>
+      <w:r>
+        <w:rPr>
+          <w:lang w:bidi="en-US"/>
+        </w:rPr>
+        <w:t xml:space="preserve"> and YOLOv5s-1st-2nd-C3SE models exhibit enhancements of detection capability compared to the YOLOv5 algorithm according to the main indicators of the </w:t>
+      </w:r>
+      <w:proofErr w:type="spellStart"/>
+      <w:r>
+        <w:rPr>
+          <w:lang w:bidi="en-US"/>
+        </w:rPr>
+        <w:t>mAP</w:t>
+      </w:r>
+      <w:proofErr w:type="spellEnd"/>
+      <w:r>
+        <w:rPr>
+          <w:lang w:bidi="en-US"/>
+        </w:rPr>
+        <w:t>, accuracy, and recall. The YOLOv5s + </w:t>
+      </w:r>
+      <w:proofErr w:type="spellStart"/>
+      <w:r>
+        <w:rPr>
+          <w:lang w:bidi="en-US"/>
+        </w:rPr>
+        <w:t>SEBiFPN</w:t>
+      </w:r>
+      <w:proofErr w:type="spellEnd"/>
+      <w:r>
+        <w:rPr>
+          <w:lang w:bidi="en-US"/>
+        </w:rPr>
+        <w:t xml:space="preserve"> model </w:t>
       </w:r>
       <w:proofErr w:type="gramStart"/>
       <w:r>
         <w:rPr>
           <w:lang w:bidi="en-US"/>
         </w:rPr>
-        <w:t>the training set</w:t>
+        <w:t>demonstrate</w:t>
       </w:r>
       <w:proofErr w:type="gramEnd"/>
       <w:r>
         <w:rPr>
           <w:lang w:bidi="en-US"/>
         </w:rPr>
-        <w:t xml:space="preserve"> for polyp detection. Then, the C3_Res2Net is integrated into the YOLOv5 backbone to enhance multiscale feature extraction. Finally, CBAM modules are added before the prediction head to enhance attention to polyp information. The experimental results indicate that YOLO-SRPD achieves a mean average precision (</w:t>
-      </w:r>
-      <w:proofErr w:type="spellStart"/>
-      <w:r>
-        <w:rPr>
-          <w:lang w:bidi="en-US"/>
-        </w:rPr>
-        <w:t>mAP</w:t>
-      </w:r>
-      <w:proofErr w:type="spellEnd"/>
-      <w:r>
-        <w:rPr>
-          <w:lang w:bidi="en-US"/>
-        </w:rPr>
-        <w:t>) of 94.2% and a precision of 95.2%. Compared to the original model (YOLOv5), the average accuracy increased by 1.8% and the recall rate increased by 5.6%. These experimental results confirm that YOLO-SRPD can address the low-resolution problem during colorectal polyp detection and exhibit exceptional robustness.</w:t>
-      </w:r>
-    </w:p>
-    <w:p>
-      <w:pPr>
-        <w:rPr>
-          <w:lang w:bidi="en-US"/>
-        </w:rPr>
-      </w:pPr>
-      <w:r>
-        <w:rPr>
-          <w:lang w:bidi="en-US"/>
-        </w:rPr>
-        <w:fldChar w:fldCharType="begin"/>
-      </w:r>
-      <w:r>
-        <w:rPr>
-          <w:lang w:bidi="en-US"/>
-        </w:rPr>
-        <w:instrText xml:space="preserve"> ADDIN ZOTERO_ITEM CSL_CITATION {"citationID":"a3l2oe07gc","properties":{"formattedCitation":"[59]","plainCitation":"[59]","noteIndex":0},"citationItems":[{"id":2090,"uris":["http://zotero.org/users/8619560/items/DFDYH32I"],"itemData":{"id":2090,"type":"article-journal","abstract":"Colorectal (CRC) represents one of the leading global causes of cancer-related deaths since polyps function as original precursors to cancer development. The identification of colorectal polyps at an early stage directly contributes to lowering CRC incidence while giving patients improved survival outcomes. The proposed research utilizes YOLOv8m through YOLOv11m state-of-the-art YOLO architectures as an advanced framework to enhance real-time detection and classification of polyps. The research used four different colorectal database sets including Kvasir-SEG and CVC-300, CVC-ClinicDB, CVC-ColonDB for training and validating the models across a wide spectrum of polyp image variations. Following 300 training epochs YOLOv8m achieved the best performance with precision at 92.4% and recall at 85.4% while reaching an F1-Score of 88.7% and mAP@0.5 at 91.1%. The testing of YOLOv8m’s generalization skills included an external validation on ETIS-LaribPolypDB where it demonstrated reliable detection performance and high accuracy levels. YOLOv8m demonstrates a strong capability for real-time polyp detection in endoscopic examinations through these performance results which showcase its potential to enhance diagnostic support.","container-title":"IEEE Access","DOI":"10.1109/ACCESS.2025.3608668","ISSN":"2169-3536","page":"162000-162008","source":"IEEE Xplore","title":"Multi-Dataset Training Strategy for Robust Polyp Detection With Clinical Validation Insights","volume":"13","author":[{"family":"Mert","given":"Alben"},{"family":"Hakan Büyüklü","given":"Ali"},{"family":"Bayram","given":"Bülent"},{"family":"Erpolat Taşabat","given":"Semra"}],"issued":{"date-parts":[["2025"]]}}}],"schema":"https://github.com/citation-style-language/schema/raw/master/csl-citation.json"} </w:instrText>
-      </w:r>
-      <w:r>
-        <w:rPr>
-          <w:lang w:bidi="en-US"/>
-        </w:rPr>
-        <w:fldChar w:fldCharType="separate"/>
-      </w:r>
-      <w:r>
-        <w:t>[59]</w:t>
-      </w:r>
-      <w:r>
-        <w:rPr>
-          <w:lang w:bidi="en-US"/>
-        </w:rPr>
-        <w:fldChar w:fldCharType="end"/>
-      </w:r>
-    </w:p>
-    <w:p>
-      <w:pPr>
-        <w:rPr>
-          <w:lang w:bidi="en-US"/>
-        </w:rPr>
-      </w:pPr>
-      <w:r>
-        <w:rPr>
-          <w:lang w:bidi="en-US"/>
-        </w:rPr>
-        <w:t xml:space="preserve">Colorectal (CRC) represents one of the leading global causes of cancer-related deaths since </w:t>
-      </w:r>
-      <w:proofErr w:type="gramStart"/>
-      <w:r>
-        <w:rPr>
-          <w:lang w:bidi="en-US"/>
-        </w:rPr>
-        <w:t>polyps</w:t>
-      </w:r>
-      <w:proofErr w:type="gramEnd"/>
-      <w:r>
-        <w:rPr>
-          <w:lang w:bidi="en-US"/>
-        </w:rPr>
-        <w:t xml:space="preserve"> function as original precursors to cancer development. The identification of colorectal polyps at an early stage directly contributes to lowering CRC incidence while giving patients improved survival outcomes. The proposed research utilizes YOLOv8m through YOLOv11m state-of-the-art YOLO </w:t>
-      </w:r>
-      <w:proofErr w:type="gramStart"/>
-      <w:r>
-        <w:rPr>
-          <w:lang w:bidi="en-US"/>
-        </w:rPr>
-        <w:t>architectures</w:t>
-      </w:r>
-      <w:proofErr w:type="gramEnd"/>
-      <w:r>
-        <w:rPr>
-          <w:lang w:bidi="en-US"/>
-        </w:rPr>
-        <w:t xml:space="preserve"> as an advanced framework to enhance real-time detection and classification of polyps. The research used four different colorectal database sets including Kvasir-SEG and CVC-300, CVC-</w:t>
-      </w:r>
-      <w:proofErr w:type="spellStart"/>
-      <w:r>
-        <w:rPr>
-          <w:lang w:bidi="en-US"/>
-        </w:rPr>
-        <w:t>ClinicDB</w:t>
-      </w:r>
-      <w:proofErr w:type="spellEnd"/>
-      <w:r>
-        <w:rPr>
-          <w:lang w:bidi="en-US"/>
-        </w:rPr>
-        <w:t>, CVC-</w:t>
-      </w:r>
-      <w:proofErr w:type="spellStart"/>
-      <w:r>
-        <w:rPr>
-          <w:lang w:bidi="en-US"/>
-        </w:rPr>
-        <w:t>ColonDB</w:t>
-      </w:r>
-      <w:proofErr w:type="spellEnd"/>
-      <w:r>
-        <w:rPr>
-          <w:lang w:bidi="en-US"/>
-        </w:rPr>
-        <w:t xml:space="preserve"> for training and validating the models across a wide spectrum of polyp image variations. Following 300 training epochs YOLOv8m achieved the best performance with precision at 92.4% and recall at 85.4% while reaching an F1-Score of 88.7% and mAP@0.5 at 91.1%. The testing of YOLOv8m’s generalization skills included an external validation on ETIS-</w:t>
-      </w:r>
-      <w:proofErr w:type="spellStart"/>
-      <w:r>
-        <w:rPr>
-          <w:lang w:bidi="en-US"/>
-        </w:rPr>
-        <w:t>LaribPolypDB</w:t>
-      </w:r>
-      <w:proofErr w:type="spellEnd"/>
-      <w:r>
-        <w:rPr>
-          <w:lang w:bidi="en-US"/>
-        </w:rPr>
-        <w:t xml:space="preserve"> where it demonstrated reliable detection performance </w:t>
-      </w:r>
-      <w:r>
-        <w:rPr>
-          <w:lang w:bidi="en-US"/>
-        </w:rPr>
-        <w:lastRenderedPageBreak/>
-        <w:t>and high accuracy levels. YOLOv8m demonstrates a strong capability for real-time polyp detection in endoscopic examinations through these performance results which showcase its potential to enhance diagnostic support.</w:t>
-      </w:r>
-    </w:p>
-    <w:p>
-      <w:pPr>
-        <w:rPr>
-          <w:lang w:bidi="en-US"/>
-        </w:rPr>
-      </w:pPr>
-    </w:p>
-    <w:p>
-      <w:pPr>
-        <w:rPr>
-          <w:lang w:bidi="en-US"/>
-        </w:rPr>
-      </w:pPr>
-      <w:r>
-        <w:rPr>
-          <w:lang w:bidi="en-US"/>
-        </w:rPr>
-        <w:fldChar w:fldCharType="begin"/>
-      </w:r>
-      <w:r>
-        <w:rPr>
-          <w:lang w:bidi="en-US"/>
-        </w:rPr>
-        <w:instrText xml:space="preserve"> ADDIN ZOTERO_ITEM CSL_CITATION {"citationID":"a22g1r1n3da","properties":{"formattedCitation":"[60]","plainCitation":"[60]","noteIndex":0},"citationItems":[{"id":2092,"uris":["http://zotero.org/users/8619560/items/NDWRB8F9"],"itemData":{"id":2092,"type":"article-journal","abstract":"Colon cancer is a prevalent malignancy, substantially it prevented most effectively from killing patients through early endoscopic detection. With the rapid development of artificial intelligence technology, the early diagnosis rate of colonic polyps achieves greater clinical efficacy for colon cancer by applying target detection algorithms to colonoscopy images. This paper presents two outcomes achieved through the application of the improved YOLOv5s algorithm with annotated microscopy images of clinical cases and publicly available polyp image data: (1) enhancement of the C3(Cross Stage Partial Networks) module with multiple layers to C3SE(Cross Stage Partial Networks with Squeeze-and-Excitation) via the attention mechanism SE (squeeze-and-excitation) and (2) fusion of higher-level features utilizing BiFPN (the weighted bi-directional feature pyramid network). Experimental comparisons are performed based on a new image dataset of colonic polyps among more than 6 target detection algorithms to validate the better detection capability. The tests indicate that the YOLOv5s + BiFPN and YOLOv5s-1st-2nd-C3SE models exhibit enhancements of detection capability compared to the YOLOv5 algorithm according to the main indicators of the mAP, accuracy, and recall. The YOLOv5s + SEBiFPN model demonstrate a substantial improvement over the YOLOv5s algorithm, and establishing a benchmark technology for advancing computer-assisted diagnostic systems is feasible.","container-title":"Scientific Reports","DOI":"10.1038/s41598-025-91467-1","ISSN":"2045-2322","issue":"1","journalAbbreviation":"Sci Rep","language":"en","license":"2025 The Author(s)","note":"publisher: Nature Publishing Group","page":"6852","source":"www.nature.com","title":"A colonic polyps detection algorithm based on an improved YOLOv5s","volume":"15","author":[{"family":"Li","given":"Jianjun"},{"family":"Zhao","given":"Jinhui"},{"family":"Wang","given":"Yifan"},{"family":"Zhu","given":"Jinhui"},{"family":"Wei","given":"Yanhong"},{"family":"Zhu","given":"Junjiang"},{"family":"Li","given":"Xiaolu"},{"family":"Yan","given":"Shubin"},{"family":"Zhang","given":"Qichun"}],"issued":{"date-parts":[["2025",2,26]]}}}],"schema":"https://github.com/citation-style-language/schema/raw/master/csl-citation.json"} </w:instrText>
-      </w:r>
-      <w:r>
-        <w:rPr>
-          <w:lang w:bidi="en-US"/>
-        </w:rPr>
-        <w:fldChar w:fldCharType="separate"/>
-      </w:r>
-      <w:r>
-        <w:t>[60]</w:t>
-      </w:r>
-      <w:r>
-        <w:rPr>
-          <w:lang w:bidi="en-US"/>
-        </w:rPr>
-        <w:fldChar w:fldCharType="end"/>
-      </w:r>
-    </w:p>
-    <w:p>
-      <w:pPr>
-        <w:rPr>
-          <w:lang w:bidi="en-US"/>
-        </w:rPr>
-      </w:pPr>
-      <w:r>
-        <w:rPr>
-          <w:lang w:bidi="en-US"/>
-        </w:rPr>
-        <w:t xml:space="preserve">Colon cancer is a prevalent malignancy, substantially it prevented most effectively from killing patients through early endoscopic detection. With the rapid development of artificial intelligence technology, the early diagnosis rate of colonic polyps achieves greater clinical efficacy for colon cancer by applying target detection algorithms to colonoscopy images. This paper presents two outcomes achieved through the application of the improved YOLOv5s algorithm with annotated microscopy images of clinical cases and publicly available polyp image data: (1) enhancement of the C3(Cross Stage Partial Networks) module with multiple layers to C3SE(Cross Stage Partial Networks with Squeeze-and-Excitation) via the attention mechanism SE (squeeze-and-excitation) and (2) fusion of higher-level features utilizing </w:t>
-      </w:r>
-      <w:proofErr w:type="spellStart"/>
-      <w:r>
-        <w:rPr>
-          <w:lang w:bidi="en-US"/>
-        </w:rPr>
-        <w:t>BiFPN</w:t>
-      </w:r>
-      <w:proofErr w:type="spellEnd"/>
-      <w:r>
-        <w:rPr>
-          <w:lang w:bidi="en-US"/>
-        </w:rPr>
-        <w:t xml:space="preserve"> (the weighted bi-directional feature pyramid network). Experimental comparisons are performed based on a new image dataset of colonic polyps among more than 6 target detection algorithms to validate the better detection capability. The tests indicate that the YOLOv5s + </w:t>
-      </w:r>
-      <w:proofErr w:type="spellStart"/>
-      <w:r>
-        <w:rPr>
-          <w:lang w:bidi="en-US"/>
-        </w:rPr>
-        <w:t>BiFPN</w:t>
-      </w:r>
-      <w:proofErr w:type="spellEnd"/>
-      <w:r>
-        <w:rPr>
-          <w:lang w:bidi="en-US"/>
-        </w:rPr>
-        <w:t xml:space="preserve"> and YOLOv5s-1st-2nd-C3SE models exhibit enhancements of detection capability compared to the YOLOv5 algorithm according to the main indicators of the </w:t>
-      </w:r>
-      <w:proofErr w:type="spellStart"/>
-      <w:r>
-        <w:rPr>
-          <w:lang w:bidi="en-US"/>
-        </w:rPr>
-        <w:t>mAP</w:t>
-      </w:r>
-      <w:proofErr w:type="spellEnd"/>
-      <w:r>
-        <w:rPr>
-          <w:lang w:bidi="en-US"/>
-        </w:rPr>
-        <w:t>, accuracy, and recall. The YOLOv5s + </w:t>
-      </w:r>
-      <w:proofErr w:type="spellStart"/>
-      <w:r>
-        <w:rPr>
-          <w:lang w:bidi="en-US"/>
-        </w:rPr>
-        <w:t>SEBiFPN</w:t>
-      </w:r>
-      <w:proofErr w:type="spellEnd"/>
-      <w:r>
-        <w:rPr>
-          <w:lang w:bidi="en-US"/>
-        </w:rPr>
-        <w:t xml:space="preserve"> model </w:t>
-      </w:r>
-      <w:proofErr w:type="gramStart"/>
-      <w:r>
-        <w:rPr>
-          <w:lang w:bidi="en-US"/>
-        </w:rPr>
-        <w:t>demonstrate</w:t>
-      </w:r>
-      <w:proofErr w:type="gramEnd"/>
-      <w:r>
-        <w:rPr>
-          <w:lang w:bidi="en-US"/>
-        </w:rPr>
         <w:t xml:space="preserve"> a substantial improvement over the YOLOv5s algorithm, and establishing a benchmark technology for advancing computer-assisted diagnostic systems is feasible.</w:t>
       </w:r>
     </w:p>
@@ -3614,14 +3709,7 @@
         <w:rPr>
           <w:lang w:bidi="en-US"/>
         </w:rPr>
-        <w:t xml:space="preserve">(3) statistical analysis to determine detection capability, distribution of failures </w:t>
-      </w:r>
-      <w:r>
-        <w:rPr>
-          <w:lang w:bidi="en-US"/>
-        </w:rPr>
-        <w:lastRenderedPageBreak/>
-        <w:t xml:space="preserve">and statistical ranking, (4) a graph-based method for test-time inference refinement and its performance evaluation and </w:t>
+        <w:t xml:space="preserve">(3) statistical analysis to determine detection capability, distribution of failures and statistical ranking, (4) a graph-based method for test-time inference refinement and its performance evaluation and </w:t>
       </w:r>
       <w:r>
         <w:rPr>
@@ -3831,6 +3919,21 @@
               <w:fldChar w:fldCharType="begin"/>
             </w:r>
             <w:r>
+              <w:instrText xml:space="preserve"> ADDIN ZOTERO_ITEM CSL_CITATION {"citationID":"SPvNanTG","properties":{"formattedCitation":"[62]","plainCitation":"[62]","noteIndex":0},"citationItems":[{"id":2026,"uris":["http://zotero.org/users/8619560/items/4DWT4CZR"],"itemData":{"id":2026,"type":"article-journal","abstract":"We introduce in this paper a novel polyp localization method for colonoscopy videos. Our method is based on a model of appearance for polyps which defines polyp boundaries in terms of valley information. We propose the integration of valley information in a robust way fostering complete, concave and continuous boundaries typically associated to polyps. This integration is done by using a window of radial sectors which accumulate valley information to create WM-DOVA (Window Median Depth of Valleys Accumulation) energy maps related with the likelihood of polyp presence. We perform a double validation of our maps, which include the introduction of two new databases, including the first, up to our knowledge, fully annotated database with clinical metadata associated. First we assess that the highest value corresponds with the location of the polyp in the image. Second, we show that WM-DOVA energy maps can be comparable with saliency maps obtained from physicians’ fixations obtained via an eye-tracker. Finally, we prove that our method outperforms state-of-the-art computational saliency results. Our method shows good performance, particularly for small polyps which are reported to be the main sources of polyp miss-rate, which indicates the potential applicability of our method in clinical practice.","container-title":"Computerized Medical Imaging and Graphics","DOI":"10.1016/j.compmedimag.2015.02.007","ISSN":"0895-6111","journalAbbreviation":"Computerized Medical Imaging and Graphics","page":"99-111","source":"ScienceDirect","title":"WM-DOVA maps for accurate polyp highlighting in colonoscopy: Validation vs. saliency maps from physicians","title-short":"WM-DOVA maps for accurate polyp highlighting in colonoscopy","volume":"43","author":[{"family":"Bernal","given":"Jorge"},{"family":"Sánchez","given":"F. Javier"},{"family":"Fernández-Esparrach","given":"Gloria"},{"family":"Gil","given":"Debora"},{"family":"Rodríguez","given":"Cristina"},{"family":"Vilariño","given":"Fernando"}],"issued":{"date-parts":[["2015",7,1]]}}}],"schema":"https://github.com/citation-style-language/schema/raw/master/csl-citation.json"} </w:instrText>
+            </w:r>
+            <w:r>
+              <w:fldChar w:fldCharType="separate"/>
+            </w:r>
+            <w:r>
+              <w:t>[62]</w:t>
+            </w:r>
+            <w:r>
+              <w:fldChar w:fldCharType="end"/>
+            </w:r>
+            <w:r>
+              <w:fldChar w:fldCharType="begin"/>
+            </w:r>
+            <w:r>
               <w:instrText xml:space="preserve"> ADDIN ZOTERO_ITEM CSL_CITATION {"citationID":"uaVjKiiq","properties":{"formattedCitation":"[35]","plainCitation":"[35]","dontUpdate":true,"noteIndex":0},"citationItems":[{"id":1542,"uris":["http://zotero.org/users/8619560/items/ES69CBK3"],"itemData":{"id":1542,"type":"article-journal","abstract":"Objectives\nTo develop and validate a deep learning (DL)-based primary tumor biopsy signature for predicting axillary lymph node (ALN) metastasis preoperatively in early breast cancer (EBC) patients with clinically negative ALN.\n\nMethods\nA total of 1,058 EBC patients with pathologically confirmed ALN status were enrolled from May 2010 to August 2020. A DL core-needle biopsy (DL-CNB) model was built on the attention-based multiple instance-learning (AMIL) framework to predict ALN status utilizing the DL features, which were extracted from the cancer areas of digitized whole-slide images (WSIs) of breast CNB specimens annotated by two pathologists. Accuracy, sensitivity, specificity, receiver operating characteristic (ROC) curves, and areas under the ROC curve (AUCs) were analyzed to evaluate our model.\n\nResults\nThe best-performing DL-CNB model with VGG16_BN as the feature extractor achieved an AUC of 0.816 (95% confidence interval (CI): 0.758, 0.865) in predicting positive ALN metastasis in the independent test cohort. Furthermore, our model incorporating the clinical data, which was called DL-CNB+C, yielded the best accuracy of 0.831 (95%CI: 0.775, 0.878), especially for patients younger than 50 years (AUC: 0.918, 95%CI: 0.825, 0.971). The interpretation of DL-CNB model showed that the top signatures most predictive of ALN metastasis were characterized by the nucleus features including density (p = 0.015), circumference (p = 0.009), circularity (p = 0.010), and orientation (p = 0.012).\n\nConclusion\nOur study provides a novel DL-based biomarker on primary tumor CNB slides to predict the metastatic status of ALN preoperatively for patients with EBC.","container-title":"Frontiers in Oncology","DOI":"10.3389/fonc.2021.759007","ISSN":"2234-943X","journalAbbreviation":"Front. Oncol.","language":"English","note":"publisher: Frontiers","source":"Frontiers","title":"Predicting Axillary Lymph Node Metastasis in Early Breast Cancer Using Deep Learning on Primary Tumor Biopsy Slides","URL":"https://www.frontiersin.org/journals/oncology/articles/10.3389/fonc.2021.759007/full","volume":"11","author":[{"family":"Xu","given":"Feng"},{"family":"Zhu","given":"Chuang"},{"family":"Tang","given":"Wenqi"},{"family":"Wang","given":"Ying"},{"family":"Zhang","given":"Yu"},{"family":"Li","given":"Jie"},{"family":"Jiang","given":"Hongchuan"},{"family":"Shi","given":"Zhongyue"},{"family":"Liu","given":"Jun"},{"family":"Jin","given":"Mulan"}],"accessed":{"date-parts":[["2025",8,20]]},"issued":{"date-parts":[["2021",10,14]]}}}],"schema":"https://github.com/citation-style-language/schema/raw/master/csl-citation.json"} </w:instrText>
             </w:r>
             <w:r>
@@ -3963,6 +4066,21 @@
               <w:fldChar w:fldCharType="begin"/>
             </w:r>
             <w:r>
+              <w:instrText xml:space="preserve"> ADDIN ZOTERO_ITEM CSL_CITATION {"citationID":"GMvEmulr","properties":{"formattedCitation":"[9]","plainCitation":"[9]","noteIndex":0},"citationItems":[{"id":2031,"uris":["http://zotero.org/users/8619560/items/DXXS8DLD"],"itemData":{"id":2031,"type":"article-journal","abstract":"This work aims at automatic polyp detection by using a model of polyp appearance in the context of the analysis of colonoscopy videos. Our method consists of three stages: region segmentation, region description and region classification. The performance of our region segmentation method guarantees that if a polyp is present in the image, it will be exclusively and totally contained in a single region. The output of the algorithm also defines which regions can be considered as non-informative. We define as our region descriptor the novel Sector Accumulation-Depth of Valleys Accumulation (SA-DOVA), which provides a necessary but not sufficient condition for the polyp presence. Finally, we classify our segmented regions according to the maximal values of the SA-DOVA descriptor. Our preliminary classification results are promising, especially when classifying those parts of the image that do not contain a polyp inside.","collection-title":"Best Papers of Iberian Conference on Pattern Recognition and Image Analysis (IbPRIA'2011)","container-title":"Pattern Recognition","DOI":"10.1016/j.patcog.2012.03.002","ISSN":"0031-3203","issue":"9","journalAbbreviation":"Pattern Recognition","page":"3166-3182","source":"ScienceDirect","title":"Towards automatic polyp detection with a polyp appearance model","volume":"45","author":[{"family":"Bernal","given":"J."},{"family":"Sánchez","given":"J."},{"family":"Vilariño","given":"F."}],"issued":{"date-parts":[["2012",9,1]]}}}],"schema":"https://github.com/citation-style-language/schema/raw/master/csl-citation.json"} </w:instrText>
+            </w:r>
+            <w:r>
+              <w:fldChar w:fldCharType="separate"/>
+            </w:r>
+            <w:r>
+              <w:t>[9]</w:t>
+            </w:r>
+            <w:r>
+              <w:fldChar w:fldCharType="end"/>
+            </w:r>
+            <w:r>
+              <w:fldChar w:fldCharType="begin"/>
+            </w:r>
+            <w:r>
               <w:instrText xml:space="preserve"> ADDIN ZOTERO_ITEM CSL_CITATION {"citationID":"zqgNDPA8","properties":{"formattedCitation":"[10]","plainCitation":"[10]","dontUpdate":true,"noteIndex":0},"citationItems":[{"id":1544,"uris":["http://zotero.org/users/8619560/items/PNS6XZXN"],"itemData":{"id":1544,"type":"article-journal","abstract":"Background: Deep learning (DL) is a representation learning approach ideally suited for image analysis challenges in digital pathology (DP). The variety of image analysis tasks in the context of DP includes detection and counting (e.g., mitotic events), segmentation (e.g., nuclei), and tissue classification (e.g., cancerous vs. non-cancerous). Unfortunately, issues with slide preparation, variations in staining and scanning across sites, and vendor platforms, as well as biological variance, such as the presentation of different grades of disease, make these image analysis tasks particularly challenging. Traditional approaches, wherein domain-specific cues are manually identified and developed into task-specific “handcrafted” features, can require extensive tuning to accommodate these variances. However, DL takes a more domain agnostic approach combining both feature discovery and implementation to maximally discriminate between the classes of interest. While DL approaches have performed well in a few DP related image analysis tasks, such as detection and tissue classification, the currently available open source tools and tutorials do not provide guidance on challenges such as (a) selecting appropriate magnification, (b) managing errors in annotations in the training (or learning) dataset, and (c) identifying a suitable training set containing information rich exemplars. These foundational concepts, which are needed to successfully translate the DL paradigm to DP tasks, are non-trivial for (i) DL experts with minimal digital histology experience, and (ii) DP and image processing experts with minimal DL experience, to derive on their own, thus meriting a dedicated tutorial. Aims: This paper investigates these concepts through seven unique DP tasks as use cases to elucidate techniques needed to produce comparable, and in many cases, superior to results from the state-of-the-art hand-crafted feature-based classification approaches. Results: Specifically, in this tutorial on DL for DP image analysis, we show how an open source framework (Caffe), with a singular network architecture, can be used to address: (a) nuclei segmentation (F-score of 0.83 across 12,000 nuclei), (b) epithelium segmentation (F-score of 0.84 across 1735 regions), (c) tubule segmentation (F-score of 0.83 from 795 tubules), (d) lymphocyte detection (F-score of 0.90 across 3064 lymphocytes), (e) mitosis detection (F-score of 0.53 across 550 mitotic events), (f) invasive ductal carcinoma detection (F-score of 0.7648 on 50 k testing patches), and (g) lymphoma classification (classification accuracy of 0.97 across 374 images). Conclusion: This paper represents the largest comprehensive study of DL approaches in DP to date, with over 1200 DP images used during evaluation. The supplemental online material that accompanies this paper consists of step-by-step instructions for the usage of the supplied source code, trained models, and input data.","container-title":"Journal of Pathology Informatics","DOI":"10.4103/2153-3539.186902","ISSN":"2153-3539","issue":"1","journalAbbreviation":"Journal of Pathology Informatics","page":"29","source":"ScienceDirect","title":"Deep learning for digital pathology image analysis: A comprehensive tutorial with selected use cases","title-short":"Deep learning for digital pathology image analysis","volume":"7","author":[{"family":"Janowczyk","given":"Andrew"},{"family":"Madabhushi","given":"Anant"}],"issued":{"date-parts":[["2016",1,1]]}}}],"schema":"https://github.com/citation-style-language/schema/raw/master/csl-citation.json"} </w:instrText>
             </w:r>
             <w:r>
@@ -4072,6 +4190,24 @@
               <w:t>LaribPolypDB</w:t>
             </w:r>
             <w:proofErr w:type="spellEnd"/>
+            <w:r>
+              <w:t xml:space="preserve"> </w:t>
+            </w:r>
+            <w:r>
+              <w:fldChar w:fldCharType="begin"/>
+            </w:r>
+            <w:r>
+              <w:instrText xml:space="preserve"> ADDIN ZOTERO_ITEM CSL_CITATION {"citationID":"QpKTUEGi","properties":{"formattedCitation":"[63]","plainCitation":"[63]","noteIndex":0},"citationItems":[{"id":2024,"uris":["http://zotero.org/users/8619560/items/IMVRV4NE"],"itemData":{"id":2024,"type":"article-journal","abstract":"Wireless capsule endoscopy (WCE) is commonly used for noninvasive gastrointestinal tract evaluation, including the detection of mucosal polyps. A new embeddable method for polyp detection in wireless capsule endoscopic images was developed and tested.","container-title":"International Journal of Computer Assisted Radiology and Surgery","DOI":"10.1007/s11548-013-0926-3","ISSN":"1861-6429","issue":"2","journalAbbreviation":"Int J CARS","language":"en","page":"283-293","source":"Springer Link","title":"Toward embedded detection of polyps in WCE images for early diagnosis of colorectal cancer","volume":"9","author":[{"family":"Silva","given":"Juan"},{"family":"Histace","given":"Aymeric"},{"family":"Romain","given":"Olivier"},{"family":"Dray","given":"Xavier"},{"family":"Granado","given":"Bertrand"}],"issued":{"date-parts":[["2014",3,1]]}}}],"schema":"https://github.com/citation-style-language/schema/raw/master/csl-citation.json"} </w:instrText>
+            </w:r>
+            <w:r>
+              <w:fldChar w:fldCharType="separate"/>
+            </w:r>
+            <w:r>
+              <w:t>[63]</w:t>
+            </w:r>
+            <w:r>
+              <w:fldChar w:fldCharType="end"/>
+            </w:r>
           </w:p>
         </w:tc>
         <w:tc>
@@ -4199,22 +4335,25 @@
     </w:p>
     <w:p>
       <w:r>
+        <w:t>This method [14] is based on a model of appearance considering polyps as protruding surfaces</w:t>
+      </w:r>
+      <w:proofErr w:type="gramStart"/>
+      <w:r>
+        <w:t>, being</w:t>
+      </w:r>
+      <w:proofErr w:type="gramEnd"/>
+      <w:r>
+        <w:t xml:space="preserve"> their boundaries defined from intensity valleys detection. Their proposal includes a pre-preprocessing stage to mitigate the impact of other valley-rich structures (blood vessels, specular highlights). To build final energy maps highlighting polyp presence, four different</w:t>
+      </w:r>
+      <w:r>
+        <w:t xml:space="preserve"> </w:t>
+      </w:r>
+      <w:r>
+        <w:t xml:space="preserve">constraints </w:t>
+      </w:r>
+      <w:r>
         <w:lastRenderedPageBreak/>
-        <w:t>This method [14] is based on a model of appearance considering polyps as protruding surfaces</w:t>
-      </w:r>
-      <w:proofErr w:type="gramStart"/>
-      <w:r>
-        <w:t>, being</w:t>
-      </w:r>
-      <w:proofErr w:type="gramEnd"/>
-      <w:r>
-        <w:t xml:space="preserve"> their boundaries defined from intensity valleys detection. Their proposal includes a pre-preprocessing stage to mitigate the impact of other valley-rich structures (blood vessels, specular highlights). To build final energy maps highlighting polyp presence, four different</w:t>
-      </w:r>
-      <w:r>
-        <w:t xml:space="preserve"> </w:t>
-      </w:r>
-      <w:r>
-        <w:t>constraints (continuity, completeness, concavity, and robustness against spurious structures) are imposed to candidate boundaries to differentiate polyps from other structures.</w:t>
+        <w:t>(continuity, completeness, concavity, and robustness against spurious structures) are imposed to candidate boundaries to differentiate polyps from other structures.</w:t>
       </w:r>
     </w:p>
     <w:p>
@@ -4382,142 +4521,905 @@
       </w:r>
       <w:proofErr w:type="gramEnd"/>
       <w:r>
-        <w:t xml:space="preserve"> polyps, a Hough transform was used for this first filtering stage. Once ROIs are detected, a second </w:t>
-      </w:r>
+        <w:t xml:space="preserve"> polyps, a Hough transform was used for this first filtering stage. Once ROIs are detected, a second analysis, based on texture is achieved </w:t>
+      </w:r>
+      <w:proofErr w:type="gramStart"/>
+      <w:r>
+        <w:t>in order to</w:t>
+      </w:r>
+      <w:proofErr w:type="gramEnd"/>
+      <w:r>
+        <w:t xml:space="preserve"> remove those ROIs with no actual polyp content. To achieve this, an ad-hoc classifier based on a boosting-based learning process using texture features computed from co-</w:t>
+      </w:r>
+      <w:proofErr w:type="spellStart"/>
+      <w:r>
+        <w:t>ocurrence</w:t>
+      </w:r>
+      <w:proofErr w:type="spellEnd"/>
+      <w:r>
+        <w:t xml:space="preserve"> matrices (standard </w:t>
+      </w:r>
+      <w:proofErr w:type="spellStart"/>
+      <w:r>
+        <w:t>Haralick</w:t>
+      </w:r>
+      <w:proofErr w:type="spellEnd"/>
+      <w:r>
+        <w:t xml:space="preserve"> features) is proposed</w:t>
+      </w:r>
+    </w:p>
+    <w:p/>
+    <w:p>
+      <w:pPr>
+        <w:pStyle w:val="Heading2"/>
+      </w:pPr>
       <w:r>
         <w:lastRenderedPageBreak/>
-        <w:t xml:space="preserve">analysis, based on texture is achieved </w:t>
+        <w:t>Object detection models</w:t>
+      </w:r>
+    </w:p>
+    <w:p>
+      <w:r>
+        <w:t xml:space="preserve">The </w:t>
+      </w:r>
+      <w:r>
+        <w:t xml:space="preserve">"You Only Look Once" (YOLO) </w:t>
+      </w:r>
+      <w:r>
+        <w:fldChar w:fldCharType="begin"/>
+      </w:r>
+      <w:r>
+        <w:instrText xml:space="preserve"> ADDIN ZOTERO_ITEM CSL_CITATION {"citationID":"S8UhbA0L","properties":{"formattedCitation":"[31]","plainCitation":"[31]","noteIndex":0},"citationItems":[{"id":1303,"uris":["http://zotero.org/users/8619560/items/3LZ4ZER6"],"itemData":{"id":1303,"type":"article","abstract":"We present YOLO, a new approach to object detection. Prior work on object detection repurposes classifiers to perform detection. Instead, we frame object detection as a regression problem to spatially separated bounding boxes and associated class probabilities. A single neural network predicts bounding boxes and class probabilities directly from full images in one evaluation. Since the whole detection pipeline is a single network, it can be optimized end-to-end directly on detection performance. Our unified architecture is extremely fast. Our base YOLO model processes images in real-time at 45 frames per second. A smaller version of the network, Fast YOLO, processes an astounding 155 frames per second while still achieving double the mAP of other real-time detectors. Compared to state-of-the-art detection systems, YOLO makes more localization errors but is far less likely to predict false detections where nothing exists. Finally, YOLO learns very general representations of objects. It outperforms all other detection methods, including DPM and R-CNN, by a wide margin when generalizing from natural images to artwork on both the Picasso Dataset and the People-Art Dataset.","DOI":"10.48550/arXiv.1506.02640","note":"arXiv:1506.02640 [cs]","number":"arXiv:1506.02640","publisher":"arXiv","source":"arXiv.org","title":"You Only Look Once: Unified, Real-Time Object Detection","title-short":"You Only Look Once","URL":"http://arxiv.org/abs/1506.02640","author":[{"family":"Redmon","given":"Joseph"},{"family":"Divvala","given":"Santosh"},{"family":"Girshick","given":"Ross"},{"family":"Farhadi","given":"Ali"}],"accessed":{"date-parts":[["2025",5,26]]},"issued":{"date-parts":[["2016",5,9]]}}}],"schema":"https://github.com/citation-style-language/schema/raw/master/csl-citation.json"} </w:instrText>
+      </w:r>
+      <w:r>
+        <w:fldChar w:fldCharType="separate"/>
+      </w:r>
+      <w:r>
+        <w:t>[31]</w:t>
+      </w:r>
+      <w:r>
+        <w:fldChar w:fldCharType="end"/>
+      </w:r>
+      <w:r>
+        <w:t xml:space="preserve"> </w:t>
+      </w:r>
+      <w:r>
+        <w:t>algorithm revolutionized real-time object detection through the unification of region proposal and classification. YOLO divides an image through a grid attempting to predict a class and a bounding box for each cell of the grid. This approach</w:t>
+      </w:r>
+      <w:r>
+        <w:t xml:space="preserve"> significantly reduced computation time and enabled end-to-end learnin</w:t>
+      </w:r>
+      <w:r>
+        <w:t xml:space="preserve">g. YOLOv1 managed to achieve real-time detection although it incorporated a CNN backbone; however, small objects were hard to identify and localize accurately </w:t>
       </w:r>
       <w:proofErr w:type="gramStart"/>
       <w:r>
-        <w:t>in order to</w:t>
+        <w:t>due to the fact that</w:t>
       </w:r>
       <w:proofErr w:type="gramEnd"/>
       <w:r>
-        <w:t xml:space="preserve"> remove those ROIs with no actual polyp content. To achieve this, an ad-hoc classifier based on a boosting-based learning process using texture features computed from co-</w:t>
+        <w:t xml:space="preserve"> each grid cell was only able to predict two bounding boxes.  </w:t>
+      </w:r>
+    </w:p>
+    <w:p>
+      <w:pPr>
+        <w:rPr>
+          <w:lang w:bidi="en-US"/>
+        </w:rPr>
+      </w:pPr>
+      <w:r>
+        <w:t>Since the introduction of YOLO in 2015, t</w:t>
+      </w:r>
+      <w:r>
+        <w:t xml:space="preserve">he YOLO </w:t>
+      </w:r>
+      <w:r>
+        <w:t>family of algorithms</w:t>
+      </w:r>
+      <w:r>
+        <w:t xml:space="preserve"> </w:t>
+      </w:r>
+      <w:r>
+        <w:rPr>
+          <w:color w:val="FF0000"/>
+        </w:rPr>
+        <w:fldChar w:fldCharType="begin"/>
+      </w:r>
+      <w:r>
+        <w:rPr>
+          <w:color w:val="FF0000"/>
+        </w:rPr>
+        <w:instrText xml:space="preserve"> ADDIN ZOTERO_ITEM CSL_CITATION {"citationID":"1RCuhZIW","properties":{"formattedCitation":"[64]","plainCitation":"[64]","noteIndex":0},"citationItems":[{"id":1298,"uris":["http://zotero.org/users/8619560/items/IGKB3IMS"],"itemData":{"id":1298,"type":"article","abstract":"This review systematically examines the progression of the You Only Look Once (YOLO) object detection algorithms from YOLOv1 to the recently unveiled YOLOv12. Employing a reverse chronological analysis, this study examines the advancements introduced by YOLO algorithms, beginning with YOLOv12 and progressing through YOLO11 (or YOLOv11), YOLOv10, YOLOv9, YOLOv8, and subsequent versions to explore each version's contributions to enhancing speed, detection accuracy, and computational efficiency in real-time object detection. Additionally, this study reviews the alternative versions derived from YOLO architectural advancements of YOLO-NAS, YOLO-X, YOLO-R, DAMO-YOLO, and Gold-YOLO. By detailing the incremental technological advancements in subsequent YOLO versions, this review chronicles the evolution of YOLO, and discusses the challenges and limitations in each of the earlier versions. The evolution signifies a path towards integrating YOLO with multimodal, context-aware, and Artificial General Intelligence (AGI) systems for the next YOLO decade, promising significant implications for future developments in AI-driven applications. (Key terms: YOLOv12, YOLOv12 architecture, YOLOv11, YOLO11, YOLO Review, YOLOv14, YOLOv15, YOLO architecture, YOLOv12 architecture)","DOI":"10.1007/s10462-025-11253-3","note":"arXiv:2406.19407 [cs]","source":"arXiv.org","title":"YOLOv12 to Its Genesis: A Decadal and Comprehensive Review of The You Only Look Once (YOLO) Series","title-short":"YOLOv12 to Its Genesis","URL":"http://arxiv.org/abs/2406.19407","author":[{"family":"Sapkota","given":"Ranjan"},{"family":"Qureshi","given":"Rizwan"},{"family":"Calero","given":"Marco Flores"},{"family":"Badjugar","given":"Chetan"},{"family":"Nepal","given":"Upesh"},{"family":"Poulose","given":"Alwin"},{"family":"Zeno","given":"Peter"},{"family":"Vaddevolu","given":"Uday Bhanu Prakash"},{"family":"Khan","given":"Sheheryar"},{"family":"Shoman","given":"Maged"},{"family":"Yan","given":"Hong"},{"family":"Karkee","given":"Manoj"}],"accessed":{"date-parts":[["2025",5,26]]},"issued":{"date-parts":[["2025",2,21]]}}}],"schema":"https://github.com/citation-style-language/schema/raw/master/csl-citation.json"} </w:instrText>
+      </w:r>
+      <w:r>
+        <w:rPr>
+          <w:color w:val="FF0000"/>
+        </w:rPr>
+        <w:fldChar w:fldCharType="separate"/>
+      </w:r>
+      <w:r>
+        <w:t>[64]</w:t>
+      </w:r>
+      <w:r>
+        <w:rPr>
+          <w:color w:val="FF0000"/>
+        </w:rPr>
+        <w:fldChar w:fldCharType="end"/>
+      </w:r>
+      <w:r>
+        <w:rPr>
+          <w:color w:val="FF0000"/>
+        </w:rPr>
+        <w:t xml:space="preserve"> </w:t>
+      </w:r>
+      <w:r>
+        <w:t xml:space="preserve">has expanded both in depth and width with several incremental improvements and various modified versions for specific applications. Each new version introduced advancements with the goal of improving computational efficiency and detection accuracy. YOLOv2 </w:t>
+      </w:r>
+      <w:r>
+        <w:rPr>
+          <w:color w:val="FF0000"/>
+          <w:lang w:bidi="en-US"/>
+        </w:rPr>
+        <w:fldChar w:fldCharType="begin"/>
+      </w:r>
+      <w:r>
+        <w:rPr>
+          <w:color w:val="FF0000"/>
+          <w:lang w:bidi="en-US"/>
+        </w:rPr>
+        <w:instrText xml:space="preserve"> ADDIN ZOTERO_ITEM CSL_CITATION {"citationID":"u6lzzIXe","properties":{"formattedCitation":"[64], [65], [66]","plainCitation":"[64], [65], [66]","noteIndex":0},"citationItems":[{"id":1298,"uris":["http://zotero.org/users/8619560/items/IGKB3IMS"],"itemData":{"id":1298,"type":"article","abstract":"This review systematically examines the progression of the You Only Look Once (YOLO) object detection algorithms from YOLOv1 to the recently unveiled YOLOv12. Employing a reverse chronological analysis, this study examines the advancements introduced by YOLO algorithms, beginning with YOLOv12 and progressing through YOLO11 (or YOLOv11), YOLOv10, YOLOv9, YOLOv8, and subsequent versions to explore each version's contributions to enhancing speed, detection accuracy, and computational efficiency in real-time object detection. Additionally, this study reviews the alternative versions derived from YOLO architectural advancements of YOLO-NAS, YOLO-X, YOLO-R, DAMO-YOLO, and Gold-YOLO. By detailing the incremental technological advancements in subsequent YOLO versions, this review chronicles the evolution of YOLO, and discusses the challenges and limitations in each of the earlier versions. The evolution signifies a path towards integrating YOLO with multimodal, context-aware, and Artificial General Intelligence (AGI) systems for the next YOLO decade, promising significant implications for future developments in AI-driven applications. (Key terms: YOLOv12, YOLOv12 architecture, YOLOv11, YOLO11, YOLO Review, YOLOv14, YOLOv15, YOLO architecture, YOLOv12 architecture)","DOI":"10.1007/s10462-025-11253-3","note":"arXiv:2406.19407 [cs]","source":"arXiv.org","title":"YOLOv12 to Its Genesis: A Decadal and Comprehensive Review of The You Only Look Once (YOLO) Series","title-short":"YOLOv12 to Its Genesis","URL":"http://arxiv.org/abs/2406.19407","author":[{"family":"Sapkota","given":"Ranjan"},{"family":"Qureshi","given":"Rizwan"},{"family":"Calero","given":"Marco Flores"},{"family":"Badjugar","given":"Chetan"},{"family":"Nepal","given":"Upesh"},{"family":"Poulose","given":"Alwin"},{"family":"Zeno","given":"Peter"},{"family":"Vaddevolu","given":"Uday Bhanu Prakash"},{"family":"Khan","given":"Sheheryar"},{"family":"Shoman","given":"Maged"},{"family":"Yan","given":"Hong"},{"family":"Karkee","given":"Manoj"}],"accessed":{"date-parts":[["2025",5,26]]},"issued":{"date-parts":[["2025",2,21]]}}},{"id":1306,"uris":["http://zotero.org/users/8619560/items/FL9B4B5Z"],"itemData":{"id":1306,"type":"article","abstract":"The YOLO (You Only Look Once) series has been a leading framework in real-time object detection, consistently improving the balance between speed and accuracy. However, integrating attention mechanisms into YOLO has been challenging due to their high computational overhead. YOLOv12 introduces a novel approach that successfully incorporates attention-based enhancements while preserving real-time performance. This paper provides a comprehensive review of YOLOv12's architectural innovations, including Area Attention for computationally efficient self-attention, Residual Efficient Layer Aggregation Networks for improved feature aggregation, and FlashAttention for optimized memory access. Additionally, we benchmark YOLOv12 against prior YOLO versions and competing object detectors, analyzing its improvements in accuracy, inference speed, and computational efficiency. Through this analysis, we demonstrate how YOLOv12 advances real-time object detection by refining the latency-accuracy trade-off and optimizing computational resources.","DOI":"10.48550/arXiv.2504.11995","note":"arXiv:2504.11995 [cs]","number":"arXiv:2504.11995","publisher":"arXiv","source":"arXiv.org","title":"A Review of YOLOv12: Attention-Based Enhancements vs. Previous Versions","title-short":"A Review of YOLOv12","URL":"http://arxiv.org/abs/2504.11995","author":[{"family":"Khanam","given":"Rahima"},{"family":"Hussain","given":"Muhammad"}],"accessed":{"date-parts":[["2025",5,26]]},"issued":{"date-parts":[["2025",4,16]]}}},{"id":1317,"uris":["http://zotero.org/users/8619560/items/ZSS53KMG"],"itemData":{"id":1317,"type":"paper-conference","abstract":"We introduce YOLO9000, a state-of-the-art, real-time object detection system that can detect over 9000 object categories. First we propose various improvements to the YOLO detection method, both novel and drawn from prior work. The improved model, YOLOv2, is state-of-the-art on standard detection tasks like PASCAL VOC and COCO. Using a novel, multi-scale training method the same YOLOv2 model can run at varying sizes, offering an easy tradeoff between speed and accuracy. At 67 FPS, YOLOv2 gets 76.8 mAP on VOC 2007. At 40 FPS, YOLOv2 gets 78.6 mAP, outperforming state-of-the-art methods like Faster RCNN with ResNet and SSD while still running significantly faster. Finally we propose a method to jointly train on object detection and classification. Using this method we train YOLO9000 simultaneously on the COCO detection dataset and the ImageNet classification dataset. Our joint training allows YOLO9000 to predict detections for object classes that dont have labelled detection data. We validate our approach on the ImageNet detection task. YOLO9000 gets 19.7 mAP on the ImageNet detection validation set despite only having detection data for 44 of the 200 classes. On the 156 classes not in COCO, YOLO9000 gets 16.0 mAP. YOLO9000 predicts detections for more than 9000 different object categories, all in real-time.","container-title":"2017 IEEE Conference on Computer Vision and Pattern Recognition (CVPR)","DOI":"10.1109/CVPR.2017.690","event-title":"2017 IEEE Conference on Computer Vision and Pattern Recognition (CVPR)","note":"ISSN: 1063-6919","page":"6517-6525","source":"IEEE Xplore","title":"YOLO9000: Better, Faster, Stronger","title-short":"YOLO9000","URL":"https://ieeexplore.ieee.org/document/8100173","author":[{"family":"Redmon","given":"Joseph"},{"family":"Farhadi","given":"Ali"}],"accessed":{"date-parts":[["2025",5,26]]},"issued":{"date-parts":[["2017",7]]}}}],"schema":"https://github.com/citation-style-language/schema/raw/master/csl-citation.json"} </w:instrText>
+      </w:r>
+      <w:r>
+        <w:rPr>
+          <w:color w:val="FF0000"/>
+          <w:lang w:bidi="en-US"/>
+        </w:rPr>
+        <w:fldChar w:fldCharType="separate"/>
+      </w:r>
+      <w:r>
+        <w:t>[64], [65], [66]</w:t>
+      </w:r>
+      <w:r>
+        <w:rPr>
+          <w:color w:val="FF0000"/>
+        </w:rPr>
+        <w:fldChar w:fldCharType="end"/>
+      </w:r>
+      <w:r>
+        <w:rPr>
+          <w:color w:val="FF0000"/>
+        </w:rPr>
+        <w:t xml:space="preserve"> </w:t>
+      </w:r>
+      <w:r>
+        <w:t xml:space="preserve">brought several </w:t>
+      </w:r>
+      <w:r>
+        <w:t xml:space="preserve">enhancements </w:t>
+      </w:r>
+      <w:r>
+        <w:t>to</w:t>
+      </w:r>
+      <w:r>
+        <w:t xml:space="preserve"> YOLOv1</w:t>
+      </w:r>
+      <w:r>
+        <w:t xml:space="preserve"> </w:t>
+      </w:r>
+      <w:r>
+        <w:t>includ</w:t>
+      </w:r>
+      <w:r>
+        <w:t>ing</w:t>
+      </w:r>
+      <w:r>
+        <w:t xml:space="preserve"> higher input resolution, batch normalization, and the adoption of anchor boxes from Faster R-CNN to improve training and performance.</w:t>
+      </w:r>
+      <w:r>
+        <w:t xml:space="preserve"> </w:t>
+      </w:r>
+      <w:r>
+        <w:rPr>
+          <w:lang w:bidi="en-US"/>
+        </w:rPr>
+        <w:t xml:space="preserve">YOLOv3 </w:t>
+      </w:r>
+      <w:r>
+        <w:rPr>
+          <w:lang w:bidi="en-US"/>
+        </w:rPr>
+        <w:fldChar w:fldCharType="begin"/>
+      </w:r>
+      <w:r>
+        <w:rPr>
+          <w:lang w:bidi="en-US"/>
+        </w:rPr>
+        <w:instrText xml:space="preserve"> ADDIN ZOTERO_ITEM CSL_CITATION {"citationID":"br1yyAyz","properties":{"formattedCitation":"[64], [65], [67]","plainCitation":"[64], [65], [67]","noteIndex":0},"citationItems":[{"id":1298,"uris":["http://zotero.org/users/8619560/items/IGKB3IMS"],"itemData":{"id":1298,"type":"article","abstract":"This review systematically examines the progression of the You Only Look Once (YOLO) object detection algorithms from YOLOv1 to the recently unveiled YOLOv12. Employing a reverse chronological analysis, this study examines the advancements introduced by YOLO algorithms, beginning with YOLOv12 and progressing through YOLO11 (or YOLOv11), YOLOv10, YOLOv9, YOLOv8, and subsequent versions to explore each version's contributions to enhancing speed, detection accuracy, and computational efficiency in real-time object detection. Additionally, this study reviews the alternative versions derived from YOLO architectural advancements of YOLO-NAS, YOLO-X, YOLO-R, DAMO-YOLO, and Gold-YOLO. By detailing the incremental technological advancements in subsequent YOLO versions, this review chronicles the evolution of YOLO, and discusses the challenges and limitations in each of the earlier versions. The evolution signifies a path towards integrating YOLO with multimodal, context-aware, and Artificial General Intelligence (AGI) systems for the next YOLO decade, promising significant implications for future developments in AI-driven applications. (Key terms: YOLOv12, YOLOv12 architecture, YOLOv11, YOLO11, YOLO Review, YOLOv14, YOLOv15, YOLO architecture, YOLOv12 architecture)","DOI":"10.1007/s10462-025-11253-3","note":"arXiv:2406.19407 [cs]","source":"arXiv.org","title":"YOLOv12 to Its Genesis: A Decadal and Comprehensive Review of The You Only Look Once (YOLO) Series","title-short":"YOLOv12 to Its Genesis","URL":"http://arxiv.org/abs/2406.19407","author":[{"family":"Sapkota","given":"Ranjan"},{"family":"Qureshi","given":"Rizwan"},{"family":"Calero","given":"Marco Flores"},{"family":"Badjugar","given":"Chetan"},{"family":"Nepal","given":"Upesh"},{"family":"Poulose","given":"Alwin"},{"family":"Zeno","given":"Peter"},{"family":"Vaddevolu","given":"Uday Bhanu Prakash"},{"family":"Khan","given":"Sheheryar"},{"family":"Shoman","given":"Maged"},{"family":"Yan","given":"Hong"},{"family":"Karkee","given":"Manoj"}],"accessed":{"date-parts":[["2025",5,26]]},"issued":{"date-parts":[["2025",2,21]]}}},{"id":1306,"uris":["http://zotero.org/users/8619560/items/FL9B4B5Z"],"itemData":{"id":1306,"type":"article","abstract":"The YOLO (You Only Look Once) series has been a leading framework in real-time object detection, consistently improving the balance between speed and accuracy. However, integrating attention mechanisms into YOLO has been challenging due to their high computational overhead. YOLOv12 introduces a novel approach that successfully incorporates attention-based enhancements while preserving real-time performance. This paper provides a comprehensive review of YOLOv12's architectural innovations, including Area Attention for computationally efficient self-attention, Residual Efficient Layer Aggregation Networks for improved feature aggregation, and FlashAttention for optimized memory access. Additionally, we benchmark YOLOv12 against prior YOLO versions and competing object detectors, analyzing its improvements in accuracy, inference speed, and computational efficiency. Through this analysis, we demonstrate how YOLOv12 advances real-time object detection by refining the latency-accuracy trade-off and optimizing computational resources.","DOI":"10.48550/arXiv.2504.11995","note":"arXiv:2504.11995 [cs]","number":"arXiv:2504.11995","publisher":"arXiv","source":"arXiv.org","title":"A Review of YOLOv12: Attention-Based Enhancements vs. Previous Versions","title-short":"A Review of YOLOv12","URL":"http://arxiv.org/abs/2504.11995","author":[{"family":"Khanam","given":"Rahima"},{"family":"Hussain","given":"Muhammad"}],"accessed":{"date-parts":[["2025",5,26]]},"issued":{"date-parts":[["2025",4,16]]}}},{"id":1312,"uris":["http://zotero.org/users/8619560/items/FDKPMXXD"],"itemData":{"id":1312,"type":"article","abstract":"We present some updates to YOLO! We made a bunch of little design changes to make it better. We also trained this new network that's pretty swell. It's a little bigger than last time but more accurate. It's still fast though, don't worry. At 320x320 YOLOv3 runs in 22 ms at 28.2 mAP, as accurate as SSD but three times faster. When we look at the old .5 IOU mAP detection metric YOLOv3 is quite good. It achieves 57.9 mAP@50 in 51 ms on a Titan X, compared to 57.5 mAP@50 in 198 ms by RetinaNet, similar performance but 3.8x faster. As always, all the code is online at https://pjreddie.com/yolo/","DOI":"10.48550/arXiv.1804.02767","note":"arXiv:1804.02767 [cs]","number":"arXiv:1804.02767","publisher":"arXiv","source":"arXiv.org","title":"YOLOv3: An Incremental Improvement","title-short":"YOLOv3","URL":"http://arxiv.org/abs/1804.02767","author":[{"family":"Redmon","given":"Joseph"},{"family":"Farhadi","given":"Ali"}],"accessed":{"date-parts":[["2025",5,26]]},"issued":{"date-parts":[["2018",4,8]]}}}],"schema":"https://github.com/citation-style-language/schema/raw/master/csl-citation.json"} </w:instrText>
+      </w:r>
+      <w:r>
+        <w:rPr>
+          <w:lang w:bidi="en-US"/>
+        </w:rPr>
+        <w:fldChar w:fldCharType="separate"/>
+      </w:r>
+      <w:r>
+        <w:t>[64], [65], [67]</w:t>
+      </w:r>
+      <w:r>
+        <w:fldChar w:fldCharType="end"/>
+      </w:r>
+      <w:r>
+        <w:rPr>
+          <w:lang w:bidi="en-US"/>
+        </w:rPr>
+        <w:t xml:space="preserve"> </w:t>
+      </w:r>
+      <w:r>
+        <w:rPr>
+          <w:lang w:bidi="en-US"/>
+        </w:rPr>
+        <w:t>achieved higher</w:t>
+      </w:r>
+      <w:r>
+        <w:rPr>
+          <w:lang w:bidi="en-US"/>
+        </w:rPr>
+        <w:t xml:space="preserve"> </w:t>
+      </w:r>
+      <w:r>
+        <w:rPr>
+          <w:lang w:bidi="en-US"/>
+        </w:rPr>
+        <w:t xml:space="preserve">accuracy in </w:t>
+      </w:r>
+      <w:r>
+        <w:rPr>
+          <w:lang w:bidi="en-US"/>
+        </w:rPr>
+        <w:t xml:space="preserve">small-object detection through multi-scale predictions using Feature Pyramid Networks (FPN) and a deeper architecture, </w:t>
+      </w:r>
+      <w:r>
+        <w:rPr>
+          <w:lang w:bidi="en-US"/>
+        </w:rPr>
+        <w:t xml:space="preserve">specifically </w:t>
+      </w:r>
+      <w:r>
+        <w:rPr>
+          <w:lang w:bidi="en-US"/>
+        </w:rPr>
+        <w:t>Darknet-53.</w:t>
+      </w:r>
+      <w:r>
+        <w:t xml:space="preserve"> </w:t>
+      </w:r>
+      <w:r>
+        <w:rPr>
+          <w:lang w:bidi="en-US"/>
+        </w:rPr>
+        <w:t xml:space="preserve">YOLOv4 </w:t>
+      </w:r>
+      <w:r>
+        <w:rPr>
+          <w:lang w:bidi="en-US"/>
+        </w:rPr>
+        <w:fldChar w:fldCharType="begin"/>
+      </w:r>
+      <w:r>
+        <w:rPr>
+          <w:lang w:bidi="en-US"/>
+        </w:rPr>
+        <w:instrText xml:space="preserve"> ADDIN ZOTERO_ITEM CSL_CITATION {"citationID":"DgLR1SGv","properties":{"formattedCitation":"[64], [65], [68]","plainCitation":"[64], [65], [68]","noteIndex":0},"citationItems":[{"id":1298,"uris":["http://zotero.org/users/8619560/items/IGKB3IMS"],"itemData":{"id":1298,"type":"article","abstract":"This review systematically examines the progression of the You Only Look Once (YOLO) object detection algorithms from YOLOv1 to the recently unveiled YOLOv12. Employing a reverse chronological analysis, this study examines the advancements introduced by YOLO algorithms, beginning with YOLOv12 and progressing through YOLO11 (or YOLOv11), YOLOv10, YOLOv9, YOLOv8, and subsequent versions to explore each version's contributions to enhancing speed, detection accuracy, and computational efficiency in real-time object detection. Additionally, this study reviews the alternative versions derived from YOLO architectural advancements of YOLO-NAS, YOLO-X, YOLO-R, DAMO-YOLO, and Gold-YOLO. By detailing the incremental technological advancements in subsequent YOLO versions, this review chronicles the evolution of YOLO, and discusses the challenges and limitations in each of the earlier versions. The evolution signifies a path towards integrating YOLO with multimodal, context-aware, and Artificial General Intelligence (AGI) systems for the next YOLO decade, promising significant implications for future developments in AI-driven applications. (Key terms: YOLOv12, YOLOv12 architecture, YOLOv11, YOLO11, YOLO Review, YOLOv14, YOLOv15, YOLO architecture, YOLOv12 architecture)","DOI":"10.1007/s10462-025-11253-3","note":"arXiv:2406.19407 [cs]","source":"arXiv.org","title":"YOLOv12 to Its Genesis: A Decadal and Comprehensive Review of The You Only Look Once (YOLO) Series","title-short":"YOLOv12 to Its Genesis","URL":"http://arxiv.org/abs/2406.19407","author":[{"family":"Sapkota","given":"Ranjan"},{"family":"Qureshi","given":"Rizwan"},{"family":"Calero","given":"Marco Flores"},{"family":"Badjugar","given":"Chetan"},{"family":"Nepal","given":"Upesh"},{"family":"Poulose","given":"Alwin"},{"family":"Zeno","given":"Peter"},{"family":"Vaddevolu","given":"Uday Bhanu Prakash"},{"family":"Khan","given":"Sheheryar"},{"family":"Shoman","given":"Maged"},{"family":"Yan","given":"Hong"},{"family":"Karkee","given":"Manoj"}],"accessed":{"date-parts":[["2025",5,26]]},"issued":{"date-parts":[["2025",2,21]]}}},{"id":1306,"uris":["http://zotero.org/users/8619560/items/FL9B4B5Z"],"itemData":{"id":1306,"type":"article","abstract":"The YOLO (You Only Look Once) series has been a leading framework in real-time object detection, consistently improving the balance between speed and accuracy. However, integrating attention mechanisms into YOLO has been challenging due to their high computational overhead. YOLOv12 introduces a novel approach that successfully incorporates attention-based enhancements while preserving real-time performance. This paper provides a comprehensive review of YOLOv12's architectural innovations, including Area Attention for computationally efficient self-attention, Residual Efficient Layer Aggregation Networks for improved feature aggregation, and FlashAttention for optimized memory access. Additionally, we benchmark YOLOv12 against prior YOLO versions and competing object detectors, analyzing its improvements in accuracy, inference speed, and computational efficiency. Through this analysis, we demonstrate how YOLOv12 advances real-time object detection by refining the latency-accuracy trade-off and optimizing computational resources.","DOI":"10.48550/arXiv.2504.11995","note":"arXiv:2504.11995 [cs]","number":"arXiv:2504.11995","publisher":"arXiv","source":"arXiv.org","title":"A Review of YOLOv12: Attention-Based Enhancements vs. Previous Versions","title-short":"A Review of YOLOv12","URL":"http://arxiv.org/abs/2504.11995","author":[{"family":"Khanam","given":"Rahima"},{"family":"Hussain","given":"Muhammad"}],"accessed":{"date-parts":[["2025",5,26]]},"issued":{"date-parts":[["2025",4,16]]}}},{"id":1320,"uris":["http://zotero.org/users/8619560/items/V29LEDB2"],"itemData":{"id":1320,"type":"article","abstract":"There are a huge number of features which are said to improve Convolutional Neural Network (CNN) accuracy. Practical testing of combinations of such features on large datasets, and theoretical justification of the result, is required. Some features operate on certain models exclusively and for certain problems exclusively, or only for small-scale datasets; while some features, such as batch-normalization and residual-connections, are applicable to the majority of models, tasks, and datasets. We assume that such universal features include Weighted-Residual-Connections (WRC), Cross-Stage-Partial-connections (CSP), Cross mini-Batch Normalization (CmBN), Self-adversarial-training (SAT) and Mish-activation. We use new features: WRC, CSP, CmBN, SAT, Mish activation, Mosaic data augmentation, CmBN, DropBlock regularization, and CIoU loss, and combine some of them to achieve state-of-the-art results: 43.5% AP (65.7% AP50) for the MS COCO dataset at a realtime speed of ~65 FPS on Tesla V100. Source code is at https://github.com/AlexeyAB/darknet","DOI":"10.48550/arXiv.2004.10934","note":"arXiv:2004.10934 [cs]","number":"arXiv:2004.10934","publisher":"arXiv","source":"arXiv.org","title":"YOLOv4: Optimal Speed and Accuracy of Object Detection","title-short":"YOLOv4","URL":"http://arxiv.org/abs/2004.10934","author":[{"family":"Bochkovskiy","given":"Alexey"},{"family":"Wang","given":"Chien-Yao"},{"family":"Liao","given":"Hong-Yuan Mark"}],"accessed":{"date-parts":[["2025",5,26]]},"issued":{"date-parts":[["2020",4,23]]}}}],"schema":"https://github.com/citation-style-language/schema/raw/master/csl-citation.json"} </w:instrText>
+      </w:r>
+      <w:r>
+        <w:rPr>
+          <w:lang w:bidi="en-US"/>
+        </w:rPr>
+        <w:fldChar w:fldCharType="separate"/>
+      </w:r>
+      <w:r>
+        <w:t>[64], [65], [68]</w:t>
+      </w:r>
+      <w:r>
+        <w:fldChar w:fldCharType="end"/>
+      </w:r>
+      <w:r>
+        <w:t xml:space="preserve"> </w:t>
+      </w:r>
+      <w:r>
+        <w:rPr>
+          <w:lang w:bidi="en-US"/>
+        </w:rPr>
+        <w:t>managed to set new standards</w:t>
+      </w:r>
+      <w:r>
+        <w:rPr>
+          <w:lang w:bidi="en-US"/>
+        </w:rPr>
+        <w:t xml:space="preserve"> for</w:t>
+      </w:r>
+      <w:r>
+        <w:rPr>
+          <w:lang w:bidi="en-US"/>
+        </w:rPr>
+        <w:t xml:space="preserve"> detection</w:t>
+      </w:r>
+      <w:r>
+        <w:rPr>
+          <w:lang w:bidi="en-US"/>
+        </w:rPr>
+        <w:t xml:space="preserve"> accuracy and</w:t>
+      </w:r>
+      <w:r>
+        <w:rPr>
+          <w:lang w:bidi="en-US"/>
+        </w:rPr>
+        <w:t xml:space="preserve"> inference</w:t>
+      </w:r>
+      <w:r>
+        <w:rPr>
+          <w:lang w:bidi="en-US"/>
+        </w:rPr>
+        <w:t xml:space="preserve"> speed</w:t>
+      </w:r>
+      <w:r>
+        <w:rPr>
+          <w:lang w:bidi="en-US"/>
+        </w:rPr>
+        <w:t xml:space="preserve"> through several new introductions, such as: </w:t>
+      </w:r>
+      <w:r>
+        <w:rPr>
+          <w:lang w:bidi="en-US"/>
+        </w:rPr>
+        <w:t xml:space="preserve">CSPDarknet-53, PANet, Mish activation, and data augmentation methods such as Mosaic and </w:t>
       </w:r>
       <w:proofErr w:type="spellStart"/>
       <w:r>
-        <w:t>ocurrence</w:t>
+        <w:rPr>
+          <w:lang w:bidi="en-US"/>
+        </w:rPr>
+        <w:t>CutMix</w:t>
       </w:r>
       <w:proofErr w:type="spellEnd"/>
       <w:r>
-        <w:t xml:space="preserve"> matrices (standard </w:t>
+        <w:rPr>
+          <w:lang w:bidi="en-US"/>
+        </w:rPr>
+        <w:t>. YOLOv5 b</w:t>
+      </w:r>
+      <w:r>
+        <w:rPr>
+          <w:lang w:bidi="en-US"/>
+        </w:rPr>
+        <w:t xml:space="preserve">y </w:t>
       </w:r>
       <w:proofErr w:type="spellStart"/>
       <w:r>
-        <w:t>Haralick</w:t>
+        <w:rPr>
+          <w:lang w:bidi="en-US"/>
+        </w:rPr>
+        <w:t>Ultralytics</w:t>
       </w:r>
       <w:proofErr w:type="spellEnd"/>
       <w:r>
-        <w:t xml:space="preserve"> features) is proposed</w:t>
+        <w:rPr>
+          <w:lang w:bidi="en-US"/>
+        </w:rPr>
+        <w:t xml:space="preserve"> </w:t>
+      </w:r>
+      <w:r>
+        <w:rPr>
+          <w:lang w:bidi="en-US"/>
+        </w:rPr>
+        <w:fldChar w:fldCharType="begin"/>
+      </w:r>
+      <w:r>
+        <w:rPr>
+          <w:lang w:bidi="en-US"/>
+        </w:rPr>
+        <w:instrText xml:space="preserve"> ADDIN ZOTERO_ITEM CSL_CITATION {"citationID":"KkX2iCsU","properties":{"formattedCitation":"[64], [65], [69]","plainCitation":"[64], [65], [69]","noteIndex":0},"citationItems":[{"id":1298,"uris":["http://zotero.org/users/8619560/items/IGKB3IMS"],"itemData":{"id":1298,"type":"article","abstract":"This review systematically examines the progression of the You Only Look Once (YOLO) object detection algorithms from YOLOv1 to the recently unveiled YOLOv12. Employing a reverse chronological analysis, this study examines the advancements introduced by YOLO algorithms, beginning with YOLOv12 and progressing through YOLO11 (or YOLOv11), YOLOv10, YOLOv9, YOLOv8, and subsequent versions to explore each version's contributions to enhancing speed, detection accuracy, and computational efficiency in real-time object detection. Additionally, this study reviews the alternative versions derived from YOLO architectural advancements of YOLO-NAS, YOLO-X, YOLO-R, DAMO-YOLO, and Gold-YOLO. By detailing the incremental technological advancements in subsequent YOLO versions, this review chronicles the evolution of YOLO, and discusses the challenges and limitations in each of the earlier versions. The evolution signifies a path towards integrating YOLO with multimodal, context-aware, and Artificial General Intelligence (AGI) systems for the next YOLO decade, promising significant implications for future developments in AI-driven applications. (Key terms: YOLOv12, YOLOv12 architecture, YOLOv11, YOLO11, YOLO Review, YOLOv14, YOLOv15, YOLO architecture, YOLOv12 architecture)","DOI":"10.1007/s10462-025-11253-3","note":"arXiv:2406.19407 [cs]","source":"arXiv.org","title":"YOLOv12 to Its Genesis: A Decadal and Comprehensive Review of The You Only Look Once (YOLO) Series","title-short":"YOLOv12 to Its Genesis","URL":"http://arxiv.org/abs/2406.19407","author":[{"family":"Sapkota","given":"Ranjan"},{"family":"Qureshi","given":"Rizwan"},{"family":"Calero","given":"Marco Flores"},{"family":"Badjugar","given":"Chetan"},{"family":"Nepal","given":"Upesh"},{"family":"Poulose","given":"Alwin"},{"family":"Zeno","given":"Peter"},{"family":"Vaddevolu","given":"Uday Bhanu Prakash"},{"family":"Khan","given":"Sheheryar"},{"family":"Shoman","given":"Maged"},{"family":"Yan","given":"Hong"},{"family":"Karkee","given":"Manoj"}],"accessed":{"date-parts":[["2025",5,26]]},"issued":{"date-parts":[["2025",2,21]]}}},{"id":1306,"uris":["http://zotero.org/users/8619560/items/FL9B4B5Z"],"itemData":{"id":1306,"type":"article","abstract":"The YOLO (You Only Look Once) series has been a leading framework in real-time object detection, consistently improving the balance between speed and accuracy. However, integrating attention mechanisms into YOLO has been challenging due to their high computational overhead. YOLOv12 introduces a novel approach that successfully incorporates attention-based enhancements while preserving real-time performance. This paper provides a comprehensive review of YOLOv12's architectural innovations, including Area Attention for computationally efficient self-attention, Residual Efficient Layer Aggregation Networks for improved feature aggregation, and FlashAttention for optimized memory access. Additionally, we benchmark YOLOv12 against prior YOLO versions and competing object detectors, analyzing its improvements in accuracy, inference speed, and computational efficiency. Through this analysis, we demonstrate how YOLOv12 advances real-time object detection by refining the latency-accuracy trade-off and optimizing computational resources.","DOI":"10.48550/arXiv.2504.11995","note":"arXiv:2504.11995 [cs]","number":"arXiv:2504.11995","publisher":"arXiv","source":"arXiv.org","title":"A Review of YOLOv12: Attention-Based Enhancements vs. Previous Versions","title-short":"A Review of YOLOv12","URL":"http://arxiv.org/abs/2504.11995","author":[{"family":"Khanam","given":"Rahima"},{"family":"Hussain","given":"Muhammad"}],"accessed":{"date-parts":[["2025",5,26]]},"issued":{"date-parts":[["2025",4,16]]}}},{"id":1302,"uris":["http://zotero.org/users/8619560/items/GU7G34JD"],"itemData":{"id":1302,"type":"software","title":"Ultralytics YOLO","URL":"https://github.com/ultralytics/ultralytics","author":[{"family":"Jocher","given":"Glenn"},{"family":"Qiu","given":"Jing"}],"issued":{"date-parts":[["2024"]]}}}],"schema":"https://github.com/citation-style-language/schema/raw/master/csl-citation.json"} </w:instrText>
+      </w:r>
+      <w:r>
+        <w:rPr>
+          <w:lang w:bidi="en-US"/>
+        </w:rPr>
+        <w:fldChar w:fldCharType="separate"/>
+      </w:r>
+      <w:r>
+        <w:t>[64], [65], [69]</w:t>
+      </w:r>
+      <w:r>
+        <w:fldChar w:fldCharType="end"/>
+      </w:r>
+      <w:r>
+        <w:t xml:space="preserve"> was designed with a </w:t>
+      </w:r>
+      <w:proofErr w:type="spellStart"/>
+      <w:r>
+        <w:t>PyTorch</w:t>
+      </w:r>
+      <w:proofErr w:type="spellEnd"/>
+      <w:r>
+        <w:t>-based framework</w:t>
+      </w:r>
+      <w:r>
+        <w:rPr>
+          <w:lang w:bidi="en-US"/>
+        </w:rPr>
+        <w:t xml:space="preserve"> with an emphasis on usability and performance and made several changes such as: </w:t>
+      </w:r>
+      <w:r>
+        <w:rPr>
+          <w:lang w:bidi="en-US"/>
+        </w:rPr>
+        <w:t>enhanced backbone, neck, and head designs, and an auto-anchor learning mechanism that optimized anchor sizes during training</w:t>
+      </w:r>
+      <w:r>
+        <w:t xml:space="preserve">. </w:t>
+      </w:r>
+      <w:r>
+        <w:rPr>
+          <w:lang w:bidi="en-US"/>
+        </w:rPr>
+        <w:t xml:space="preserve">YOLOv6 </w:t>
+      </w:r>
+      <w:r>
+        <w:rPr>
+          <w:lang w:bidi="en-US"/>
+        </w:rPr>
+        <w:fldChar w:fldCharType="begin"/>
+      </w:r>
+      <w:r>
+        <w:rPr>
+          <w:lang w:bidi="en-US"/>
+        </w:rPr>
+        <w:instrText xml:space="preserve"> ADDIN ZOTERO_ITEM CSL_CITATION {"citationID":"cfFNAP6A","properties":{"formattedCitation":"[64], [65], [70]","plainCitation":"[64], [65], [70]","noteIndex":0},"citationItems":[{"id":1298,"uris":["http://zotero.org/users/8619560/items/IGKB3IMS"],"itemData":{"id":1298,"type":"article","abstract":"This review systematically examines the progression of the You Only Look Once (YOLO) object detection algorithms from YOLOv1 to the recently unveiled YOLOv12. Employing a reverse chronological analysis, this study examines the advancements introduced by YOLO algorithms, beginning with YOLOv12 and progressing through YOLO11 (or YOLOv11), YOLOv10, YOLOv9, YOLOv8, and subsequent versions to explore each version's contributions to enhancing speed, detection accuracy, and computational efficiency in real-time object detection. Additionally, this study reviews the alternative versions derived from YOLO architectural advancements of YOLO-NAS, YOLO-X, YOLO-R, DAMO-YOLO, and Gold-YOLO. By detailing the incremental technological advancements in subsequent YOLO versions, this review chronicles the evolution of YOLO, and discusses the challenges and limitations in each of the earlier versions. The evolution signifies a path towards integrating YOLO with multimodal, context-aware, and Artificial General Intelligence (AGI) systems for the next YOLO decade, promising significant implications for future developments in AI-driven applications. (Key terms: YOLOv12, YOLOv12 architecture, YOLOv11, YOLO11, YOLO Review, YOLOv14, YOLOv15, YOLO architecture, YOLOv12 architecture)","DOI":"10.1007/s10462-025-11253-3","note":"arXiv:2406.19407 [cs]","source":"arXiv.org","title":"YOLOv12 to Its Genesis: A Decadal and Comprehensive Review of The You Only Look Once (YOLO) Series","title-short":"YOLOv12 to Its Genesis","URL":"http://arxiv.org/abs/2406.19407","author":[{"family":"Sapkota","given":"Ranjan"},{"family":"Qureshi","given":"Rizwan"},{"family":"Calero","given":"Marco Flores"},{"family":"Badjugar","given":"Chetan"},{"family":"Nepal","given":"Upesh"},{"family":"Poulose","given":"Alwin"},{"family":"Zeno","given":"Peter"},{"family":"Vaddevolu","given":"Uday Bhanu Prakash"},{"family":"Khan","given":"Sheheryar"},{"family":"Shoman","given":"Maged"},{"family":"Yan","given":"Hong"},{"family":"Karkee","given":"Manoj"}],"accessed":{"date-parts":[["2025",5,26]]},"issued":{"date-parts":[["2025",2,21]]}}},{"id":1306,"uris":["http://zotero.org/users/8619560/items/FL9B4B5Z"],"itemData":{"id":1306,"type":"article","abstract":"The YOLO (You Only Look Once) series has been a leading framework in real-time object detection, consistently improving the balance between speed and accuracy. However, integrating attention mechanisms into YOLO has been challenging due to their high computational overhead. YOLOv12 introduces a novel approach that successfully incorporates attention-based enhancements while preserving real-time performance. This paper provides a comprehensive review of YOLOv12's architectural innovations, including Area Attention for computationally efficient self-attention, Residual Efficient Layer Aggregation Networks for improved feature aggregation, and FlashAttention for optimized memory access. Additionally, we benchmark YOLOv12 against prior YOLO versions and competing object detectors, analyzing its improvements in accuracy, inference speed, and computational efficiency. Through this analysis, we demonstrate how YOLOv12 advances real-time object detection by refining the latency-accuracy trade-off and optimizing computational resources.","DOI":"10.48550/arXiv.2504.11995","note":"arXiv:2504.11995 [cs]","number":"arXiv:2504.11995","publisher":"arXiv","source":"arXiv.org","title":"A Review of YOLOv12: Attention-Based Enhancements vs. Previous Versions","title-short":"A Review of YOLOv12","URL":"http://arxiv.org/abs/2504.11995","author":[{"family":"Khanam","given":"Rahima"},{"family":"Hussain","given":"Muhammad"}],"accessed":{"date-parts":[["2025",5,26]]},"issued":{"date-parts":[["2025",4,16]]}}},{"id":1323,"uris":["http://zotero.org/users/8619560/items/U2X3VZQU"],"itemData":{"id":1323,"type":"article","abstract":"For years, the YOLO series has been the de facto industry-level standard for efficient object detection. The YOLO community has prospered overwhelmingly to enrich its use in a multitude of hardware platforms and abundant scenarios. In this technical report, we strive to push its limits to the next level, stepping forward with an unwavering mindset for industry application. Considering the diverse requirements for speed and accuracy in the real environment, we extensively examine the up-to-date object detection advancements either from industry or academia. Specifically, we heavily assimilate ideas from recent network design, training strategies, testing techniques, quantization, and optimization methods. On top of this, we integrate our thoughts and practice to build a suite of deployment-ready networks at various scales to accommodate diversified use cases. With the generous permission of YOLO authors, we name it YOLOv6. We also express our warm welcome to users and contributors for further enhancement. For a glimpse of performance, our YOLOv6-N hits 35.9% AP on the COCO dataset at a throughput of 1234 FPS on an NVIDIA Tesla T4 GPU. YOLOv6-S strikes 43.5% AP at 495 FPS, outperforming other mainstream detectors at the same scale~(YOLOv5-S, YOLOX-S, and PPYOLOE-S). Our quantized version of YOLOv6-S even brings a new state-of-the-art 43.3% AP at 869 FPS. Furthermore, YOLOv6-M/L also achieves better accuracy performance (i.e., 49.5%/52.3%) than other detectors with a similar inference speed. We carefully conducted experiments to validate the effectiveness of each component. Our code is made available at https://github.com/meituan/YOLOv6.","DOI":"10.48550/arXiv.2209.02976","note":"arXiv:2209.02976 [cs]","number":"arXiv:2209.02976","publisher":"arXiv","source":"arXiv.org","title":"YOLOv6: A Single-Stage Object Detection Framework for Industrial Applications","title-short":"YOLOv6","URL":"http://arxiv.org/abs/2209.02976","author":[{"family":"Li","given":"Chuyi"},{"family":"Li","given":"Lulu"},{"family":"Jiang","given":"Hongliang"},{"family":"Weng","given":"Kaiheng"},{"family":"Geng","given":"Yifei"},{"family":"Li","given":"Liang"},{"family":"Ke","given":"Zaidan"},{"family":"Li","given":"Qingyuan"},{"family":"Cheng","given":"Meng"},{"family":"Nie","given":"Weiqiang"},{"family":"Li","given":"Yiduo"},{"family":"Zhang","given":"Bo"},{"family":"Liang","given":"Yufei"},{"family":"Zhou","given":"Linyuan"},{"family":"Xu","given":"Xiaoming"},{"family":"Chu","given":"Xiangxiang"},{"family":"Wei","given":"Xiaoming"},{"family":"Wei","given":"Xiaolin"}],"accessed":{"date-parts":[["2025",5,26]]},"issued":{"date-parts":[["2022",9,7]]}}}],"schema":"https://github.com/citation-style-language/schema/raw/master/csl-citation.json"} </w:instrText>
+      </w:r>
+      <w:r>
+        <w:rPr>
+          <w:lang w:bidi="en-US"/>
+        </w:rPr>
+        <w:fldChar w:fldCharType="separate"/>
+      </w:r>
+      <w:r>
+        <w:t>[64], [65], [70]</w:t>
+      </w:r>
+      <w:r>
+        <w:fldChar w:fldCharType="end"/>
+      </w:r>
+      <w:r>
+        <w:rPr>
+          <w:lang w:bidi="en-US"/>
+        </w:rPr>
+        <w:t xml:space="preserve"> added the </w:t>
+      </w:r>
+      <w:proofErr w:type="spellStart"/>
+      <w:r>
+        <w:rPr>
+          <w:lang w:bidi="en-US"/>
+        </w:rPr>
+        <w:t>EfficientRep</w:t>
+      </w:r>
+      <w:proofErr w:type="spellEnd"/>
+      <w:r>
+        <w:rPr>
+          <w:lang w:bidi="en-US"/>
+        </w:rPr>
+        <w:t xml:space="preserve"> backbone and </w:t>
+      </w:r>
+      <w:proofErr w:type="spellStart"/>
+      <w:r>
+        <w:rPr>
+          <w:lang w:bidi="en-US"/>
+        </w:rPr>
+        <w:t>RepOptimizer</w:t>
+      </w:r>
+      <w:proofErr w:type="spellEnd"/>
+      <w:r>
+        <w:rPr>
+          <w:lang w:bidi="en-US"/>
+        </w:rPr>
+        <w:t xml:space="preserve"> to improve efficiency</w:t>
+      </w:r>
+      <w:r>
+        <w:rPr>
+          <w:lang w:bidi="en-US"/>
+        </w:rPr>
+        <w:t xml:space="preserve">. </w:t>
+      </w:r>
+      <w:r>
+        <w:rPr>
+          <w:lang w:bidi="en-US"/>
+        </w:rPr>
+        <w:t xml:space="preserve">YOLOv7 </w:t>
+      </w:r>
+      <w:r>
+        <w:rPr>
+          <w:lang w:bidi="en-US"/>
+        </w:rPr>
+        <w:fldChar w:fldCharType="begin"/>
+      </w:r>
+      <w:r>
+        <w:rPr>
+          <w:lang w:bidi="en-US"/>
+        </w:rPr>
+        <w:instrText xml:space="preserve"> ADDIN ZOTERO_ITEM CSL_CITATION {"citationID":"A5eyNYzF","properties":{"formattedCitation":"[64], [65], [71]","plainCitation":"[64], [65], [71]","noteIndex":0},"citationItems":[{"id":1298,"uris":["http://zotero.org/users/8619560/items/IGKB3IMS"],"itemData":{"id":1298,"type":"article","abstract":"This review systematically examines the progression of the You Only Look Once (YOLO) object detection algorithms from YOLOv1 to the recently unveiled YOLOv12. Employing a reverse chronological analysis, this study examines the advancements introduced by YOLO algorithms, beginning with YOLOv12 and progressing through YOLO11 (or YOLOv11), YOLOv10, YOLOv9, YOLOv8, and subsequent versions to explore each version's contributions to enhancing speed, detection accuracy, and computational efficiency in real-time object detection. Additionally, this study reviews the alternative versions derived from YOLO architectural advancements of YOLO-NAS, YOLO-X, YOLO-R, DAMO-YOLO, and Gold-YOLO. By detailing the incremental technological advancements in subsequent YOLO versions, this review chronicles the evolution of YOLO, and discusses the challenges and limitations in each of the earlier versions. The evolution signifies a path towards integrating YOLO with multimodal, context-aware, and Artificial General Intelligence (AGI) systems for the next YOLO decade, promising significant implications for future developments in AI-driven applications. (Key terms: YOLOv12, YOLOv12 architecture, YOLOv11, YOLO11, YOLO Review, YOLOv14, YOLOv15, YOLO architecture, YOLOv12 architecture)","DOI":"10.1007/s10462-025-11253-3","note":"arXiv:2406.19407 [cs]","source":"arXiv.org","title":"YOLOv12 to Its Genesis: A Decadal and Comprehensive Review of The You Only Look Once (YOLO) Series","title-short":"YOLOv12 to Its Genesis","URL":"http://arxiv.org/abs/2406.19407","author":[{"family":"Sapkota","given":"Ranjan"},{"family":"Qureshi","given":"Rizwan"},{"family":"Calero","given":"Marco Flores"},{"family":"Badjugar","given":"Chetan"},{"family":"Nepal","given":"Upesh"},{"family":"Poulose","given":"Alwin"},{"family":"Zeno","given":"Peter"},{"family":"Vaddevolu","given":"Uday Bhanu Prakash"},{"family":"Khan","given":"Sheheryar"},{"family":"Shoman","given":"Maged"},{"family":"Yan","given":"Hong"},{"family":"Karkee","given":"Manoj"}],"accessed":{"date-parts":[["2025",5,26]]},"issued":{"date-parts":[["2025",2,21]]}}},{"id":1306,"uris":["http://zotero.org/users/8619560/items/FL9B4B5Z"],"itemData":{"id":1306,"type":"article","abstract":"The YOLO (You Only Look Once) series has been a leading framework in real-time object detection, consistently improving the balance between speed and accuracy. However, integrating attention mechanisms into YOLO has been challenging due to their high computational overhead. YOLOv12 introduces a novel approach that successfully incorporates attention-based enhancements while preserving real-time performance. This paper provides a comprehensive review of YOLOv12's architectural innovations, including Area Attention for computationally efficient self-attention, Residual Efficient Layer Aggregation Networks for improved feature aggregation, and FlashAttention for optimized memory access. Additionally, we benchmark YOLOv12 against prior YOLO versions and competing object detectors, analyzing its improvements in accuracy, inference speed, and computational efficiency. Through this analysis, we demonstrate how YOLOv12 advances real-time object detection by refining the latency-accuracy trade-off and optimizing computational resources.","DOI":"10.48550/arXiv.2504.11995","note":"arXiv:2504.11995 [cs]","number":"arXiv:2504.11995","publisher":"arXiv","source":"arXiv.org","title":"A Review of YOLOv12: Attention-Based Enhancements vs. Previous Versions","title-short":"A Review of YOLOv12","URL":"http://arxiv.org/abs/2504.11995","author":[{"family":"Khanam","given":"Rahima"},{"family":"Hussain","given":"Muhammad"}],"accessed":{"date-parts":[["2025",5,26]]},"issued":{"date-parts":[["2025",4,16]]}}},{"id":1327,"uris":["http://zotero.org/users/8619560/items/PKYUS9RT"],"itemData":{"id":1327,"type":"paper-conference","abstract":"Real-time object detection is one of the most important research topics in computer vision. As new approaches regarding architecture optimization and training optimization are continually being developed, we have found two research topics that have spawned when dealing with these latest state-of-the-art methods. To address the topics, we propose a trainable bag-of-freebies oriented solution. We combine the flexible and efficient training tools with the proposed architecture and the compound scaling method. YOLOv7 surpasses all known object detectors in both speed and accuracy in the range from 5 FPS to 120 FPS and has the highest accuracy 56.8% AP among all known real-time object detectors with 30 FPS or higher on GPU V100. Source code is released in https://github.com/WongKinYiu/yolov7.","container-title":"2023 IEEE/CVF Conference on Computer Vision and Pattern Recognition (CVPR)","DOI":"10.1109/CVPR52729.2023.00721","event-title":"2023 IEEE/CVF Conference on Computer Vision and Pattern Recognition (CVPR)","note":"ISSN: 2575-7075","page":"7464-7475","source":"IEEE Xplore","title":"YOLOv7: Trainable Bag-of-Freebies Sets New State-of-the-Art for Real-Time Object Detectors","title-short":"YOLOv7","URL":"https://ieeexplore.ieee.org/document/10204762","author":[{"family":"Wang","given":"Chien-Yao"},{"family":"Bochkovskiy","given":"Alexey"},{"family":"Liao","given":"Hong-Yuan Mark"}],"accessed":{"date-parts":[["2025",5,26]]},"issued":{"date-parts":[["2023",6]]}}}],"schema":"https://github.com/citation-style-language/schema/raw/master/csl-citation.json"} </w:instrText>
+      </w:r>
+      <w:r>
+        <w:rPr>
+          <w:lang w:bidi="en-US"/>
+        </w:rPr>
+        <w:fldChar w:fldCharType="separate"/>
+      </w:r>
+      <w:r>
+        <w:t>[64], [65], [71]</w:t>
+      </w:r>
+      <w:r>
+        <w:fldChar w:fldCharType="end"/>
+      </w:r>
+      <w:r>
+        <w:rPr>
+          <w:lang w:bidi="en-US"/>
+        </w:rPr>
+        <w:t xml:space="preserve"> </w:t>
+      </w:r>
+      <w:r>
+        <w:rPr>
+          <w:lang w:bidi="en-US"/>
+        </w:rPr>
+        <w:t xml:space="preserve">improved efficiency by </w:t>
+      </w:r>
+      <w:r>
+        <w:rPr>
+          <w:lang w:bidi="en-US"/>
+        </w:rPr>
+        <w:t>introduc</w:t>
+      </w:r>
+      <w:r>
+        <w:rPr>
+          <w:lang w:bidi="en-US"/>
+        </w:rPr>
+        <w:t>ing</w:t>
+      </w:r>
+      <w:r>
+        <w:rPr>
+          <w:lang w:bidi="en-US"/>
+        </w:rPr>
+        <w:t xml:space="preserve"> a trainable bag-of-freebies and the Extended Efficient Layer Aggregation Network (E-ELAN)</w:t>
+      </w:r>
+      <w:r>
+        <w:rPr>
+          <w:lang w:bidi="en-US"/>
+        </w:rPr>
+        <w:t>.</w:t>
       </w:r>
     </w:p>
     <w:p/>
     <w:p>
-      <w:pPr>
-        <w:pStyle w:val="Heading2"/>
-      </w:pPr>
-      <w:r>
-        <w:t>Object detection models</w:t>
-      </w:r>
-    </w:p>
-    <w:p>
-      <w:r>
-        <w:t xml:space="preserve">The </w:t>
-      </w:r>
-      <w:r>
-        <w:t xml:space="preserve">"You Only Look Once" (YOLO) </w:t>
-      </w:r>
-      <w:r>
+      <w:r>
+        <w:t xml:space="preserve">YOLOv8 </w:t>
+      </w:r>
+      <w:r>
+        <w:rPr>
+          <w:lang w:bidi="en-US"/>
+        </w:rPr>
         <w:fldChar w:fldCharType="begin"/>
       </w:r>
       <w:r>
-        <w:instrText xml:space="preserve"> ADDIN ZOTERO_ITEM CSL_CITATION {"citationID":"S8UhbA0L","properties":{"formattedCitation":"[31]","plainCitation":"[31]","noteIndex":0},"citationItems":[{"id":1303,"uris":["http://zotero.org/users/8619560/items/3LZ4ZER6"],"itemData":{"id":1303,"type":"article","abstract":"We present YOLO, a new approach to object detection. Prior work on object detection repurposes classifiers to perform detection. Instead, we frame object detection as a regression problem to spatially separated bounding boxes and associated class probabilities. A single neural network predicts bounding boxes and class probabilities directly from full images in one evaluation. Since the whole detection pipeline is a single network, it can be optimized end-to-end directly on detection performance. Our unified architecture is extremely fast. Our base YOLO model processes images in real-time at 45 frames per second. A smaller version of the network, Fast YOLO, processes an astounding 155 frames per second while still achieving double the mAP of other real-time detectors. Compared to state-of-the-art detection systems, YOLO makes more localization errors but is far less likely to predict false detections where nothing exists. Finally, YOLO learns very general representations of objects. It outperforms all other detection methods, including DPM and R-CNN, by a wide margin when generalizing from natural images to artwork on both the Picasso Dataset and the People-Art Dataset.","DOI":"10.48550/arXiv.1506.02640","note":"arXiv:1506.02640 [cs]","number":"arXiv:1506.02640","publisher":"arXiv","source":"arXiv.org","title":"You Only Look Once: Unified, Real-Time Object Detection","title-short":"You Only Look Once","URL":"http://arxiv.org/abs/1506.02640","author":[{"family":"Redmon","given":"Joseph"},{"family":"Divvala","given":"Santosh"},{"family":"Girshick","given":"Ross"},{"family":"Farhadi","given":"Ali"}],"accessed":{"date-parts":[["2025",5,26]]},"issued":{"date-parts":[["2016",5,9]]}}}],"schema":"https://github.com/citation-style-language/schema/raw/master/csl-citation.json"} </w:instrText>
-      </w:r>
-      <w:r>
+        <w:rPr>
+          <w:lang w:bidi="en-US"/>
+        </w:rPr>
+        <w:instrText xml:space="preserve"> ADDIN ZOTERO_ITEM CSL_CITATION {"citationID":"XioXOs4F","properties":{"formattedCitation":"[64], [65], [69]","plainCitation":"[64], [65], [69]","noteIndex":0},"citationItems":[{"id":1298,"uris":["http://zotero.org/users/8619560/items/IGKB3IMS"],"itemData":{"id":1298,"type":"article","abstract":"This review systematically examines the progression of the You Only Look Once (YOLO) object detection algorithms from YOLOv1 to the recently unveiled YOLOv12. Employing a reverse chronological analysis, this study examines the advancements introduced by YOLO algorithms, beginning with YOLOv12 and progressing through YOLO11 (or YOLOv11), YOLOv10, YOLOv9, YOLOv8, and subsequent versions to explore each version's contributions to enhancing speed, detection accuracy, and computational efficiency in real-time object detection. Additionally, this study reviews the alternative versions derived from YOLO architectural advancements of YOLO-NAS, YOLO-X, YOLO-R, DAMO-YOLO, and Gold-YOLO. By detailing the incremental technological advancements in subsequent YOLO versions, this review chronicles the evolution of YOLO, and discusses the challenges and limitations in each of the earlier versions. The evolution signifies a path towards integrating YOLO with multimodal, context-aware, and Artificial General Intelligence (AGI) systems for the next YOLO decade, promising significant implications for future developments in AI-driven applications. (Key terms: YOLOv12, YOLOv12 architecture, YOLOv11, YOLO11, YOLO Review, YOLOv14, YOLOv15, YOLO architecture, YOLOv12 architecture)","DOI":"10.1007/s10462-025-11253-3","note":"arXiv:2406.19407 [cs]","source":"arXiv.org","title":"YOLOv12 to Its Genesis: A Decadal and Comprehensive Review of The You Only Look Once (YOLO) Series","title-short":"YOLOv12 to Its Genesis","URL":"http://arxiv.org/abs/2406.19407","author":[{"family":"Sapkota","given":"Ranjan"},{"family":"Qureshi","given":"Rizwan"},{"family":"Calero","given":"Marco Flores"},{"family":"Badjugar","given":"Chetan"},{"family":"Nepal","given":"Upesh"},{"family":"Poulose","given":"Alwin"},{"family":"Zeno","given":"Peter"},{"family":"Vaddevolu","given":"Uday Bhanu Prakash"},{"family":"Khan","given":"Sheheryar"},{"family":"Shoman","given":"Maged"},{"family":"Yan","given":"Hong"},{"family":"Karkee","given":"Manoj"}],"accessed":{"date-parts":[["2025",5,26]]},"issued":{"date-parts":[["2025",2,21]]}}},{"id":1306,"uris":["http://zotero.org/users/8619560/items/FL9B4B5Z"],"itemData":{"id":1306,"type":"article","abstract":"The YOLO (You Only Look Once) series has been a leading framework in real-time object detection, consistently improving the balance between speed and accuracy. However, integrating attention mechanisms into YOLO has been challenging due to their high computational overhead. YOLOv12 introduces a novel approach that successfully incorporates attention-based enhancements while preserving real-time performance. This paper provides a comprehensive review of YOLOv12's architectural innovations, including Area Attention for computationally efficient self-attention, Residual Efficient Layer Aggregation Networks for improved feature aggregation, and FlashAttention for optimized memory access. Additionally, we benchmark YOLOv12 against prior YOLO versions and competing object detectors, analyzing its improvements in accuracy, inference speed, and computational efficiency. Through this analysis, we demonstrate how YOLOv12 advances real-time object detection by refining the latency-accuracy trade-off and optimizing computational resources.","DOI":"10.48550/arXiv.2504.11995","note":"arXiv:2504.11995 [cs]","number":"arXiv:2504.11995","publisher":"arXiv","source":"arXiv.org","title":"A Review of YOLOv12: Attention-Based Enhancements vs. Previous Versions","title-short":"A Review of YOLOv12","URL":"http://arxiv.org/abs/2504.11995","author":[{"family":"Khanam","given":"Rahima"},{"family":"Hussain","given":"Muhammad"}],"accessed":{"date-parts":[["2025",5,26]]},"issued":{"date-parts":[["2025",4,16]]}}},{"id":1302,"uris":["http://zotero.org/users/8619560/items/GU7G34JD"],"itemData":{"id":1302,"type":"software","title":"Ultralytics YOLO","URL":"https://github.com/ultralytics/ultralytics","author":[{"family":"Jocher","given":"Glenn"},{"family":"Qiu","given":"Jing"}],"issued":{"date-parts":[["2024"]]}}}],"schema":"https://github.com/citation-style-language/schema/raw/master/csl-citation.json"} </w:instrText>
+      </w:r>
+      <w:r>
+        <w:rPr>
+          <w:lang w:bidi="en-US"/>
+        </w:rPr>
         <w:fldChar w:fldCharType="separate"/>
       </w:r>
       <w:r>
-        <w:t>[31]</w:t>
+        <w:t>[64], [65], [69]</w:t>
       </w:r>
       <w:r>
         <w:fldChar w:fldCharType="end"/>
       </w:r>
       <w:r>
+        <w:rPr>
+          <w:lang w:bidi="en-US"/>
+        </w:rPr>
+        <w:t xml:space="preserve">, also from </w:t>
+      </w:r>
+      <w:proofErr w:type="spellStart"/>
+      <w:r>
+        <w:rPr>
+          <w:lang w:bidi="en-US"/>
+        </w:rPr>
+        <w:t>Ultralytics</w:t>
+      </w:r>
+      <w:proofErr w:type="spellEnd"/>
+      <w:r>
+        <w:rPr>
+          <w:lang w:bidi="en-US"/>
+        </w:rPr>
         <w:t xml:space="preserve"> </w:t>
       </w:r>
       <w:r>
-        <w:t>algorithm revolutionized real-time object detection through the unification of region proposal and classification. YOLO divides an image through a grid attempting to predict a class and a bounding box for each cell of the grid. This approach</w:t>
-      </w:r>
-      <w:r>
-        <w:t xml:space="preserve"> significantly reduced computation time and enabled end-to-end learnin</w:t>
-      </w:r>
-      <w:r>
-        <w:t xml:space="preserve">g. YOLOv1 managed to achieve real-time detection although it incorporated a CNN backbone; however, small objects were hard to identify and localize accurately </w:t>
-      </w:r>
-      <w:proofErr w:type="gramStart"/>
-      <w:r>
-        <w:t>due to the fact that</w:t>
-      </w:r>
-      <w:proofErr w:type="gramEnd"/>
-      <w:r>
-        <w:t xml:space="preserve"> each grid cell was only able to predict two bounding boxes.  </w:t>
-      </w:r>
-    </w:p>
-    <w:p>
-      <w:pPr>
-        <w:rPr>
-          <w:lang w:bidi="en-US"/>
-        </w:rPr>
-      </w:pPr>
-      <w:r>
-        <w:t>Since the introduction of YOLO in 2015, t</w:t>
-      </w:r>
-      <w:r>
-        <w:t xml:space="preserve">he YOLO </w:t>
-      </w:r>
-      <w:r>
-        <w:t>family of algorithms</w:t>
-      </w:r>
-      <w:r>
+        <w:rPr>
+          <w:lang w:bidi="en-US"/>
+        </w:rPr>
+        <w:fldChar w:fldCharType="begin"/>
+      </w:r>
+      <w:r>
+        <w:rPr>
+          <w:lang w:bidi="en-US"/>
+        </w:rPr>
+        <w:instrText xml:space="preserve"> ADDIN ZOTERO_ITEM CSL_CITATION {"citationID":"0QgsX4Uv","properties":{"formattedCitation":"[69]","plainCitation":"[69]","noteIndex":0},"citationItems":[{"id":1302,"uris":["http://zotero.org/users/8619560/items/GU7G34JD"],"itemData":{"id":1302,"type":"software","title":"Ultralytics YOLO","URL":"https://github.com/ultralytics/ultralytics","author":[{"family":"Jocher","given":"Glenn"},{"family":"Qiu","given":"Jing"}],"issued":{"date-parts":[["2024"]]}}}],"schema":"https://github.com/citation-style-language/schema/raw/master/csl-citation.json"} </w:instrText>
+      </w:r>
+      <w:r>
+        <w:rPr>
+          <w:lang w:bidi="en-US"/>
+        </w:rPr>
+        <w:fldChar w:fldCharType="separate"/>
+      </w:r>
+      <w:r>
+        <w:t>[69]</w:t>
+      </w:r>
+      <w:r>
+        <w:fldChar w:fldCharType="end"/>
+      </w:r>
+      <w:r>
+        <w:rPr>
+          <w:lang w:bidi="en-US"/>
+        </w:rPr>
+        <w:t xml:space="preserve">, </w:t>
+      </w:r>
+      <w:r>
+        <w:t>integrated</w:t>
+      </w:r>
+      <w:r>
+        <w:t xml:space="preserve"> the C2f module </w:t>
+      </w:r>
+      <w:r>
+        <w:t xml:space="preserve">into the architecture </w:t>
+      </w:r>
+      <w:r>
+        <w:t xml:space="preserve">and transitioned to anchor-free detection for </w:t>
+      </w:r>
+      <w:r>
+        <w:t xml:space="preserve">a more </w:t>
+      </w:r>
+      <w:r>
+        <w:t>simplified</w:t>
+      </w:r>
+      <w:r>
+        <w:t xml:space="preserve"> and </w:t>
+      </w:r>
+      <w:r>
+        <w:t xml:space="preserve">specialized detection. </w:t>
+      </w:r>
+      <w:r>
+        <w:rPr>
+          <w:lang w:bidi="en-US"/>
+        </w:rPr>
+        <w:t xml:space="preserve">YOLOv9 </w:t>
+      </w:r>
+      <w:r>
+        <w:rPr>
+          <w:lang w:bidi="en-US"/>
+        </w:rPr>
+        <w:fldChar w:fldCharType="begin"/>
+      </w:r>
+      <w:r>
+        <w:rPr>
+          <w:lang w:bidi="en-US"/>
+        </w:rPr>
+        <w:instrText xml:space="preserve"> ADDIN ZOTERO_ITEM CSL_CITATION {"citationID":"vBP1eLuo","properties":{"formattedCitation":"[64], [65], [72]","plainCitation":"[64], [65], [72]","noteIndex":0},"citationItems":[{"id":1298,"uris":["http://zotero.org/users/8619560/items/IGKB3IMS"],"itemData":{"id":1298,"type":"article","abstract":"This review systematically examines the progression of the You Only Look Once (YOLO) object detection algorithms from YOLOv1 to the recently unveiled YOLOv12. Employing a reverse chronological analysis, this study examines the advancements introduced by YOLO algorithms, beginning with YOLOv12 and progressing through YOLO11 (or YOLOv11), YOLOv10, YOLOv9, YOLOv8, and subsequent versions to explore each version's contributions to enhancing speed, detection accuracy, and computational efficiency in real-time object detection. Additionally, this study reviews the alternative versions derived from YOLO architectural advancements of YOLO-NAS, YOLO-X, YOLO-R, DAMO-YOLO, and Gold-YOLO. By detailing the incremental technological advancements in subsequent YOLO versions, this review chronicles the evolution of YOLO, and discusses the challenges and limitations in each of the earlier versions. The evolution signifies a path towards integrating YOLO with multimodal, context-aware, and Artificial General Intelligence (AGI) systems for the next YOLO decade, promising significant implications for future developments in AI-driven applications. (Key terms: YOLOv12, YOLOv12 architecture, YOLOv11, YOLO11, YOLO Review, YOLOv14, YOLOv15, YOLO architecture, YOLOv12 architecture)","DOI":"10.1007/s10462-025-11253-3","note":"arXiv:2406.19407 [cs]","source":"arXiv.org","title":"YOLOv12 to Its Genesis: A Decadal and Comprehensive Review of The You Only Look Once (YOLO) Series","title-short":"YOLOv12 to Its Genesis","URL":"http://arxiv.org/abs/2406.19407","author":[{"family":"Sapkota","given":"Ranjan"},{"family":"Qureshi","given":"Rizwan"},{"family":"Calero","given":"Marco Flores"},{"family":"Badjugar","given":"Chetan"},{"family":"Nepal","given":"Upesh"},{"family":"Poulose","given":"Alwin"},{"family":"Zeno","given":"Peter"},{"family":"Vaddevolu","given":"Uday Bhanu Prakash"},{"family":"Khan","given":"Sheheryar"},{"family":"Shoman","given":"Maged"},{"family":"Yan","given":"Hong"},{"family":"Karkee","given":"Manoj"}],"accessed":{"date-parts":[["2025",5,26]]},"issued":{"date-parts":[["2025",2,21]]}}},{"id":1306,"uris":["http://zotero.org/users/8619560/items/FL9B4B5Z"],"itemData":{"id":1306,"type":"article","abstract":"The YOLO (You Only Look Once) series has been a leading framework in real-time object detection, consistently improving the balance between speed and accuracy. However, integrating attention mechanisms into YOLO has been challenging due to their high computational overhead. YOLOv12 introduces a novel approach that successfully incorporates attention-based enhancements while preserving real-time performance. This paper provides a comprehensive review of YOLOv12's architectural innovations, including Area Attention for computationally efficient self-attention, Residual Efficient Layer Aggregation Networks for improved feature aggregation, and FlashAttention for optimized memory access. Additionally, we benchmark YOLOv12 against prior YOLO versions and competing object detectors, analyzing its improvements in accuracy, inference speed, and computational efficiency. Through this analysis, we demonstrate how YOLOv12 advances real-time object detection by refining the latency-accuracy trade-off and optimizing computational resources.","DOI":"10.48550/arXiv.2504.11995","note":"arXiv:2504.11995 [cs]","number":"arXiv:2504.11995","publisher":"arXiv","source":"arXiv.org","title":"A Review of YOLOv12: Attention-Based Enhancements vs. Previous Versions","title-short":"A Review of YOLOv12","URL":"http://arxiv.org/abs/2504.11995","author":[{"family":"Khanam","given":"Rahima"},{"family":"Hussain","given":"Muhammad"}],"accessed":{"date-parts":[["2025",5,26]]},"issued":{"date-parts":[["2025",4,16]]}}},{"id":1330,"uris":["http://zotero.org/users/8619560/items/SEGFNZMS"],"itemData":{"id":1330,"type":"article","abstract":"Today's deep learning methods focus on how to design the most appropriate objective functions so that the prediction results of the model can be closest to the ground truth. Meanwhile, an appropriate architecture that can facilitate acquisition of enough information for prediction has to be designed. Existing methods ignore a fact that when input data undergoes layer-by-layer feature extraction and spatial transformation, large amount of information will be lost. This paper will delve into the important issues of data loss when data is transmitted through deep networks, namely information bottleneck and reversible functions. We proposed the concept of programmable gradient information (PGI) to cope with the various changes required by deep networks to achieve multiple objectives. PGI can provide complete input information for the target task to calculate objective function, so that reliable gradient information can be obtained to update network weights. In addition, a new lightweight network architecture -- Generalized Efficient Layer Aggregation Network (GELAN), based on gradient path planning is designed. GELAN's architecture confirms that PGI has gained superior results on lightweight models. We verified the proposed GELAN and PGI on MS COCO dataset based object detection. The results show that GELAN only uses conventional convolution operators to achieve better parameter utilization than the state-of-the-art methods developed based on depth-wise convolution. PGI can be used for variety of models from lightweight to large. It can be used to obtain complete information, so that train-from-scratch models can achieve better results than state-of-the-art models pre-trained using large datasets, the comparison results are shown in Figure 1. The source codes are at: https://github.com/WongKinYiu/yolov9.","DOI":"10.48550/arXiv.2402.13616","note":"arXiv:2402.13616 [cs]","number":"arXiv:2402.13616","publisher":"arXiv","source":"arXiv.org","title":"YOLOv9: Learning What You Want to Learn Using Programmable Gradient Information","title-short":"YOLOv9","URL":"http://arxiv.org/abs/2402.13616","author":[{"family":"Wang","given":"Chien-Yao"},{"family":"Yeh","given":"I.-Hau"},{"family":"Liao","given":"Hong-Yuan Mark"}],"accessed":{"date-parts":[["2025",5,26]]},"issued":{"date-parts":[["2024",2,29]]}}}],"schema":"https://github.com/citation-style-language/schema/raw/master/csl-citation.json"} </w:instrText>
+      </w:r>
+      <w:r>
+        <w:rPr>
+          <w:lang w:bidi="en-US"/>
+        </w:rPr>
+        <w:fldChar w:fldCharType="separate"/>
+      </w:r>
+      <w:r>
+        <w:t>[64], [65], [72]</w:t>
+      </w:r>
+      <w:r>
+        <w:fldChar w:fldCharType="end"/>
+      </w:r>
+      <w:r>
+        <w:rPr>
+          <w:lang w:bidi="en-US"/>
+        </w:rPr>
         <w:t xml:space="preserve"> </w:t>
       </w:r>
       <w:r>
+        <w:t>incorporated the Generalized Efficient Layer Aggregation Network (GELAN) and Programmable Gradient Information (PGI)</w:t>
+      </w:r>
+      <w:r>
+        <w:t xml:space="preserve"> to </w:t>
+      </w:r>
+      <w:r>
+        <w:t xml:space="preserve">mitigate information degradation in deep networks. </w:t>
+      </w:r>
+      <w:r>
+        <w:rPr>
+          <w:lang w:bidi="en-US"/>
+        </w:rPr>
+        <w:t xml:space="preserve">YOLOv10 </w:t>
+      </w:r>
+      <w:r>
+        <w:rPr>
+          <w:lang w:bidi="en-US"/>
+        </w:rPr>
+        <w:fldChar w:fldCharType="begin"/>
+      </w:r>
+      <w:r>
+        <w:rPr>
+          <w:lang w:bidi="en-US"/>
+        </w:rPr>
+        <w:instrText xml:space="preserve"> ADDIN ZOTERO_ITEM CSL_CITATION {"citationID":"oblE8jdc","properties":{"formattedCitation":"[64], [65], [73]","plainCitation":"[64], [65], [73]","noteIndex":0},"citationItems":[{"id":1298,"uris":["http://zotero.org/users/8619560/items/IGKB3IMS"],"itemData":{"id":1298,"type":"article","abstract":"This review systematically examines the progression of the You Only Look Once (YOLO) object detection algorithms from YOLOv1 to the recently unveiled YOLOv12. Employing a reverse chronological analysis, this study examines the advancements introduced by YOLO algorithms, beginning with YOLOv12 and progressing through YOLO11 (or YOLOv11), YOLOv10, YOLOv9, YOLOv8, and subsequent versions to explore each version's contributions to enhancing speed, detection accuracy, and computational efficiency in real-time object detection. Additionally, this study reviews the alternative versions derived from YOLO architectural advancements of YOLO-NAS, YOLO-X, YOLO-R, DAMO-YOLO, and Gold-YOLO. By detailing the incremental technological advancements in subsequent YOLO versions, this review chronicles the evolution of YOLO, and discusses the challenges and limitations in each of the earlier versions. The evolution signifies a path towards integrating YOLO with multimodal, context-aware, and Artificial General Intelligence (AGI) systems for the next YOLO decade, promising significant implications for future developments in AI-driven applications. (Key terms: YOLOv12, YOLOv12 architecture, YOLOv11, YOLO11, YOLO Review, YOLOv14, YOLOv15, YOLO architecture, YOLOv12 architecture)","DOI":"10.1007/s10462-025-11253-3","note":"arXiv:2406.19407 [cs]","source":"arXiv.org","title":"YOLOv12 to Its Genesis: A Decadal and Comprehensive Review of The You Only Look Once (YOLO) Series","title-short":"YOLOv12 to Its Genesis","URL":"http://arxiv.org/abs/2406.19407","author":[{"family":"Sapkota","given":"Ranjan"},{"family":"Qureshi","given":"Rizwan"},{"family":"Calero","given":"Marco Flores"},{"family":"Badjugar","given":"Chetan"},{"family":"Nepal","given":"Upesh"},{"family":"Poulose","given":"Alwin"},{"family":"Zeno","given":"Peter"},{"family":"Vaddevolu","given":"Uday Bhanu Prakash"},{"family":"Khan","given":"Sheheryar"},{"family":"Shoman","given":"Maged"},{"family":"Yan","given":"Hong"},{"family":"Karkee","given":"Manoj"}],"accessed":{"date-parts":[["2025",5,26]]},"issued":{"date-parts":[["2025",2,21]]}}},{"id":1306,"uris":["http://zotero.org/users/8619560/items/FL9B4B5Z"],"itemData":{"id":1306,"type":"article","abstract":"The YOLO (You Only Look Once) series has been a leading framework in real-time object detection, consistently improving the balance between speed and accuracy. However, integrating attention mechanisms into YOLO has been challenging due to their high computational overhead. YOLOv12 introduces a novel approach that successfully incorporates attention-based enhancements while preserving real-time performance. This paper provides a comprehensive review of YOLOv12's architectural innovations, including Area Attention for computationally efficient self-attention, Residual Efficient Layer Aggregation Networks for improved feature aggregation, and FlashAttention for optimized memory access. Additionally, we benchmark YOLOv12 against prior YOLO versions and competing object detectors, analyzing its improvements in accuracy, inference speed, and computational efficiency. Through this analysis, we demonstrate how YOLOv12 advances real-time object detection by refining the latency-accuracy trade-off and optimizing computational resources.","DOI":"10.48550/arXiv.2504.11995","note":"arXiv:2504.11995 [cs]","number":"arXiv:2504.11995","publisher":"arXiv","source":"arXiv.org","title":"A Review of YOLOv12: Attention-Based Enhancements vs. Previous Versions","title-short":"A Review of YOLOv12","URL":"http://arxiv.org/abs/2504.11995","author":[{"family":"Khanam","given":"Rahima"},{"family":"Hussain","given":"Muhammad"}],"accessed":{"date-parts":[["2025",5,26]]},"issued":{"date-parts":[["2025",4,16]]}}},{"id":1331,"uris":["http://zotero.org/users/8619560/items/QDTGKR2Q"],"itemData":{"id":1331,"type":"article","abstract":"Over the past years, YOLOs have emerged as the predominant paradigm in the field of real-time object detection owing to their effective balance between computational cost and detection performance. Researchers have explored the architectural designs, optimization objectives, data augmentation strategies, and others for YOLOs, achieving notable progress. However, the reliance on the non-maximum suppression (NMS) for post-processing hampers the end-to-end deployment of YOLOs and adversely impacts the inference latency. Besides, the design of various components in YOLOs lacks the comprehensive and thorough inspection, resulting in noticeable computational redundancy and limiting the model's capability. It renders the suboptimal efficiency, along with considerable potential for performance improvements. In this work, we aim to further advance the performance-efficiency boundary of YOLOs from both the post-processing and model architecture. To this end, we first present the consistent dual assignments for NMS-free training of YOLOs, which brings competitive performance and low inference latency simultaneously. Moreover, we introduce the holistic efficiency-accuracy driven model design strategy for YOLOs. We comprehensively optimize various components of YOLOs from both efficiency and accuracy perspectives, which greatly reduces the computational overhead and enhances the capability. The outcome of our effort is a new generation of YOLO series for real-time end-to-end object detection, dubbed YOLOv10. Extensive experiments show that YOLOv10 achieves state-of-the-art performance and efficiency across various model scales. For example, our YOLOv10-S is 1.8$\\times$ faster than RT-DETR-R18 under the similar AP on COCO, meanwhile enjoying 2.8$\\times$ smaller number of parameters and FLOPs. Compared with YOLOv9-C, YOLOv10-B has 46\\% less latency and 25\\% fewer parameters for the same performance.","DOI":"10.48550/arXiv.2405.14458","note":"arXiv:2405.14458 [cs]","number":"arXiv:2405.14458","publisher":"arXiv","source":"arXiv.org","title":"YOLOv10: Real-Time End-to-End Object Detection","title-short":"YOLOv10","URL":"http://arxiv.org/abs/2405.14458","author":[{"family":"Wang","given":"Ao"},{"family":"Chen","given":"Hui"},{"family":"Liu","given":"Lihao"},{"family":"Chen","given":"Kai"},{"family":"Lin","given":"Zijia"},{"family":"Han","given":"Jungong"},{"family":"Ding","given":"Guiguang"}],"accessed":{"date-parts":[["2025",5,26]]},"issued":{"date-parts":[["2024",10,30]]}}}],"schema":"https://github.com/citation-style-language/schema/raw/master/csl-citation.json"} </w:instrText>
+      </w:r>
+      <w:r>
+        <w:rPr>
+          <w:lang w:bidi="en-US"/>
+        </w:rPr>
+        <w:fldChar w:fldCharType="separate"/>
+      </w:r>
+      <w:r>
+        <w:t>[64], [65], [73]</w:t>
+      </w:r>
+      <w:r>
+        <w:fldChar w:fldCharType="end"/>
+      </w:r>
+      <w:r>
         <w:rPr>
           <w:color w:val="FF0000"/>
+          <w:lang w:bidi="en-US"/>
+        </w:rPr>
+        <w:t xml:space="preserve"> </w:t>
+      </w:r>
+      <w:r>
+        <w:t>remov</w:t>
+      </w:r>
+      <w:r>
+        <w:t xml:space="preserve">ed </w:t>
+      </w:r>
+      <w:r>
+        <w:t>non-maximum suppression (NMS)</w:t>
+      </w:r>
+      <w:r>
+        <w:t xml:space="preserve"> and</w:t>
+      </w:r>
+      <w:r>
+        <w:t xml:space="preserve"> introduc</w:t>
+      </w:r>
+      <w:r>
+        <w:t>ed</w:t>
+      </w:r>
+      <w:r>
+        <w:t xml:space="preserve"> a dual assignment strategy</w:t>
+      </w:r>
+      <w:r>
+        <w:t xml:space="preserve"> and</w:t>
+      </w:r>
+      <w:r>
+        <w:t xml:space="preserve"> lightweight classification heads</w:t>
+      </w:r>
+      <w:r>
+        <w:t xml:space="preserve"> achieving </w:t>
+      </w:r>
+      <w:r>
+        <w:t xml:space="preserve">real-time efficiency. </w:t>
+      </w:r>
+      <w:r>
+        <w:rPr>
+          <w:lang w:bidi="en-US"/>
+        </w:rPr>
+        <w:t xml:space="preserve">YOLOv11 </w:t>
+      </w:r>
+      <w:r>
+        <w:rPr>
+          <w:lang w:bidi="en-US"/>
         </w:rPr>
         <w:fldChar w:fldCharType="begin"/>
       </w:r>
       <w:r>
         <w:rPr>
+          <w:lang w:bidi="en-US"/>
+        </w:rPr>
+        <w:instrText xml:space="preserve"> ADDIN ZOTERO_ITEM CSL_CITATION {"citationID":"MAxi98bY","properties":{"formattedCitation":"[64], [65], [69]","plainCitation":"[64], [65], [69]","noteIndex":0},"citationItems":[{"id":1298,"uris":["http://zotero.org/users/8619560/items/IGKB3IMS"],"itemData":{"id":1298,"type":"article","abstract":"This review systematically examines the progression of the You Only Look Once (YOLO) object detection algorithms from YOLOv1 to the recently unveiled YOLOv12. Employing a reverse chronological analysis, this study examines the advancements introduced by YOLO algorithms, beginning with YOLOv12 and progressing through YOLO11 (or YOLOv11), YOLOv10, YOLOv9, YOLOv8, and subsequent versions to explore each version's contributions to enhancing speed, detection accuracy, and computational efficiency in real-time object detection. Additionally, this study reviews the alternative versions derived from YOLO architectural advancements of YOLO-NAS, YOLO-X, YOLO-R, DAMO-YOLO, and Gold-YOLO. By detailing the incremental technological advancements in subsequent YOLO versions, this review chronicles the evolution of YOLO, and discusses the challenges and limitations in each of the earlier versions. The evolution signifies a path towards integrating YOLO with multimodal, context-aware, and Artificial General Intelligence (AGI) systems for the next YOLO decade, promising significant implications for future developments in AI-driven applications. (Key terms: YOLOv12, YOLOv12 architecture, YOLOv11, YOLO11, YOLO Review, YOLOv14, YOLOv15, YOLO architecture, YOLOv12 architecture)","DOI":"10.1007/s10462-025-11253-3","note":"arXiv:2406.19407 [cs]","source":"arXiv.org","title":"YOLOv12 to Its Genesis: A Decadal and Comprehensive Review of The You Only Look Once (YOLO) Series","title-short":"YOLOv12 to Its Genesis","URL":"http://arxiv.org/abs/2406.19407","author":[{"family":"Sapkota","given":"Ranjan"},{"family":"Qureshi","given":"Rizwan"},{"family":"Calero","given":"Marco Flores"},{"family":"Badjugar","given":"Chetan"},{"family":"Nepal","given":"Upesh"},{"family":"Poulose","given":"Alwin"},{"family":"Zeno","given":"Peter"},{"family":"Vaddevolu","given":"Uday Bhanu Prakash"},{"family":"Khan","given":"Sheheryar"},{"family":"Shoman","given":"Maged"},{"family":"Yan","given":"Hong"},{"family":"Karkee","given":"Manoj"}],"accessed":{"date-parts":[["2025",5,26]]},"issued":{"date-parts":[["2025",2,21]]}}},{"id":1306,"uris":["http://zotero.org/users/8619560/items/FL9B4B5Z"],"itemData":{"id":1306,"type":"article","abstract":"The YOLO (You Only Look Once) series has been a leading framework in real-time object detection, consistently improving the balance between speed and accuracy. However, integrating attention mechanisms into YOLO has been challenging due to their high computational overhead. YOLOv12 introduces a novel approach that successfully incorporates attention-based enhancements while preserving real-time performance. This paper provides a comprehensive review of YOLOv12's architectural innovations, including Area Attention for computationally efficient self-attention, Residual Efficient Layer Aggregation Networks for improved feature aggregation, and FlashAttention for optimized memory access. Additionally, we benchmark YOLOv12 against prior YOLO versions and competing object detectors, analyzing its improvements in accuracy, inference speed, and computational efficiency. Through this analysis, we demonstrate how YOLOv12 advances real-time object detection by refining the latency-accuracy trade-off and optimizing computational resources.","DOI":"10.48550/arXiv.2504.11995","note":"arXiv:2504.11995 [cs]","number":"arXiv:2504.11995","publisher":"arXiv","source":"arXiv.org","title":"A Review of YOLOv12: Attention-Based Enhancements vs. Previous Versions","title-short":"A Review of YOLOv12","URL":"http://arxiv.org/abs/2504.11995","author":[{"family":"Khanam","given":"Rahima"},{"family":"Hussain","given":"Muhammad"}],"accessed":{"date-parts":[["2025",5,26]]},"issued":{"date-parts":[["2025",4,16]]}}},{"id":1302,"uris":["http://zotero.org/users/8619560/items/GU7G34JD"],"itemData":{"id":1302,"type":"software","title":"Ultralytics YOLO","URL":"https://github.com/ultralytics/ultralytics","author":[{"family":"Jocher","given":"Glenn"},{"family":"Qiu","given":"Jing"}],"issued":{"date-parts":[["2024"]]}}}],"schema":"https://github.com/citation-style-language/schema/raw/master/csl-citation.json"} </w:instrText>
+      </w:r>
+      <w:r>
+        <w:rPr>
+          <w:lang w:bidi="en-US"/>
+        </w:rPr>
+        <w:fldChar w:fldCharType="separate"/>
+      </w:r>
+      <w:r>
+        <w:t>[64], [65], [69]</w:t>
+      </w:r>
+      <w:r>
+        <w:fldChar w:fldCharType="end"/>
+      </w:r>
+      <w:r>
+        <w:rPr>
           <w:color w:val="FF0000"/>
         </w:rPr>
-        <w:instrText xml:space="preserve"> ADDIN ZOTERO_ITEM CSL_CITATION {"citationID":"1RCuhZIW","properties":{"formattedCitation":"[64]","plainCitation":"[64]","noteIndex":0},"citationItems":[{"id":1298,"uris":["http://zotero.org/users/8619560/items/IGKB3IMS"],"itemData":{"id":1298,"type":"article","abstract":"This review systematically examines the progression of the You Only Look Once (YOLO) object detection algorithms from YOLOv1 to the recently unveiled YOLOv12. Employing a reverse chronological analysis, this study examines the advancements introduced by YOLO algorithms, beginning with YOLOv12 and progressing through YOLO11 (or YOLOv11), YOLOv10, YOLOv9, YOLOv8, and subsequent versions to explore each version's contributions to enhancing speed, detection accuracy, and computational efficiency in real-time object detection. Additionally, this study reviews the alternative versions derived from YOLO architectural advancements of YOLO-NAS, YOLO-X, YOLO-R, DAMO-YOLO, and Gold-YOLO. By detailing the incremental technological advancements in subsequent YOLO versions, this review chronicles the evolution of YOLO, and discusses the challenges and limitations in each of the earlier versions. The evolution signifies a path towards integrating YOLO with multimodal, context-aware, and Artificial General Intelligence (AGI) systems for the next YOLO decade, promising significant implications for future developments in AI-driven applications. (Key terms: YOLOv12, YOLOv12 architecture, YOLOv11, YOLO11, YOLO Review, YOLOv14, YOLOv15, YOLO architecture, YOLOv12 architecture)","DOI":"10.1007/s10462-025-11253-3","note":"arXiv:2406.19407 [cs]","source":"arXiv.org","title":"YOLOv12 to Its Genesis: A Decadal and Comprehensive Review of The You Only Look Once (YOLO) Series","title-short":"YOLOv12 to Its Genesis","URL":"http://arxiv.org/abs/2406.19407","author":[{"family":"Sapkota","given":"Ranjan"},{"family":"Qureshi","given":"Rizwan"},{"family":"Calero","given":"Marco Flores"},{"family":"Badjugar","given":"Chetan"},{"family":"Nepal","given":"Upesh"},{"family":"Poulose","given":"Alwin"},{"family":"Zeno","given":"Peter"},{"family":"Vaddevolu","given":"Uday Bhanu Prakash"},{"family":"Khan","given":"Sheheryar"},{"family":"Shoman","given":"Maged"},{"family":"Yan","given":"Hong"},{"family":"Karkee","given":"Manoj"}],"accessed":{"date-parts":[["2025",5,26]]},"issued":{"date-parts":[["2025",2,21]]}}}],"schema":"https://github.com/citation-style-language/schema/raw/master/csl-citation.json"} </w:instrText>
+        <w:t xml:space="preserve"> </w:t>
+      </w:r>
+      <w:r>
+        <w:t>integrated</w:t>
+      </w:r>
+      <w:r>
+        <w:t xml:space="preserve"> the C3k2 block, SPPF, and C2PSA </w:t>
+      </w:r>
+      <w:r>
+        <w:t>into the architecture</w:t>
+      </w:r>
+      <w:r>
+        <w:t xml:space="preserve"> to improve feature extraction and spatial attention while balancing precision and efficiency.</w:t>
+      </w:r>
+    </w:p>
+    <w:p>
+      <w:pPr>
+        <w:rPr>
+          <w:lang w:bidi="en-US"/>
+        </w:rPr>
+      </w:pPr>
+      <w:r>
+        <w:t xml:space="preserve">YOLOv12 </w:t>
       </w:r>
       <w:r>
         <w:rPr>
           <w:color w:val="FF0000"/>
+          <w:lang w:bidi="en-US"/>
+        </w:rPr>
+        <w:fldChar w:fldCharType="begin"/>
+      </w:r>
+      <w:r>
+        <w:rPr>
+          <w:color w:val="FF0000"/>
+          <w:lang w:bidi="en-US"/>
+        </w:rPr>
+        <w:instrText xml:space="preserve"> ADDIN ZOTERO_ITEM CSL_CITATION {"citationID":"lMXJLe8I","properties":{"formattedCitation":"[64], [65], [69], [74]","plainCitation":"[64], [65], [69], [74]","noteIndex":0},"citationItems":[{"id":1298,"uris":["http://zotero.org/users/8619560/items/IGKB3IMS"],"itemData":{"id":1298,"type":"article","abstract":"This review systematically examines the progression of the You Only Look Once (YOLO) object detection algorithms from YOLOv1 to the recently unveiled YOLOv12. Employing a reverse chronological analysis, this study examines the advancements introduced by YOLO algorithms, beginning with YOLOv12 and progressing through YOLO11 (or YOLOv11), YOLOv10, YOLOv9, YOLOv8, and subsequent versions to explore each version's contributions to enhancing speed, detection accuracy, and computational efficiency in real-time object detection. Additionally, this study reviews the alternative versions derived from YOLO architectural advancements of YOLO-NAS, YOLO-X, YOLO-R, DAMO-YOLO, and Gold-YOLO. By detailing the incremental technological advancements in subsequent YOLO versions, this review chronicles the evolution of YOLO, and discusses the challenges and limitations in each of the earlier versions. The evolution signifies a path towards integrating YOLO with multimodal, context-aware, and Artificial General Intelligence (AGI) systems for the next YOLO decade, promising significant implications for future developments in AI-driven applications. (Key terms: YOLOv12, YOLOv12 architecture, YOLOv11, YOLO11, YOLO Review, YOLOv14, YOLOv15, YOLO architecture, YOLOv12 architecture)","DOI":"10.1007/s10462-025-11253-3","note":"arXiv:2406.19407 [cs]","source":"arXiv.org","title":"YOLOv12 to Its Genesis: A Decadal and Comprehensive Review of The You Only Look Once (YOLO) Series","title-short":"YOLOv12 to Its Genesis","URL":"http://arxiv.org/abs/2406.19407","author":[{"family":"Sapkota","given":"Ranjan"},{"family":"Qureshi","given":"Rizwan"},{"family":"Calero","given":"Marco Flores"},{"family":"Badjugar","given":"Chetan"},{"family":"Nepal","given":"Upesh"},{"family":"Poulose","given":"Alwin"},{"family":"Zeno","given":"Peter"},{"family":"Vaddevolu","given":"Uday Bhanu Prakash"},{"family":"Khan","given":"Sheheryar"},{"family":"Shoman","given":"Maged"},{"family":"Yan","given":"Hong"},{"family":"Karkee","given":"Manoj"}],"accessed":{"date-parts":[["2025",5,26]]},"issued":{"date-parts":[["2025",2,21]]}}},{"id":1302,"uris":["http://zotero.org/users/8619560/items/GU7G34JD"],"itemData":{"id":1302,"type":"software","title":"Ultralytics YOLO","URL":"https://github.com/ultralytics/ultralytics","author":[{"family":"Jocher","given":"Glenn"},{"family":"Qiu","given":"Jing"}],"issued":{"date-parts":[["2024"]]}}},{"id":1292,"uris":["http://zotero.org/users/8619560/items/I4SMGGNV"],"itemData":{"id":1292,"type":"article","abstract":"Enhancing the network architecture of the YOLO framework has been crucial for a long time, but has focused on CNN-based improvements despite the proven superiority of attention mechanisms in modeling capabilities. This is because attention-based models cannot match the speed of CNN-based models. This paper proposes an attention-centric YOLO framework, namely YOLOv12, that matches the speed of previous CNN-based ones while harnessing the performance benefits of attention mechanisms. YOLOv12 surpasses all popular real-time object detectors in accuracy with competitive speed. For example, YOLOv12-N achieves 40.6% mAP with an inference latency of 1.64 ms on a T4 GPU, outperforming advanced YOLOv10-N / YOLOv11-N by 2.1%/1.2% mAP with a comparable speed. This advantage extends to other model scales. YOLOv12 also surpasses end-to-end real-time detectors that improve DETR, such as RT-DETR / RT-DETRv2: YOLOv12-S beats RT-DETR-R18 / RT-DETRv2-R18 while running 42% faster, using only 36% of the computation and 45% of the parameters. More comparisons are shown in Figure 1.","DOI":"10.48550/arXiv.2502.12524","note":"arXiv:2502.12524 [cs]","number":"arXiv:2502.12524","publisher":"arXiv","source":"arXiv.org","title":"YOLOv12: Attention-Centric Real-Time Object Detectors","title-short":"YOLOv12","URL":"http://arxiv.org/abs/2502.12524","author":[{"family":"Tian","given":"Yunjie"},{"family":"Ye","given":"Qixiang"},{"family":"Doermann","given":"David"}],"accessed":{"date-parts":[["2025",5,26]]},"issued":{"date-parts":[["2025",2,18]]}}},{"id":1306,"uris":["http://zotero.org/users/8619560/items/FL9B4B5Z"],"itemData":{"id":1306,"type":"article","abstract":"The YOLO (You Only Look Once) series has been a leading framework in real-time object detection, consistently improving the balance between speed and accuracy. However, integrating attention mechanisms into YOLO has been challenging due to their high computational overhead. YOLOv12 introduces a novel approach that successfully incorporates attention-based enhancements while preserving real-time performance. This paper provides a comprehensive review of YOLOv12's architectural innovations, including Area Attention for computationally efficient self-attention, Residual Efficient Layer Aggregation Networks for improved feature aggregation, and FlashAttention for optimized memory access. Additionally, we benchmark YOLOv12 against prior YOLO versions and competing object detectors, analyzing its improvements in accuracy, inference speed, and computational efficiency. Through this analysis, we demonstrate how YOLOv12 advances real-time object detection by refining the latency-accuracy trade-off and optimizing computational resources.","DOI":"10.48550/arXiv.2504.11995","note":"arXiv:2504.11995 [cs]","number":"arXiv:2504.11995","publisher":"arXiv","source":"arXiv.org","title":"A Review of YOLOv12: Attention-Based Enhancements vs. Previous Versions","title-short":"A Review of YOLOv12","URL":"http://arxiv.org/abs/2504.11995","author":[{"family":"Khanam","given":"Rahima"},{"family":"Hussain","given":"Muhammad"}],"accessed":{"date-parts":[["2025",5,26]]},"issued":{"date-parts":[["2025",4,16]]}}}],"schema":"https://github.com/citation-style-language/schema/raw/master/csl-citation.json"} </w:instrText>
+      </w:r>
+      <w:r>
+        <w:rPr>
+          <w:color w:val="FF0000"/>
+          <w:lang w:bidi="en-US"/>
         </w:rPr>
         <w:fldChar w:fldCharType="separate"/>
       </w:r>
       <w:r>
-        <w:t>[64]</w:t>
+        <w:t>[64], [65], [69], [74]</w:t>
       </w:r>
       <w:r>
         <w:rPr>
           <w:color w:val="FF0000"/>
+          <w:lang w:bidi="en-US"/>
         </w:rPr>
         <w:fldChar w:fldCharType="end"/>
       </w:r>
       <w:r>
         <w:rPr>
           <w:color w:val="FF0000"/>
+          <w:lang w:bidi="en-US"/>
         </w:rPr>
         <w:t xml:space="preserve"> </w:t>
       </w:r>
       <w:r>
-        <w:t xml:space="preserve">has expanded both in depth and width with several incremental improvements and various modified versions for specific applications. Each new version introduced advancements with the goal of improving computational efficiency and detection accuracy. YOLOv2 </w:t>
+        <w:t>shift</w:t>
+      </w:r>
+      <w:r>
+        <w:t>ed</w:t>
+      </w:r>
+      <w:r>
+        <w:t xml:space="preserve"> toward an attention-centric architecture achieving state-of-the-art accuracy and efficiency while maintaining real-time performance</w:t>
+      </w:r>
+      <w:r>
+        <w:t xml:space="preserve"> </w:t>
       </w:r>
       <w:r>
         <w:rPr>
@@ -4531,7 +5433,7 @@
           <w:color w:val="FF0000"/>
           <w:lang w:bidi="en-US"/>
         </w:rPr>
-        <w:instrText xml:space="preserve"> ADDIN ZOTERO_ITEM CSL_CITATION {"citationID":"u6lzzIXe","properties":{"formattedCitation":"[64], [65], [66]","plainCitation":"[64], [65], [66]","noteIndex":0},"citationItems":[{"id":1298,"uris":["http://zotero.org/users/8619560/items/IGKB3IMS"],"itemData":{"id":1298,"type":"article","abstract":"This review systematically examines the progression of the You Only Look Once (YOLO) object detection algorithms from YOLOv1 to the recently unveiled YOLOv12. Employing a reverse chronological analysis, this study examines the advancements introduced by YOLO algorithms, beginning with YOLOv12 and progressing through YOLO11 (or YOLOv11), YOLOv10, YOLOv9, YOLOv8, and subsequent versions to explore each version's contributions to enhancing speed, detection accuracy, and computational efficiency in real-time object detection. Additionally, this study reviews the alternative versions derived from YOLO architectural advancements of YOLO-NAS, YOLO-X, YOLO-R, DAMO-YOLO, and Gold-YOLO. By detailing the incremental technological advancements in subsequent YOLO versions, this review chronicles the evolution of YOLO, and discusses the challenges and limitations in each of the earlier versions. The evolution signifies a path towards integrating YOLO with multimodal, context-aware, and Artificial General Intelligence (AGI) systems for the next YOLO decade, promising significant implications for future developments in AI-driven applications. (Key terms: YOLOv12, YOLOv12 architecture, YOLOv11, YOLO11, YOLO Review, YOLOv14, YOLOv15, YOLO architecture, YOLOv12 architecture)","DOI":"10.1007/s10462-025-11253-3","note":"arXiv:2406.19407 [cs]","source":"arXiv.org","title":"YOLOv12 to Its Genesis: A Decadal and Comprehensive Review of The You Only Look Once (YOLO) Series","title-short":"YOLOv12 to Its Genesis","URL":"http://arxiv.org/abs/2406.19407","author":[{"family":"Sapkota","given":"Ranjan"},{"family":"Qureshi","given":"Rizwan"},{"family":"Calero","given":"Marco Flores"},{"family":"Badjugar","given":"Chetan"},{"family":"Nepal","given":"Upesh"},{"family":"Poulose","given":"Alwin"},{"family":"Zeno","given":"Peter"},{"family":"Vaddevolu","given":"Uday Bhanu Prakash"},{"family":"Khan","given":"Sheheryar"},{"family":"Shoman","given":"Maged"},{"family":"Yan","given":"Hong"},{"family":"Karkee","given":"Manoj"}],"accessed":{"date-parts":[["2025",5,26]]},"issued":{"date-parts":[["2025",2,21]]}}},{"id":1306,"uris":["http://zotero.org/users/8619560/items/FL9B4B5Z"],"itemData":{"id":1306,"type":"article","abstract":"The YOLO (You Only Look Once) series has been a leading framework in real-time object detection, consistently improving the balance between speed and accuracy. However, integrating attention mechanisms into YOLO has been challenging due to their high computational overhead. YOLOv12 introduces a novel approach that successfully incorporates attention-based enhancements while preserving real-time performance. This paper provides a comprehensive review of YOLOv12's architectural innovations, including Area Attention for computationally efficient self-attention, Residual Efficient Layer Aggregation Networks for improved feature aggregation, and FlashAttention for optimized memory access. Additionally, we benchmark YOLOv12 against prior YOLO versions and competing object detectors, analyzing its improvements in accuracy, inference speed, and computational efficiency. Through this analysis, we demonstrate how YOLOv12 advances real-time object detection by refining the latency-accuracy trade-off and optimizing computational resources.","DOI":"10.48550/arXiv.2504.11995","note":"arXiv:2504.11995 [cs]","number":"arXiv:2504.11995","publisher":"arXiv","source":"arXiv.org","title":"A Review of YOLOv12: Attention-Based Enhancements vs. Previous Versions","title-short":"A Review of YOLOv12","URL":"http://arxiv.org/abs/2504.11995","author":[{"family":"Khanam","given":"Rahima"},{"family":"Hussain","given":"Muhammad"}],"accessed":{"date-parts":[["2025",5,26]]},"issued":{"date-parts":[["2025",4,16]]}}},{"id":1317,"uris":["http://zotero.org/users/8619560/items/ZSS53KMG"],"itemData":{"id":1317,"type":"paper-conference","abstract":"We introduce YOLO9000, a state-of-the-art, real-time object detection system that can detect over 9000 object categories. First we propose various improvements to the YOLO detection method, both novel and drawn from prior work. The improved model, YOLOv2, is state-of-the-art on standard detection tasks like PASCAL VOC and COCO. Using a novel, multi-scale training method the same YOLOv2 model can run at varying sizes, offering an easy tradeoff between speed and accuracy. At 67 FPS, YOLOv2 gets 76.8 mAP on VOC 2007. At 40 FPS, YOLOv2 gets 78.6 mAP, outperforming state-of-the-art methods like Faster RCNN with ResNet and SSD while still running significantly faster. Finally we propose a method to jointly train on object detection and classification. Using this method we train YOLO9000 simultaneously on the COCO detection dataset and the ImageNet classification dataset. Our joint training allows YOLO9000 to predict detections for object classes that dont have labelled detection data. We validate our approach on the ImageNet detection task. YOLO9000 gets 19.7 mAP on the ImageNet detection validation set despite only having detection data for 44 of the 200 classes. On the 156 classes not in COCO, YOLO9000 gets 16.0 mAP. YOLO9000 predicts detections for more than 9000 different object categories, all in real-time.","container-title":"2017 IEEE Conference on Computer Vision and Pattern Recognition (CVPR)","DOI":"10.1109/CVPR.2017.690","event-title":"2017 IEEE Conference on Computer Vision and Pattern Recognition (CVPR)","note":"ISSN: 1063-6919","page":"6517-6525","source":"IEEE Xplore","title":"YOLO9000: Better, Faster, Stronger","title-short":"YOLO9000","URL":"https://ieeexplore.ieee.org/document/8100173","author":[{"family":"Redmon","given":"Joseph"},{"family":"Farhadi","given":"Ali"}],"accessed":{"date-parts":[["2025",5,26]]},"issued":{"date-parts":[["2017",7]]}}}],"schema":"https://github.com/citation-style-language/schema/raw/master/csl-citation.json"} </w:instrText>
+        <w:instrText xml:space="preserve"> ADDIN ZOTERO_ITEM CSL_CITATION {"citationID":"nZeJ7Sx6","properties":{"formattedCitation":"[65], [74]","plainCitation":"[65], [74]","noteIndex":0},"citationItems":[{"id":1292,"uris":["http://zotero.org/users/8619560/items/I4SMGGNV"],"itemData":{"id":1292,"type":"article","abstract":"Enhancing the network architecture of the YOLO framework has been crucial for a long time, but has focused on CNN-based improvements despite the proven superiority of attention mechanisms in modeling capabilities. This is because attention-based models cannot match the speed of CNN-based models. This paper proposes an attention-centric YOLO framework, namely YOLOv12, that matches the speed of previous CNN-based ones while harnessing the performance benefits of attention mechanisms. YOLOv12 surpasses all popular real-time object detectors in accuracy with competitive speed. For example, YOLOv12-N achieves 40.6% mAP with an inference latency of 1.64 ms on a T4 GPU, outperforming advanced YOLOv10-N / YOLOv11-N by 2.1%/1.2% mAP with a comparable speed. This advantage extends to other model scales. YOLOv12 also surpasses end-to-end real-time detectors that improve DETR, such as RT-DETR / RT-DETRv2: YOLOv12-S beats RT-DETR-R18 / RT-DETRv2-R18 while running 42% faster, using only 36% of the computation and 45% of the parameters. More comparisons are shown in Figure 1.","DOI":"10.48550/arXiv.2502.12524","note":"arXiv:2502.12524 [cs]","number":"arXiv:2502.12524","publisher":"arXiv","source":"arXiv.org","title":"YOLOv12: Attention-Centric Real-Time Object Detectors","title-short":"YOLOv12","URL":"http://arxiv.org/abs/2502.12524","author":[{"family":"Tian","given":"Yunjie"},{"family":"Ye","given":"Qixiang"},{"family":"Doermann","given":"David"}],"accessed":{"date-parts":[["2025",5,26]]},"issued":{"date-parts":[["2025",2,18]]}}},{"id":1306,"uris":["http://zotero.org/users/8619560/items/FL9B4B5Z"],"itemData":{"id":1306,"type":"article","abstract":"The YOLO (You Only Look Once) series has been a leading framework in real-time object detection, consistently improving the balance between speed and accuracy. However, integrating attention mechanisms into YOLO has been challenging due to their high computational overhead. YOLOv12 introduces a novel approach that successfully incorporates attention-based enhancements while preserving real-time performance. This paper provides a comprehensive review of YOLOv12's architectural innovations, including Area Attention for computationally efficient self-attention, Residual Efficient Layer Aggregation Networks for improved feature aggregation, and FlashAttention for optimized memory access. Additionally, we benchmark YOLOv12 against prior YOLO versions and competing object detectors, analyzing its improvements in accuracy, inference speed, and computational efficiency. Through this analysis, we demonstrate how YOLOv12 advances real-time object detection by refining the latency-accuracy trade-off and optimizing computational resources.","DOI":"10.48550/arXiv.2504.11995","note":"arXiv:2504.11995 [cs]","number":"arXiv:2504.11995","publisher":"arXiv","source":"arXiv.org","title":"A Review of YOLOv12: Attention-Based Enhancements vs. Previous Versions","title-short":"A Review of YOLOv12","URL":"http://arxiv.org/abs/2504.11995","author":[{"family":"Khanam","given":"Rahima"},{"family":"Hussain","given":"Muhammad"}],"accessed":{"date-parts":[["2025",5,26]]},"issued":{"date-parts":[["2025",4,16]]}}}],"schema":"https://github.com/citation-style-language/schema/raw/master/csl-citation.json"} </w:instrText>
       </w:r>
       <w:r>
         <w:rPr>
@@ -4541,830 +5443,67 @@
         <w:fldChar w:fldCharType="separate"/>
       </w:r>
       <w:r>
-        <w:t>[64], [65], [66]</w:t>
+        <w:t>[65], [74]</w:t>
       </w:r>
       <w:r>
         <w:rPr>
           <w:color w:val="FF0000"/>
+          <w:lang w:bidi="en-US"/>
         </w:rPr>
         <w:fldChar w:fldCharType="end"/>
       </w:r>
       <w:r>
+        <w:t xml:space="preserve">. </w:t>
+      </w:r>
+      <w:r>
+        <w:t>The i</w:t>
+      </w:r>
+      <w:r>
+        <w:t xml:space="preserve">nnovations </w:t>
+      </w:r>
+      <w:r>
+        <w:t xml:space="preserve">that allowed YOLOv12 to achieve this (confirmed through ablation studies </w:t>
+      </w:r>
+      <w:r>
         <w:rPr>
           <w:color w:val="FF0000"/>
-        </w:rPr>
-        <w:t xml:space="preserve"> </w:t>
-      </w:r>
-      <w:r>
-        <w:t xml:space="preserve">brought several </w:t>
-      </w:r>
-      <w:r>
-        <w:t xml:space="preserve">enhancements </w:t>
-      </w:r>
-      <w:r>
-        <w:t>to</w:t>
-      </w:r>
-      <w:r>
-        <w:t xml:space="preserve"> YOLOv1</w:t>
-      </w:r>
-      <w:r>
-        <w:t xml:space="preserve"> </w:t>
-      </w:r>
-      <w:r>
-        <w:t>includ</w:t>
-      </w:r>
-      <w:r>
-        <w:t>ing</w:t>
-      </w:r>
-      <w:r>
-        <w:t xml:space="preserve"> higher input resolution, batch normalization, and the adoption of anchor boxes from Faster R-CNN to improve training and performance.</w:t>
-      </w:r>
-      <w:r>
-        <w:t xml:space="preserve"> </w:t>
-      </w:r>
-      <w:r>
-        <w:rPr>
-          <w:lang w:bidi="en-US"/>
-        </w:rPr>
-        <w:t xml:space="preserve">YOLOv3 </w:t>
-      </w:r>
-      <w:r>
-        <w:rPr>
           <w:lang w:bidi="en-US"/>
         </w:rPr>
         <w:fldChar w:fldCharType="begin"/>
       </w:r>
       <w:r>
         <w:rPr>
-          <w:lang w:bidi="en-US"/>
-        </w:rPr>
-        <w:instrText xml:space="preserve"> ADDIN ZOTERO_ITEM CSL_CITATION {"citationID":"br1yyAyz","properties":{"formattedCitation":"[64], [65], [67]","plainCitation":"[64], [65], [67]","noteIndex":0},"citationItems":[{"id":1298,"uris":["http://zotero.org/users/8619560/items/IGKB3IMS"],"itemData":{"id":1298,"type":"article","abstract":"This review systematically examines the progression of the You Only Look Once (YOLO) object detection algorithms from YOLOv1 to the recently unveiled YOLOv12. Employing a reverse chronological analysis, this study examines the advancements introduced by YOLO algorithms, beginning with YOLOv12 and progressing through YOLO11 (or YOLOv11), YOLOv10, YOLOv9, YOLOv8, and subsequent versions to explore each version's contributions to enhancing speed, detection accuracy, and computational efficiency in real-time object detection. Additionally, this study reviews the alternative versions derived from YOLO architectural advancements of YOLO-NAS, YOLO-X, YOLO-R, DAMO-YOLO, and Gold-YOLO. By detailing the incremental technological advancements in subsequent YOLO versions, this review chronicles the evolution of YOLO, and discusses the challenges and limitations in each of the earlier versions. The evolution signifies a path towards integrating YOLO with multimodal, context-aware, and Artificial General Intelligence (AGI) systems for the next YOLO decade, promising significant implications for future developments in AI-driven applications. (Key terms: YOLOv12, YOLOv12 architecture, YOLOv11, YOLO11, YOLO Review, YOLOv14, YOLOv15, YOLO architecture, YOLOv12 architecture)","DOI":"10.1007/s10462-025-11253-3","note":"arXiv:2406.19407 [cs]","source":"arXiv.org","title":"YOLOv12 to Its Genesis: A Decadal and Comprehensive Review of The You Only Look Once (YOLO) Series","title-short":"YOLOv12 to Its Genesis","URL":"http://arxiv.org/abs/2406.19407","author":[{"family":"Sapkota","given":"Ranjan"},{"family":"Qureshi","given":"Rizwan"},{"family":"Calero","given":"Marco Flores"},{"family":"Badjugar","given":"Chetan"},{"family":"Nepal","given":"Upesh"},{"family":"Poulose","given":"Alwin"},{"family":"Zeno","given":"Peter"},{"family":"Vaddevolu","given":"Uday Bhanu Prakash"},{"family":"Khan","given":"Sheheryar"},{"family":"Shoman","given":"Maged"},{"family":"Yan","given":"Hong"},{"family":"Karkee","given":"Manoj"}],"accessed":{"date-parts":[["2025",5,26]]},"issued":{"date-parts":[["2025",2,21]]}}},{"id":1306,"uris":["http://zotero.org/users/8619560/items/FL9B4B5Z"],"itemData":{"id":1306,"type":"article","abstract":"The YOLO (You Only Look Once) series has been a leading framework in real-time object detection, consistently improving the balance between speed and accuracy. However, integrating attention mechanisms into YOLO has been challenging due to their high computational overhead. YOLOv12 introduces a novel approach that successfully incorporates attention-based enhancements while preserving real-time performance. This paper provides a comprehensive review of YOLOv12's architectural innovations, including Area Attention for computationally efficient self-attention, Residual Efficient Layer Aggregation Networks for improved feature aggregation, and FlashAttention for optimized memory access. Additionally, we benchmark YOLOv12 against prior YOLO versions and competing object detectors, analyzing its improvements in accuracy, inference speed, and computational efficiency. Through this analysis, we demonstrate how YOLOv12 advances real-time object detection by refining the latency-accuracy trade-off and optimizing computational resources.","DOI":"10.48550/arXiv.2504.11995","note":"arXiv:2504.11995 [cs]","number":"arXiv:2504.11995","publisher":"arXiv","source":"arXiv.org","title":"A Review of YOLOv12: Attention-Based Enhancements vs. Previous Versions","title-short":"A Review of YOLOv12","URL":"http://arxiv.org/abs/2504.11995","author":[{"family":"Khanam","given":"Rahima"},{"family":"Hussain","given":"Muhammad"}],"accessed":{"date-parts":[["2025",5,26]]},"issued":{"date-parts":[["2025",4,16]]}}},{"id":1312,"uris":["http://zotero.org/users/8619560/items/FDKPMXXD"],"itemData":{"id":1312,"type":"article","abstract":"We present some updates to YOLO! We made a bunch of little design changes to make it better. We also trained this new network that's pretty swell. It's a little bigger than last time but more accurate. It's still fast though, don't worry. At 320x320 YOLOv3 runs in 22 ms at 28.2 mAP, as accurate as SSD but three times faster. When we look at the old .5 IOU mAP detection metric YOLOv3 is quite good. It achieves 57.9 mAP@50 in 51 ms on a Titan X, compared to 57.5 mAP@50 in 198 ms by RetinaNet, similar performance but 3.8x faster. As always, all the code is online at https://pjreddie.com/yolo/","DOI":"10.48550/arXiv.1804.02767","note":"arXiv:1804.02767 [cs]","number":"arXiv:1804.02767","publisher":"arXiv","source":"arXiv.org","title":"YOLOv3: An Incremental Improvement","title-short":"YOLOv3","URL":"http://arxiv.org/abs/1804.02767","author":[{"family":"Redmon","given":"Joseph"},{"family":"Farhadi","given":"Ali"}],"accessed":{"date-parts":[["2025",5,26]]},"issued":{"date-parts":[["2018",4,8]]}}}],"schema":"https://github.com/citation-style-language/schema/raw/master/csl-citation.json"} </w:instrText>
-      </w:r>
-      <w:r>
-        <w:rPr>
+          <w:color w:val="FF0000"/>
+          <w:lang w:bidi="en-US"/>
+        </w:rPr>
+        <w:instrText xml:space="preserve"> ADDIN ZOTERO_ITEM CSL_CITATION {"citationID":"nizzCv9H","properties":{"formattedCitation":"[74]","plainCitation":"[74]","noteIndex":0},"citationItems":[{"id":1292,"uris":["http://zotero.org/users/8619560/items/I4SMGGNV"],"itemData":{"id":1292,"type":"article","abstract":"Enhancing the network architecture of the YOLO framework has been crucial for a long time, but has focused on CNN-based improvements despite the proven superiority of attention mechanisms in modeling capabilities. This is because attention-based models cannot match the speed of CNN-based models. This paper proposes an attention-centric YOLO framework, namely YOLOv12, that matches the speed of previous CNN-based ones while harnessing the performance benefits of attention mechanisms. YOLOv12 surpasses all popular real-time object detectors in accuracy with competitive speed. For example, YOLOv12-N achieves 40.6% mAP with an inference latency of 1.64 ms on a T4 GPU, outperforming advanced YOLOv10-N / YOLOv11-N by 2.1%/1.2% mAP with a comparable speed. This advantage extends to other model scales. YOLOv12 also surpasses end-to-end real-time detectors that improve DETR, such as RT-DETR / RT-DETRv2: YOLOv12-S beats RT-DETR-R18 / RT-DETRv2-R18 while running 42% faster, using only 36% of the computation and 45% of the parameters. More comparisons are shown in Figure 1.","DOI":"10.48550/arXiv.2502.12524","note":"arXiv:2502.12524 [cs]","number":"arXiv:2502.12524","publisher":"arXiv","source":"arXiv.org","title":"YOLOv12: Attention-Centric Real-Time Object Detectors","title-short":"YOLOv12","URL":"http://arxiv.org/abs/2502.12524","author":[{"family":"Tian","given":"Yunjie"},{"family":"Ye","given":"Qixiang"},{"family":"Doermann","given":"David"}],"accessed":{"date-parts":[["2025",5,26]]},"issued":{"date-parts":[["2025",2,18]]}}}],"schema":"https://github.com/citation-style-language/schema/raw/master/csl-citation.json"} </w:instrText>
+      </w:r>
+      <w:r>
+        <w:rPr>
+          <w:color w:val="FF0000"/>
           <w:lang w:bidi="en-US"/>
         </w:rPr>
         <w:fldChar w:fldCharType="separate"/>
       </w:r>
       <w:r>
-        <w:t>[64], [65], [67]</w:t>
-      </w:r>
-      <w:r>
+        <w:t>[74]</w:t>
+      </w:r>
+      <w:r>
+        <w:rPr>
+          <w:color w:val="FF0000"/>
+          <w:lang w:bidi="en-US"/>
+        </w:rPr>
         <w:fldChar w:fldCharType="end"/>
       </w:r>
       <w:r>
-        <w:rPr>
-          <w:lang w:bidi="en-US"/>
-        </w:rPr>
-        <w:t xml:space="preserve"> </w:t>
-      </w:r>
-      <w:r>
-        <w:rPr>
-          <w:lang w:bidi="en-US"/>
-        </w:rPr>
-        <w:t>achieved higher</w:t>
-      </w:r>
-      <w:r>
-        <w:rPr>
-          <w:lang w:bidi="en-US"/>
-        </w:rPr>
-        <w:t xml:space="preserve"> </w:t>
-      </w:r>
-      <w:r>
-        <w:rPr>
-          <w:lang w:bidi="en-US"/>
-        </w:rPr>
-        <w:t xml:space="preserve">accuracy in </w:t>
-      </w:r>
-      <w:r>
-        <w:rPr>
-          <w:lang w:bidi="en-US"/>
-        </w:rPr>
-        <w:t xml:space="preserve">small-object detection through multi-scale predictions using Feature Pyramid Networks (FPN) and a deeper architecture, </w:t>
-      </w:r>
-      <w:r>
-        <w:rPr>
-          <w:lang w:bidi="en-US"/>
-        </w:rPr>
-        <w:t xml:space="preserve">specifically </w:t>
-      </w:r>
-      <w:r>
-        <w:rPr>
-          <w:lang w:bidi="en-US"/>
-        </w:rPr>
-        <w:t>Darknet-53.</w:t>
-      </w:r>
-      <w:r>
-        <w:t xml:space="preserve"> </w:t>
-      </w:r>
-      <w:r>
-        <w:rPr>
-          <w:lang w:bidi="en-US"/>
-        </w:rPr>
-        <w:t xml:space="preserve">YOLOv4 </w:t>
-      </w:r>
-      <w:r>
-        <w:rPr>
-          <w:lang w:bidi="en-US"/>
-        </w:rPr>
-        <w:fldChar w:fldCharType="begin"/>
-      </w:r>
-      <w:r>
-        <w:rPr>
-          <w:lang w:bidi="en-US"/>
-        </w:rPr>
-        <w:instrText xml:space="preserve"> ADDIN ZOTERO_ITEM CSL_CITATION {"citationID":"DgLR1SGv","properties":{"formattedCitation":"[64], [65], [68]","plainCitation":"[64], [65], [68]","noteIndex":0},"citationItems":[{"id":1298,"uris":["http://zotero.org/users/8619560/items/IGKB3IMS"],"itemData":{"id":1298,"type":"article","abstract":"This review systematically examines the progression of the You Only Look Once (YOLO) object detection algorithms from YOLOv1 to the recently unveiled YOLOv12. Employing a reverse chronological analysis, this study examines the advancements introduced by YOLO algorithms, beginning with YOLOv12 and progressing through YOLO11 (or YOLOv11), YOLOv10, YOLOv9, YOLOv8, and subsequent versions to explore each version's contributions to enhancing speed, detection accuracy, and computational efficiency in real-time object detection. Additionally, this study reviews the alternative versions derived from YOLO architectural advancements of YOLO-NAS, YOLO-X, YOLO-R, DAMO-YOLO, and Gold-YOLO. By detailing the incremental technological advancements in subsequent YOLO versions, this review chronicles the evolution of YOLO, and discusses the challenges and limitations in each of the earlier versions. The evolution signifies a path towards integrating YOLO with multimodal, context-aware, and Artificial General Intelligence (AGI) systems for the next YOLO decade, promising significant implications for future developments in AI-driven applications. (Key terms: YOLOv12, YOLOv12 architecture, YOLOv11, YOLO11, YOLO Review, YOLOv14, YOLOv15, YOLO architecture, YOLOv12 architecture)","DOI":"10.1007/s10462-025-11253-3","note":"arXiv:2406.19407 [cs]","source":"arXiv.org","title":"YOLOv12 to Its Genesis: A Decadal and Comprehensive Review of The You Only Look Once (YOLO) Series","title-short":"YOLOv12 to Its Genesis","URL":"http://arxiv.org/abs/2406.19407","author":[{"family":"Sapkota","given":"Ranjan"},{"family":"Qureshi","given":"Rizwan"},{"family":"Calero","given":"Marco Flores"},{"family":"Badjugar","given":"Chetan"},{"family":"Nepal","given":"Upesh"},{"family":"Poulose","given":"Alwin"},{"family":"Zeno","given":"Peter"},{"family":"Vaddevolu","given":"Uday Bhanu Prakash"},{"family":"Khan","given":"Sheheryar"},{"family":"Shoman","given":"Maged"},{"family":"Yan","given":"Hong"},{"family":"Karkee","given":"Manoj"}],"accessed":{"date-parts":[["2025",5,26]]},"issued":{"date-parts":[["2025",2,21]]}}},{"id":1306,"uris":["http://zotero.org/users/8619560/items/FL9B4B5Z"],"itemData":{"id":1306,"type":"article","abstract":"The YOLO (You Only Look Once) series has been a leading framework in real-time object detection, consistently improving the balance between speed and accuracy. However, integrating attention mechanisms into YOLO has been challenging due to their high computational overhead. YOLOv12 introduces a novel approach that successfully incorporates attention-based enhancements while preserving real-time performance. This paper provides a comprehensive review of YOLOv12's architectural innovations, including Area Attention for computationally efficient self-attention, Residual Efficient Layer Aggregation Networks for improved feature aggregation, and FlashAttention for optimized memory access. Additionally, we benchmark YOLOv12 against prior YOLO versions and competing object detectors, analyzing its improvements in accuracy, inference speed, and computational efficiency. Through this analysis, we demonstrate how YOLOv12 advances real-time object detection by refining the latency-accuracy trade-off and optimizing computational resources.","DOI":"10.48550/arXiv.2504.11995","note":"arXiv:2504.11995 [cs]","number":"arXiv:2504.11995","publisher":"arXiv","source":"arXiv.org","title":"A Review of YOLOv12: Attention-Based Enhancements vs. Previous Versions","title-short":"A Review of YOLOv12","URL":"http://arxiv.org/abs/2504.11995","author":[{"family":"Khanam","given":"Rahima"},{"family":"Hussain","given":"Muhammad"}],"accessed":{"date-parts":[["2025",5,26]]},"issued":{"date-parts":[["2025",4,16]]}}},{"id":1320,"uris":["http://zotero.org/users/8619560/items/V29LEDB2"],"itemData":{"id":1320,"type":"article","abstract":"There are a huge number of features which are said to improve Convolutional Neural Network (CNN) accuracy. Practical testing of combinations of such features on large datasets, and theoretical justification of the result, is required. Some features operate on certain models exclusively and for certain problems exclusively, or only for small-scale datasets; while some features, such as batch-normalization and residual-connections, are applicable to the majority of models, tasks, and datasets. We assume that such universal features include Weighted-Residual-Connections (WRC), Cross-Stage-Partial-connections (CSP), Cross mini-Batch Normalization (CmBN), Self-adversarial-training (SAT) and Mish-activation. We use new features: WRC, CSP, CmBN, SAT, Mish activation, Mosaic data augmentation, CmBN, DropBlock regularization, and CIoU loss, and combine some of them to achieve state-of-the-art results: 43.5% AP (65.7% AP50) for the MS COCO dataset at a realtime speed of ~65 FPS on Tesla V100. Source code is at https://github.com/AlexeyAB/darknet","DOI":"10.48550/arXiv.2004.10934","note":"arXiv:2004.10934 [cs]","number":"arXiv:2004.10934","publisher":"arXiv","source":"arXiv.org","title":"YOLOv4: Optimal Speed and Accuracy of Object Detection","title-short":"YOLOv4","URL":"http://arxiv.org/abs/2004.10934","author":[{"family":"Bochkovskiy","given":"Alexey"},{"family":"Wang","given":"Chien-Yao"},{"family":"Liao","given":"Hong-Yuan Mark"}],"accessed":{"date-parts":[["2025",5,26]]},"issued":{"date-parts":[["2020",4,23]]}}}],"schema":"https://github.com/citation-style-language/schema/raw/master/csl-citation.json"} </w:instrText>
-      </w:r>
-      <w:r>
-        <w:rPr>
-          <w:lang w:bidi="en-US"/>
-        </w:rPr>
-        <w:fldChar w:fldCharType="separate"/>
-      </w:r>
-      <w:r>
-        <w:t>[64], [65], [68]</w:t>
-      </w:r>
-      <w:r>
-        <w:fldChar w:fldCharType="end"/>
-      </w:r>
-      <w:r>
-        <w:t xml:space="preserve"> </w:t>
-      </w:r>
-      <w:r>
-        <w:rPr>
-          <w:lang w:bidi="en-US"/>
-        </w:rPr>
-        <w:t>managed to set new standards</w:t>
-      </w:r>
-      <w:r>
-        <w:rPr>
-          <w:lang w:bidi="en-US"/>
-        </w:rPr>
-        <w:t xml:space="preserve"> for</w:t>
-      </w:r>
-      <w:r>
-        <w:rPr>
-          <w:lang w:bidi="en-US"/>
-        </w:rPr>
-        <w:t xml:space="preserve"> detection</w:t>
-      </w:r>
-      <w:r>
-        <w:rPr>
-          <w:lang w:bidi="en-US"/>
-        </w:rPr>
-        <w:t xml:space="preserve"> accuracy and</w:t>
-      </w:r>
-      <w:r>
-        <w:rPr>
-          <w:lang w:bidi="en-US"/>
-        </w:rPr>
-        <w:t xml:space="preserve"> inference</w:t>
-      </w:r>
-      <w:r>
-        <w:rPr>
-          <w:lang w:bidi="en-US"/>
-        </w:rPr>
-        <w:t xml:space="preserve"> speed</w:t>
-      </w:r>
-      <w:r>
-        <w:rPr>
-          <w:lang w:bidi="en-US"/>
-        </w:rPr>
-        <w:t xml:space="preserve"> through several new introductions, such as: </w:t>
-      </w:r>
-      <w:r>
-        <w:rPr>
-          <w:lang w:bidi="en-US"/>
-        </w:rPr>
-        <w:t xml:space="preserve">CSPDarknet-53, PANet, Mish activation, and data augmentation methods such as Mosaic and </w:t>
-      </w:r>
-      <w:proofErr w:type="spellStart"/>
-      <w:r>
-        <w:rPr>
-          <w:lang w:bidi="en-US"/>
-        </w:rPr>
-        <w:t>CutMix</w:t>
-      </w:r>
-      <w:proofErr w:type="spellEnd"/>
-      <w:r>
-        <w:rPr>
-          <w:lang w:bidi="en-US"/>
-        </w:rPr>
-        <w:t>. YOLOv5 b</w:t>
-      </w:r>
-      <w:r>
-        <w:rPr>
-          <w:lang w:bidi="en-US"/>
-        </w:rPr>
-        <w:t xml:space="preserve">y </w:t>
-      </w:r>
-      <w:proofErr w:type="spellStart"/>
-      <w:r>
-        <w:rPr>
-          <w:lang w:bidi="en-US"/>
-        </w:rPr>
-        <w:t>Ultralytics</w:t>
-      </w:r>
-      <w:proofErr w:type="spellEnd"/>
-      <w:r>
-        <w:rPr>
-          <w:lang w:bidi="en-US"/>
-        </w:rPr>
-        <w:t xml:space="preserve"> </w:t>
-      </w:r>
-      <w:r>
-        <w:rPr>
-          <w:lang w:bidi="en-US"/>
-        </w:rPr>
-        <w:fldChar w:fldCharType="begin"/>
-      </w:r>
-      <w:r>
-        <w:rPr>
-          <w:lang w:bidi="en-US"/>
-        </w:rPr>
-        <w:instrText xml:space="preserve"> ADDIN ZOTERO_ITEM CSL_CITATION {"citationID":"KkX2iCsU","properties":{"formattedCitation":"[64], [65], [69]","plainCitation":"[64], [65], [69]","noteIndex":0},"citationItems":[{"id":1298,"uris":["http://zotero.org/users/8619560/items/IGKB3IMS"],"itemData":{"id":1298,"type":"article","abstract":"This review systematically examines the progression of the You Only Look Once (YOLO) object detection algorithms from YOLOv1 to the recently unveiled YOLOv12. Employing a reverse chronological analysis, this study examines the advancements introduced by YOLO algorithms, beginning with YOLOv12 and progressing through YOLO11 (or YOLOv11), YOLOv10, YOLOv9, YOLOv8, and subsequent versions to explore each version's contributions to enhancing speed, detection accuracy, and computational efficiency in real-time object detection. Additionally, this study reviews the alternative versions derived from YOLO architectural advancements of YOLO-NAS, YOLO-X, YOLO-R, DAMO-YOLO, and Gold-YOLO. By detailing the incremental technological advancements in subsequent YOLO versions, this review chronicles the evolution of YOLO, and discusses the challenges and limitations in each of the earlier versions. The evolution signifies a path towards integrating YOLO with multimodal, context-aware, and Artificial General Intelligence (AGI) systems for the next YOLO decade, promising significant implications for future developments in AI-driven applications. (Key terms: YOLOv12, YOLOv12 architecture, YOLOv11, YOLO11, YOLO Review, YOLOv14, YOLOv15, YOLO architecture, YOLOv12 architecture)","DOI":"10.1007/s10462-025-11253-3","note":"arXiv:2406.19407 [cs]","source":"arXiv.org","title":"YOLOv12 to Its Genesis: A Decadal and Comprehensive Review of The You Only Look Once (YOLO) Series","title-short":"YOLOv12 to Its Genesis","URL":"http://arxiv.org/abs/2406.19407","author":[{"family":"Sapkota","given":"Ranjan"},{"family":"Qureshi","given":"Rizwan"},{"family":"Calero","given":"Marco Flores"},{"family":"Badjugar","given":"Chetan"},{"family":"Nepal","given":"Upesh"},{"family":"Poulose","given":"Alwin"},{"family":"Zeno","given":"Peter"},{"family":"Vaddevolu","given":"Uday Bhanu Prakash"},{"family":"Khan","given":"Sheheryar"},{"family":"Shoman","given":"Maged"},{"family":"Yan","given":"Hong"},{"family":"Karkee","given":"Manoj"}],"accessed":{"date-parts":[["2025",5,26]]},"issued":{"date-parts":[["2025",2,21]]}}},{"id":1306,"uris":["http://zotero.org/users/8619560/items/FL9B4B5Z"],"itemData":{"id":1306,"type":"article","abstract":"The YOLO (You Only Look Once) series has been a leading framework in real-time object detection, consistently improving the balance between speed and accuracy. However, integrating attention mechanisms into YOLO has been challenging due to their high computational overhead. YOLOv12 introduces a novel approach that successfully incorporates attention-based enhancements while preserving real-time performance. This paper provides a comprehensive review of YOLOv12's architectural innovations, including Area Attention for computationally efficient self-attention, Residual Efficient Layer Aggregation Networks for improved feature aggregation, and FlashAttention for optimized memory access. Additionally, we benchmark YOLOv12 against prior YOLO versions and competing object detectors, analyzing its improvements in accuracy, inference speed, and computational efficiency. Through this analysis, we demonstrate how YOLOv12 advances real-time object detection by refining the latency-accuracy trade-off and optimizing computational resources.","DOI":"10.48550/arXiv.2504.11995","note":"arXiv:2504.11995 [cs]","number":"arXiv:2504.11995","publisher":"arXiv","source":"arXiv.org","title":"A Review of YOLOv12: Attention-Based Enhancements vs. Previous Versions","title-short":"A Review of YOLOv12","URL":"http://arxiv.org/abs/2504.11995","author":[{"family":"Khanam","given":"Rahima"},{"family":"Hussain","given":"Muhammad"}],"accessed":{"date-parts":[["2025",5,26]]},"issued":{"date-parts":[["2025",4,16]]}}},{"id":1302,"uris":["http://zotero.org/users/8619560/items/GU7G34JD"],"itemData":{"id":1302,"type":"software","title":"Ultralytics YOLO","URL":"https://github.com/ultralytics/ultralytics","author":[{"family":"Jocher","given":"Glenn"},{"family":"Qiu","given":"Jing"}],"issued":{"date-parts":[["2024"]]}}}],"schema":"https://github.com/citation-style-language/schema/raw/master/csl-citation.json"} </w:instrText>
-      </w:r>
-      <w:r>
-        <w:rPr>
-          <w:lang w:bidi="en-US"/>
-        </w:rPr>
-        <w:fldChar w:fldCharType="separate"/>
-      </w:r>
-      <w:r>
-        <w:t>[64], [65], [69]</w:t>
-      </w:r>
-      <w:r>
-        <w:fldChar w:fldCharType="end"/>
-      </w:r>
-      <w:r>
-        <w:t xml:space="preserve"> was designed with a </w:t>
-      </w:r>
-      <w:proofErr w:type="spellStart"/>
-      <w:r>
-        <w:t>PyTorch</w:t>
-      </w:r>
-      <w:proofErr w:type="spellEnd"/>
-      <w:r>
-        <w:t>-based framework</w:t>
-      </w:r>
-      <w:r>
-        <w:rPr>
-          <w:lang w:bidi="en-US"/>
-        </w:rPr>
-        <w:t xml:space="preserve"> with an emphasis on usability and performance and made several changes such as: </w:t>
-      </w:r>
-      <w:r>
-        <w:rPr>
-          <w:lang w:bidi="en-US"/>
-        </w:rPr>
-        <w:t>enhanced backbone, neck, and head designs, and an auto-anchor learning mechanism that optimized anchor sizes during training</w:t>
-      </w:r>
-      <w:r>
-        <w:t xml:space="preserve">. </w:t>
-      </w:r>
-      <w:r>
-        <w:rPr>
-          <w:lang w:bidi="en-US"/>
-        </w:rPr>
-        <w:t xml:space="preserve">YOLOv6 </w:t>
-      </w:r>
-      <w:r>
-        <w:rPr>
-          <w:lang w:bidi="en-US"/>
-        </w:rPr>
-        <w:fldChar w:fldCharType="begin"/>
-      </w:r>
-      <w:r>
-        <w:rPr>
-          <w:lang w:bidi="en-US"/>
-        </w:rPr>
-        <w:instrText xml:space="preserve"> ADDIN ZOTERO_ITEM CSL_CITATION {"citationID":"cfFNAP6A","properties":{"formattedCitation":"[64], [65], [70]","plainCitation":"[64], [65], [70]","noteIndex":0},"citationItems":[{"id":1298,"uris":["http://zotero.org/users/8619560/items/IGKB3IMS"],"itemData":{"id":1298,"type":"article","abstract":"This review systematically examines the progression of the You Only Look Once (YOLO) object detection algorithms from YOLOv1 to the recently unveiled YOLOv12. Employing a reverse chronological analysis, this study examines the advancements introduced by YOLO algorithms, beginning with YOLOv12 and progressing through YOLO11 (or YOLOv11), YOLOv10, YOLOv9, YOLOv8, and subsequent versions to explore each version's contributions to enhancing speed, detection accuracy, and computational efficiency in real-time object detection. Additionally, this study reviews the alternative versions derived from YOLO architectural advancements of YOLO-NAS, YOLO-X, YOLO-R, DAMO-YOLO, and Gold-YOLO. By detailing the incremental technological advancements in subsequent YOLO versions, this review chronicles the evolution of YOLO, and discusses the challenges and limitations in each of the earlier versions. The evolution signifies a path towards integrating YOLO with multimodal, context-aware, and Artificial General Intelligence (AGI) systems for the next YOLO decade, promising significant implications for future developments in AI-driven applications. (Key terms: YOLOv12, YOLOv12 architecture, YOLOv11, YOLO11, YOLO Review, YOLOv14, YOLOv15, YOLO architecture, YOLOv12 architecture)","DOI":"10.1007/s10462-025-11253-3","note":"arXiv:2406.19407 [cs]","source":"arXiv.org","title":"YOLOv12 to Its Genesis: A Decadal and Comprehensive Review of The You Only Look Once (YOLO) Series","title-short":"YOLOv12 to Its Genesis","URL":"http://arxiv.org/abs/2406.19407","author":[{"family":"Sapkota","given":"Ranjan"},{"family":"Qureshi","given":"Rizwan"},{"family":"Calero","given":"Marco Flores"},{"family":"Badjugar","given":"Chetan"},{"family":"Nepal","given":"Upesh"},{"family":"Poulose","given":"Alwin"},{"family":"Zeno","given":"Peter"},{"family":"Vaddevolu","given":"Uday Bhanu Prakash"},{"family":"Khan","given":"Sheheryar"},{"family":"Shoman","given":"Maged"},{"family":"Yan","given":"Hong"},{"family":"Karkee","given":"Manoj"}],"accessed":{"date-parts":[["2025",5,26]]},"issued":{"date-parts":[["2025",2,21]]}}},{"id":1306,"uris":["http://zotero.org/users/8619560/items/FL9B4B5Z"],"itemData":{"id":1306,"type":"article","abstract":"The YOLO (You Only Look Once) series has been a leading framework in real-time object detection, consistently improving the balance between speed and accuracy. However, integrating attention mechanisms into YOLO has been challenging due to their high computational overhead. YOLOv12 introduces a novel approach that successfully incorporates attention-based enhancements while preserving real-time performance. This paper provides a comprehensive review of YOLOv12's architectural innovations, including Area Attention for computationally efficient self-attention, Residual Efficient Layer Aggregation Networks for improved feature aggregation, and FlashAttention for optimized memory access. Additionally, we benchmark YOLOv12 against prior YOLO versions and competing object detectors, analyzing its improvements in accuracy, inference speed, and computational efficiency. Through this analysis, we demonstrate how YOLOv12 advances real-time object detection by refining the latency-accuracy trade-off and optimizing computational resources.","DOI":"10.48550/arXiv.2504.11995","note":"arXiv:2504.11995 [cs]","number":"arXiv:2504.11995","publisher":"arXiv","source":"arXiv.org","title":"A Review of YOLOv12: Attention-Based Enhancements vs. Previous Versions","title-short":"A Review of YOLOv12","URL":"http://arxiv.org/abs/2504.11995","author":[{"family":"Khanam","given":"Rahima"},{"family":"Hussain","given":"Muhammad"}],"accessed":{"date-parts":[["2025",5,26]]},"issued":{"date-parts":[["2025",4,16]]}}},{"id":1323,"uris":["http://zotero.org/users/8619560/items/U2X3VZQU"],"itemData":{"id":1323,"type":"article","abstract":"For years, the YOLO series has been the de facto industry-level standard for efficient object detection. The YOLO community has prospered overwhelmingly to enrich its use in a multitude of hardware platforms and abundant scenarios. In this technical report, we strive to push its limits to the next level, stepping forward with an unwavering mindset for industry application. Considering the diverse requirements for speed and accuracy in the real environment, we extensively examine the up-to-date object detection advancements either from industry or academia. Specifically, we heavily assimilate ideas from recent network design, training strategies, testing techniques, quantization, and optimization methods. On top of this, we integrate our thoughts and practice to build a suite of deployment-ready networks at various scales to accommodate diversified use cases. With the generous permission of YOLO authors, we name it YOLOv6. We also express our warm welcome to users and contributors for further enhancement. For a glimpse of performance, our YOLOv6-N hits 35.9% AP on the COCO dataset at a throughput of 1234 FPS on an NVIDIA Tesla T4 GPU. YOLOv6-S strikes 43.5% AP at 495 FPS, outperforming other mainstream detectors at the same scale~(YOLOv5-S, YOLOX-S, and PPYOLOE-S). Our quantized version of YOLOv6-S even brings a new state-of-the-art 43.3% AP at 869 FPS. Furthermore, YOLOv6-M/L also achieves better accuracy performance (i.e., 49.5%/52.3%) than other detectors with a similar inference speed. We carefully conducted experiments to validate the effectiveness of each component. Our code is made available at https://github.com/meituan/YOLOv6.","DOI":"10.48550/arXiv.2209.02976","note":"arXiv:2209.02976 [cs]","number":"arXiv:2209.02976","publisher":"arXiv","source":"arXiv.org","title":"YOLOv6: A Single-Stage Object Detection Framework for Industrial Applications","title-short":"YOLOv6","URL":"http://arxiv.org/abs/2209.02976","author":[{"family":"Li","given":"Chuyi"},{"family":"Li","given":"Lulu"},{"family":"Jiang","given":"Hongliang"},{"family":"Weng","given":"Kaiheng"},{"family":"Geng","given":"Yifei"},{"family":"Li","given":"Liang"},{"family":"Ke","given":"Zaidan"},{"family":"Li","given":"Qingyuan"},{"family":"Cheng","given":"Meng"},{"family":"Nie","given":"Weiqiang"},{"family":"Li","given":"Yiduo"},{"family":"Zhang","given":"Bo"},{"family":"Liang","given":"Yufei"},{"family":"Zhou","given":"Linyuan"},{"family":"Xu","given":"Xiaoming"},{"family":"Chu","given":"Xiangxiang"},{"family":"Wei","given":"Xiaoming"},{"family":"Wei","given":"Xiaolin"}],"accessed":{"date-parts":[["2025",5,26]]},"issued":{"date-parts":[["2022",9,7]]}}}],"schema":"https://github.com/citation-style-language/schema/raw/master/csl-citation.json"} </w:instrText>
-      </w:r>
-      <w:r>
-        <w:rPr>
-          <w:lang w:bidi="en-US"/>
-        </w:rPr>
-        <w:fldChar w:fldCharType="separate"/>
-      </w:r>
-      <w:r>
-        <w:t>[64], [65], [70]</w:t>
-      </w:r>
-      <w:r>
-        <w:fldChar w:fldCharType="end"/>
-      </w:r>
-      <w:r>
-        <w:rPr>
-          <w:lang w:bidi="en-US"/>
-        </w:rPr>
-        <w:t xml:space="preserve"> added the </w:t>
-      </w:r>
-      <w:proofErr w:type="spellStart"/>
-      <w:r>
-        <w:rPr>
-          <w:lang w:bidi="en-US"/>
-        </w:rPr>
-        <w:t>EfficientRep</w:t>
-      </w:r>
-      <w:proofErr w:type="spellEnd"/>
-      <w:r>
-        <w:rPr>
-          <w:lang w:bidi="en-US"/>
-        </w:rPr>
-        <w:t xml:space="preserve"> backbone and </w:t>
-      </w:r>
-      <w:proofErr w:type="spellStart"/>
-      <w:r>
-        <w:rPr>
-          <w:lang w:bidi="en-US"/>
-        </w:rPr>
-        <w:t>RepOptimizer</w:t>
-      </w:r>
-      <w:proofErr w:type="spellEnd"/>
-      <w:r>
-        <w:rPr>
-          <w:lang w:bidi="en-US"/>
-        </w:rPr>
-        <w:t xml:space="preserve"> to improve efficiency</w:t>
-      </w:r>
-      <w:r>
-        <w:rPr>
-          <w:lang w:bidi="en-US"/>
-        </w:rPr>
-        <w:t xml:space="preserve">. </w:t>
-      </w:r>
-      <w:r>
-        <w:rPr>
-          <w:lang w:bidi="en-US"/>
-        </w:rPr>
-        <w:t xml:space="preserve">YOLOv7 </w:t>
-      </w:r>
-      <w:r>
-        <w:rPr>
-          <w:lang w:bidi="en-US"/>
-        </w:rPr>
-        <w:fldChar w:fldCharType="begin"/>
-      </w:r>
-      <w:r>
-        <w:rPr>
-          <w:lang w:bidi="en-US"/>
-        </w:rPr>
-        <w:instrText xml:space="preserve"> ADDIN ZOTERO_ITEM CSL_CITATION {"citationID":"A5eyNYzF","properties":{"formattedCitation":"[64], [65], [71]","plainCitation":"[64], [65], [71]","noteIndex":0},"citationItems":[{"id":1298,"uris":["http://zotero.org/users/8619560/items/IGKB3IMS"],"itemData":{"id":1298,"type":"article","abstract":"This review systematically examines the progression of the You Only Look Once (YOLO) object detection algorithms from YOLOv1 to the recently unveiled YOLOv12. Employing a reverse chronological analysis, this study examines the advancements introduced by YOLO algorithms, beginning with YOLOv12 and progressing through YOLO11 (or YOLOv11), YOLOv10, YOLOv9, YOLOv8, and subsequent versions to explore each version's contributions to enhancing speed, detection accuracy, and computational efficiency in real-time object detection. Additionally, this study reviews the alternative versions derived from YOLO architectural advancements of YOLO-NAS, YOLO-X, YOLO-R, DAMO-YOLO, and Gold-YOLO. By detailing the incremental technological advancements in subsequent YOLO versions, this review chronicles the evolution of YOLO, and discusses the challenges and limitations in each of the earlier versions. The evolution signifies a path towards integrating YOLO with multimodal, context-aware, and Artificial General Intelligence (AGI) systems for the next YOLO decade, promising significant implications for future developments in AI-driven applications. (Key terms: YOLOv12, YOLOv12 architecture, YOLOv11, YOLO11, YOLO Review, YOLOv14, YOLOv15, YOLO architecture, YOLOv12 architecture)","DOI":"10.1007/s10462-025-11253-3","note":"arXiv:2406.19407 [cs]","source":"arXiv.org","title":"YOLOv12 to Its Genesis: A Decadal and Comprehensive Review of The You Only Look Once (YOLO) Series","title-short":"YOLOv12 to Its Genesis","URL":"http://arxiv.org/abs/2406.19407","author":[{"family":"Sapkota","given":"Ranjan"},{"family":"Qureshi","given":"Rizwan"},{"family":"Calero","given":"Marco Flores"},{"family":"Badjugar","given":"Chetan"},{"family":"Nepal","given":"Upesh"},{"family":"Poulose","given":"Alwin"},{"family":"Zeno","given":"Peter"},{"family":"Vaddevolu","given":"Uday Bhanu Prakash"},{"family":"Khan","given":"Sheheryar"},{"family":"Shoman","given":"Maged"},{"family":"Yan","given":"Hong"},{"family":"Karkee","given":"Manoj"}],"accessed":{"date-parts":[["2025",5,26]]},"issued":{"date-parts":[["2025",2,21]]}}},{"id":1306,"uris":["http://zotero.org/users/8619560/items/FL9B4B5Z"],"itemData":{"id":1306,"type":"article","abstract":"The YOLO (You Only Look Once) series has been a leading framework in real-time object detection, consistently improving the balance between speed and accuracy. However, integrating attention mechanisms into YOLO has been challenging due to their high computational overhead. YOLOv12 introduces a novel approach that successfully incorporates attention-based enhancements while preserving real-time performance. This paper provides a comprehensive review of YOLOv12's architectural innovations, including Area Attention for computationally efficient self-attention, Residual Efficient Layer Aggregation Networks for improved feature aggregation, and FlashAttention for optimized memory access. Additionally, we benchmark YOLOv12 against prior YOLO versions and competing object detectors, analyzing its improvements in accuracy, inference speed, and computational efficiency. Through this analysis, we demonstrate how YOLOv12 advances real-time object detection by refining the latency-accuracy trade-off and optimizing computational resources.","DOI":"10.48550/arXiv.2504.11995","note":"arXiv:2504.11995 [cs]","number":"arXiv:2504.11995","publisher":"arXiv","source":"arXiv.org","title":"A Review of YOLOv12: Attention-Based Enhancements vs. Previous Versions","title-short":"A Review of YOLOv12","URL":"http://arxiv.org/abs/2504.11995","author":[{"family":"Khanam","given":"Rahima"},{"family":"Hussain","given":"Muhammad"}],"accessed":{"date-parts":[["2025",5,26]]},"issued":{"date-parts":[["2025",4,16]]}}},{"id":1327,"uris":["http://zotero.org/users/8619560/items/PKYUS9RT"],"itemData":{"id":1327,"type":"paper-conference","abstract":"Real-time object detection is one of the most important research topics in computer vision. As new approaches regarding architecture optimization and training optimization are continually being developed, we have found two research topics that have spawned when dealing with these latest state-of-the-art methods. To address the topics, we propose a trainable bag-of-freebies oriented solution. We combine the flexible and efficient training tools with the proposed architecture and the compound scaling method. YOLOv7 surpasses all known object detectors in both speed and accuracy in the range from 5 FPS to 120 FPS and has the highest accuracy 56.8% AP among all known real-time object detectors with 30 FPS or higher on GPU V100. Source code is released in https://github.com/WongKinYiu/yolov7.","container-title":"2023 IEEE/CVF Conference on Computer Vision and Pattern Recognition (CVPR)","DOI":"10.1109/CVPR52729.2023.00721","event-title":"2023 IEEE/CVF Conference on Computer Vision and Pattern Recognition (CVPR)","note":"ISSN: 2575-7075","page":"7464-7475","source":"IEEE Xplore","title":"YOLOv7: Trainable Bag-of-Freebies Sets New State-of-the-Art for Real-Time Object Detectors","title-short":"YOLOv7","URL":"https://ieeexplore.ieee.org/document/10204762","author":[{"family":"Wang","given":"Chien-Yao"},{"family":"Bochkovskiy","given":"Alexey"},{"family":"Liao","given":"Hong-Yuan Mark"}],"accessed":{"date-parts":[["2025",5,26]]},"issued":{"date-parts":[["2023",6]]}}}],"schema":"https://github.com/citation-style-language/schema/raw/master/csl-citation.json"} </w:instrText>
-      </w:r>
-      <w:r>
-        <w:rPr>
-          <w:lang w:bidi="en-US"/>
-        </w:rPr>
-        <w:fldChar w:fldCharType="separate"/>
-      </w:r>
-      <w:r>
-        <w:t>[64], [65], [71]</w:t>
-      </w:r>
-      <w:r>
-        <w:fldChar w:fldCharType="end"/>
-      </w:r>
-      <w:r>
-        <w:rPr>
-          <w:lang w:bidi="en-US"/>
-        </w:rPr>
-        <w:t xml:space="preserve"> </w:t>
-      </w:r>
-      <w:r>
-        <w:rPr>
-          <w:lang w:bidi="en-US"/>
-        </w:rPr>
-        <w:t xml:space="preserve">improved efficiency by </w:t>
-      </w:r>
-      <w:r>
-        <w:rPr>
-          <w:lang w:bidi="en-US"/>
-        </w:rPr>
-        <w:t>introduc</w:t>
-      </w:r>
-      <w:r>
-        <w:rPr>
-          <w:lang w:bidi="en-US"/>
-        </w:rPr>
-        <w:t>ing</w:t>
-      </w:r>
-      <w:r>
-        <w:rPr>
-          <w:lang w:bidi="en-US"/>
-        </w:rPr>
-        <w:t xml:space="preserve"> a trainable bag-of-freebies and the Extended Efficient Layer Aggregation Network (E-ELAN)</w:t>
-      </w:r>
-      <w:r>
-        <w:rPr>
-          <w:lang w:bidi="en-US"/>
-        </w:rPr>
-        <w:t>.</w:t>
-      </w:r>
-    </w:p>
-    <w:p/>
-    <w:p>
-      <w:r>
-        <w:t xml:space="preserve">YOLOv8 </w:t>
-      </w:r>
-      <w:r>
-        <w:rPr>
-          <w:lang w:bidi="en-US"/>
-        </w:rPr>
-        <w:fldChar w:fldCharType="begin"/>
-      </w:r>
-      <w:r>
-        <w:rPr>
-          <w:lang w:bidi="en-US"/>
-        </w:rPr>
-        <w:instrText xml:space="preserve"> ADDIN ZOTERO_ITEM CSL_CITATION {"citationID":"XioXOs4F","properties":{"formattedCitation":"[64], [65], [69]","plainCitation":"[64], [65], [69]","noteIndex":0},"citationItems":[{"id":1298,"uris":["http://zotero.org/users/8619560/items/IGKB3IMS"],"itemData":{"id":1298,"type":"article","abstract":"This review systematically examines the progression of the You Only Look Once (YOLO) object detection algorithms from YOLOv1 to the recently unveiled YOLOv12. Employing a reverse chronological analysis, this study examines the advancements introduced by YOLO algorithms, beginning with YOLOv12 and progressing through YOLO11 (or YOLOv11), YOLOv10, YOLOv9, YOLOv8, and subsequent versions to explore each version's contributions to enhancing speed, detection accuracy, and computational efficiency in real-time object detection. Additionally, this study reviews the alternative versions derived from YOLO architectural advancements of YOLO-NAS, YOLO-X, YOLO-R, DAMO-YOLO, and Gold-YOLO. By detailing the incremental technological advancements in subsequent YOLO versions, this review chronicles the evolution of YOLO, and discusses the challenges and limitations in each of the earlier versions. The evolution signifies a path towards integrating YOLO with multimodal, context-aware, and Artificial General Intelligence (AGI) systems for the next YOLO decade, promising significant implications for future developments in AI-driven applications. (Key terms: YOLOv12, YOLOv12 architecture, YOLOv11, YOLO11, YOLO Review, YOLOv14, YOLOv15, YOLO architecture, YOLOv12 architecture)","DOI":"10.1007/s10462-025-11253-3","note":"arXiv:2406.19407 [cs]","source":"arXiv.org","title":"YOLOv12 to Its Genesis: A Decadal and Comprehensive Review of The You Only Look Once (YOLO) Series","title-short":"YOLOv12 to Its Genesis","URL":"http://arxiv.org/abs/2406.19407","author":[{"family":"Sapkota","given":"Ranjan"},{"family":"Qureshi","given":"Rizwan"},{"family":"Calero","given":"Marco Flores"},{"family":"Badjugar","given":"Chetan"},{"family":"Nepal","given":"Upesh"},{"family":"Poulose","given":"Alwin"},{"family":"Zeno","given":"Peter"},{"family":"Vaddevolu","given":"Uday Bhanu Prakash"},{"family":"Khan","given":"Sheheryar"},{"family":"Shoman","given":"Maged"},{"family":"Yan","given":"Hong"},{"family":"Karkee","given":"Manoj"}],"accessed":{"date-parts":[["2025",5,26]]},"issued":{"date-parts":[["2025",2,21]]}}},{"id":1306,"uris":["http://zotero.org/users/8619560/items/FL9B4B5Z"],"itemData":{"id":1306,"type":"article","abstract":"The YOLO (You Only Look Once) series has been a leading framework in real-time object detection, consistently improving the balance between speed and accuracy. However, integrating attention mechanisms into YOLO has been challenging due to their high computational overhead. YOLOv12 introduces a novel approach that successfully incorporates attention-based enhancements while preserving real-time performance. This paper provides a comprehensive review of YOLOv12's architectural innovations, including Area Attention for computationally efficient self-attention, Residual Efficient Layer Aggregation Networks for improved feature aggregation, and FlashAttention for optimized memory access. Additionally, we benchmark YOLOv12 against prior YOLO versions and competing object detectors, analyzing its improvements in accuracy, inference speed, and computational efficiency. Through this analysis, we demonstrate how YOLOv12 advances real-time object detection by refining the latency-accuracy trade-off and optimizing computational resources.","DOI":"10.48550/arXiv.2504.11995","note":"arXiv:2504.11995 [cs]","number":"arXiv:2504.11995","publisher":"arXiv","source":"arXiv.org","title":"A Review of YOLOv12: Attention-Based Enhancements vs. Previous Versions","title-short":"A Review of YOLOv12","URL":"http://arxiv.org/abs/2504.11995","author":[{"family":"Khanam","given":"Rahima"},{"family":"Hussain","given":"Muhammad"}],"accessed":{"date-parts":[["2025",5,26]]},"issued":{"date-parts":[["2025",4,16]]}}},{"id":1302,"uris":["http://zotero.org/users/8619560/items/GU7G34JD"],"itemData":{"id":1302,"type":"software","title":"Ultralytics YOLO","URL":"https://github.com/ultralytics/ultralytics","author":[{"family":"Jocher","given":"Glenn"},{"family":"Qiu","given":"Jing"}],"issued":{"date-parts":[["2024"]]}}}],"schema":"https://github.com/citation-style-language/schema/raw/master/csl-citation.json"} </w:instrText>
-      </w:r>
-      <w:r>
-        <w:rPr>
-          <w:lang w:bidi="en-US"/>
-        </w:rPr>
-        <w:fldChar w:fldCharType="separate"/>
-      </w:r>
-      <w:r>
-        <w:t>[64], [65], [69]</w:t>
-      </w:r>
-      <w:r>
-        <w:fldChar w:fldCharType="end"/>
-      </w:r>
-      <w:r>
-        <w:rPr>
-          <w:lang w:bidi="en-US"/>
-        </w:rPr>
-        <w:t xml:space="preserve">, also from </w:t>
-      </w:r>
-      <w:proofErr w:type="spellStart"/>
-      <w:r>
-        <w:rPr>
-          <w:lang w:bidi="en-US"/>
-        </w:rPr>
-        <w:t>Ultralytics</w:t>
-      </w:r>
-      <w:proofErr w:type="spellEnd"/>
-      <w:r>
-        <w:rPr>
-          <w:lang w:bidi="en-US"/>
-        </w:rPr>
-        <w:t xml:space="preserve"> </w:t>
-      </w:r>
-      <w:r>
-        <w:rPr>
-          <w:lang w:bidi="en-US"/>
-        </w:rPr>
-        <w:fldChar w:fldCharType="begin"/>
-      </w:r>
-      <w:r>
-        <w:rPr>
-          <w:lang w:bidi="en-US"/>
-        </w:rPr>
-        <w:instrText xml:space="preserve"> ADDIN ZOTERO_ITEM CSL_CITATION {"citationID":"0QgsX4Uv","properties":{"formattedCitation":"[69]","plainCitation":"[69]","noteIndex":0},"citationItems":[{"id":1302,"uris":["http://zotero.org/users/8619560/items/GU7G34JD"],"itemData":{"id":1302,"type":"software","title":"Ultralytics YOLO","URL":"https://github.com/ultralytics/ultralytics","author":[{"family":"Jocher","given":"Glenn"},{"family":"Qiu","given":"Jing"}],"issued":{"date-parts":[["2024"]]}}}],"schema":"https://github.com/citation-style-language/schema/raw/master/csl-citation.json"} </w:instrText>
-      </w:r>
-      <w:r>
-        <w:rPr>
-          <w:lang w:bidi="en-US"/>
-        </w:rPr>
-        <w:fldChar w:fldCharType="separate"/>
-      </w:r>
-      <w:r>
-        <w:t>[69]</w:t>
-      </w:r>
-      <w:r>
-        <w:fldChar w:fldCharType="end"/>
-      </w:r>
-      <w:r>
-        <w:rPr>
-          <w:lang w:bidi="en-US"/>
-        </w:rPr>
-        <w:t xml:space="preserve">, </w:t>
-      </w:r>
-      <w:r>
-        <w:t>integrated</w:t>
-      </w:r>
-      <w:r>
-        <w:t xml:space="preserve"> the C2f module </w:t>
-      </w:r>
-      <w:r>
-        <w:t xml:space="preserve">into the architecture </w:t>
-      </w:r>
-      <w:r>
-        <w:t xml:space="preserve">and transitioned to anchor-free detection for </w:t>
-      </w:r>
-      <w:r>
-        <w:t xml:space="preserve">a more </w:t>
-      </w:r>
-      <w:r>
-        <w:t>simplified</w:t>
-      </w:r>
-      <w:r>
-        <w:t xml:space="preserve"> and </w:t>
-      </w:r>
-      <w:r>
-        <w:t xml:space="preserve">specialized detection. </w:t>
-      </w:r>
-      <w:r>
-        <w:rPr>
-          <w:lang w:bidi="en-US"/>
-        </w:rPr>
-        <w:t xml:space="preserve">YOLOv9 </w:t>
-      </w:r>
-      <w:r>
-        <w:rPr>
-          <w:lang w:bidi="en-US"/>
-        </w:rPr>
-        <w:fldChar w:fldCharType="begin"/>
-      </w:r>
-      <w:r>
-        <w:rPr>
-          <w:lang w:bidi="en-US"/>
-        </w:rPr>
-        <w:instrText xml:space="preserve"> ADDIN ZOTERO_ITEM CSL_CITATION {"citationID":"vBP1eLuo","properties":{"formattedCitation":"[64], [65], [72]","plainCitation":"[64], [65], [72]","noteIndex":0},"citationItems":[{"id":1298,"uris":["http://zotero.org/users/8619560/items/IGKB3IMS"],"itemData":{"id":1298,"type":"article","abstract":"This review systematically examines the progression of the You Only Look Once (YOLO) object detection algorithms from YOLOv1 to the recently unveiled YOLOv12. Employing a reverse chronological analysis, this study examines the advancements introduced by YOLO algorithms, beginning with YOLOv12 and progressing through YOLO11 (or YOLOv11), YOLOv10, YOLOv9, YOLOv8, and subsequent versions to explore each version's contributions to enhancing speed, detection accuracy, and computational efficiency in real-time object detection. Additionally, this study reviews the alternative versions derived from YOLO architectural advancements of YOLO-NAS, YOLO-X, YOLO-R, DAMO-YOLO, and Gold-YOLO. By detailing the incremental technological advancements in subsequent YOLO versions, this review chronicles the evolution of YOLO, and discusses the challenges and limitations in each of the earlier versions. The evolution signifies a path towards integrating YOLO with multimodal, context-aware, and Artificial General Intelligence (AGI) systems for the next YOLO decade, promising significant implications for future developments in AI-driven applications. (Key terms: YOLOv12, YOLOv12 architecture, YOLOv11, YOLO11, YOLO Review, YOLOv14, YOLOv15, YOLO architecture, YOLOv12 architecture)","DOI":"10.1007/s10462-025-11253-3","note":"arXiv:2406.19407 [cs]","source":"arXiv.org","title":"YOLOv12 to Its Genesis: A Decadal and Comprehensive Review of The You Only Look Once (YOLO) Series","title-short":"YOLOv12 to Its Genesis","URL":"http://arxiv.org/abs/2406.19407","author":[{"family":"Sapkota","given":"Ranjan"},{"family":"Qureshi","given":"Rizwan"},{"family":"Calero","given":"Marco Flores"},{"family":"Badjugar","given":"Chetan"},{"family":"Nepal","given":"Upesh"},{"family":"Poulose","given":"Alwin"},{"family":"Zeno","given":"Peter"},{"family":"Vaddevolu","given":"Uday Bhanu Prakash"},{"family":"Khan","given":"Sheheryar"},{"family":"Shoman","given":"Maged"},{"family":"Yan","given":"Hong"},{"family":"Karkee","given":"Manoj"}],"accessed":{"date-parts":[["2025",5,26]]},"issued":{"date-parts":[["2025",2,21]]}}},{"id":1306,"uris":["http://zotero.org/users/8619560/items/FL9B4B5Z"],"itemData":{"id":1306,"type":"article","abstract":"The YOLO (You Only Look Once) series has been a leading framework in real-time object detection, consistently improving the balance between speed and accuracy. However, integrating attention mechanisms into YOLO has been challenging due to their high computational overhead. YOLOv12 introduces a novel approach that successfully incorporates attention-based enhancements while preserving real-time performance. This paper provides a comprehensive review of YOLOv12's architectural innovations, including Area Attention for computationally efficient self-attention, Residual Efficient Layer Aggregation Networks for improved feature aggregation, and FlashAttention for optimized memory access. Additionally, we benchmark YOLOv12 against prior YOLO versions and competing object detectors, analyzing its improvements in accuracy, inference speed, and computational efficiency. Through this analysis, we demonstrate how YOLOv12 advances real-time object detection by refining the latency-accuracy trade-off and optimizing computational resources.","DOI":"10.48550/arXiv.2504.11995","note":"arXiv:2504.11995 [cs]","number":"arXiv:2504.11995","publisher":"arXiv","source":"arXiv.org","title":"A Review of YOLOv12: Attention-Based Enhancements vs. Previous Versions","title-short":"A Review of YOLOv12","URL":"http://arxiv.org/abs/2504.11995","author":[{"family":"Khanam","given":"Rahima"},{"family":"Hussain","given":"Muhammad"}],"accessed":{"date-parts":[["2025",5,26]]},"issued":{"date-parts":[["2025",4,16]]}}},{"id":1330,"uris":["http://zotero.org/users/8619560/items/SEGFNZMS"],"itemData":{"id":1330,"type":"article","abstract":"Today's deep learning methods focus on how to design the most appropriate objective functions so that the prediction results of the model can be closest to the ground truth. Meanwhile, an appropriate architecture that can facilitate acquisition of enough information for prediction has to be designed. Existing methods ignore a fact that when input data undergoes layer-by-layer feature extraction and spatial transformation, large amount of information will be lost. This paper will delve into the important issues of data loss when data is transmitted through deep networks, namely information bottleneck and reversible functions. We proposed the concept of programmable gradient information (PGI) to cope with the various changes required by deep networks to achieve multiple objectives. PGI can provide complete input information for the target task to calculate objective function, so that reliable gradient information can be obtained to update network weights. In addition, a new lightweight network architecture -- Generalized Efficient Layer Aggregation Network (GELAN), based on gradient path planning is designed. GELAN's architecture confirms that PGI has gained superior results on lightweight models. We verified the proposed GELAN and PGI on MS COCO dataset based object detection. The results show that GELAN only uses conventional convolution operators to achieve better parameter utilization than the state-of-the-art methods developed based on depth-wise convolution. PGI can be used for variety of models from lightweight to large. It can be used to obtain complete information, so that train-from-scratch models can achieve better results than state-of-the-art models pre-trained using large datasets, the comparison results are shown in Figure 1. The source codes are at: https://github.com/WongKinYiu/yolov9.","DOI":"10.48550/arXiv.2402.13616","note":"arXiv:2402.13616 [cs]","number":"arXiv:2402.13616","publisher":"arXiv","source":"arXiv.org","title":"YOLOv9: Learning What You Want to Learn Using Programmable Gradient Information","title-short":"YOLOv9","URL":"http://arxiv.org/abs/2402.13616","author":[{"family":"Wang","given":"Chien-Yao"},{"family":"Yeh","given":"I.-Hau"},{"family":"Liao","given":"Hong-Yuan Mark"}],"accessed":{"date-parts":[["2025",5,26]]},"issued":{"date-parts":[["2024",2,29]]}}}],"schema":"https://github.com/citation-style-language/schema/raw/master/csl-citation.json"} </w:instrText>
-      </w:r>
-      <w:r>
-        <w:rPr>
-          <w:lang w:bidi="en-US"/>
-        </w:rPr>
-        <w:fldChar w:fldCharType="separate"/>
-      </w:r>
-      <w:r>
-        <w:t>[64], [65], [72]</w:t>
-      </w:r>
-      <w:r>
-        <w:fldChar w:fldCharType="end"/>
-      </w:r>
-      <w:r>
-        <w:rPr>
-          <w:lang w:bidi="en-US"/>
-        </w:rPr>
-        <w:t xml:space="preserve"> </w:t>
-      </w:r>
-      <w:r>
-        <w:t>incorporated the Generalized Efficient Layer Aggregation Network (GELAN) and Programmable Gradient Information (PGI)</w:t>
-      </w:r>
-      <w:r>
-        <w:t xml:space="preserve"> to </w:t>
-      </w:r>
-      <w:r>
-        <w:t xml:space="preserve">mitigate information degradation in deep networks. </w:t>
-      </w:r>
-      <w:r>
-        <w:rPr>
-          <w:lang w:bidi="en-US"/>
-        </w:rPr>
-        <w:t xml:space="preserve">YOLOv10 </w:t>
-      </w:r>
-      <w:r>
-        <w:rPr>
-          <w:lang w:bidi="en-US"/>
-        </w:rPr>
-        <w:fldChar w:fldCharType="begin"/>
-      </w:r>
-      <w:r>
-        <w:rPr>
-          <w:lang w:bidi="en-US"/>
-        </w:rPr>
-        <w:instrText xml:space="preserve"> ADDIN ZOTERO_ITEM CSL_CITATION {"citationID":"oblE8jdc","properties":{"formattedCitation":"[64], [65], [73]","plainCitation":"[64], [65], [73]","noteIndex":0},"citationItems":[{"id":1298,"uris":["http://zotero.org/users/8619560/items/IGKB3IMS"],"itemData":{"id":1298,"type":"article","abstract":"This review systematically examines the progression of the You Only Look Once (YOLO) object detection algorithms from YOLOv1 to the recently unveiled YOLOv12. Employing a reverse chronological analysis, this study examines the advancements introduced by YOLO algorithms, beginning with YOLOv12 and progressing through YOLO11 (or YOLOv11), YOLOv10, YOLOv9, YOLOv8, and subsequent versions to explore each version's contributions to enhancing speed, detection accuracy, and computational efficiency in real-time object detection. Additionally, this study reviews the alternative versions derived from YOLO architectural advancements of YOLO-NAS, YOLO-X, YOLO-R, DAMO-YOLO, and Gold-YOLO. By detailing the incremental technological advancements in subsequent YOLO versions, this review chronicles the evolution of YOLO, and discusses the challenges and limitations in each of the earlier versions. The evolution signifies a path towards integrating YOLO with multimodal, context-aware, and Artificial General Intelligence (AGI) systems for the next YOLO decade, promising significant implications for future developments in AI-driven applications. (Key terms: YOLOv12, YOLOv12 architecture, YOLOv11, YOLO11, YOLO Review, YOLOv14, YOLOv15, YOLO architecture, YOLOv12 architecture)","DOI":"10.1007/s10462-025-11253-3","note":"arXiv:2406.19407 [cs]","source":"arXiv.org","title":"YOLOv12 to Its Genesis: A Decadal and Comprehensive Review of The You Only Look Once (YOLO) Series","title-short":"YOLOv12 to Its Genesis","URL":"http://arxiv.org/abs/2406.19407","author":[{"family":"Sapkota","given":"Ranjan"},{"family":"Qureshi","given":"Rizwan"},{"family":"Calero","given":"Marco Flores"},{"family":"Badjugar","given":"Chetan"},{"family":"Nepal","given":"Upesh"},{"family":"Poulose","given":"Alwin"},{"family":"Zeno","given":"Peter"},{"family":"Vaddevolu","given":"Uday Bhanu Prakash"},{"family":"Khan","given":"Sheheryar"},{"family":"Shoman","given":"Maged"},{"family":"Yan","given":"Hong"},{"family":"Karkee","given":"Manoj"}],"accessed":{"date-parts":[["2025",5,26]]},"issued":{"date-parts":[["2025",2,21]]}}},{"id":1306,"uris":["http://zotero.org/users/8619560/items/FL9B4B5Z"],"itemData":{"id":1306,"type":"article","abstract":"The YOLO (You Only Look Once) series has been a leading framework in real-time object detection, consistently improving the balance between speed and accuracy. However, integrating attention mechanisms into YOLO has been challenging due to their high computational overhead. YOLOv12 introduces a novel approach that successfully incorporates attention-based enhancements while preserving real-time performance. This paper provides a comprehensive review of YOLOv12's architectural innovations, including Area Attention for computationally efficient self-attention, Residual Efficient Layer Aggregation Networks for improved feature aggregation, and FlashAttention for optimized memory access. Additionally, we benchmark YOLOv12 against prior YOLO versions and competing object detectors, analyzing its improvements in accuracy, inference speed, and computational efficiency. Through this analysis, we demonstrate how YOLOv12 advances real-time object detection by refining the latency-accuracy trade-off and optimizing computational resources.","DOI":"10.48550/arXiv.2504.11995","note":"arXiv:2504.11995 [cs]","number":"arXiv:2504.11995","publisher":"arXiv","source":"arXiv.org","title":"A Review of YOLOv12: Attention-Based Enhancements vs. Previous Versions","title-short":"A Review of YOLOv12","URL":"http://arxiv.org/abs/2504.11995","author":[{"family":"Khanam","given":"Rahima"},{"family":"Hussain","given":"Muhammad"}],"accessed":{"date-parts":[["2025",5,26]]},"issued":{"date-parts":[["2025",4,16]]}}},{"id":1331,"uris":["http://zotero.org/users/8619560/items/QDTGKR2Q"],"itemData":{"id":1331,"type":"article","abstract":"Over the past years, YOLOs have emerged as the predominant paradigm in the field of real-time object detection owing to their effective balance between computational cost and detection performance. Researchers have explored the architectural designs, optimization objectives, data augmentation strategies, and others for YOLOs, achieving notable progress. However, the reliance on the non-maximum suppression (NMS) for post-processing hampers the end-to-end deployment of YOLOs and adversely impacts the inference latency. Besides, the design of various components in YOLOs lacks the comprehensive and thorough inspection, resulting in noticeable computational redundancy and limiting the model's capability. It renders the suboptimal efficiency, along with considerable potential for performance improvements. In this work, we aim to further advance the performance-efficiency boundary of YOLOs from both the post-processing and model architecture. To this end, we first present the consistent dual assignments for NMS-free training of YOLOs, which brings competitive performance and low inference latency simultaneously. Moreover, we introduce the holistic efficiency-accuracy driven model design strategy for YOLOs. We comprehensively optimize various components of YOLOs from both efficiency and accuracy perspectives, which greatly reduces the computational overhead and enhances the capability. The outcome of our effort is a new generation of YOLO series for real-time end-to-end object detection, dubbed YOLOv10. Extensive experiments show that YOLOv10 achieves state-of-the-art performance and efficiency across various model scales. For example, our YOLOv10-S is 1.8$\\times$ faster than RT-DETR-R18 under the similar AP on COCO, meanwhile enjoying 2.8$\\times$ smaller number of parameters and FLOPs. Compared with YOLOv9-C, YOLOv10-B has 46\\% less latency and 25\\% fewer parameters for the same performance.","DOI":"10.48550/arXiv.2405.14458","note":"arXiv:2405.14458 [cs]","number":"arXiv:2405.14458","publisher":"arXiv","source":"arXiv.org","title":"YOLOv10: Real-Time End-to-End Object Detection","title-short":"YOLOv10","URL":"http://arxiv.org/abs/2405.14458","author":[{"family":"Wang","given":"Ao"},{"family":"Chen","given":"Hui"},{"family":"Liu","given":"Lihao"},{"family":"Chen","given":"Kai"},{"family":"Lin","given":"Zijia"},{"family":"Han","given":"Jungong"},{"family":"Ding","given":"Guiguang"}],"accessed":{"date-parts":[["2025",5,26]]},"issued":{"date-parts":[["2024",10,30]]}}}],"schema":"https://github.com/citation-style-language/schema/raw/master/csl-citation.json"} </w:instrText>
-      </w:r>
-      <w:r>
-        <w:rPr>
-          <w:lang w:bidi="en-US"/>
-        </w:rPr>
-        <w:fldChar w:fldCharType="separate"/>
-      </w:r>
-      <w:r>
-        <w:t>[64], [65], [73]</w:t>
-      </w:r>
-      <w:r>
-        <w:fldChar w:fldCharType="end"/>
-      </w:r>
-      <w:r>
-        <w:rPr>
-          <w:color w:val="FF0000"/>
-          <w:lang w:bidi="en-US"/>
-        </w:rPr>
-        <w:t xml:space="preserve"> </w:t>
-      </w:r>
-      <w:r>
-        <w:t>remov</w:t>
-      </w:r>
-      <w:r>
-        <w:t xml:space="preserve">ed </w:t>
-      </w:r>
-      <w:r>
-        <w:t>non-maximum suppression (NMS)</w:t>
-      </w:r>
-      <w:r>
-        <w:t xml:space="preserve"> and</w:t>
-      </w:r>
-      <w:r>
-        <w:t xml:space="preserve"> introduc</w:t>
-      </w:r>
-      <w:r>
-        <w:t>ed</w:t>
-      </w:r>
-      <w:r>
-        <w:t xml:space="preserve"> a dual assignment strategy</w:t>
-      </w:r>
-      <w:r>
-        <w:t xml:space="preserve"> and</w:t>
-      </w:r>
-      <w:r>
-        <w:t xml:space="preserve"> lightweight classification heads</w:t>
-      </w:r>
-      <w:r>
-        <w:t xml:space="preserve"> achieving </w:t>
-      </w:r>
-      <w:r>
-        <w:t xml:space="preserve">real-time efficiency. </w:t>
-      </w:r>
-      <w:r>
-        <w:rPr>
-          <w:lang w:bidi="en-US"/>
-        </w:rPr>
-        <w:t xml:space="preserve">YOLOv11 </w:t>
-      </w:r>
-      <w:r>
-        <w:rPr>
-          <w:lang w:bidi="en-US"/>
-        </w:rPr>
-        <w:fldChar w:fldCharType="begin"/>
-      </w:r>
-      <w:r>
-        <w:rPr>
-          <w:lang w:bidi="en-US"/>
-        </w:rPr>
-        <w:instrText xml:space="preserve"> ADDIN ZOTERO_ITEM CSL_CITATION {"citationID":"MAxi98bY","properties":{"formattedCitation":"[64], [65], [69]","plainCitation":"[64], [65], [69]","noteIndex":0},"citationItems":[{"id":1298,"uris":["http://zotero.org/users/8619560/items/IGKB3IMS"],"itemData":{"id":1298,"type":"article","abstract":"This review systematically examines the progression of the You Only Look Once (YOLO) object detection algorithms from YOLOv1 to the recently unveiled YOLOv12. Employing a reverse chronological analysis, this study examines the advancements introduced by YOLO algorithms, beginning with YOLOv12 and progressing through YOLO11 (or YOLOv11), YOLOv10, YOLOv9, YOLOv8, and subsequent versions to explore each version's contributions to enhancing speed, detection accuracy, and computational efficiency in real-time object detection. Additionally, this study reviews the alternative versions derived from YOLO architectural advancements of YOLO-NAS, YOLO-X, YOLO-R, DAMO-YOLO, and Gold-YOLO. By detailing the incremental technological advancements in subsequent YOLO versions, this review chronicles the evolution of YOLO, and discusses the challenges and limitations in each of the earlier versions. The evolution signifies a path towards integrating YOLO with multimodal, context-aware, and Artificial General Intelligence (AGI) systems for the next YOLO decade, promising significant implications for future developments in AI-driven applications. (Key terms: YOLOv12, YOLOv12 architecture, YOLOv11, YOLO11, YOLO Review, YOLOv14, YOLOv15, YOLO architecture, YOLOv12 architecture)","DOI":"10.1007/s10462-025-11253-3","note":"arXiv:2406.19407 [cs]","source":"arXiv.org","title":"YOLOv12 to Its Genesis: A Decadal and Comprehensive Review of The You Only Look Once (YOLO) Series","title-short":"YOLOv12 to Its Genesis","URL":"http://arxiv.org/abs/2406.19407","author":[{"family":"Sapkota","given":"Ranjan"},{"family":"Qureshi","given":"Rizwan"},{"family":"Calero","given":"Marco Flores"},{"family":"Badjugar","given":"Chetan"},{"family":"Nepal","given":"Upesh"},{"family":"Poulose","given":"Alwin"},{"family":"Zeno","given":"Peter"},{"family":"Vaddevolu","given":"Uday Bhanu Prakash"},{"family":"Khan","given":"Sheheryar"},{"family":"Shoman","given":"Maged"},{"family":"Yan","given":"Hong"},{"family":"Karkee","given":"Manoj"}],"accessed":{"date-parts":[["2025",5,26]]},"issued":{"date-parts":[["2025",2,21]]}}},{"id":1306,"uris":["http://zotero.org/users/8619560/items/FL9B4B5Z"],"itemData":{"id":1306,"type":"article","abstract":"The YOLO (You Only Look Once) series has been a leading framework in real-time object detection, consistently improving the balance between speed and accuracy. However, integrating attention mechanisms into YOLO has been challenging due to their high computational overhead. YOLOv12 introduces a novel approach that successfully incorporates attention-based enhancements while preserving real-time performance. This paper provides a comprehensive review of YOLOv12's architectural innovations, including Area Attention for computationally efficient self-attention, Residual Efficient Layer Aggregation Networks for improved feature aggregation, and FlashAttention for optimized memory access. Additionally, we benchmark YOLOv12 against prior YOLO versions and competing object detectors, analyzing its improvements in accuracy, inference speed, and computational efficiency. Through this analysis, we demonstrate how YOLOv12 advances real-time object detection by refining the latency-accuracy trade-off and optimizing computational resources.","DOI":"10.48550/arXiv.2504.11995","note":"arXiv:2504.11995 [cs]","number":"arXiv:2504.11995","publisher":"arXiv","source":"arXiv.org","title":"A Review of YOLOv12: Attention-Based Enhancements vs. Previous Versions","title-short":"A Review of YOLOv12","URL":"http://arxiv.org/abs/2504.11995","author":[{"family":"Khanam","given":"Rahima"},{"family":"Hussain","given":"Muhammad"}],"accessed":{"date-parts":[["2025",5,26]]},"issued":{"date-parts":[["2025",4,16]]}}},{"id":1302,"uris":["http://zotero.org/users/8619560/items/GU7G34JD"],"itemData":{"id":1302,"type":"software","title":"Ultralytics YOLO","URL":"https://github.com/ultralytics/ultralytics","author":[{"family":"Jocher","given":"Glenn"},{"family":"Qiu","given":"Jing"}],"issued":{"date-parts":[["2024"]]}}}],"schema":"https://github.com/citation-style-language/schema/raw/master/csl-citation.json"} </w:instrText>
-      </w:r>
-      <w:r>
-        <w:rPr>
-          <w:lang w:bidi="en-US"/>
-        </w:rPr>
-        <w:fldChar w:fldCharType="separate"/>
-      </w:r>
-      <w:r>
-        <w:t>[64], [65], [69]</w:t>
-      </w:r>
-      <w:r>
-        <w:fldChar w:fldCharType="end"/>
-      </w:r>
-      <w:r>
-        <w:rPr>
-          <w:color w:val="FF0000"/>
-        </w:rPr>
-        <w:t xml:space="preserve"> </w:t>
-      </w:r>
-      <w:r>
-        <w:t>integrated</w:t>
-      </w:r>
-      <w:r>
-        <w:t xml:space="preserve"> the C3k2 block, SPPF, and C2PSA </w:t>
-      </w:r>
-      <w:r>
-        <w:t>into the architecture</w:t>
-      </w:r>
-      <w:r>
-        <w:t xml:space="preserve"> to improve feature extraction and spatial attention while balancing precision and efficiency.</w:t>
-      </w:r>
-    </w:p>
-    <w:p>
-      <w:pPr>
-        <w:rPr>
-          <w:lang w:bidi="en-US"/>
-        </w:rPr>
-      </w:pPr>
+        <w:t>) are:</w:t>
+      </w:r>
+      <w:r>
+        <w:t xml:space="preserve"> the Area Attention module, which reduces computational complexity while maintaining a large receptive field, and Residual Efficient Layer Aggregation Networks (R-ELAN) that enhance </w:t>
+      </w:r>
       <w:r>
         <w:lastRenderedPageBreak/>
-        <w:t xml:space="preserve">YOLOv12 </w:t>
-      </w:r>
-      <w:r>
-        <w:rPr>
-          <w:color w:val="FF0000"/>
-          <w:lang w:bidi="en-US"/>
-        </w:rPr>
-        <w:fldChar w:fldCharType="begin"/>
-      </w:r>
-      <w:r>
-        <w:rPr>
-          <w:color w:val="FF0000"/>
-          <w:lang w:bidi="en-US"/>
-        </w:rPr>
-        <w:instrText xml:space="preserve"> ADDIN ZOTERO_ITEM CSL_CITATION {"citationID":"lMXJLe8I","properties":{"formattedCitation":"[64], [65], [69], [74]","plainCitation":"[64], [65], [69], [74]","noteIndex":0},"citationItems":[{"id":1298,"uris":["http://zotero.org/users/8619560/items/IGKB3IMS"],"itemData":{"id":1298,"type":"article","abstract":"This review systematically examines the progression of the You Only Look Once (YOLO) object detection algorithms from YOLOv1 to the recently unveiled YOLOv12. Employing a reverse chronological analysis, this study examines the advancements introduced by YOLO algorithms, beginning with YOLOv12 and progressing through YOLO11 (or YOLOv11), YOLOv10, YOLOv9, YOLOv8, and subsequent versions to explore each version's contributions to enhancing speed, detection accuracy, and computational efficiency in real-time object detection. Additionally, this study reviews the alternative versions derived from YOLO architectural advancements of YOLO-NAS, YOLO-X, YOLO-R, DAMO-YOLO, and Gold-YOLO. By detailing the incremental technological advancements in subsequent YOLO versions, this review chronicles the evolution of YOLO, and discusses the challenges and limitations in each of the earlier versions. The evolution signifies a path towards integrating YOLO with multimodal, context-aware, and Artificial General Intelligence (AGI) systems for the next YOLO decade, promising significant implications for future developments in AI-driven applications. (Key terms: YOLOv12, YOLOv12 architecture, YOLOv11, YOLO11, YOLO Review, YOLOv14, YOLOv15, YOLO architecture, YOLOv12 architecture)","DOI":"10.1007/s10462-025-11253-3","note":"arXiv:2406.19407 [cs]","source":"arXiv.org","title":"YOLOv12 to Its Genesis: A Decadal and Comprehensive Review of The You Only Look Once (YOLO) Series","title-short":"YOLOv12 to Its Genesis","URL":"http://arxiv.org/abs/2406.19407","author":[{"family":"Sapkota","given":"Ranjan"},{"family":"Qureshi","given":"Rizwan"},{"family":"Calero","given":"Marco Flores"},{"family":"Badjugar","given":"Chetan"},{"family":"Nepal","given":"Upesh"},{"family":"Poulose","given":"Alwin"},{"family":"Zeno","given":"Peter"},{"family":"Vaddevolu","given":"Uday Bhanu Prakash"},{"family":"Khan","given":"Sheheryar"},{"family":"Shoman","given":"Maged"},{"family":"Yan","given":"Hong"},{"family":"Karkee","given":"Manoj"}],"accessed":{"date-parts":[["2025",5,26]]},"issued":{"date-parts":[["2025",2,21]]}}},{"id":1302,"uris":["http://zotero.org/users/8619560/items/GU7G34JD"],"itemData":{"id":1302,"type":"software","title":"Ultralytics YOLO","URL":"https://github.com/ultralytics/ultralytics","author":[{"family":"Jocher","given":"Glenn"},{"family":"Qiu","given":"Jing"}],"issued":{"date-parts":[["2024"]]}}},{"id":1292,"uris":["http://zotero.org/users/8619560/items/I4SMGGNV"],"itemData":{"id":1292,"type":"article","abstract":"Enhancing the network architecture of the YOLO framework has been crucial for a long time, but has focused on CNN-based improvements despite the proven superiority of attention mechanisms in modeling capabilities. This is because attention-based models cannot match the speed of CNN-based models. This paper proposes an attention-centric YOLO framework, namely YOLOv12, that matches the speed of previous CNN-based ones while harnessing the performance benefits of attention mechanisms. YOLOv12 surpasses all popular real-time object detectors in accuracy with competitive speed. For example, YOLOv12-N achieves 40.6% mAP with an inference latency of 1.64 ms on a T4 GPU, outperforming advanced YOLOv10-N / YOLOv11-N by 2.1%/1.2% mAP with a comparable speed. This advantage extends to other model scales. YOLOv12 also surpasses end-to-end real-time detectors that improve DETR, such as RT-DETR / RT-DETRv2: YOLOv12-S beats RT-DETR-R18 / RT-DETRv2-R18 while running 42% faster, using only 36% of the computation and 45% of the parameters. More comparisons are shown in Figure 1.","DOI":"10.48550/arXiv.2502.12524","note":"arXiv:2502.12524 [cs]","number":"arXiv:2502.12524","publisher":"arXiv","source":"arXiv.org","title":"YOLOv12: Attention-Centric Real-Time Object Detectors","title-short":"YOLOv12","URL":"http://arxiv.org/abs/2502.12524","author":[{"family":"Tian","given":"Yunjie"},{"family":"Ye","given":"Qixiang"},{"family":"Doermann","given":"David"}],"accessed":{"date-parts":[["2025",5,26]]},"issued":{"date-parts":[["2025",2,18]]}}},{"id":1306,"uris":["http://zotero.org/users/8619560/items/FL9B4B5Z"],"itemData":{"id":1306,"type":"article","abstract":"The YOLO (You Only Look Once) series has been a leading framework in real-time object detection, consistently improving the balance between speed and accuracy. However, integrating attention mechanisms into YOLO has been challenging due to their high computational overhead. YOLOv12 introduces a novel approach that successfully incorporates attention-based enhancements while preserving real-time performance. This paper provides a comprehensive review of YOLOv12's architectural innovations, including Area Attention for computationally efficient self-attention, Residual Efficient Layer Aggregation Networks for improved feature aggregation, and FlashAttention for optimized memory access. Additionally, we benchmark YOLOv12 against prior YOLO versions and competing object detectors, analyzing its improvements in accuracy, inference speed, and computational efficiency. Through this analysis, we demonstrate how YOLOv12 advances real-time object detection by refining the latency-accuracy trade-off and optimizing computational resources.","DOI":"10.48550/arXiv.2504.11995","note":"arXiv:2504.11995 [cs]","number":"arXiv:2504.11995","publisher":"arXiv","source":"arXiv.org","title":"A Review of YOLOv12: Attention-Based Enhancements vs. Previous Versions","title-short":"A Review of YOLOv12","URL":"http://arxiv.org/abs/2504.11995","author":[{"family":"Khanam","given":"Rahima"},{"family":"Hussain","given":"Muhammad"}],"accessed":{"date-parts":[["2025",5,26]]},"issued":{"date-parts":[["2025",4,16]]}}}],"schema":"https://github.com/citation-style-language/schema/raw/master/csl-citation.json"} </w:instrText>
-      </w:r>
-      <w:r>
-        <w:rPr>
-          <w:color w:val="FF0000"/>
-          <w:lang w:bidi="en-US"/>
-        </w:rPr>
-        <w:fldChar w:fldCharType="separate"/>
-      </w:r>
-      <w:r>
-        <w:t>[64], [65], [69], [74]</w:t>
-      </w:r>
-      <w:r>
-        <w:rPr>
-          <w:color w:val="FF0000"/>
-          <w:lang w:bidi="en-US"/>
-        </w:rPr>
-        <w:fldChar w:fldCharType="end"/>
-      </w:r>
-      <w:r>
-        <w:rPr>
-          <w:color w:val="FF0000"/>
-          <w:lang w:bidi="en-US"/>
-        </w:rPr>
-        <w:t xml:space="preserve"> </w:t>
-      </w:r>
-      <w:r>
-        <w:t>shift</w:t>
-      </w:r>
-      <w:r>
-        <w:t>ed</w:t>
-      </w:r>
-      <w:r>
-        <w:t xml:space="preserve"> toward an attention-centric architecture achieving state-of-the-art accuracy and efficiency while maintaining real-time performance</w:t>
-      </w:r>
-      <w:r>
-        <w:t xml:space="preserve"> </w:t>
-      </w:r>
-      <w:r>
-        <w:rPr>
-          <w:color w:val="FF0000"/>
-          <w:lang w:bidi="en-US"/>
-        </w:rPr>
-        <w:fldChar w:fldCharType="begin"/>
-      </w:r>
-      <w:r>
-        <w:rPr>
-          <w:color w:val="FF0000"/>
-          <w:lang w:bidi="en-US"/>
-        </w:rPr>
-        <w:instrText xml:space="preserve"> ADDIN ZOTERO_ITEM CSL_CITATION {"citationID":"nZeJ7Sx6","properties":{"formattedCitation":"[65], [74]","plainCitation":"[65], [74]","noteIndex":0},"citationItems":[{"id":1292,"uris":["http://zotero.org/users/8619560/items/I4SMGGNV"],"itemData":{"id":1292,"type":"article","abstract":"Enhancing the network architecture of the YOLO framework has been crucial for a long time, but has focused on CNN-based improvements despite the proven superiority of attention mechanisms in modeling capabilities. This is because attention-based models cannot match the speed of CNN-based models. This paper proposes an attention-centric YOLO framework, namely YOLOv12, that matches the speed of previous CNN-based ones while harnessing the performance benefits of attention mechanisms. YOLOv12 surpasses all popular real-time object detectors in accuracy with competitive speed. For example, YOLOv12-N achieves 40.6% mAP with an inference latency of 1.64 ms on a T4 GPU, outperforming advanced YOLOv10-N / YOLOv11-N by 2.1%/1.2% mAP with a comparable speed. This advantage extends to other model scales. YOLOv12 also surpasses end-to-end real-time detectors that improve DETR, such as RT-DETR / RT-DETRv2: YOLOv12-S beats RT-DETR-R18 / RT-DETRv2-R18 while running 42% faster, using only 36% of the computation and 45% of the parameters. More comparisons are shown in Figure 1.","DOI":"10.48550/arXiv.2502.12524","note":"arXiv:2502.12524 [cs]","number":"arXiv:2502.12524","publisher":"arXiv","source":"arXiv.org","title":"YOLOv12: Attention-Centric Real-Time Object Detectors","title-short":"YOLOv12","URL":"http://arxiv.org/abs/2502.12524","author":[{"family":"Tian","given":"Yunjie"},{"family":"Ye","given":"Qixiang"},{"family":"Doermann","given":"David"}],"accessed":{"date-parts":[["2025",5,26]]},"issued":{"date-parts":[["2025",2,18]]}}},{"id":1306,"uris":["http://zotero.org/users/8619560/items/FL9B4B5Z"],"itemData":{"id":1306,"type":"article","abstract":"The YOLO (You Only Look Once) series has been a leading framework in real-time object detection, consistently improving the balance between speed and accuracy. However, integrating attention mechanisms into YOLO has been challenging due to their high computational overhead. YOLOv12 introduces a novel approach that successfully incorporates attention-based enhancements while preserving real-time performance. This paper provides a comprehensive review of YOLOv12's architectural innovations, including Area Attention for computationally efficient self-attention, Residual Efficient Layer Aggregation Networks for improved feature aggregation, and FlashAttention for optimized memory access. Additionally, we benchmark YOLOv12 against prior YOLO versions and competing object detectors, analyzing its improvements in accuracy, inference speed, and computational efficiency. Through this analysis, we demonstrate how YOLOv12 advances real-time object detection by refining the latency-accuracy trade-off and optimizing computational resources.","DOI":"10.48550/arXiv.2504.11995","note":"arXiv:2504.11995 [cs]","number":"arXiv:2504.11995","publisher":"arXiv","source":"arXiv.org","title":"A Review of YOLOv12: Attention-Based Enhancements vs. Previous Versions","title-short":"A Review of YOLOv12","URL":"http://arxiv.org/abs/2504.11995","author":[{"family":"Khanam","given":"Rahima"},{"family":"Hussain","given":"Muhammad"}],"accessed":{"date-parts":[["2025",5,26]]},"issued":{"date-parts":[["2025",4,16]]}}}],"schema":"https://github.com/citation-style-language/schema/raw/master/csl-citation.json"} </w:instrText>
-      </w:r>
-      <w:r>
-        <w:rPr>
-          <w:color w:val="FF0000"/>
-          <w:lang w:bidi="en-US"/>
-        </w:rPr>
-        <w:fldChar w:fldCharType="separate"/>
-      </w:r>
-      <w:r>
-        <w:t>[65], [74]</w:t>
-      </w:r>
-      <w:r>
-        <w:rPr>
-          <w:color w:val="FF0000"/>
-          <w:lang w:bidi="en-US"/>
-        </w:rPr>
-        <w:fldChar w:fldCharType="end"/>
-      </w:r>
-      <w:r>
-        <w:t xml:space="preserve">. </w:t>
-      </w:r>
-      <w:r>
-        <w:t>The i</w:t>
-      </w:r>
-      <w:r>
-        <w:t xml:space="preserve">nnovations </w:t>
-      </w:r>
-      <w:r>
-        <w:t xml:space="preserve">that allowed YOLOv12 to achieve this (confirmed through ablation studies </w:t>
-      </w:r>
-      <w:r>
-        <w:rPr>
-          <w:color w:val="FF0000"/>
-          <w:lang w:bidi="en-US"/>
-        </w:rPr>
-        <w:fldChar w:fldCharType="begin"/>
-      </w:r>
-      <w:r>
-        <w:rPr>
-          <w:color w:val="FF0000"/>
-          <w:lang w:bidi="en-US"/>
-        </w:rPr>
-        <w:instrText xml:space="preserve"> ADDIN ZOTERO_ITEM CSL_CITATION {"citationID":"nizzCv9H","properties":{"formattedCitation":"[74]","plainCitation":"[74]","noteIndex":0},"citationItems":[{"id":1292,"uris":["http://zotero.org/users/8619560/items/I4SMGGNV"],"itemData":{"id":1292,"type":"article","abstract":"Enhancing the network architecture of the YOLO framework has been crucial for a long time, but has focused on CNN-based improvements despite the proven superiority of attention mechanisms in modeling capabilities. This is because attention-based models cannot match the speed of CNN-based models. This paper proposes an attention-centric YOLO framework, namely YOLOv12, that matches the speed of previous CNN-based ones while harnessing the performance benefits of attention mechanisms. YOLOv12 surpasses all popular real-time object detectors in accuracy with competitive speed. For example, YOLOv12-N achieves 40.6% mAP with an inference latency of 1.64 ms on a T4 GPU, outperforming advanced YOLOv10-N / YOLOv11-N by 2.1%/1.2% mAP with a comparable speed. This advantage extends to other model scales. YOLOv12 also surpasses end-to-end real-time detectors that improve DETR, such as RT-DETR / RT-DETRv2: YOLOv12-S beats RT-DETR-R18 / RT-DETRv2-R18 while running 42% faster, using only 36% of the computation and 45% of the parameters. More comparisons are shown in Figure 1.","DOI":"10.48550/arXiv.2502.12524","note":"arXiv:2502.12524 [cs]","number":"arXiv:2502.12524","publisher":"arXiv","source":"arXiv.org","title":"YOLOv12: Attention-Centric Real-Time Object Detectors","title-short":"YOLOv12","URL":"http://arxiv.org/abs/2502.12524","author":[{"family":"Tian","given":"Yunjie"},{"family":"Ye","given":"Qixiang"},{"family":"Doermann","given":"David"}],"accessed":{"date-parts":[["2025",5,26]]},"issued":{"date-parts":[["2025",2,18]]}}}],"schema":"https://github.com/citation-style-language/schema/raw/master/csl-citation.json"} </w:instrText>
-      </w:r>
-      <w:r>
-        <w:rPr>
-          <w:color w:val="FF0000"/>
-          <w:lang w:bidi="en-US"/>
-        </w:rPr>
-        <w:fldChar w:fldCharType="separate"/>
-      </w:r>
-      <w:r>
-        <w:t>[74]</w:t>
-      </w:r>
-      <w:r>
-        <w:rPr>
-          <w:color w:val="FF0000"/>
-          <w:lang w:bidi="en-US"/>
-        </w:rPr>
-        <w:fldChar w:fldCharType="end"/>
-      </w:r>
-      <w:r>
-        <w:t>) are:</w:t>
-      </w:r>
-      <w:r>
-        <w:t xml:space="preserve"> the Area Attention module, which reduces computational complexity while maintaining a large receptive field, and Residual Efficient Layer Aggregation Networks (R-ELAN) that enhance feature aggregation and optimize training for larger models. Other architectural updates include </w:t>
+        <w:t xml:space="preserve">feature aggregation and optimize training for larger models. Other architectural updates include </w:t>
       </w:r>
       <w:proofErr w:type="spellStart"/>
       <w:r>

</xml_diff>